<commit_message>
Working on dis report
</commit_message>
<xml_diff>
--- a/Dis Report.docx
+++ b/Dis Report.docx
@@ -218,7 +218,7 @@
                         <a:effectLst/>
                         <a:extLst>
                           <a:ext uri="{C572A759-6A51-4108-AA02-DFA0A04FC94B}">
-                            <ma14:wrappingTextBoxFlag xmlns="" xmlns:mo="http://schemas.microsoft.com/office/mac/office/2008/main" xmlns:mv="urn:schemas-microsoft-com:mac:vml" xmlns:o="urn:schemas-microsoft-com:office:office" xmlns:v="urn:schemas-microsoft-com:vml" xmlns:w10="urn:schemas-microsoft-com:office:word" xmlns:w="http://schemas.openxmlformats.org/wordprocessingml/2006/main" xmlns:ma14="http://schemas.microsoft.com/office/mac/drawingml/2011/main"/>
+                            <ma14:wrappingTextBoxFlag xmlns:ma14="http://schemas.microsoft.com/office/mac/drawingml/2011/main" xmlns:w="http://schemas.openxmlformats.org/wordprocessingml/2006/main" xmlns:w10="urn:schemas-microsoft-com:office:word" xmlns:v="urn:schemas-microsoft-com:vml" xmlns:o="urn:schemas-microsoft-com:office:office" xmlns:mv="urn:schemas-microsoft-com:mac:vml" xmlns:mo="http://schemas.microsoft.com/office/mac/office/2008/main" xmlns=""/>
                           </a:ext>
                         </a:extLst>
                       </wps:spPr>
@@ -2574,26 +2574,558 @@
         <w:jc w:val="both"/>
         <w:rPr>
           <w:rFonts w:ascii="Verdana" w:hAnsi="Verdana"/>
+          <w:bCs/>
+          <w:sz w:val="18"/>
+          <w:szCs w:val="18"/>
+        </w:rPr>
+      </w:pPr>
+      <w:r>
+        <w:rPr>
+          <w:rFonts w:ascii="Verdana" w:hAnsi="Verdana"/>
+          <w:bCs/>
+          <w:sz w:val="18"/>
+          <w:szCs w:val="18"/>
+        </w:rPr>
+        <w:t xml:space="preserve">The main bulk of this project is looking into different areas of learning theory and human </w:t>
+      </w:r>
+      <w:r>
+        <w:rPr>
+          <w:rFonts w:ascii="Verdana" w:hAnsi="Verdana"/>
+          <w:bCs/>
+          <w:sz w:val="18"/>
+          <w:szCs w:val="18"/>
+        </w:rPr>
+        <w:lastRenderedPageBreak/>
+        <w:t xml:space="preserve">pattern recognition. </w:t>
+      </w:r>
+      <w:proofErr w:type="gramStart"/>
+      <w:r>
+        <w:rPr>
+          <w:rFonts w:ascii="Verdana" w:hAnsi="Verdana"/>
+          <w:bCs/>
+          <w:sz w:val="18"/>
+          <w:szCs w:val="18"/>
+        </w:rPr>
+        <w:t>With this in mind, the</w:t>
+      </w:r>
+      <w:proofErr w:type="gramEnd"/>
+      <w:r>
+        <w:rPr>
+          <w:rFonts w:ascii="Verdana" w:hAnsi="Verdana"/>
+          <w:bCs/>
+          <w:sz w:val="18"/>
+          <w:szCs w:val="18"/>
+        </w:rPr>
+        <w:t xml:space="preserve"> project came up with these questions to research in assisting the artifacts second iteration </w:t>
+      </w:r>
+      <w:r>
+        <w:rPr>
+          <w:rFonts w:ascii="Verdana" w:hAnsi="Verdana"/>
+          <w:bCs/>
+          <w:sz w:val="18"/>
+          <w:szCs w:val="18"/>
+        </w:rPr>
+        <w:t>alongside</w:t>
+      </w:r>
+      <w:r>
+        <w:rPr>
+          <w:rFonts w:ascii="Verdana" w:hAnsi="Verdana"/>
+          <w:bCs/>
+          <w:sz w:val="18"/>
+          <w:szCs w:val="18"/>
+        </w:rPr>
+        <w:t xml:space="preserve"> the main </w:t>
+      </w:r>
+      <w:r>
+        <w:rPr>
+          <w:rFonts w:ascii="Verdana" w:hAnsi="Verdana"/>
+          <w:bCs/>
+          <w:sz w:val="18"/>
+          <w:szCs w:val="18"/>
+        </w:rPr>
+        <w:t>project’s</w:t>
+      </w:r>
+      <w:r>
+        <w:rPr>
+          <w:rFonts w:ascii="Verdana" w:hAnsi="Verdana"/>
+          <w:bCs/>
+          <w:sz w:val="18"/>
+          <w:szCs w:val="18"/>
+        </w:rPr>
+        <w:t xml:space="preserve"> objective.</w:t>
+      </w:r>
+    </w:p>
+    <w:p>
+      <w:pPr>
+        <w:jc w:val="both"/>
+        <w:rPr>
+          <w:rFonts w:ascii="Verdana" w:hAnsi="Verdana"/>
+          <w:bCs/>
+          <w:sz w:val="18"/>
+          <w:szCs w:val="18"/>
+        </w:rPr>
+      </w:pPr>
+    </w:p>
+    <w:p>
+      <w:pPr>
+        <w:pStyle w:val="ListParagraph"/>
+        <w:numPr>
+          <w:ilvl w:val="0"/>
+          <w:numId w:val="8"/>
+        </w:numPr>
+        <w:jc w:val="both"/>
+        <w:rPr>
+          <w:rFonts w:ascii="Verdana" w:hAnsi="Verdana"/>
+          <w:bCs/>
+          <w:sz w:val="18"/>
+          <w:szCs w:val="18"/>
+        </w:rPr>
+      </w:pPr>
+      <w:r>
+        <w:rPr>
+          <w:rFonts w:ascii="Verdana" w:hAnsi="Verdana"/>
+          <w:bCs/>
+          <w:sz w:val="18"/>
+          <w:szCs w:val="18"/>
+        </w:rPr>
+        <w:t>What are the most effective proven ways of learning?</w:t>
+      </w:r>
+      <w:r>
+        <w:rPr>
+          <w:rFonts w:ascii="Verdana" w:hAnsi="Verdana"/>
+          <w:bCs/>
+          <w:sz w:val="18"/>
+          <w:szCs w:val="18"/>
+        </w:rPr>
+        <w:t xml:space="preserve"> </w:t>
+      </w:r>
+    </w:p>
+    <w:p>
+      <w:pPr>
+        <w:pStyle w:val="ListParagraph"/>
+        <w:numPr>
+          <w:ilvl w:val="0"/>
+          <w:numId w:val="8"/>
+        </w:numPr>
+        <w:jc w:val="both"/>
+        <w:rPr>
+          <w:rFonts w:ascii="Verdana" w:hAnsi="Verdana"/>
+          <w:bCs/>
+          <w:sz w:val="18"/>
+          <w:szCs w:val="18"/>
+        </w:rPr>
+      </w:pPr>
+      <w:r>
+        <w:rPr>
+          <w:rFonts w:ascii="Verdana" w:hAnsi="Verdana"/>
+          <w:bCs/>
+          <w:sz w:val="18"/>
+          <w:szCs w:val="18"/>
+        </w:rPr>
+        <w:t>How do different people learn?</w:t>
+      </w:r>
+    </w:p>
+    <w:p>
+      <w:pPr>
+        <w:pStyle w:val="ListParagraph"/>
+        <w:numPr>
+          <w:ilvl w:val="0"/>
+          <w:numId w:val="8"/>
+        </w:numPr>
+        <w:jc w:val="both"/>
+        <w:rPr>
+          <w:rFonts w:ascii="Verdana" w:hAnsi="Verdana"/>
+          <w:bCs/>
+          <w:sz w:val="18"/>
+          <w:szCs w:val="18"/>
+        </w:rPr>
+      </w:pPr>
+      <w:r>
+        <w:rPr>
+          <w:rFonts w:ascii="Verdana" w:hAnsi="Verdana"/>
+          <w:bCs/>
+          <w:sz w:val="18"/>
+          <w:szCs w:val="18"/>
+        </w:rPr>
+        <w:t>How do people of different ages learn?</w:t>
+      </w:r>
+    </w:p>
+    <w:p>
+      <w:pPr>
+        <w:pStyle w:val="ListParagraph"/>
+        <w:numPr>
+          <w:ilvl w:val="0"/>
+          <w:numId w:val="8"/>
+        </w:numPr>
+        <w:jc w:val="both"/>
+        <w:rPr>
+          <w:rFonts w:ascii="Verdana" w:hAnsi="Verdana"/>
+          <w:bCs/>
+          <w:sz w:val="18"/>
+          <w:szCs w:val="18"/>
+        </w:rPr>
+      </w:pPr>
+      <w:r>
+        <w:rPr>
+          <w:rFonts w:ascii="Verdana" w:hAnsi="Verdana"/>
+          <w:bCs/>
+          <w:sz w:val="18"/>
+          <w:szCs w:val="18"/>
+        </w:rPr>
+        <w:t xml:space="preserve">What patterns do people pick up from either consciously or sub-consciously? </w:t>
+      </w:r>
+    </w:p>
+    <w:p>
+      <w:pPr>
+        <w:pStyle w:val="ListParagraph"/>
+        <w:numPr>
+          <w:ilvl w:val="0"/>
+          <w:numId w:val="8"/>
+        </w:numPr>
+        <w:jc w:val="both"/>
+        <w:rPr>
+          <w:rFonts w:ascii="Verdana" w:hAnsi="Verdana"/>
+          <w:bCs/>
+          <w:sz w:val="18"/>
+          <w:szCs w:val="18"/>
+        </w:rPr>
+      </w:pPr>
+      <w:r>
+        <w:rPr>
+          <w:rFonts w:ascii="Verdana" w:hAnsi="Verdana"/>
+          <w:bCs/>
+          <w:sz w:val="18"/>
+          <w:szCs w:val="18"/>
+        </w:rPr>
+        <w:t>Does having visual flair improve the learning experience/attention span?</w:t>
+      </w:r>
+    </w:p>
+    <w:p>
+      <w:pPr>
+        <w:jc w:val="both"/>
+        <w:rPr>
+          <w:rFonts w:ascii="Verdana" w:hAnsi="Verdana"/>
+          <w:bCs/>
+          <w:sz w:val="18"/>
+          <w:szCs w:val="18"/>
+        </w:rPr>
+      </w:pPr>
+    </w:p>
+    <w:p>
+      <w:pPr>
+        <w:jc w:val="both"/>
+        <w:rPr>
+          <w:rFonts w:ascii="Verdana" w:hAnsi="Verdana"/>
+          <w:bCs/>
+          <w:sz w:val="18"/>
+          <w:szCs w:val="18"/>
+        </w:rPr>
+      </w:pPr>
+      <w:r>
+        <w:rPr>
+          <w:rFonts w:ascii="Verdana" w:hAnsi="Verdana"/>
+          <w:bCs/>
+          <w:sz w:val="18"/>
+          <w:szCs w:val="18"/>
+        </w:rPr>
+        <w:t>Looking into the most effective ways of learning is a good start for the project. Being able to get a good understanding of how humans learn and being able to apply this to the artifact and project will mean a strong base is created to work upon.</w:t>
+      </w:r>
+    </w:p>
+    <w:p>
+      <w:pPr>
+        <w:jc w:val="both"/>
+        <w:rPr>
+          <w:rFonts w:ascii="Verdana" w:hAnsi="Verdana"/>
+          <w:bCs/>
+          <w:sz w:val="18"/>
+          <w:szCs w:val="18"/>
+        </w:rPr>
+      </w:pPr>
+    </w:p>
+    <w:p>
+      <w:pPr>
+        <w:jc w:val="both"/>
+        <w:rPr>
+          <w:rFonts w:ascii="Verdana" w:hAnsi="Verdana"/>
+          <w:bCs/>
+          <w:sz w:val="18"/>
+          <w:szCs w:val="18"/>
+        </w:rPr>
+      </w:pPr>
+      <w:r>
+        <w:rPr>
+          <w:rFonts w:ascii="Verdana" w:hAnsi="Verdana"/>
+          <w:bCs/>
+          <w:sz w:val="18"/>
+          <w:szCs w:val="18"/>
+        </w:rPr>
+        <w:t>Once the base has been set the project will investigate how different people of different ages learn more effectively. The idea of this is that older people may have an easier time learning due to prior life experiences while younger people may be experiencing learning something for the first time.</w:t>
+      </w:r>
+    </w:p>
+    <w:p>
+      <w:pPr>
+        <w:jc w:val="both"/>
+        <w:rPr>
+          <w:rFonts w:ascii="Verdana" w:hAnsi="Verdana"/>
+          <w:bCs/>
+          <w:sz w:val="18"/>
+          <w:szCs w:val="18"/>
+        </w:rPr>
+      </w:pPr>
+    </w:p>
+    <w:p>
+      <w:pPr>
+        <w:jc w:val="both"/>
+        <w:rPr>
+          <w:rFonts w:ascii="Verdana" w:hAnsi="Verdana"/>
+          <w:bCs/>
+          <w:sz w:val="18"/>
+          <w:szCs w:val="18"/>
+        </w:rPr>
+      </w:pPr>
+      <w:r>
+        <w:rPr>
+          <w:rFonts w:ascii="Verdana" w:hAnsi="Verdana"/>
+          <w:bCs/>
+          <w:sz w:val="18"/>
+          <w:szCs w:val="18"/>
+        </w:rPr>
+        <w:t>Finally</w:t>
+      </w:r>
+      <w:r>
+        <w:rPr>
+          <w:rFonts w:ascii="Verdana" w:hAnsi="Verdana"/>
+          <w:bCs/>
+          <w:sz w:val="18"/>
+          <w:szCs w:val="18"/>
+        </w:rPr>
+        <w:t>, looking into common patters people tend to follow either</w:t>
+      </w:r>
+      <w:r>
+        <w:rPr>
+          <w:rFonts w:ascii="Verdana" w:hAnsi="Verdana"/>
+          <w:bCs/>
+          <w:sz w:val="18"/>
+          <w:szCs w:val="18"/>
+        </w:rPr>
+        <w:t xml:space="preserve"> </w:t>
+      </w:r>
+      <w:r>
+        <w:rPr>
+          <w:rFonts w:ascii="Verdana" w:hAnsi="Verdana"/>
+          <w:bCs/>
+          <w:sz w:val="18"/>
+          <w:szCs w:val="18"/>
+        </w:rPr>
+        <w:t>consciously or sub-consciously</w:t>
+      </w:r>
+      <w:r>
+        <w:rPr>
+          <w:rFonts w:ascii="Verdana" w:hAnsi="Verdana"/>
+          <w:bCs/>
+          <w:sz w:val="18"/>
+          <w:szCs w:val="18"/>
+        </w:rPr>
+        <w:t xml:space="preserve"> can help get a better understanding of how people learn. The play test will help to assist this research question due to the play conditions being the same for everyone. Using the data gathered from this will be used and expanded on further in the method section.</w:t>
+      </w:r>
+    </w:p>
+    <w:p>
+      <w:pPr>
+        <w:jc w:val="both"/>
+        <w:rPr>
+          <w:rFonts w:ascii="Verdana" w:hAnsi="Verdana"/>
+          <w:bCs/>
+          <w:sz w:val="18"/>
+          <w:szCs w:val="18"/>
+        </w:rPr>
+      </w:pPr>
+    </w:p>
+    <w:p>
+      <w:pPr>
+        <w:jc w:val="both"/>
+        <w:rPr>
+          <w:rFonts w:ascii="Verdana" w:hAnsi="Verdana"/>
           <w:b/>
           <w:sz w:val="18"/>
           <w:szCs w:val="18"/>
         </w:rPr>
       </w:pPr>
+      <w:r>
+        <w:rPr>
+          <w:rFonts w:ascii="Verdana" w:hAnsi="Verdana"/>
+          <w:bCs/>
+          <w:noProof/>
+          <w:sz w:val="18"/>
+          <w:szCs w:val="18"/>
+        </w:rPr>
+        <w:t>------------------------------------------------------</w:t>
+      </w:r>
     </w:p>
     <w:p>
       <w:pPr>
         <w:jc w:val="both"/>
         <w:rPr>
           <w:rFonts w:ascii="Verdana" w:hAnsi="Verdana"/>
+          <w:bCs/>
+          <w:color w:val="FF0000"/>
+          <w:sz w:val="18"/>
+          <w:szCs w:val="18"/>
+        </w:rPr>
+      </w:pPr>
+      <w:r>
+        <w:rPr>
+          <w:rFonts w:ascii="Verdana" w:hAnsi="Verdana"/>
+          <w:bCs/>
+          <w:color w:val="FF0000"/>
+          <w:sz w:val="18"/>
+          <w:szCs w:val="18"/>
+        </w:rPr>
+        <w:t>Having just introduced the project, lead the reader over to the key research questions. State your research questions simply, clearly and concisely.</w:t>
+      </w:r>
+    </w:p>
+    <w:p>
+      <w:pPr>
+        <w:jc w:val="both"/>
+        <w:rPr>
+          <w:rFonts w:ascii="Verdana" w:hAnsi="Verdana"/>
+          <w:bCs/>
+          <w:sz w:val="18"/>
+          <w:szCs w:val="18"/>
+        </w:rPr>
+      </w:pPr>
+      <w:r>
+        <w:rPr>
+          <w:rFonts w:ascii="Verdana" w:hAnsi="Verdana"/>
+          <w:bCs/>
+          <w:noProof/>
+          <w:sz w:val="18"/>
+          <w:szCs w:val="18"/>
+        </w:rPr>
+        <w:t>------------------------------------------------------</w:t>
+      </w:r>
+    </w:p>
+    <w:p>
+      <w:pPr>
+        <w:jc w:val="both"/>
+        <w:rPr>
+          <w:rFonts w:ascii="Verdana" w:hAnsi="Verdana"/>
+          <w:bCs/>
+          <w:sz w:val="18"/>
+          <w:szCs w:val="18"/>
+        </w:rPr>
+      </w:pPr>
+    </w:p>
+    <w:p>
+      <w:pPr>
+        <w:jc w:val="both"/>
+        <w:rPr>
+          <w:rFonts w:ascii="Verdana" w:hAnsi="Verdana"/>
+          <w:sz w:val="18"/>
+          <w:szCs w:val="18"/>
+        </w:rPr>
+      </w:pPr>
+      <w:r>
+        <w:rPr>
+          <w:rFonts w:ascii="Verdana" w:hAnsi="Verdana"/>
           <w:b/>
           <w:sz w:val="18"/>
           <w:szCs w:val="18"/>
         </w:rPr>
-      </w:pPr>
+        <w:t>3</w:t>
+      </w:r>
+      <w:r>
+        <w:rPr>
+          <w:rFonts w:ascii="Verdana" w:hAnsi="Verdana"/>
+          <w:b/>
+          <w:sz w:val="18"/>
+          <w:szCs w:val="18"/>
+        </w:rPr>
+        <w:t xml:space="preserve">. </w:t>
+      </w:r>
+      <w:r>
+        <w:rPr>
+          <w:rFonts w:ascii="Verdana" w:hAnsi="Verdana"/>
+          <w:b/>
+          <w:sz w:val="18"/>
+          <w:szCs w:val="18"/>
+        </w:rPr>
+        <w:t>Literature review</w:t>
+      </w:r>
+      <w:r>
+        <w:rPr>
+          <w:rFonts w:ascii="Verdana" w:hAnsi="Verdana"/>
+          <w:b/>
+          <w:sz w:val="18"/>
+          <w:szCs w:val="18"/>
+        </w:rPr>
+        <w:t xml:space="preserve"> </w:t>
+      </w:r>
       <w:r>
         <w:rPr>
           <w:rFonts w:ascii="Verdana" w:hAnsi="Verdana"/>
           <w:bCs/>
+          <w:sz w:val="18"/>
+          <w:szCs w:val="18"/>
+        </w:rPr>
+        <w:t>~</w:t>
+      </w:r>
+      <w:r>
+        <w:rPr>
+          <w:rFonts w:ascii="Verdana" w:hAnsi="Verdana"/>
+          <w:sz w:val="18"/>
+          <w:szCs w:val="18"/>
+        </w:rPr>
+        <w:t>1</w:t>
+      </w:r>
+      <w:r>
+        <w:rPr>
+          <w:rFonts w:ascii="Verdana" w:hAnsi="Verdana"/>
+          <w:sz w:val="18"/>
+          <w:szCs w:val="18"/>
+        </w:rPr>
+        <w:t>5</w:t>
+      </w:r>
+      <w:r>
+        <w:rPr>
+          <w:rFonts w:ascii="Verdana" w:hAnsi="Verdana"/>
+          <w:sz w:val="18"/>
+          <w:szCs w:val="18"/>
+        </w:rPr>
+        <w:t>00</w:t>
+      </w:r>
+      <w:r>
+        <w:rPr>
+          <w:rFonts w:ascii="Verdana" w:hAnsi="Verdana"/>
+          <w:sz w:val="18"/>
+          <w:szCs w:val="18"/>
+        </w:rPr>
+        <w:t>w</w:t>
+      </w:r>
+    </w:p>
+    <w:p>
+      <w:pPr>
+        <w:jc w:val="both"/>
+        <w:rPr>
+          <w:rFonts w:ascii="Verdana" w:hAnsi="Verdana"/>
+          <w:sz w:val="18"/>
+          <w:szCs w:val="18"/>
+        </w:rPr>
+      </w:pPr>
+    </w:p>
+    <w:p>
+      <w:pPr>
+        <w:jc w:val="both"/>
+        <w:rPr>
+          <w:rFonts w:ascii="Verdana" w:hAnsi="Verdana"/>
+          <w:noProof/>
+          <w:sz w:val="18"/>
+          <w:szCs w:val="18"/>
+        </w:rPr>
+      </w:pPr>
+      <w:r>
+        <w:rPr>
+          <w:rFonts w:ascii="Verdana" w:hAnsi="Verdana"/>
+          <w:bCs/>
           <w:noProof/>
           <w:sz w:val="18"/>
           <w:szCs w:val="18"/>
@@ -2606,96 +3138,78 @@
         <w:jc w:val="both"/>
         <w:rPr>
           <w:rFonts w:ascii="Verdana" w:hAnsi="Verdana"/>
-          <w:bCs/>
-          <w:color w:val="FF0000"/>
-          <w:sz w:val="18"/>
-          <w:szCs w:val="18"/>
-        </w:rPr>
-      </w:pPr>
-      <w:r>
-        <w:rPr>
-          <w:rFonts w:ascii="Verdana" w:hAnsi="Verdana"/>
-          <w:bCs/>
-          <w:color w:val="FF0000"/>
-          <w:sz w:val="18"/>
-          <w:szCs w:val="18"/>
-        </w:rPr>
-        <w:lastRenderedPageBreak/>
-        <w:t>Having just introduced the project, lead the reader over to the key research questions. State your research questions simply, clearly and concisely.</w:t>
-      </w:r>
-    </w:p>
-    <w:p>
-      <w:pPr>
-        <w:jc w:val="both"/>
-        <w:rPr>
-          <w:rFonts w:ascii="Verdana" w:hAnsi="Verdana"/>
-          <w:bCs/>
-          <w:sz w:val="18"/>
-          <w:szCs w:val="18"/>
-        </w:rPr>
-      </w:pPr>
-      <w:r>
-        <w:rPr>
-          <w:rFonts w:ascii="Verdana" w:hAnsi="Verdana"/>
-          <w:bCs/>
-          <w:noProof/>
-          <w:sz w:val="18"/>
-          <w:szCs w:val="18"/>
-        </w:rPr>
-        <w:t>------------------------------------------------------</w:t>
-      </w:r>
-    </w:p>
-    <w:p>
-      <w:pPr>
-        <w:jc w:val="both"/>
-        <w:rPr>
-          <w:rFonts w:ascii="Verdana" w:hAnsi="Verdana"/>
-          <w:bCs/>
-          <w:sz w:val="18"/>
-          <w:szCs w:val="18"/>
-        </w:rPr>
-      </w:pPr>
-    </w:p>
-    <w:p>
-      <w:pPr>
-        <w:jc w:val="both"/>
-        <w:rPr>
-          <w:rFonts w:ascii="Verdana" w:hAnsi="Verdana"/>
-          <w:sz w:val="18"/>
-          <w:szCs w:val="18"/>
-        </w:rPr>
-      </w:pPr>
-      <w:r>
-        <w:rPr>
-          <w:rFonts w:ascii="Verdana" w:hAnsi="Verdana"/>
-          <w:b/>
-          <w:sz w:val="18"/>
-          <w:szCs w:val="18"/>
-        </w:rPr>
-        <w:t>3</w:t>
-      </w:r>
-      <w:r>
-        <w:rPr>
-          <w:rFonts w:ascii="Verdana" w:hAnsi="Verdana"/>
-          <w:b/>
-          <w:sz w:val="18"/>
-          <w:szCs w:val="18"/>
-        </w:rPr>
-        <w:t xml:space="preserve">. </w:t>
-      </w:r>
-      <w:r>
-        <w:rPr>
-          <w:rFonts w:ascii="Verdana" w:hAnsi="Verdana"/>
-          <w:b/>
-          <w:sz w:val="18"/>
-          <w:szCs w:val="18"/>
-        </w:rPr>
-        <w:t>Literature review</w:t>
-      </w:r>
-      <w:r>
-        <w:rPr>
-          <w:rFonts w:ascii="Verdana" w:hAnsi="Verdana"/>
-          <w:b/>
+          <w:color w:val="FF0000"/>
+          <w:sz w:val="18"/>
+          <w:szCs w:val="18"/>
+        </w:rPr>
+      </w:pPr>
+      <w:r>
+        <w:rPr>
+          <w:rFonts w:ascii="Verdana" w:hAnsi="Verdana"/>
+          <w:color w:val="FF0000"/>
+          <w:sz w:val="18"/>
+          <w:szCs w:val="18"/>
+        </w:rPr>
+        <w:t xml:space="preserve">Introduce </w:t>
+      </w:r>
+      <w:r>
+        <w:rPr>
+          <w:rFonts w:ascii="Verdana" w:hAnsi="Verdana"/>
+          <w:color w:val="FF0000"/>
+          <w:sz w:val="18"/>
+          <w:szCs w:val="18"/>
+        </w:rPr>
+        <w:t>your</w:t>
+      </w:r>
+      <w:r>
+        <w:rPr>
+          <w:rFonts w:ascii="Verdana" w:hAnsi="Verdana"/>
+          <w:color w:val="FF0000"/>
+          <w:sz w:val="18"/>
+          <w:szCs w:val="18"/>
+        </w:rPr>
+        <w:t xml:space="preserve"> reader</w:t>
+      </w:r>
+      <w:r>
+        <w:rPr>
+          <w:rFonts w:ascii="Verdana" w:hAnsi="Verdana"/>
+          <w:color w:val="FF0000"/>
+          <w:sz w:val="18"/>
+          <w:szCs w:val="18"/>
+        </w:rPr>
+        <w:t xml:space="preserve"> (assume they are a</w:t>
+      </w:r>
+      <w:r>
+        <w:rPr>
+          <w:rFonts w:ascii="Verdana" w:hAnsi="Verdana"/>
+          <w:color w:val="FF0000"/>
+          <w:sz w:val="18"/>
+          <w:szCs w:val="18"/>
+        </w:rPr>
+        <w:t xml:space="preserve"> peer</w:t>
+      </w:r>
+      <w:r>
+        <w:rPr>
+          <w:rFonts w:ascii="Verdana" w:hAnsi="Verdana"/>
+          <w:color w:val="FF0000"/>
+          <w:sz w:val="18"/>
+          <w:szCs w:val="18"/>
+        </w:rPr>
+        <w:t xml:space="preserve"> in </w:t>
+      </w:r>
+      <w:r>
+        <w:rPr>
+          <w:rFonts w:ascii="Verdana" w:hAnsi="Verdana"/>
+          <w:color w:val="FF0000"/>
+          <w:sz w:val="18"/>
+          <w:szCs w:val="18"/>
+        </w:rPr>
+        <w:t>your</w:t>
+      </w:r>
+      <w:r>
+        <w:rPr>
+          <w:rFonts w:ascii="Verdana" w:hAnsi="Verdana"/>
+          <w:color w:val="FF0000"/>
           <w:sz w:val="18"/>
           <w:szCs w:val="18"/>
         </w:rPr>
@@ -2704,123 +3218,61 @@
       <w:r>
         <w:rPr>
           <w:rFonts w:ascii="Verdana" w:hAnsi="Verdana"/>
-          <w:bCs/>
-          <w:sz w:val="18"/>
-          <w:szCs w:val="18"/>
-        </w:rPr>
-        <w:t>~</w:t>
-      </w:r>
-      <w:r>
-        <w:rPr>
-          <w:rFonts w:ascii="Verdana" w:hAnsi="Verdana"/>
-          <w:sz w:val="18"/>
-          <w:szCs w:val="18"/>
-        </w:rPr>
-        <w:t>1</w:t>
-      </w:r>
-      <w:r>
-        <w:rPr>
-          <w:rFonts w:ascii="Verdana" w:hAnsi="Verdana"/>
-          <w:sz w:val="18"/>
-          <w:szCs w:val="18"/>
-        </w:rPr>
-        <w:t>5</w:t>
-      </w:r>
-      <w:r>
-        <w:rPr>
-          <w:rFonts w:ascii="Verdana" w:hAnsi="Verdana"/>
-          <w:sz w:val="18"/>
-          <w:szCs w:val="18"/>
-        </w:rPr>
-        <w:t>00</w:t>
-      </w:r>
-      <w:r>
-        <w:rPr>
-          <w:rFonts w:ascii="Verdana" w:hAnsi="Verdana"/>
-          <w:sz w:val="18"/>
-          <w:szCs w:val="18"/>
-        </w:rPr>
-        <w:t>w</w:t>
-      </w:r>
-    </w:p>
-    <w:p>
-      <w:pPr>
-        <w:jc w:val="both"/>
-        <w:rPr>
-          <w:rFonts w:ascii="Verdana" w:hAnsi="Verdana"/>
-          <w:sz w:val="18"/>
-          <w:szCs w:val="18"/>
-        </w:rPr>
-      </w:pPr>
-    </w:p>
-    <w:p>
-      <w:pPr>
-        <w:jc w:val="both"/>
-        <w:rPr>
-          <w:rFonts w:ascii="Verdana" w:hAnsi="Verdana"/>
-          <w:sz w:val="18"/>
-          <w:szCs w:val="18"/>
-        </w:rPr>
-      </w:pPr>
-      <w:r>
-        <w:rPr>
-          <w:rFonts w:ascii="Verdana" w:hAnsi="Verdana"/>
-          <w:sz w:val="18"/>
-          <w:szCs w:val="18"/>
-        </w:rPr>
-        <w:t xml:space="preserve">Introduce </w:t>
-      </w:r>
-      <w:r>
-        <w:rPr>
-          <w:rFonts w:ascii="Verdana" w:hAnsi="Verdana"/>
-          <w:sz w:val="18"/>
-          <w:szCs w:val="18"/>
-        </w:rPr>
-        <w:t>your</w:t>
-      </w:r>
-      <w:r>
-        <w:rPr>
-          <w:rFonts w:ascii="Verdana" w:hAnsi="Verdana"/>
-          <w:sz w:val="18"/>
-          <w:szCs w:val="18"/>
-        </w:rPr>
-        <w:t xml:space="preserve"> reader</w:t>
-      </w:r>
-      <w:r>
-        <w:rPr>
-          <w:rFonts w:ascii="Verdana" w:hAnsi="Verdana"/>
-          <w:sz w:val="18"/>
-          <w:szCs w:val="18"/>
-        </w:rPr>
-        <w:t xml:space="preserve"> (assume they are a</w:t>
-      </w:r>
-      <w:r>
-        <w:rPr>
-          <w:rFonts w:ascii="Verdana" w:hAnsi="Verdana"/>
-          <w:sz w:val="18"/>
-          <w:szCs w:val="18"/>
-        </w:rPr>
-        <w:t xml:space="preserve"> peer</w:t>
-      </w:r>
-      <w:r>
-        <w:rPr>
-          <w:rFonts w:ascii="Verdana" w:hAnsi="Verdana"/>
-          <w:sz w:val="18"/>
-          <w:szCs w:val="18"/>
-        </w:rPr>
-        <w:t xml:space="preserve"> in </w:t>
-      </w:r>
-      <w:r>
-        <w:rPr>
-          <w:rFonts w:ascii="Verdana" w:hAnsi="Verdana"/>
-          <w:sz w:val="18"/>
-          <w:szCs w:val="18"/>
-        </w:rPr>
-        <w:t>your</w:t>
-      </w:r>
-      <w:r>
-        <w:rPr>
-          <w:rFonts w:ascii="Verdana" w:hAnsi="Verdana"/>
+          <w:color w:val="FF0000"/>
+          <w:sz w:val="18"/>
+          <w:szCs w:val="18"/>
+        </w:rPr>
+        <w:t>subject area</w:t>
+      </w:r>
+      <w:r>
+        <w:rPr>
+          <w:rFonts w:ascii="Verdana" w:hAnsi="Verdana"/>
+          <w:color w:val="FF0000"/>
+          <w:sz w:val="18"/>
+          <w:szCs w:val="18"/>
+        </w:rPr>
+        <w:t>)</w:t>
+      </w:r>
+      <w:r>
+        <w:rPr>
+          <w:rFonts w:ascii="Verdana" w:hAnsi="Verdana"/>
+          <w:color w:val="FF0000"/>
+          <w:sz w:val="18"/>
+          <w:szCs w:val="18"/>
+        </w:rPr>
+        <w:t xml:space="preserve"> to </w:t>
+      </w:r>
+      <w:r>
+        <w:rPr>
+          <w:rFonts w:ascii="Verdana" w:hAnsi="Verdana"/>
+          <w:color w:val="FF0000"/>
+          <w:sz w:val="18"/>
+          <w:szCs w:val="18"/>
+        </w:rPr>
+        <w:t xml:space="preserve">the </w:t>
+      </w:r>
+      <w:r>
+        <w:rPr>
+          <w:rFonts w:ascii="Verdana" w:hAnsi="Verdana"/>
+          <w:color w:val="FF0000"/>
+          <w:sz w:val="18"/>
+          <w:szCs w:val="18"/>
+        </w:rPr>
+        <w:t>key literature</w:t>
+      </w:r>
+      <w:r>
+        <w:rPr>
+          <w:rFonts w:ascii="Verdana" w:hAnsi="Verdana"/>
+          <w:color w:val="FF0000"/>
+          <w:sz w:val="18"/>
+          <w:szCs w:val="18"/>
+        </w:rPr>
+        <w:t xml:space="preserve"> and</w:t>
+      </w:r>
+      <w:r>
+        <w:rPr>
+          <w:rFonts w:ascii="Verdana" w:hAnsi="Verdana"/>
+          <w:color w:val="FF0000"/>
           <w:sz w:val="18"/>
           <w:szCs w:val="18"/>
         </w:rPr>
@@ -2829,62 +3281,7 @@
       <w:r>
         <w:rPr>
           <w:rFonts w:ascii="Verdana" w:hAnsi="Verdana"/>
-          <w:sz w:val="18"/>
-          <w:szCs w:val="18"/>
-        </w:rPr>
-        <w:t>subject area</w:t>
-      </w:r>
-      <w:r>
-        <w:rPr>
-          <w:rFonts w:ascii="Verdana" w:hAnsi="Verdana"/>
-          <w:sz w:val="18"/>
-          <w:szCs w:val="18"/>
-        </w:rPr>
-        <w:t>)</w:t>
-      </w:r>
-      <w:r>
-        <w:rPr>
-          <w:rFonts w:ascii="Verdana" w:hAnsi="Verdana"/>
-          <w:sz w:val="18"/>
-          <w:szCs w:val="18"/>
-        </w:rPr>
-        <w:t xml:space="preserve"> to </w:t>
-      </w:r>
-      <w:r>
-        <w:rPr>
-          <w:rFonts w:ascii="Verdana" w:hAnsi="Verdana"/>
-          <w:sz w:val="18"/>
-          <w:szCs w:val="18"/>
-        </w:rPr>
-        <w:t xml:space="preserve">the </w:t>
-      </w:r>
-      <w:r>
-        <w:rPr>
-          <w:rFonts w:ascii="Verdana" w:hAnsi="Verdana"/>
-          <w:sz w:val="18"/>
-          <w:szCs w:val="18"/>
-        </w:rPr>
-        <w:t>key literature</w:t>
-      </w:r>
-      <w:r>
-        <w:rPr>
-          <w:rFonts w:ascii="Verdana" w:hAnsi="Verdana"/>
-          <w:sz w:val="18"/>
-          <w:szCs w:val="18"/>
-        </w:rPr>
-        <w:t xml:space="preserve"> and</w:t>
-      </w:r>
-      <w:r>
-        <w:rPr>
-          <w:rFonts w:ascii="Verdana" w:hAnsi="Verdana"/>
-          <w:sz w:val="18"/>
-          <w:szCs w:val="18"/>
-        </w:rPr>
-        <w:t xml:space="preserve"> </w:t>
-      </w:r>
-      <w:r>
-        <w:rPr>
-          <w:rFonts w:ascii="Verdana" w:hAnsi="Verdana"/>
+          <w:color w:val="FF0000"/>
           <w:sz w:val="18"/>
           <w:szCs w:val="18"/>
         </w:rPr>
@@ -2893,6 +3290,7 @@
       <w:r>
         <w:rPr>
           <w:rFonts w:ascii="Verdana" w:hAnsi="Verdana"/>
+          <w:color w:val="FF0000"/>
           <w:sz w:val="18"/>
           <w:szCs w:val="18"/>
         </w:rPr>
@@ -2901,6 +3299,7 @@
       <w:r>
         <w:rPr>
           <w:rFonts w:ascii="Verdana" w:hAnsi="Verdana"/>
+          <w:color w:val="FF0000"/>
           <w:sz w:val="18"/>
           <w:szCs w:val="18"/>
         </w:rPr>
@@ -2911,6 +3310,7 @@
           <w:rFonts w:ascii="Verdana" w:hAnsi="Verdana"/>
           <w:i/>
           <w:iCs/>
+          <w:color w:val="FF0000"/>
           <w:sz w:val="18"/>
           <w:szCs w:val="18"/>
         </w:rPr>
@@ -2919,6 +3319,7 @@
       <w:r>
         <w:rPr>
           <w:rFonts w:ascii="Verdana" w:hAnsi="Verdana"/>
+          <w:color w:val="FF0000"/>
           <w:sz w:val="18"/>
           <w:szCs w:val="18"/>
         </w:rPr>
@@ -2927,6 +3328,7 @@
       <w:r>
         <w:rPr>
           <w:rFonts w:ascii="Verdana" w:hAnsi="Verdana"/>
+          <w:color w:val="FF0000"/>
           <w:sz w:val="18"/>
           <w:szCs w:val="18"/>
         </w:rPr>
@@ -2935,6 +3337,7 @@
       <w:r>
         <w:rPr>
           <w:rFonts w:ascii="Verdana" w:hAnsi="Verdana"/>
+          <w:color w:val="FF0000"/>
           <w:sz w:val="18"/>
           <w:szCs w:val="18"/>
         </w:rPr>
@@ -2943,6 +3346,7 @@
       <w:r>
         <w:rPr>
           <w:rFonts w:ascii="Verdana" w:hAnsi="Verdana"/>
+          <w:color w:val="FF0000"/>
           <w:sz w:val="18"/>
           <w:szCs w:val="18"/>
         </w:rPr>
@@ -2951,6 +3355,7 @@
       <w:r>
         <w:rPr>
           <w:rFonts w:ascii="Verdana" w:hAnsi="Verdana"/>
+          <w:color w:val="FF0000"/>
           <w:sz w:val="18"/>
           <w:szCs w:val="18"/>
         </w:rPr>
@@ -2959,6 +3364,7 @@
       <w:r>
         <w:rPr>
           <w:rFonts w:ascii="Verdana" w:hAnsi="Verdana"/>
+          <w:color w:val="FF0000"/>
           <w:sz w:val="18"/>
           <w:szCs w:val="18"/>
         </w:rPr>
@@ -2967,6 +3373,7 @@
       <w:r>
         <w:rPr>
           <w:rFonts w:ascii="Verdana" w:hAnsi="Verdana"/>
+          <w:color w:val="FF0000"/>
           <w:sz w:val="18"/>
           <w:szCs w:val="18"/>
         </w:rPr>
@@ -2975,6 +3382,7 @@
       <w:r>
         <w:rPr>
           <w:rFonts w:ascii="Verdana" w:hAnsi="Verdana"/>
+          <w:color w:val="FF0000"/>
           <w:sz w:val="18"/>
           <w:szCs w:val="18"/>
         </w:rPr>
@@ -2983,6 +3391,7 @@
       <w:r>
         <w:rPr>
           <w:rFonts w:ascii="Verdana" w:hAnsi="Verdana"/>
+          <w:color w:val="FF0000"/>
           <w:sz w:val="18"/>
           <w:szCs w:val="18"/>
         </w:rPr>
@@ -2991,6 +3400,7 @@
       <w:r>
         <w:rPr>
           <w:rFonts w:ascii="Verdana" w:hAnsi="Verdana"/>
+          <w:color w:val="FF0000"/>
           <w:sz w:val="18"/>
           <w:szCs w:val="18"/>
         </w:rPr>
@@ -2999,6 +3409,7 @@
       <w:r>
         <w:rPr>
           <w:rFonts w:ascii="Verdana" w:hAnsi="Verdana"/>
+          <w:color w:val="FF0000"/>
           <w:sz w:val="18"/>
           <w:szCs w:val="18"/>
         </w:rPr>
@@ -3007,6 +3418,7 @@
       <w:r>
         <w:rPr>
           <w:rFonts w:ascii="Verdana" w:hAnsi="Verdana"/>
+          <w:color w:val="FF0000"/>
           <w:sz w:val="18"/>
           <w:szCs w:val="18"/>
         </w:rPr>
@@ -3018,6 +3430,7 @@
         <w:jc w:val="both"/>
         <w:rPr>
           <w:rFonts w:ascii="Verdana" w:hAnsi="Verdana"/>
+          <w:color w:val="FF0000"/>
           <w:sz w:val="18"/>
           <w:szCs w:val="18"/>
         </w:rPr>
@@ -3028,6 +3441,7 @@
         <w:jc w:val="both"/>
         <w:rPr>
           <w:rFonts w:ascii="Verdana" w:hAnsi="Verdana"/>
+          <w:color w:val="FF0000"/>
           <w:sz w:val="18"/>
           <w:szCs w:val="18"/>
         </w:rPr>
@@ -3035,48 +3449,18 @@
       <w:r>
         <w:rPr>
           <w:rFonts w:ascii="Verdana" w:eastAsia="Times New Roman" w:hAnsi="Verdana" w:cs="Times New Roman"/>
-          <w:sz w:val="18"/>
-          <w:szCs w:val="18"/>
-        </w:rPr>
-        <w:t xml:space="preserve">If you are new to </w:t>
-      </w:r>
-      <w:r>
-        <w:rPr>
-          <w:rFonts w:ascii="Verdana" w:eastAsia="Times New Roman" w:hAnsi="Verdana" w:cs="Times New Roman"/>
-          <w:sz w:val="18"/>
-          <w:szCs w:val="18"/>
-        </w:rPr>
-        <w:t xml:space="preserve">UWE Bristol Harvard </w:t>
-      </w:r>
-      <w:r>
-        <w:rPr>
-          <w:rFonts w:ascii="Verdana" w:eastAsia="Times New Roman" w:hAnsi="Verdana" w:cs="Times New Roman"/>
-          <w:sz w:val="18"/>
-          <w:szCs w:val="18"/>
-        </w:rPr>
-        <w:t>referencing</w:t>
-      </w:r>
-      <w:r>
-        <w:rPr>
-          <w:rFonts w:ascii="Verdana" w:eastAsia="Times New Roman" w:hAnsi="Verdana" w:cs="Times New Roman"/>
-          <w:sz w:val="18"/>
-          <w:szCs w:val="18"/>
-        </w:rPr>
-        <w:t xml:space="preserve"> please</w:t>
-      </w:r>
-      <w:r>
-        <w:rPr>
-          <w:rFonts w:ascii="Verdana" w:eastAsia="Times New Roman" w:hAnsi="Verdana" w:cs="Times New Roman"/>
-          <w:sz w:val="18"/>
-          <w:szCs w:val="18"/>
-        </w:rPr>
-        <w:t xml:space="preserve"> read the </w:t>
+          <w:color w:val="FF0000"/>
+          <w:sz w:val="18"/>
+          <w:szCs w:val="18"/>
+        </w:rPr>
+        <w:t xml:space="preserve">If you are new to UWE Bristol Harvard referencing please read the </w:t>
       </w:r>
       <w:hyperlink r:id="rId16" w:history="1">
         <w:r>
           <w:rPr>
             <w:rStyle w:val="Hyperlink"/>
             <w:rFonts w:ascii="Verdana" w:eastAsia="Times New Roman" w:hAnsi="Verdana" w:cs="Times New Roman"/>
+            <w:color w:val="FF0000"/>
             <w:sz w:val="18"/>
             <w:szCs w:val="18"/>
           </w:rPr>
@@ -3086,6 +3470,7 @@
       <w:r>
         <w:rPr>
           <w:rFonts w:ascii="Verdana" w:eastAsia="Times New Roman" w:hAnsi="Verdana" w:cs="Times New Roman"/>
+          <w:color w:val="FF0000"/>
           <w:sz w:val="18"/>
           <w:szCs w:val="18"/>
         </w:rPr>
@@ -3096,6 +3481,7 @@
           <w:rPr>
             <w:rStyle w:val="Hyperlink"/>
             <w:rFonts w:ascii="Verdana" w:eastAsia="Times New Roman" w:hAnsi="Verdana" w:cs="Times New Roman"/>
+            <w:color w:val="FF0000"/>
             <w:sz w:val="18"/>
             <w:szCs w:val="18"/>
           </w:rPr>
@@ -3105,32 +3491,18 @@
       <w:r>
         <w:rPr>
           <w:rFonts w:ascii="Verdana" w:eastAsia="Times New Roman" w:hAnsi="Verdana" w:cs="Times New Roman"/>
-          <w:sz w:val="18"/>
-          <w:szCs w:val="18"/>
-        </w:rPr>
-        <w:t>. Also</w:t>
-      </w:r>
-      <w:r>
-        <w:rPr>
-          <w:rFonts w:ascii="Verdana" w:eastAsia="Times New Roman" w:hAnsi="Verdana" w:cs="Times New Roman"/>
-          <w:sz w:val="18"/>
-          <w:szCs w:val="18"/>
-        </w:rPr>
-        <w:t xml:space="preserve"> here for</w:t>
-      </w:r>
-      <w:r>
-        <w:rPr>
-          <w:rFonts w:ascii="Verdana" w:eastAsia="Times New Roman" w:hAnsi="Verdana" w:cs="Times New Roman"/>
-          <w:sz w:val="18"/>
-          <w:szCs w:val="18"/>
-        </w:rPr>
-        <w:t xml:space="preserve"> </w:t>
+          <w:color w:val="FF0000"/>
+          <w:sz w:val="18"/>
+          <w:szCs w:val="18"/>
+        </w:rPr>
+        <w:t xml:space="preserve">. Also here for </w:t>
       </w:r>
       <w:hyperlink r:id="rId18" w:history="1">
         <w:r>
           <w:rPr>
             <w:rStyle w:val="Hyperlink"/>
             <w:rFonts w:ascii="Verdana" w:eastAsia="Times New Roman" w:hAnsi="Verdana" w:cs="Times New Roman"/>
+            <w:color w:val="FF0000"/>
             <w:sz w:val="18"/>
             <w:szCs w:val="18"/>
           </w:rPr>
@@ -3140,48 +3512,18 @@
       <w:r>
         <w:rPr>
           <w:rFonts w:ascii="Verdana" w:eastAsia="Times New Roman" w:hAnsi="Verdana" w:cs="Times New Roman"/>
-          <w:sz w:val="18"/>
-          <w:szCs w:val="18"/>
-        </w:rPr>
-        <w:t xml:space="preserve"> (includes when to use quotation marks).</w:t>
-      </w:r>
-      <w:r>
-        <w:rPr>
-          <w:rFonts w:ascii="Verdana" w:eastAsia="Times New Roman" w:hAnsi="Verdana" w:cs="Times New Roman"/>
-          <w:sz w:val="18"/>
-          <w:szCs w:val="18"/>
-        </w:rPr>
-        <w:t xml:space="preserve"> Follow g</w:t>
-      </w:r>
-      <w:r>
-        <w:rPr>
-          <w:rFonts w:ascii="Verdana" w:eastAsia="Times New Roman" w:hAnsi="Verdana" w:cs="Times New Roman"/>
-          <w:sz w:val="18"/>
-          <w:szCs w:val="18"/>
-        </w:rPr>
-        <w:t xml:space="preserve">uidance </w:t>
-      </w:r>
-      <w:r>
-        <w:rPr>
-          <w:rFonts w:ascii="Verdana" w:eastAsia="Times New Roman" w:hAnsi="Verdana" w:cs="Times New Roman"/>
-          <w:sz w:val="18"/>
-          <w:szCs w:val="18"/>
-        </w:rPr>
-        <w:t xml:space="preserve">here </w:t>
-      </w:r>
-      <w:r>
-        <w:rPr>
-          <w:rFonts w:ascii="Verdana" w:eastAsia="Times New Roman" w:hAnsi="Verdana" w:cs="Times New Roman"/>
-          <w:sz w:val="18"/>
-          <w:szCs w:val="18"/>
-        </w:rPr>
-        <w:t xml:space="preserve">on how to reference the following: </w:t>
+          <w:color w:val="FF0000"/>
+          <w:sz w:val="18"/>
+          <w:szCs w:val="18"/>
+        </w:rPr>
+        <w:t xml:space="preserve"> (includes when to use quotation marks). Follow guidance here on how to reference the following: </w:t>
       </w:r>
       <w:hyperlink r:id="rId19" w:anchor="books" w:history="1">
         <w:r>
           <w:rPr>
             <w:rStyle w:val="Hyperlink"/>
             <w:rFonts w:ascii="Verdana" w:eastAsia="Times New Roman" w:hAnsi="Verdana" w:cs="Times New Roman"/>
+            <w:color w:val="FF0000"/>
             <w:sz w:val="18"/>
             <w:szCs w:val="18"/>
           </w:rPr>
@@ -3191,6 +3533,7 @@
       <w:r>
         <w:rPr>
           <w:rFonts w:ascii="Verdana" w:eastAsia="Times New Roman" w:hAnsi="Verdana" w:cs="Times New Roman"/>
+          <w:color w:val="FF0000"/>
           <w:sz w:val="18"/>
           <w:szCs w:val="18"/>
         </w:rPr>
@@ -3201,6 +3544,7 @@
           <w:rPr>
             <w:rStyle w:val="Hyperlink"/>
             <w:rFonts w:ascii="Verdana" w:eastAsia="Times New Roman" w:hAnsi="Verdana" w:cs="Times New Roman"/>
+            <w:color w:val="FF0000"/>
             <w:sz w:val="18"/>
             <w:szCs w:val="18"/>
           </w:rPr>
@@ -3209,6 +3553,7 @@
         <w:r>
           <w:rPr>
             <w:rFonts w:ascii="Verdana" w:eastAsia="Times New Roman" w:hAnsi="Verdana" w:cs="Times New Roman"/>
+            <w:color w:val="FF0000"/>
             <w:sz w:val="18"/>
             <w:szCs w:val="18"/>
           </w:rPr>
@@ -3218,6 +3563,7 @@
           <w:rPr>
             <w:rStyle w:val="Hyperlink"/>
             <w:rFonts w:ascii="Verdana" w:eastAsia="Times New Roman" w:hAnsi="Verdana" w:cs="Times New Roman"/>
+            <w:color w:val="FF0000"/>
             <w:sz w:val="18"/>
             <w:szCs w:val="18"/>
           </w:rPr>
@@ -3227,6 +3573,7 @@
       <w:r>
         <w:rPr>
           <w:rFonts w:ascii="Verdana" w:eastAsia="Times New Roman" w:hAnsi="Verdana" w:cs="Times New Roman"/>
+          <w:color w:val="FF0000"/>
           <w:sz w:val="18"/>
           <w:szCs w:val="18"/>
         </w:rPr>
@@ -3237,6 +3584,7 @@
           <w:rPr>
             <w:rStyle w:val="Hyperlink"/>
             <w:rFonts w:ascii="Verdana" w:eastAsia="Times New Roman" w:hAnsi="Verdana" w:cs="Times New Roman"/>
+            <w:color w:val="FF0000"/>
             <w:sz w:val="18"/>
             <w:szCs w:val="18"/>
           </w:rPr>
@@ -3246,6 +3594,7 @@
       <w:r>
         <w:rPr>
           <w:rFonts w:ascii="Verdana" w:eastAsia="Times New Roman" w:hAnsi="Verdana" w:cs="Times New Roman"/>
+          <w:color w:val="FF0000"/>
           <w:sz w:val="18"/>
           <w:szCs w:val="18"/>
         </w:rPr>
@@ -3254,6 +3603,7 @@
       <w:r>
         <w:rPr>
           <w:rFonts w:ascii="Verdana" w:eastAsia="Times New Roman" w:hAnsi="Verdana" w:cs="Times New Roman"/>
+          <w:color w:val="FF0000"/>
           <w:sz w:val="18"/>
           <w:szCs w:val="18"/>
         </w:rPr>
@@ -3264,15 +3614,27 @@
           <w:rPr>
             <w:rStyle w:val="Hyperlink"/>
             <w:rFonts w:ascii="Verdana" w:eastAsia="Times New Roman" w:hAnsi="Verdana" w:cs="Times New Roman"/>
+            <w:color w:val="FF0000"/>
             <w:sz w:val="18"/>
             <w:szCs w:val="18"/>
           </w:rPr>
-          <w:t>television programmes</w:t>
+          <w:t xml:space="preserve">television </w:t>
+        </w:r>
+        <w:r>
+          <w:rPr>
+            <w:rStyle w:val="Hyperlink"/>
+            <w:rFonts w:ascii="Verdana" w:eastAsia="Times New Roman" w:hAnsi="Verdana" w:cs="Times New Roman"/>
+            <w:color w:val="FF0000"/>
+            <w:sz w:val="18"/>
+            <w:szCs w:val="18"/>
+          </w:rPr>
+          <w:t>programmes</w:t>
         </w:r>
       </w:hyperlink>
       <w:r>
         <w:rPr>
           <w:rFonts w:ascii="Verdana" w:eastAsia="Times New Roman" w:hAnsi="Verdana" w:cs="Times New Roman"/>
+          <w:color w:val="FF0000"/>
           <w:sz w:val="18"/>
           <w:szCs w:val="18"/>
         </w:rPr>
@@ -3283,6 +3645,7 @@
           <w:rPr>
             <w:rStyle w:val="Hyperlink"/>
             <w:rFonts w:ascii="Verdana" w:eastAsia="Times New Roman" w:hAnsi="Verdana" w:cs="Times New Roman"/>
+            <w:color w:val="FF0000"/>
             <w:sz w:val="18"/>
             <w:szCs w:val="18"/>
           </w:rPr>
@@ -3292,6 +3655,7 @@
       <w:r>
         <w:rPr>
           <w:rFonts w:ascii="Verdana" w:eastAsia="Times New Roman" w:hAnsi="Verdana" w:cs="Times New Roman"/>
+          <w:color w:val="FF0000"/>
           <w:sz w:val="18"/>
           <w:szCs w:val="18"/>
         </w:rPr>
@@ -3302,6 +3666,7 @@
           <w:rPr>
             <w:rStyle w:val="Hyperlink"/>
             <w:rFonts w:ascii="Verdana" w:eastAsia="Times New Roman" w:hAnsi="Verdana" w:cs="Times New Roman"/>
+            <w:color w:val="FF0000"/>
             <w:sz w:val="18"/>
             <w:szCs w:val="18"/>
           </w:rPr>
@@ -3311,6 +3676,7 @@
       <w:r>
         <w:rPr>
           <w:rFonts w:ascii="Verdana" w:eastAsia="Times New Roman" w:hAnsi="Verdana" w:cs="Times New Roman"/>
+          <w:color w:val="FF0000"/>
           <w:sz w:val="18"/>
           <w:szCs w:val="18"/>
         </w:rPr>
@@ -3321,6 +3687,7 @@
           <w:rPr>
             <w:rStyle w:val="Hyperlink"/>
             <w:rFonts w:ascii="Verdana" w:eastAsia="Times New Roman" w:hAnsi="Verdana" w:cs="Times New Roman"/>
+            <w:color w:val="FF0000"/>
             <w:sz w:val="18"/>
             <w:szCs w:val="18"/>
           </w:rPr>
@@ -3330,6 +3697,7 @@
       <w:r>
         <w:rPr>
           <w:rFonts w:ascii="Verdana" w:eastAsia="Times New Roman" w:hAnsi="Verdana" w:cs="Times New Roman"/>
+          <w:color w:val="FF0000"/>
           <w:sz w:val="18"/>
           <w:szCs w:val="18"/>
         </w:rPr>
@@ -3341,10 +3709,21 @@
         <w:jc w:val="both"/>
         <w:rPr>
           <w:rFonts w:ascii="Verdana" w:hAnsi="Verdana"/>
-          <w:sz w:val="18"/>
-          <w:szCs w:val="18"/>
-        </w:rPr>
-      </w:pPr>
+          <w:noProof/>
+          <w:sz w:val="18"/>
+          <w:szCs w:val="18"/>
+        </w:rPr>
+      </w:pPr>
+      <w:r>
+        <w:rPr>
+          <w:rFonts w:ascii="Verdana" w:hAnsi="Verdana"/>
+          <w:bCs/>
+          <w:noProof/>
+          <w:sz w:val="18"/>
+          <w:szCs w:val="18"/>
+        </w:rPr>
+        <w:t>------------------------------------------------------</w:t>
+      </w:r>
     </w:p>
     <w:p>
       <w:pPr>
@@ -3355,6 +3734,94 @@
           <w:szCs w:val="18"/>
         </w:rPr>
       </w:pPr>
+      <w:r>
+        <w:rPr>
+          <w:rFonts w:ascii="Verdana" w:hAnsi="Verdana"/>
+          <w:b/>
+          <w:sz w:val="18"/>
+          <w:szCs w:val="18"/>
+        </w:rPr>
+        <w:t>4</w:t>
+      </w:r>
+      <w:r>
+        <w:rPr>
+          <w:rFonts w:ascii="Verdana" w:hAnsi="Verdana"/>
+          <w:b/>
+          <w:sz w:val="18"/>
+          <w:szCs w:val="18"/>
+        </w:rPr>
+        <w:t>.</w:t>
+      </w:r>
+      <w:r>
+        <w:rPr>
+          <w:rFonts w:ascii="Verdana" w:hAnsi="Verdana"/>
+          <w:b/>
+          <w:sz w:val="18"/>
+          <w:szCs w:val="18"/>
+        </w:rPr>
+        <w:t xml:space="preserve">1 </w:t>
+      </w:r>
+      <w:r>
+        <w:rPr>
+          <w:rFonts w:ascii="Verdana" w:hAnsi="Verdana"/>
+          <w:b/>
+          <w:sz w:val="18"/>
+          <w:szCs w:val="18"/>
+        </w:rPr>
+        <w:t xml:space="preserve">Research </w:t>
+      </w:r>
+      <w:r>
+        <w:rPr>
+          <w:rFonts w:ascii="Verdana" w:hAnsi="Verdana"/>
+          <w:b/>
+          <w:sz w:val="18"/>
+          <w:szCs w:val="18"/>
+        </w:rPr>
+        <w:t>M</w:t>
+      </w:r>
+      <w:r>
+        <w:rPr>
+          <w:rFonts w:ascii="Verdana" w:hAnsi="Verdana"/>
+          <w:b/>
+          <w:sz w:val="18"/>
+          <w:szCs w:val="18"/>
+        </w:rPr>
+        <w:t>ethods</w:t>
+      </w:r>
+      <w:r>
+        <w:rPr>
+          <w:rFonts w:ascii="Verdana" w:hAnsi="Verdana"/>
+          <w:b/>
+          <w:sz w:val="18"/>
+          <w:szCs w:val="18"/>
+        </w:rPr>
+        <w:t xml:space="preserve"> </w:t>
+      </w:r>
+      <w:r>
+        <w:rPr>
+          <w:rFonts w:ascii="Verdana" w:hAnsi="Verdana"/>
+          <w:bCs/>
+          <w:sz w:val="18"/>
+          <w:szCs w:val="18"/>
+        </w:rPr>
+        <w:t>~</w:t>
+      </w:r>
+      <w:r>
+        <w:rPr>
+          <w:rFonts w:ascii="Verdana" w:hAnsi="Verdana"/>
+          <w:sz w:val="18"/>
+          <w:szCs w:val="18"/>
+        </w:rPr>
+        <w:t>500</w:t>
+      </w:r>
+      <w:r>
+        <w:rPr>
+          <w:rFonts w:ascii="Verdana" w:hAnsi="Verdana"/>
+          <w:sz w:val="18"/>
+          <w:szCs w:val="18"/>
+        </w:rPr>
+        <w:t>w</w:t>
+      </w:r>
     </w:p>
     <w:p>
       <w:pPr>
@@ -3365,6 +3832,124 @@
           <w:szCs w:val="18"/>
         </w:rPr>
       </w:pPr>
+    </w:p>
+    <w:p>
+      <w:pPr>
+        <w:jc w:val="both"/>
+        <w:rPr>
+          <w:rFonts w:ascii="Verdana" w:hAnsi="Verdana"/>
+          <w:sz w:val="18"/>
+          <w:szCs w:val="18"/>
+        </w:rPr>
+      </w:pPr>
+      <w:r>
+        <w:rPr>
+          <w:rFonts w:ascii="Verdana" w:hAnsi="Verdana"/>
+          <w:sz w:val="18"/>
+          <w:szCs w:val="18"/>
+        </w:rPr>
+        <w:t xml:space="preserve">The literature review and the artifact will be closely linked with the final iteration of the artifact using the research from the review along side player testing. The review will go into topics such as learning theory to find the most effective ways humans learn and pattern recognition and how this can be used to sub-consciously guide players. Using proven and researched methods will help create a solid base for the project to work from.  Looking deeper into how different ages learn will also help in making sure the new information provided is accessible and useful for a wider demographic. </w:t>
+      </w:r>
+    </w:p>
+    <w:p>
+      <w:pPr>
+        <w:jc w:val="both"/>
+        <w:rPr>
+          <w:rFonts w:ascii="Verdana" w:hAnsi="Verdana"/>
+          <w:sz w:val="18"/>
+          <w:szCs w:val="18"/>
+        </w:rPr>
+      </w:pPr>
+    </w:p>
+    <w:p>
+      <w:pPr>
+        <w:jc w:val="both"/>
+        <w:rPr>
+          <w:rFonts w:ascii="Verdana" w:hAnsi="Verdana"/>
+          <w:sz w:val="18"/>
+          <w:szCs w:val="18"/>
+        </w:rPr>
+      </w:pPr>
+      <w:r>
+        <w:rPr>
+          <w:rFonts w:ascii="Verdana" w:hAnsi="Verdana"/>
+          <w:sz w:val="18"/>
+          <w:szCs w:val="18"/>
+        </w:rPr>
+        <w:t>The first play test will be done with the first iteration of the artifact made for the project.</w:t>
+      </w:r>
+      <w:r>
+        <w:rPr>
+          <w:rFonts w:ascii="Verdana" w:hAnsi="Verdana"/>
+          <w:sz w:val="18"/>
+          <w:szCs w:val="18"/>
+        </w:rPr>
+        <w:t xml:space="preserve"> A playtest was chosen to conduct research on real people as it can give accurate first party data giving more control to the researcher to get the information they require.</w:t>
+      </w:r>
+      <w:r>
+        <w:rPr>
+          <w:rFonts w:ascii="Verdana" w:hAnsi="Verdana"/>
+          <w:sz w:val="18"/>
+          <w:szCs w:val="18"/>
+        </w:rPr>
+        <w:t xml:space="preserve"> It will consist of a 2D platformer with tutorial stages before letting the player play through a few levels having to use the information provided to them. Before the test a series of question will be asked to get a background of the player such as previous experiences and age. During the play test the tester will be asked what they are thinking </w:t>
+      </w:r>
+      <w:r>
+        <w:rPr>
+          <w:rFonts w:ascii="Verdana" w:hAnsi="Verdana"/>
+          <w:sz w:val="18"/>
+          <w:szCs w:val="18"/>
+        </w:rPr>
+        <w:t>and whether they understand the objectives. After the play test they will be asked questions on whether they would add anything themselves or if previous experiences with these sorts of games gave them a head start. The data from the questions along side recording the gameplay to create graphs on where people got stuck or if people did the same things in the same spots will be used to iterate and improve the tutorial section of the artifact with all the research conducted.</w:t>
+      </w:r>
+    </w:p>
+    <w:p>
+      <w:pPr>
+        <w:jc w:val="both"/>
+        <w:rPr>
+          <w:rFonts w:ascii="Verdana" w:hAnsi="Verdana"/>
+          <w:sz w:val="18"/>
+          <w:szCs w:val="18"/>
+        </w:rPr>
+      </w:pPr>
+    </w:p>
+    <w:p>
+      <w:pPr>
+        <w:jc w:val="both"/>
+        <w:rPr>
+          <w:rFonts w:ascii="Verdana" w:hAnsi="Verdana"/>
+          <w:sz w:val="18"/>
+          <w:szCs w:val="18"/>
+        </w:rPr>
+      </w:pPr>
+      <w:r>
+        <w:rPr>
+          <w:rFonts w:ascii="Verdana" w:hAnsi="Verdana"/>
+          <w:sz w:val="18"/>
+          <w:szCs w:val="18"/>
+        </w:rPr>
+        <w:t>Once all the data is collected and the artifact has been iterated another play test will happen to see whether the results to the questionnaire and gameplay have had an overall improvement in understanding of the games mechanics.</w:t>
+      </w:r>
+    </w:p>
+    <w:p>
+      <w:pPr>
+        <w:jc w:val="both"/>
+        <w:rPr>
+          <w:rFonts w:ascii="Verdana" w:hAnsi="Verdana"/>
+          <w:sz w:val="18"/>
+          <w:szCs w:val="18"/>
+        </w:rPr>
+      </w:pPr>
+    </w:p>
+    <w:p>
+      <w:pPr>
+        <w:jc w:val="both"/>
+        <w:rPr>
+          <w:rFonts w:ascii="Verdana" w:hAnsi="Verdana"/>
+          <w:sz w:val="18"/>
+          <w:szCs w:val="18"/>
+        </w:rPr>
+      </w:pPr>
       <w:r>
         <w:rPr>
           <w:rFonts w:ascii="Verdana" w:hAnsi="Verdana"/>
@@ -3372,25 +3957,7 @@
           <w:sz w:val="18"/>
           <w:szCs w:val="18"/>
         </w:rPr>
-        <w:t>4</w:t>
-      </w:r>
-      <w:r>
-        <w:rPr>
-          <w:rFonts w:ascii="Verdana" w:hAnsi="Verdana"/>
-          <w:b/>
-          <w:sz w:val="18"/>
-          <w:szCs w:val="18"/>
-        </w:rPr>
-        <w:t>. Research methods</w:t>
-      </w:r>
-      <w:r>
-        <w:rPr>
-          <w:rFonts w:ascii="Verdana" w:hAnsi="Verdana"/>
-          <w:b/>
-          <w:sz w:val="18"/>
-          <w:szCs w:val="18"/>
-        </w:rPr>
-        <w:t xml:space="preserve"> and </w:t>
+        <w:t xml:space="preserve">4.2 </w:t>
       </w:r>
       <w:r>
         <w:rPr>
@@ -3412,14 +3979,822 @@
         </w:rPr>
         <w:t>s</w:t>
       </w:r>
-      <w:r>
+    </w:p>
+    <w:p>
+      <w:pPr>
+        <w:jc w:val="both"/>
+        <w:rPr>
+          <w:rFonts w:ascii="Verdana" w:hAnsi="Verdana"/>
+          <w:sz w:val="18"/>
+          <w:szCs w:val="18"/>
+        </w:rPr>
+      </w:pPr>
+    </w:p>
+    <w:p>
+      <w:pPr>
+        <w:jc w:val="both"/>
+        <w:rPr>
+          <w:rFonts w:ascii="Verdana" w:hAnsi="Verdana"/>
+          <w:sz w:val="18"/>
+          <w:szCs w:val="18"/>
+        </w:rPr>
+      </w:pPr>
+      <w:r>
+        <w:rPr>
+          <w:rFonts w:ascii="Verdana" w:hAnsi="Verdana"/>
+          <w:sz w:val="18"/>
+          <w:szCs w:val="18"/>
+        </w:rPr>
+        <w:t>Before any participation the test must read through the privacy notice, participant information and the consent for which they must sign. This insure they tester understand what they are signing up for. All data personal data collected will be securely stored on a OneDrive</w:t>
+      </w:r>
+      <w:r>
+        <w:rPr>
+          <w:rFonts w:ascii="Verdana" w:hAnsi="Verdana"/>
+          <w:sz w:val="18"/>
+          <w:szCs w:val="18"/>
+        </w:rPr>
+        <w:t xml:space="preserve"> where only the researcher can access. The tester if informed that they can withdraw consent and their data at anytime from the day of the test to 2 weeks after for any reason. Once the marks from the module are received all data accessible to the researcher will be permanently destroyed with only </w:t>
+      </w:r>
+      <w:r>
+        <w:rPr>
+          <w:rFonts w:ascii="Verdana" w:hAnsi="Verdana"/>
+          <w:sz w:val="18"/>
+          <w:szCs w:val="18"/>
+        </w:rPr>
+        <w:lastRenderedPageBreak/>
+        <w:t>anonymous quotes being left in the report itself. Due to the test being brought to the participant in the form of a laptop the tester will be able to pick a place they feel comfortable doing it in. The risks of injury or harm to the test are virtually non-existent due to this fact alongside there being no physical requirements. The tester can also request breaks and can pause the game at any time or stop the test entirely when requested.</w:t>
+      </w:r>
+    </w:p>
+    <w:p>
+      <w:pPr>
+        <w:jc w:val="both"/>
+        <w:rPr>
+          <w:rFonts w:ascii="Verdana" w:hAnsi="Verdana"/>
+          <w:noProof/>
+          <w:sz w:val="18"/>
+          <w:szCs w:val="18"/>
+        </w:rPr>
+      </w:pPr>
+      <w:r>
+        <w:rPr>
+          <w:rFonts w:ascii="Verdana" w:hAnsi="Verdana"/>
+          <w:bCs/>
+          <w:noProof/>
+          <w:sz w:val="18"/>
+          <w:szCs w:val="18"/>
+        </w:rPr>
+        <w:t>------------------------------------------------------</w:t>
+      </w:r>
+    </w:p>
+    <w:p>
+      <w:pPr>
+        <w:jc w:val="both"/>
+        <w:rPr>
+          <w:rFonts w:ascii="Verdana" w:hAnsi="Verdana"/>
+          <w:color w:val="FF0000"/>
+          <w:sz w:val="18"/>
+          <w:szCs w:val="18"/>
+        </w:rPr>
+      </w:pPr>
+      <w:r>
+        <w:rPr>
+          <w:rFonts w:ascii="Verdana" w:hAnsi="Verdana"/>
+          <w:color w:val="FF0000"/>
+          <w:sz w:val="18"/>
+          <w:szCs w:val="18"/>
+        </w:rPr>
+        <w:t>B</w:t>
+      </w:r>
+      <w:r>
+        <w:rPr>
+          <w:rFonts w:ascii="Verdana" w:hAnsi="Verdana"/>
+          <w:color w:val="FF0000"/>
+          <w:sz w:val="18"/>
+          <w:szCs w:val="18"/>
+        </w:rPr>
+        <w:t xml:space="preserve">riefly </w:t>
+      </w:r>
+      <w:r>
+        <w:rPr>
+          <w:rFonts w:ascii="Verdana" w:hAnsi="Verdana"/>
+          <w:color w:val="FF0000"/>
+          <w:sz w:val="18"/>
+          <w:szCs w:val="18"/>
+        </w:rPr>
+        <w:t>tell the reader</w:t>
+      </w:r>
+      <w:r>
+        <w:rPr>
+          <w:rFonts w:ascii="Verdana" w:hAnsi="Verdana"/>
+          <w:color w:val="FF0000"/>
+          <w:sz w:val="18"/>
+          <w:szCs w:val="18"/>
+        </w:rPr>
+        <w:t xml:space="preserve"> which research methods </w:t>
+      </w:r>
+      <w:r>
+        <w:rPr>
+          <w:rFonts w:ascii="Verdana" w:hAnsi="Verdana"/>
+          <w:color w:val="FF0000"/>
+          <w:sz w:val="18"/>
+          <w:szCs w:val="18"/>
+        </w:rPr>
+        <w:t>you will</w:t>
+      </w:r>
+      <w:r>
+        <w:rPr>
+          <w:rFonts w:ascii="Verdana" w:hAnsi="Verdana"/>
+          <w:color w:val="FF0000"/>
+          <w:sz w:val="18"/>
+          <w:szCs w:val="18"/>
+        </w:rPr>
+        <w:t xml:space="preserve"> use to answer </w:t>
+      </w:r>
+      <w:r>
+        <w:rPr>
+          <w:rFonts w:ascii="Verdana" w:hAnsi="Verdana"/>
+          <w:color w:val="FF0000"/>
+          <w:sz w:val="18"/>
+          <w:szCs w:val="18"/>
+        </w:rPr>
+        <w:t xml:space="preserve">the research </w:t>
+      </w:r>
+      <w:r>
+        <w:rPr>
+          <w:rFonts w:ascii="Verdana" w:hAnsi="Verdana"/>
+          <w:color w:val="FF0000"/>
+          <w:sz w:val="18"/>
+          <w:szCs w:val="18"/>
+        </w:rPr>
+        <w:t>questions. Use the correct terminology when identifying research methods and give a brief rationale of why these methods were chosen (and not others)</w:t>
+      </w:r>
+      <w:r>
+        <w:rPr>
+          <w:rFonts w:ascii="Verdana" w:hAnsi="Verdana"/>
+          <w:color w:val="FF0000"/>
+          <w:sz w:val="18"/>
+          <w:szCs w:val="18"/>
+        </w:rPr>
+        <w:t>. Try to convince the reader that the choices of method were appropriate for this project</w:t>
+      </w:r>
+      <w:r>
+        <w:rPr>
+          <w:rFonts w:ascii="Verdana" w:hAnsi="Verdana"/>
+          <w:color w:val="FF0000"/>
+          <w:sz w:val="18"/>
+          <w:szCs w:val="18"/>
+        </w:rPr>
+        <w:t xml:space="preserve">, and that </w:t>
+      </w:r>
+      <w:r>
+        <w:rPr>
+          <w:rFonts w:ascii="Verdana" w:hAnsi="Verdana"/>
+          <w:color w:val="FF0000"/>
+          <w:sz w:val="18"/>
+          <w:szCs w:val="18"/>
+        </w:rPr>
+        <w:t>it looked like</w:t>
+      </w:r>
+      <w:r>
+        <w:rPr>
+          <w:rFonts w:ascii="Verdana" w:hAnsi="Verdana"/>
+          <w:color w:val="FF0000"/>
+          <w:sz w:val="18"/>
+          <w:szCs w:val="18"/>
+        </w:rPr>
+        <w:t xml:space="preserve"> they </w:t>
+      </w:r>
+      <w:r>
+        <w:rPr>
+          <w:rFonts w:ascii="Verdana" w:hAnsi="Verdana"/>
+          <w:color w:val="FF0000"/>
+          <w:sz w:val="18"/>
+          <w:szCs w:val="18"/>
+        </w:rPr>
+        <w:t xml:space="preserve">could </w:t>
+      </w:r>
+      <w:r>
+        <w:rPr>
+          <w:rFonts w:ascii="Verdana" w:hAnsi="Verdana"/>
+          <w:color w:val="FF0000"/>
+          <w:sz w:val="18"/>
+          <w:szCs w:val="18"/>
+        </w:rPr>
+        <w:t xml:space="preserve">provide </w:t>
+      </w:r>
+      <w:r>
+        <w:rPr>
+          <w:rFonts w:ascii="Verdana" w:hAnsi="Verdana"/>
+          <w:color w:val="FF0000"/>
+          <w:sz w:val="18"/>
+          <w:szCs w:val="18"/>
+        </w:rPr>
+        <w:t xml:space="preserve">the </w:t>
+      </w:r>
+      <w:r>
+        <w:rPr>
+          <w:rFonts w:ascii="Verdana" w:hAnsi="Verdana"/>
+          <w:color w:val="FF0000"/>
+          <w:sz w:val="18"/>
+          <w:szCs w:val="18"/>
+        </w:rPr>
+        <w:t>necessary answers</w:t>
+      </w:r>
+      <w:r>
+        <w:rPr>
+          <w:rFonts w:ascii="Verdana" w:hAnsi="Verdana"/>
+          <w:color w:val="FF0000"/>
+          <w:sz w:val="18"/>
+          <w:szCs w:val="18"/>
+        </w:rPr>
+        <w:t>.</w:t>
+      </w:r>
+    </w:p>
+    <w:p>
+      <w:pPr>
+        <w:jc w:val="both"/>
+        <w:rPr>
+          <w:rFonts w:ascii="Verdana" w:hAnsi="Verdana"/>
+          <w:color w:val="FF0000"/>
+          <w:sz w:val="18"/>
+          <w:szCs w:val="18"/>
+        </w:rPr>
+      </w:pPr>
+    </w:p>
+    <w:p>
+      <w:pPr>
+        <w:jc w:val="both"/>
+        <w:rPr>
+          <w:rFonts w:ascii="Verdana" w:hAnsi="Verdana"/>
+          <w:color w:val="FF0000"/>
+          <w:sz w:val="18"/>
+          <w:szCs w:val="18"/>
+        </w:rPr>
+      </w:pPr>
+      <w:r>
+        <w:rPr>
+          <w:rFonts w:ascii="Verdana" w:hAnsi="Verdana"/>
+          <w:color w:val="FF0000"/>
+          <w:sz w:val="18"/>
+          <w:szCs w:val="18"/>
+        </w:rPr>
+        <w:t>If qualitative</w:t>
+      </w:r>
+      <w:r>
+        <w:rPr>
+          <w:rFonts w:ascii="Verdana" w:hAnsi="Verdana"/>
+          <w:color w:val="FF0000"/>
+          <w:sz w:val="18"/>
+          <w:szCs w:val="18"/>
+        </w:rPr>
+        <w:t xml:space="preserve"> or </w:t>
+      </w:r>
+      <w:r>
+        <w:rPr>
+          <w:rFonts w:ascii="Verdana" w:hAnsi="Verdana"/>
+          <w:color w:val="FF0000"/>
+          <w:sz w:val="18"/>
+          <w:szCs w:val="18"/>
+        </w:rPr>
+        <w:t xml:space="preserve">user research was conducted, </w:t>
+      </w:r>
+      <w:r>
+        <w:rPr>
+          <w:rFonts w:ascii="Verdana" w:hAnsi="Verdana"/>
+          <w:color w:val="FF0000"/>
+          <w:sz w:val="18"/>
+          <w:szCs w:val="18"/>
+        </w:rPr>
+        <w:t>or research involving</w:t>
+      </w:r>
+      <w:r>
+        <w:rPr>
+          <w:rFonts w:ascii="Verdana" w:hAnsi="Verdana"/>
+          <w:color w:val="FF0000"/>
+          <w:sz w:val="18"/>
+          <w:szCs w:val="18"/>
+        </w:rPr>
+        <w:t xml:space="preserve"> human participants, </w:t>
+      </w:r>
+      <w:r>
+        <w:rPr>
+          <w:rFonts w:ascii="Verdana" w:hAnsi="Verdana"/>
+          <w:color w:val="FF0000"/>
+          <w:sz w:val="18"/>
+          <w:szCs w:val="18"/>
+        </w:rPr>
+        <w:t xml:space="preserve">introduce the purpose of </w:t>
+      </w:r>
+      <w:r>
+        <w:rPr>
+          <w:rFonts w:ascii="Verdana" w:hAnsi="Verdana"/>
+          <w:color w:val="FF0000"/>
+          <w:sz w:val="18"/>
+          <w:szCs w:val="18"/>
+        </w:rPr>
+        <w:t>this</w:t>
+      </w:r>
+      <w:r>
+        <w:rPr>
+          <w:rFonts w:ascii="Verdana" w:hAnsi="Verdana"/>
+          <w:color w:val="FF0000"/>
+          <w:sz w:val="18"/>
+          <w:szCs w:val="18"/>
+        </w:rPr>
+        <w:t xml:space="preserve">, </w:t>
+      </w:r>
+      <w:r>
+        <w:rPr>
+          <w:rFonts w:ascii="Verdana" w:hAnsi="Verdana"/>
+          <w:color w:val="FF0000"/>
+          <w:sz w:val="18"/>
+          <w:szCs w:val="18"/>
+        </w:rPr>
+        <w:t xml:space="preserve">briefly </w:t>
+      </w:r>
+      <w:r>
+        <w:rPr>
+          <w:rFonts w:ascii="Verdana" w:hAnsi="Verdana"/>
+          <w:color w:val="FF0000"/>
+          <w:sz w:val="18"/>
+          <w:szCs w:val="18"/>
+        </w:rPr>
+        <w:t xml:space="preserve">describe the participants, sample size, </w:t>
+      </w:r>
+      <w:r>
+        <w:rPr>
+          <w:rFonts w:ascii="Verdana" w:hAnsi="Verdana"/>
+          <w:color w:val="FF0000"/>
+          <w:sz w:val="18"/>
+          <w:szCs w:val="18"/>
+        </w:rPr>
+        <w:t>process</w:t>
+      </w:r>
+      <w:r>
+        <w:rPr>
+          <w:rFonts w:ascii="Verdana" w:hAnsi="Verdana"/>
+          <w:color w:val="FF0000"/>
+          <w:sz w:val="18"/>
+          <w:szCs w:val="18"/>
+        </w:rPr>
+        <w:t xml:space="preserve"> applied, response rate (if applicable), data analysis </w:t>
+      </w:r>
+      <w:r>
+        <w:rPr>
+          <w:rFonts w:ascii="Verdana" w:hAnsi="Verdana"/>
+          <w:color w:val="FF0000"/>
+          <w:sz w:val="18"/>
+          <w:szCs w:val="18"/>
+        </w:rPr>
+        <w:t xml:space="preserve">method </w:t>
+      </w:r>
+      <w:r>
+        <w:rPr>
+          <w:rFonts w:ascii="Verdana" w:hAnsi="Verdana"/>
+          <w:color w:val="FF0000"/>
+          <w:sz w:val="18"/>
+          <w:szCs w:val="18"/>
+        </w:rPr>
+        <w:t xml:space="preserve">and evaluation method. </w:t>
+      </w:r>
+    </w:p>
+    <w:p>
+      <w:pPr>
+        <w:rPr>
+          <w:rFonts w:ascii="Verdana" w:hAnsi="Verdana"/>
+          <w:color w:val="FF0000"/>
+          <w:sz w:val="18"/>
+          <w:szCs w:val="18"/>
+        </w:rPr>
+      </w:pPr>
+    </w:p>
+    <w:p>
+      <w:pPr>
+        <w:jc w:val="both"/>
+        <w:rPr>
+          <w:rFonts w:ascii="Verdana" w:hAnsi="Verdana"/>
+          <w:color w:val="FF0000"/>
+          <w:sz w:val="18"/>
+          <w:szCs w:val="18"/>
+        </w:rPr>
+      </w:pPr>
+      <w:r>
+        <w:rPr>
+          <w:rFonts w:ascii="Verdana" w:hAnsi="Verdana"/>
+          <w:color w:val="FF0000"/>
+          <w:sz w:val="18"/>
+          <w:szCs w:val="18"/>
+        </w:rPr>
+        <w:t>Your</w:t>
+      </w:r>
+      <w:r>
+        <w:rPr>
+          <w:rFonts w:ascii="Verdana" w:hAnsi="Verdana"/>
+          <w:color w:val="FF0000"/>
+          <w:sz w:val="18"/>
+          <w:szCs w:val="18"/>
+        </w:rPr>
+        <w:t xml:space="preserve"> reader </w:t>
+      </w:r>
+      <w:r>
+        <w:rPr>
+          <w:rFonts w:ascii="Verdana" w:hAnsi="Verdana"/>
+          <w:color w:val="FF0000"/>
+          <w:sz w:val="18"/>
+          <w:szCs w:val="18"/>
+        </w:rPr>
+        <w:t xml:space="preserve">also </w:t>
+      </w:r>
+      <w:r>
+        <w:rPr>
+          <w:rFonts w:ascii="Verdana" w:hAnsi="Verdana"/>
+          <w:color w:val="FF0000"/>
+          <w:sz w:val="18"/>
+          <w:szCs w:val="18"/>
+        </w:rPr>
+        <w:t xml:space="preserve">needs to </w:t>
+      </w:r>
+      <w:r>
+        <w:rPr>
+          <w:rFonts w:ascii="Verdana" w:hAnsi="Verdana"/>
+          <w:color w:val="FF0000"/>
+          <w:sz w:val="18"/>
+          <w:szCs w:val="18"/>
+        </w:rPr>
+        <w:t>know</w:t>
+      </w:r>
+      <w:r>
+        <w:rPr>
+          <w:rFonts w:ascii="Verdana" w:hAnsi="Verdana"/>
+          <w:color w:val="FF0000"/>
+          <w:sz w:val="18"/>
+          <w:szCs w:val="18"/>
+        </w:rPr>
+        <w:t xml:space="preserve"> </w:t>
+      </w:r>
+      <w:r>
+        <w:rPr>
+          <w:rFonts w:ascii="Verdana" w:hAnsi="Verdana"/>
+          <w:color w:val="FF0000"/>
+          <w:sz w:val="18"/>
+          <w:szCs w:val="18"/>
+        </w:rPr>
+        <w:t>that</w:t>
+      </w:r>
+      <w:r>
+        <w:rPr>
+          <w:rFonts w:ascii="Verdana" w:hAnsi="Verdana"/>
+          <w:color w:val="FF0000"/>
+          <w:sz w:val="18"/>
+          <w:szCs w:val="18"/>
+        </w:rPr>
+        <w:t xml:space="preserve"> </w:t>
+      </w:r>
+      <w:r>
+        <w:rPr>
+          <w:rFonts w:ascii="Verdana" w:hAnsi="Verdana"/>
+          <w:color w:val="FF0000"/>
+          <w:sz w:val="18"/>
+          <w:szCs w:val="18"/>
+        </w:rPr>
+        <w:t xml:space="preserve">all </w:t>
+      </w:r>
+      <w:r>
+        <w:rPr>
+          <w:rFonts w:ascii="Verdana" w:hAnsi="Verdana"/>
+          <w:color w:val="FF0000"/>
+          <w:sz w:val="18"/>
+          <w:szCs w:val="18"/>
+        </w:rPr>
+        <w:t>research</w:t>
+      </w:r>
+      <w:r>
+        <w:rPr>
+          <w:rFonts w:ascii="Verdana" w:hAnsi="Verdana"/>
+          <w:color w:val="FF0000"/>
+          <w:sz w:val="18"/>
+          <w:szCs w:val="18"/>
+        </w:rPr>
+        <w:t xml:space="preserve"> methods were applied ethically and professionally</w:t>
+      </w:r>
+      <w:r>
+        <w:rPr>
+          <w:rFonts w:ascii="Verdana" w:hAnsi="Verdana"/>
+          <w:color w:val="FF0000"/>
+          <w:sz w:val="18"/>
+          <w:szCs w:val="18"/>
+        </w:rPr>
+        <w:t xml:space="preserve"> at </w:t>
+      </w:r>
+      <w:r>
+        <w:rPr>
+          <w:rFonts w:ascii="Verdana" w:hAnsi="Verdana"/>
+          <w:color w:val="FF0000"/>
+          <w:sz w:val="18"/>
+          <w:szCs w:val="18"/>
+        </w:rPr>
+        <w:t>all</w:t>
+      </w:r>
+      <w:r>
+        <w:rPr>
+          <w:rFonts w:ascii="Verdana" w:hAnsi="Verdana"/>
+          <w:color w:val="FF0000"/>
+          <w:sz w:val="18"/>
+          <w:szCs w:val="18"/>
+        </w:rPr>
+        <w:t xml:space="preserve"> project stage</w:t>
+      </w:r>
+      <w:r>
+        <w:rPr>
+          <w:rFonts w:ascii="Verdana" w:hAnsi="Verdana"/>
+          <w:color w:val="FF0000"/>
+          <w:sz w:val="18"/>
+          <w:szCs w:val="18"/>
+        </w:rPr>
+        <w:t>s, meaning research and practice.</w:t>
+      </w:r>
+    </w:p>
+    <w:p>
+      <w:pPr>
+        <w:jc w:val="both"/>
+        <w:rPr>
+          <w:rFonts w:ascii="Verdana" w:hAnsi="Verdana"/>
+          <w:color w:val="FF0000"/>
+          <w:sz w:val="18"/>
+          <w:szCs w:val="18"/>
+        </w:rPr>
+      </w:pPr>
+    </w:p>
+    <w:p>
+      <w:pPr>
+        <w:jc w:val="both"/>
+        <w:rPr>
+          <w:rFonts w:ascii="Verdana" w:hAnsi="Verdana"/>
+          <w:color w:val="FF0000"/>
+          <w:sz w:val="18"/>
+          <w:szCs w:val="18"/>
+        </w:rPr>
+      </w:pPr>
+      <w:r>
+        <w:rPr>
+          <w:rFonts w:ascii="Verdana" w:hAnsi="Verdana"/>
+          <w:color w:val="FF0000"/>
+          <w:sz w:val="18"/>
+          <w:szCs w:val="18"/>
+        </w:rPr>
+        <w:t xml:space="preserve">What you may need to mention </w:t>
+      </w:r>
+      <w:r>
+        <w:rPr>
+          <w:rFonts w:ascii="Verdana" w:hAnsi="Verdana"/>
+          <w:color w:val="FF0000"/>
+          <w:sz w:val="18"/>
+          <w:szCs w:val="18"/>
+        </w:rPr>
+        <w:t>in this section (depending on each project)</w:t>
+      </w:r>
+      <w:r>
+        <w:rPr>
+          <w:rFonts w:ascii="Verdana" w:hAnsi="Verdana"/>
+          <w:color w:val="FF0000"/>
+          <w:sz w:val="18"/>
+          <w:szCs w:val="18"/>
+        </w:rPr>
+        <w:t xml:space="preserve"> is</w:t>
+      </w:r>
+      <w:r>
+        <w:rPr>
+          <w:rFonts w:ascii="Verdana" w:hAnsi="Verdana"/>
+          <w:color w:val="FF0000"/>
+          <w:sz w:val="18"/>
+          <w:szCs w:val="18"/>
+        </w:rPr>
+        <w:t xml:space="preserve"> data collection, data storage,</w:t>
+      </w:r>
+      <w:r>
+        <w:rPr>
+          <w:rFonts w:ascii="Verdana" w:hAnsi="Verdana"/>
+          <w:color w:val="FF0000"/>
+          <w:sz w:val="18"/>
+          <w:szCs w:val="18"/>
+        </w:rPr>
+        <w:t xml:space="preserve"> data disposal, gaining informed participant consent, respecting privacy, not causing harm</w:t>
+      </w:r>
+      <w:r>
+        <w:rPr>
+          <w:rFonts w:ascii="Verdana" w:hAnsi="Verdana"/>
+          <w:color w:val="FF0000"/>
+          <w:sz w:val="18"/>
+          <w:szCs w:val="18"/>
+        </w:rPr>
+        <w:t xml:space="preserve"> either directly or </w:t>
+      </w:r>
+      <w:r>
+        <w:rPr>
+          <w:rFonts w:ascii="Verdana" w:hAnsi="Verdana"/>
+          <w:color w:val="FF0000"/>
+          <w:sz w:val="18"/>
+          <w:szCs w:val="18"/>
+        </w:rPr>
+        <w:t xml:space="preserve">indirectly </w:t>
+      </w:r>
+      <w:r>
+        <w:rPr>
+          <w:rFonts w:ascii="Verdana" w:hAnsi="Verdana"/>
+          <w:color w:val="FF0000"/>
+          <w:sz w:val="18"/>
+          <w:szCs w:val="18"/>
+        </w:rPr>
+        <w:t xml:space="preserve">through your project work, </w:t>
+      </w:r>
+      <w:r>
+        <w:rPr>
+          <w:rFonts w:ascii="Verdana" w:hAnsi="Verdana"/>
+          <w:color w:val="FF0000"/>
+          <w:sz w:val="18"/>
+          <w:szCs w:val="18"/>
+        </w:rPr>
+        <w:t xml:space="preserve">as well as </w:t>
+      </w:r>
+      <w:r>
+        <w:rPr>
+          <w:rFonts w:ascii="Verdana" w:hAnsi="Verdana"/>
+          <w:color w:val="FF0000"/>
+          <w:sz w:val="18"/>
+          <w:szCs w:val="18"/>
+        </w:rPr>
+        <w:t xml:space="preserve">how you were </w:t>
+      </w:r>
+      <w:r>
+        <w:rPr>
+          <w:rFonts w:ascii="Verdana" w:hAnsi="Verdana"/>
+          <w:color w:val="FF0000"/>
+          <w:sz w:val="18"/>
+          <w:szCs w:val="18"/>
+        </w:rPr>
+        <w:t>working to professional guidelines and standards.</w:t>
+      </w:r>
+      <w:r>
+        <w:rPr>
+          <w:rFonts w:ascii="Verdana" w:hAnsi="Verdana"/>
+          <w:color w:val="FF0000"/>
+          <w:sz w:val="18"/>
+          <w:szCs w:val="18"/>
+        </w:rPr>
+        <w:t xml:space="preserve"> </w:t>
+      </w:r>
+      <w:r>
+        <w:rPr>
+          <w:rFonts w:ascii="Verdana" w:hAnsi="Verdana"/>
+          <w:color w:val="FF0000"/>
+          <w:sz w:val="18"/>
+          <w:szCs w:val="18"/>
+        </w:rPr>
+        <w:t xml:space="preserve">Non-disclosure agreements, intellectual property </w:t>
+      </w:r>
+      <w:r>
+        <w:rPr>
+          <w:rFonts w:ascii="Verdana" w:hAnsi="Verdana"/>
+          <w:color w:val="FF0000"/>
+          <w:sz w:val="18"/>
+          <w:szCs w:val="18"/>
+        </w:rPr>
+        <w:t xml:space="preserve">rights </w:t>
+      </w:r>
+      <w:r>
+        <w:rPr>
+          <w:rFonts w:ascii="Verdana" w:hAnsi="Verdana"/>
+          <w:color w:val="FF0000"/>
+          <w:sz w:val="18"/>
+          <w:szCs w:val="18"/>
+        </w:rPr>
+        <w:t xml:space="preserve">or copyright issues also </w:t>
+      </w:r>
+      <w:r>
+        <w:rPr>
+          <w:rFonts w:ascii="Verdana" w:hAnsi="Verdana"/>
+          <w:color w:val="FF0000"/>
+          <w:sz w:val="18"/>
+          <w:szCs w:val="18"/>
+        </w:rPr>
+        <w:t xml:space="preserve">need to </w:t>
+      </w:r>
+      <w:r>
+        <w:rPr>
+          <w:rFonts w:ascii="Verdana" w:hAnsi="Verdana"/>
+          <w:color w:val="FF0000"/>
+          <w:sz w:val="18"/>
+          <w:szCs w:val="18"/>
+        </w:rPr>
+        <w:t>be dealt with here.</w:t>
+      </w:r>
+    </w:p>
+    <w:p>
+      <w:pPr>
+        <w:rPr>
+          <w:rFonts w:ascii="Verdana" w:hAnsi="Verdana"/>
+          <w:color w:val="FF0000"/>
+          <w:sz w:val="18"/>
+          <w:szCs w:val="18"/>
+        </w:rPr>
+      </w:pPr>
+    </w:p>
+    <w:p>
+      <w:pPr>
+        <w:jc w:val="both"/>
+        <w:rPr>
+          <w:rFonts w:ascii="Verdana" w:hAnsi="Verdana"/>
+          <w:color w:val="FF0000"/>
+          <w:sz w:val="18"/>
+          <w:szCs w:val="18"/>
+        </w:rPr>
+      </w:pPr>
+      <w:r>
+        <w:rPr>
+          <w:rFonts w:ascii="Verdana" w:hAnsi="Verdana"/>
+          <w:color w:val="FF0000"/>
+          <w:sz w:val="18"/>
+          <w:szCs w:val="18"/>
+        </w:rPr>
+        <w:t xml:space="preserve">Write a summary </w:t>
+      </w:r>
+      <w:r>
+        <w:rPr>
+          <w:rFonts w:ascii="Verdana" w:hAnsi="Verdana"/>
+          <w:color w:val="FF0000"/>
+          <w:sz w:val="18"/>
+          <w:szCs w:val="18"/>
+        </w:rPr>
+        <w:t xml:space="preserve">of the most important findings of the research phase and explain how exactly each of these findings will influence the follow-on stages of the project. </w:t>
+      </w:r>
+    </w:p>
+    <w:p>
+      <w:pPr>
+        <w:jc w:val="both"/>
+        <w:rPr>
+          <w:rFonts w:ascii="Verdana" w:hAnsi="Verdana"/>
+          <w:noProof/>
+          <w:sz w:val="18"/>
+          <w:szCs w:val="18"/>
+        </w:rPr>
+      </w:pPr>
+      <w:r>
+        <w:rPr>
+          <w:rFonts w:ascii="Verdana" w:hAnsi="Verdana"/>
+          <w:bCs/>
+          <w:noProof/>
+          <w:sz w:val="18"/>
+          <w:szCs w:val="18"/>
+        </w:rPr>
+        <w:t>------------------------------------------------------</w:t>
+      </w:r>
+    </w:p>
+    <w:p>
+      <w:pPr>
+        <w:jc w:val="both"/>
         <w:rPr>
           <w:rFonts w:ascii="Verdana" w:hAnsi="Verdana"/>
           <w:b/>
           <w:sz w:val="18"/>
           <w:szCs w:val="18"/>
         </w:rPr>
-        <w:t xml:space="preserve"> </w:t>
+      </w:pPr>
+    </w:p>
+    <w:p>
+      <w:pPr>
+        <w:jc w:val="both"/>
+        <w:rPr>
+          <w:rFonts w:ascii="Verdana" w:hAnsi="Verdana"/>
+          <w:sz w:val="18"/>
+          <w:szCs w:val="18"/>
+        </w:rPr>
+      </w:pPr>
+      <w:r>
+        <w:rPr>
+          <w:rFonts w:ascii="Verdana" w:hAnsi="Verdana"/>
+          <w:b/>
+          <w:sz w:val="18"/>
+          <w:szCs w:val="18"/>
+        </w:rPr>
+        <w:t>5</w:t>
+      </w:r>
+      <w:r>
+        <w:rPr>
+          <w:rFonts w:ascii="Verdana" w:hAnsi="Verdana"/>
+          <w:b/>
+          <w:sz w:val="18"/>
+          <w:szCs w:val="18"/>
+        </w:rPr>
+        <w:t xml:space="preserve">. </w:t>
+      </w:r>
+      <w:r>
+        <w:rPr>
+          <w:rFonts w:ascii="Verdana" w:hAnsi="Verdana"/>
+          <w:b/>
+          <w:sz w:val="18"/>
+          <w:szCs w:val="18"/>
+        </w:rPr>
+        <w:t xml:space="preserve">Practice </w:t>
       </w:r>
       <w:r>
         <w:rPr>
@@ -3436,15 +4811,23 @@
           <w:sz w:val="18"/>
           <w:szCs w:val="18"/>
         </w:rPr>
-        <w:t>500</w:t>
-      </w:r>
-      <w:r>
-        <w:rPr>
-          <w:rFonts w:ascii="Verdana" w:hAnsi="Verdana"/>
-          <w:sz w:val="18"/>
-          <w:szCs w:val="18"/>
-        </w:rPr>
-        <w:t>w</w:t>
+        <w:t>25</w:t>
+      </w:r>
+      <w:r>
+        <w:rPr>
+          <w:rFonts w:ascii="Verdana" w:hAnsi="Verdana"/>
+          <w:sz w:val="18"/>
+          <w:szCs w:val="18"/>
+        </w:rPr>
+        <w:t>00</w:t>
+      </w:r>
+      <w:r>
+        <w:rPr>
+          <w:rFonts w:ascii="Verdana" w:hAnsi="Verdana"/>
+          <w:sz w:val="18"/>
+          <w:szCs w:val="18"/>
+        </w:rPr>
+        <w:t xml:space="preserve"> words</w:t>
       </w:r>
     </w:p>
     <w:p>
@@ -3459,6 +4842,11 @@
     </w:p>
     <w:p>
       <w:pPr>
+        <w:pStyle w:val="ListParagraph"/>
+        <w:numPr>
+          <w:ilvl w:val="0"/>
+          <w:numId w:val="11"/>
+        </w:numPr>
         <w:jc w:val="both"/>
         <w:rPr>
           <w:rFonts w:ascii="Verdana" w:hAnsi="Verdana"/>
@@ -3472,211 +4860,16 @@
           <w:sz w:val="18"/>
           <w:szCs w:val="18"/>
         </w:rPr>
-        <w:t>B</w:t>
-      </w:r>
-      <w:r>
-        <w:rPr>
-          <w:rFonts w:ascii="Verdana" w:hAnsi="Verdana"/>
-          <w:sz w:val="18"/>
-          <w:szCs w:val="18"/>
-        </w:rPr>
-        <w:t xml:space="preserve">riefly </w:t>
-      </w:r>
-      <w:r>
-        <w:rPr>
-          <w:rFonts w:ascii="Verdana" w:hAnsi="Verdana"/>
-          <w:sz w:val="18"/>
-          <w:szCs w:val="18"/>
-        </w:rPr>
-        <w:t>tell the reader</w:t>
-      </w:r>
-      <w:r>
-        <w:rPr>
-          <w:rFonts w:ascii="Verdana" w:hAnsi="Verdana"/>
-          <w:sz w:val="18"/>
-          <w:szCs w:val="18"/>
-        </w:rPr>
-        <w:t xml:space="preserve"> which </w:t>
-      </w:r>
-      <w:r>
-        <w:rPr>
-          <w:rFonts w:ascii="Verdana" w:hAnsi="Verdana"/>
-          <w:sz w:val="18"/>
-          <w:szCs w:val="18"/>
-        </w:rPr>
-        <w:t xml:space="preserve">research methods </w:t>
-      </w:r>
-      <w:r>
-        <w:rPr>
-          <w:rFonts w:ascii="Verdana" w:hAnsi="Verdana"/>
-          <w:sz w:val="18"/>
-          <w:szCs w:val="18"/>
-        </w:rPr>
-        <w:t>you will</w:t>
-      </w:r>
-      <w:r>
-        <w:rPr>
-          <w:rFonts w:ascii="Verdana" w:hAnsi="Verdana"/>
-          <w:sz w:val="18"/>
-          <w:szCs w:val="18"/>
-        </w:rPr>
-        <w:t xml:space="preserve"> </w:t>
-      </w:r>
-      <w:r>
-        <w:rPr>
-          <w:rFonts w:ascii="Verdana" w:hAnsi="Verdana"/>
-          <w:sz w:val="18"/>
-          <w:szCs w:val="18"/>
-        </w:rPr>
-        <w:t xml:space="preserve">use to answer </w:t>
-      </w:r>
-      <w:r>
-        <w:rPr>
-          <w:rFonts w:ascii="Verdana" w:hAnsi="Verdana"/>
-          <w:sz w:val="18"/>
-          <w:szCs w:val="18"/>
-        </w:rPr>
-        <w:t xml:space="preserve">the research </w:t>
-      </w:r>
-      <w:r>
-        <w:rPr>
-          <w:rFonts w:ascii="Verdana" w:hAnsi="Verdana"/>
-          <w:sz w:val="18"/>
-          <w:szCs w:val="18"/>
-        </w:rPr>
-        <w:t xml:space="preserve">questions. Use the correct terminology </w:t>
-      </w:r>
-      <w:r>
-        <w:rPr>
-          <w:rFonts w:ascii="Verdana" w:hAnsi="Verdana"/>
-          <w:sz w:val="18"/>
-          <w:szCs w:val="18"/>
-        </w:rPr>
-        <w:t>when</w:t>
-      </w:r>
-      <w:r>
-        <w:rPr>
-          <w:rFonts w:ascii="Verdana" w:hAnsi="Verdana"/>
-          <w:sz w:val="18"/>
-          <w:szCs w:val="18"/>
-        </w:rPr>
-        <w:t xml:space="preserve"> identify</w:t>
-      </w:r>
-      <w:r>
-        <w:rPr>
-          <w:rFonts w:ascii="Verdana" w:hAnsi="Verdana"/>
-          <w:sz w:val="18"/>
-          <w:szCs w:val="18"/>
-        </w:rPr>
-        <w:t>ing</w:t>
-      </w:r>
-      <w:r>
-        <w:rPr>
-          <w:rFonts w:ascii="Verdana" w:hAnsi="Verdana"/>
-          <w:sz w:val="18"/>
-          <w:szCs w:val="18"/>
-        </w:rPr>
-        <w:t xml:space="preserve"> </w:t>
-      </w:r>
-      <w:r>
-        <w:rPr>
-          <w:rFonts w:ascii="Verdana" w:hAnsi="Verdana"/>
-          <w:sz w:val="18"/>
-          <w:szCs w:val="18"/>
-        </w:rPr>
-        <w:t>research</w:t>
-      </w:r>
-      <w:r>
-        <w:rPr>
-          <w:rFonts w:ascii="Verdana" w:hAnsi="Verdana"/>
-          <w:sz w:val="18"/>
-          <w:szCs w:val="18"/>
-        </w:rPr>
-        <w:t xml:space="preserve"> methods and give a brief rationale of why these methods </w:t>
-      </w:r>
-      <w:r>
-        <w:rPr>
-          <w:rFonts w:ascii="Verdana" w:hAnsi="Verdana"/>
-          <w:sz w:val="18"/>
-          <w:szCs w:val="18"/>
-        </w:rPr>
-        <w:t>were chosen (and not others)</w:t>
-      </w:r>
-      <w:r>
-        <w:rPr>
-          <w:rFonts w:ascii="Verdana" w:hAnsi="Verdana"/>
-          <w:sz w:val="18"/>
-          <w:szCs w:val="18"/>
-        </w:rPr>
-        <w:t>. Try to convince the reader that the choices of method were appropriate for this project</w:t>
-      </w:r>
-      <w:r>
-        <w:rPr>
-          <w:rFonts w:ascii="Verdana" w:hAnsi="Verdana"/>
-          <w:sz w:val="18"/>
-          <w:szCs w:val="18"/>
-        </w:rPr>
-        <w:t xml:space="preserve">, and that </w:t>
-      </w:r>
-      <w:r>
-        <w:rPr>
-          <w:rFonts w:ascii="Verdana" w:hAnsi="Verdana"/>
-          <w:sz w:val="18"/>
-          <w:szCs w:val="18"/>
-        </w:rPr>
-        <w:t>it looked like</w:t>
-      </w:r>
-      <w:r>
-        <w:rPr>
-          <w:rFonts w:ascii="Verdana" w:hAnsi="Verdana"/>
-          <w:sz w:val="18"/>
-          <w:szCs w:val="18"/>
-        </w:rPr>
-        <w:t xml:space="preserve"> they </w:t>
-      </w:r>
-      <w:r>
-        <w:rPr>
-          <w:rFonts w:ascii="Verdana" w:hAnsi="Verdana"/>
-          <w:sz w:val="18"/>
-          <w:szCs w:val="18"/>
-        </w:rPr>
-        <w:t xml:space="preserve">could </w:t>
-      </w:r>
-      <w:r>
-        <w:rPr>
-          <w:rFonts w:ascii="Verdana" w:hAnsi="Verdana"/>
-          <w:sz w:val="18"/>
-          <w:szCs w:val="18"/>
-        </w:rPr>
-        <w:t xml:space="preserve">provide </w:t>
-      </w:r>
-      <w:r>
-        <w:rPr>
-          <w:rFonts w:ascii="Verdana" w:hAnsi="Verdana"/>
-          <w:sz w:val="18"/>
-          <w:szCs w:val="18"/>
-        </w:rPr>
-        <w:t xml:space="preserve">the </w:t>
-      </w:r>
-      <w:r>
-        <w:rPr>
-          <w:rFonts w:ascii="Verdana" w:hAnsi="Verdana"/>
-          <w:sz w:val="18"/>
-          <w:szCs w:val="18"/>
-        </w:rPr>
-        <w:t>necessary answers</w:t>
-      </w:r>
-      <w:r>
-        <w:rPr>
-          <w:rFonts w:ascii="Verdana" w:hAnsi="Verdana"/>
-          <w:sz w:val="18"/>
-          <w:szCs w:val="18"/>
-        </w:rPr>
-        <w:t>.</w:t>
-      </w:r>
-    </w:p>
-    <w:p>
-      <w:pPr>
+        <w:t>Initial proposal</w:t>
+      </w:r>
+    </w:p>
+    <w:p>
+      <w:pPr>
+        <w:pStyle w:val="ListParagraph"/>
+        <w:numPr>
+          <w:ilvl w:val="0"/>
+          <w:numId w:val="11"/>
+        </w:numPr>
         <w:jc w:val="both"/>
         <w:rPr>
           <w:rFonts w:ascii="Verdana" w:hAnsi="Verdana"/>
@@ -3684,9 +4877,22 @@
           <w:szCs w:val="18"/>
         </w:rPr>
       </w:pPr>
-    </w:p>
-    <w:p>
-      <w:pPr>
+      <w:r>
+        <w:rPr>
+          <w:rFonts w:ascii="Verdana" w:hAnsi="Verdana"/>
+          <w:sz w:val="18"/>
+          <w:szCs w:val="18"/>
+        </w:rPr>
+        <w:t>Full proposal</w:t>
+      </w:r>
+    </w:p>
+    <w:p>
+      <w:pPr>
+        <w:pStyle w:val="ListParagraph"/>
+        <w:numPr>
+          <w:ilvl w:val="0"/>
+          <w:numId w:val="11"/>
+        </w:numPr>
         <w:jc w:val="both"/>
         <w:rPr>
           <w:rFonts w:ascii="Verdana" w:hAnsi="Verdana"/>
@@ -3700,124 +4906,16 @@
           <w:sz w:val="18"/>
           <w:szCs w:val="18"/>
         </w:rPr>
-        <w:t>If qualitative</w:t>
-      </w:r>
-      <w:r>
-        <w:rPr>
-          <w:rFonts w:ascii="Verdana" w:hAnsi="Verdana"/>
-          <w:sz w:val="18"/>
-          <w:szCs w:val="18"/>
-        </w:rPr>
-        <w:t xml:space="preserve"> or </w:t>
-      </w:r>
-      <w:r>
-        <w:rPr>
-          <w:rFonts w:ascii="Verdana" w:hAnsi="Verdana"/>
-          <w:sz w:val="18"/>
-          <w:szCs w:val="18"/>
-        </w:rPr>
-        <w:t xml:space="preserve">user research was conducted, </w:t>
-      </w:r>
-      <w:r>
-        <w:rPr>
-          <w:rFonts w:ascii="Verdana" w:hAnsi="Verdana"/>
-          <w:sz w:val="18"/>
-          <w:szCs w:val="18"/>
-        </w:rPr>
-        <w:t>or research involving</w:t>
-      </w:r>
-      <w:r>
-        <w:rPr>
-          <w:rFonts w:ascii="Verdana" w:hAnsi="Verdana"/>
-          <w:sz w:val="18"/>
-          <w:szCs w:val="18"/>
-        </w:rPr>
-        <w:t xml:space="preserve"> human participants, </w:t>
-      </w:r>
-      <w:r>
-        <w:rPr>
-          <w:rFonts w:ascii="Verdana" w:hAnsi="Verdana"/>
-          <w:sz w:val="18"/>
-          <w:szCs w:val="18"/>
-        </w:rPr>
-        <w:t xml:space="preserve">introduce the purpose of </w:t>
-      </w:r>
-      <w:r>
-        <w:rPr>
-          <w:rFonts w:ascii="Verdana" w:hAnsi="Verdana"/>
-          <w:sz w:val="18"/>
-          <w:szCs w:val="18"/>
-        </w:rPr>
-        <w:t>this</w:t>
-      </w:r>
-      <w:r>
-        <w:rPr>
-          <w:rFonts w:ascii="Verdana" w:hAnsi="Verdana"/>
-          <w:sz w:val="18"/>
-          <w:szCs w:val="18"/>
-        </w:rPr>
-        <w:t xml:space="preserve">, </w:t>
-      </w:r>
-      <w:r>
-        <w:rPr>
-          <w:rFonts w:ascii="Verdana" w:hAnsi="Verdana"/>
-          <w:sz w:val="18"/>
-          <w:szCs w:val="18"/>
-        </w:rPr>
-        <w:t xml:space="preserve">briefly </w:t>
-      </w:r>
-      <w:r>
-        <w:rPr>
-          <w:rFonts w:ascii="Verdana" w:hAnsi="Verdana"/>
-          <w:sz w:val="18"/>
-          <w:szCs w:val="18"/>
-        </w:rPr>
-        <w:t xml:space="preserve">describe the participants, sample size, </w:t>
-      </w:r>
-      <w:r>
-        <w:rPr>
-          <w:rFonts w:ascii="Verdana" w:hAnsi="Verdana"/>
-          <w:sz w:val="18"/>
-          <w:szCs w:val="18"/>
-        </w:rPr>
-        <w:t>process</w:t>
-      </w:r>
-      <w:r>
-        <w:rPr>
-          <w:rFonts w:ascii="Verdana" w:hAnsi="Verdana"/>
-          <w:sz w:val="18"/>
-          <w:szCs w:val="18"/>
-        </w:rPr>
-        <w:t xml:space="preserve"> applied, response rate (if applicable), data analysis </w:t>
-      </w:r>
-      <w:r>
-        <w:rPr>
-          <w:rFonts w:ascii="Verdana" w:hAnsi="Verdana"/>
-          <w:sz w:val="18"/>
-          <w:szCs w:val="18"/>
-        </w:rPr>
-        <w:t xml:space="preserve">method </w:t>
-      </w:r>
-      <w:r>
-        <w:rPr>
-          <w:rFonts w:ascii="Verdana" w:hAnsi="Verdana"/>
-          <w:sz w:val="18"/>
-          <w:szCs w:val="18"/>
-        </w:rPr>
-        <w:t xml:space="preserve">and evaluation method. </w:t>
-      </w:r>
-    </w:p>
-    <w:p>
-      <w:pPr>
-        <w:rPr>
-          <w:rFonts w:ascii="Verdana" w:hAnsi="Verdana"/>
-          <w:sz w:val="18"/>
-          <w:szCs w:val="18"/>
-        </w:rPr>
-      </w:pPr>
-    </w:p>
-    <w:p>
-      <w:pPr>
+        <w:t>Poster presentation – prototype artifact</w:t>
+      </w:r>
+    </w:p>
+    <w:p>
+      <w:pPr>
+        <w:pStyle w:val="ListParagraph"/>
+        <w:numPr>
+          <w:ilvl w:val="0"/>
+          <w:numId w:val="11"/>
+        </w:numPr>
         <w:jc w:val="both"/>
         <w:rPr>
           <w:rFonts w:ascii="Verdana" w:hAnsi="Verdana"/>
@@ -3831,139 +4929,16 @@
           <w:sz w:val="18"/>
           <w:szCs w:val="18"/>
         </w:rPr>
-        <w:t>Your</w:t>
-      </w:r>
-      <w:r>
-        <w:rPr>
-          <w:rFonts w:ascii="Verdana" w:hAnsi="Verdana"/>
-          <w:sz w:val="18"/>
-          <w:szCs w:val="18"/>
-        </w:rPr>
-        <w:t xml:space="preserve"> reader </w:t>
-      </w:r>
-      <w:r>
-        <w:rPr>
-          <w:rFonts w:ascii="Verdana" w:hAnsi="Verdana"/>
-          <w:sz w:val="18"/>
-          <w:szCs w:val="18"/>
-        </w:rPr>
-        <w:t xml:space="preserve">also </w:t>
-      </w:r>
-      <w:r>
-        <w:rPr>
-          <w:rFonts w:ascii="Verdana" w:hAnsi="Verdana"/>
-          <w:sz w:val="18"/>
-          <w:szCs w:val="18"/>
-        </w:rPr>
-        <w:t xml:space="preserve">needs to </w:t>
-      </w:r>
-      <w:r>
-        <w:rPr>
-          <w:rFonts w:ascii="Verdana" w:hAnsi="Verdana"/>
-          <w:sz w:val="18"/>
-          <w:szCs w:val="18"/>
-        </w:rPr>
-        <w:t>know</w:t>
-      </w:r>
-      <w:r>
-        <w:rPr>
-          <w:rFonts w:ascii="Verdana" w:hAnsi="Verdana"/>
-          <w:sz w:val="18"/>
-          <w:szCs w:val="18"/>
-        </w:rPr>
-        <w:t xml:space="preserve"> </w:t>
-      </w:r>
-      <w:r>
-        <w:rPr>
-          <w:rFonts w:ascii="Verdana" w:hAnsi="Verdana"/>
-          <w:sz w:val="18"/>
-          <w:szCs w:val="18"/>
-        </w:rPr>
-        <w:t>that</w:t>
-      </w:r>
-      <w:r>
-        <w:rPr>
-          <w:rFonts w:ascii="Verdana" w:hAnsi="Verdana"/>
-          <w:sz w:val="18"/>
-          <w:szCs w:val="18"/>
-        </w:rPr>
-        <w:t xml:space="preserve"> </w:t>
-      </w:r>
-      <w:r>
-        <w:rPr>
-          <w:rFonts w:ascii="Verdana" w:hAnsi="Verdana"/>
-          <w:sz w:val="18"/>
-          <w:szCs w:val="18"/>
-        </w:rPr>
-        <w:t xml:space="preserve">all </w:t>
-      </w:r>
-      <w:r>
-        <w:rPr>
-          <w:rFonts w:ascii="Verdana" w:hAnsi="Verdana"/>
-          <w:sz w:val="18"/>
-          <w:szCs w:val="18"/>
-        </w:rPr>
-        <w:t>research</w:t>
-      </w:r>
-      <w:r>
-        <w:rPr>
-          <w:rFonts w:ascii="Verdana" w:hAnsi="Verdana"/>
-          <w:sz w:val="18"/>
-          <w:szCs w:val="18"/>
-        </w:rPr>
-        <w:t xml:space="preserve"> methods</w:t>
-      </w:r>
-      <w:r>
-        <w:rPr>
-          <w:rFonts w:ascii="Verdana" w:hAnsi="Verdana"/>
-          <w:sz w:val="18"/>
-          <w:szCs w:val="18"/>
-        </w:rPr>
-        <w:t xml:space="preserve"> were applied ethically</w:t>
-      </w:r>
-      <w:r>
-        <w:rPr>
-          <w:rFonts w:ascii="Verdana" w:hAnsi="Verdana"/>
-          <w:sz w:val="18"/>
-          <w:szCs w:val="18"/>
-        </w:rPr>
-        <w:t xml:space="preserve"> and professionally</w:t>
-      </w:r>
-      <w:r>
-        <w:rPr>
-          <w:rFonts w:ascii="Verdana" w:hAnsi="Verdana"/>
-          <w:sz w:val="18"/>
-          <w:szCs w:val="18"/>
-        </w:rPr>
-        <w:t xml:space="preserve"> at </w:t>
-      </w:r>
-      <w:r>
-        <w:rPr>
-          <w:rFonts w:ascii="Verdana" w:hAnsi="Verdana"/>
-          <w:sz w:val="18"/>
-          <w:szCs w:val="18"/>
-        </w:rPr>
-        <w:t>all</w:t>
-      </w:r>
-      <w:r>
-        <w:rPr>
-          <w:rFonts w:ascii="Verdana" w:hAnsi="Verdana"/>
-          <w:sz w:val="18"/>
-          <w:szCs w:val="18"/>
-        </w:rPr>
-        <w:t xml:space="preserve"> project stage</w:t>
-      </w:r>
-      <w:r>
-        <w:rPr>
-          <w:rFonts w:ascii="Verdana" w:hAnsi="Verdana"/>
-          <w:sz w:val="18"/>
-          <w:szCs w:val="18"/>
-        </w:rPr>
-        <w:t>s, meaning research and practice.</w:t>
-      </w:r>
-    </w:p>
-    <w:p>
-      <w:pPr>
+        <w:t>Artifact improvements</w:t>
+      </w:r>
+    </w:p>
+    <w:p>
+      <w:pPr>
+        <w:pStyle w:val="ListParagraph"/>
+        <w:numPr>
+          <w:ilvl w:val="0"/>
+          <w:numId w:val="11"/>
+        </w:numPr>
         <w:jc w:val="both"/>
         <w:rPr>
           <w:rFonts w:ascii="Verdana" w:hAnsi="Verdana"/>
@@ -3971,9 +4946,22 @@
           <w:szCs w:val="18"/>
         </w:rPr>
       </w:pPr>
-    </w:p>
-    <w:p>
-      <w:pPr>
+      <w:r>
+        <w:rPr>
+          <w:rFonts w:ascii="Verdana" w:hAnsi="Verdana"/>
+          <w:sz w:val="18"/>
+          <w:szCs w:val="18"/>
+        </w:rPr>
+        <w:t>Playtesting</w:t>
+      </w:r>
+    </w:p>
+    <w:p>
+      <w:pPr>
+        <w:pStyle w:val="ListParagraph"/>
+        <w:numPr>
+          <w:ilvl w:val="0"/>
+          <w:numId w:val="11"/>
+        </w:numPr>
         <w:jc w:val="both"/>
         <w:rPr>
           <w:rFonts w:ascii="Verdana" w:hAnsi="Verdana"/>
@@ -3987,148 +4975,16 @@
           <w:sz w:val="18"/>
           <w:szCs w:val="18"/>
         </w:rPr>
-        <w:t xml:space="preserve">What you may need to mention </w:t>
-      </w:r>
-      <w:r>
-        <w:rPr>
-          <w:rFonts w:ascii="Verdana" w:hAnsi="Verdana"/>
-          <w:sz w:val="18"/>
-          <w:szCs w:val="18"/>
-        </w:rPr>
-        <w:t>in this section (depending on each project)</w:t>
-      </w:r>
-      <w:r>
-        <w:rPr>
-          <w:rFonts w:ascii="Verdana" w:hAnsi="Verdana"/>
-          <w:sz w:val="18"/>
-          <w:szCs w:val="18"/>
-        </w:rPr>
-        <w:t xml:space="preserve"> is</w:t>
-      </w:r>
-      <w:r>
-        <w:rPr>
-          <w:rFonts w:ascii="Verdana" w:hAnsi="Verdana"/>
-          <w:sz w:val="18"/>
-          <w:szCs w:val="18"/>
-        </w:rPr>
-        <w:t xml:space="preserve"> data collection, data storage,</w:t>
-      </w:r>
-      <w:r>
-        <w:rPr>
-          <w:rFonts w:ascii="Verdana" w:hAnsi="Verdana"/>
-          <w:sz w:val="18"/>
-          <w:szCs w:val="18"/>
-        </w:rPr>
-        <w:t xml:space="preserve"> data disposal, gaining informed participant consent, respecting privacy, not causing harm</w:t>
-      </w:r>
-      <w:r>
-        <w:rPr>
-          <w:rFonts w:ascii="Verdana" w:hAnsi="Verdana"/>
-          <w:sz w:val="18"/>
-          <w:szCs w:val="18"/>
-        </w:rPr>
-        <w:t xml:space="preserve"> either directly or </w:t>
-      </w:r>
-      <w:r>
-        <w:rPr>
-          <w:rFonts w:ascii="Verdana" w:hAnsi="Verdana"/>
-          <w:sz w:val="18"/>
-          <w:szCs w:val="18"/>
-        </w:rPr>
-        <w:t xml:space="preserve">indirectly </w:t>
-      </w:r>
-      <w:r>
-        <w:rPr>
-          <w:rFonts w:ascii="Verdana" w:hAnsi="Verdana"/>
-          <w:sz w:val="18"/>
-          <w:szCs w:val="18"/>
-        </w:rPr>
-        <w:t xml:space="preserve">through your project work, </w:t>
-      </w:r>
-      <w:r>
-        <w:rPr>
-          <w:rFonts w:ascii="Verdana" w:hAnsi="Verdana"/>
-          <w:sz w:val="18"/>
-          <w:szCs w:val="18"/>
-        </w:rPr>
-        <w:t xml:space="preserve">as well as </w:t>
-      </w:r>
-      <w:r>
-        <w:rPr>
-          <w:rFonts w:ascii="Verdana" w:hAnsi="Verdana"/>
-          <w:sz w:val="18"/>
-          <w:szCs w:val="18"/>
-        </w:rPr>
-        <w:t xml:space="preserve">how you were </w:t>
-      </w:r>
-      <w:r>
-        <w:rPr>
-          <w:rFonts w:ascii="Verdana" w:hAnsi="Verdana"/>
-          <w:sz w:val="18"/>
-          <w:szCs w:val="18"/>
-        </w:rPr>
-        <w:t>working to professional guidelines and standards.</w:t>
-      </w:r>
-      <w:r>
-        <w:rPr>
-          <w:rFonts w:ascii="Verdana" w:hAnsi="Verdana"/>
-          <w:sz w:val="18"/>
-          <w:szCs w:val="18"/>
-        </w:rPr>
-        <w:t xml:space="preserve"> </w:t>
-      </w:r>
-      <w:r>
-        <w:rPr>
-          <w:rFonts w:ascii="Verdana" w:hAnsi="Verdana"/>
-          <w:sz w:val="18"/>
-          <w:szCs w:val="18"/>
-        </w:rPr>
-        <w:t xml:space="preserve">Non-disclosure agreements, intellectual property </w:t>
-      </w:r>
-      <w:r>
-        <w:rPr>
-          <w:rFonts w:ascii="Verdana" w:hAnsi="Verdana"/>
-          <w:sz w:val="18"/>
-          <w:szCs w:val="18"/>
-        </w:rPr>
-        <w:t xml:space="preserve">rights </w:t>
-      </w:r>
-      <w:r>
-        <w:rPr>
-          <w:rFonts w:ascii="Verdana" w:hAnsi="Verdana"/>
-          <w:sz w:val="18"/>
-          <w:szCs w:val="18"/>
-        </w:rPr>
-        <w:t xml:space="preserve">or copyright issues also </w:t>
-      </w:r>
-      <w:r>
-        <w:rPr>
-          <w:rFonts w:ascii="Verdana" w:hAnsi="Verdana"/>
-          <w:sz w:val="18"/>
-          <w:szCs w:val="18"/>
-        </w:rPr>
-        <w:t xml:space="preserve">need to </w:t>
-      </w:r>
-      <w:r>
-        <w:rPr>
-          <w:rFonts w:ascii="Verdana" w:hAnsi="Verdana"/>
-          <w:sz w:val="18"/>
-          <w:szCs w:val="18"/>
-        </w:rPr>
-        <w:t>be dealt with here.</w:t>
-      </w:r>
-    </w:p>
-    <w:p>
-      <w:pPr>
-        <w:rPr>
-          <w:rFonts w:ascii="Verdana" w:hAnsi="Verdana"/>
-          <w:sz w:val="18"/>
-          <w:szCs w:val="18"/>
-        </w:rPr>
-      </w:pPr>
-    </w:p>
-    <w:p>
-      <w:pPr>
+        <w:t>Artifact iterations</w:t>
+      </w:r>
+    </w:p>
+    <w:p>
+      <w:pPr>
+        <w:pStyle w:val="ListParagraph"/>
+        <w:numPr>
+          <w:ilvl w:val="0"/>
+          <w:numId w:val="11"/>
+        </w:numPr>
         <w:jc w:val="both"/>
         <w:rPr>
           <w:rFonts w:ascii="Verdana" w:hAnsi="Verdana"/>
@@ -4142,51 +4998,16 @@
           <w:sz w:val="18"/>
           <w:szCs w:val="18"/>
         </w:rPr>
-        <w:t xml:space="preserve">Write a summary </w:t>
-      </w:r>
-      <w:r>
-        <w:rPr>
-          <w:rFonts w:ascii="Verdana" w:hAnsi="Verdana"/>
-          <w:sz w:val="18"/>
-          <w:szCs w:val="18"/>
-        </w:rPr>
-        <w:t>of the most important findings</w:t>
-      </w:r>
-      <w:r>
-        <w:rPr>
-          <w:rFonts w:ascii="Verdana" w:hAnsi="Verdana"/>
-          <w:sz w:val="18"/>
-          <w:szCs w:val="18"/>
-        </w:rPr>
-        <w:t xml:space="preserve"> </w:t>
-      </w:r>
-      <w:r>
-        <w:rPr>
-          <w:rFonts w:ascii="Verdana" w:hAnsi="Verdana"/>
-          <w:sz w:val="18"/>
-          <w:szCs w:val="18"/>
-        </w:rPr>
-        <w:t xml:space="preserve">of </w:t>
-      </w:r>
-      <w:r>
-        <w:rPr>
-          <w:rFonts w:ascii="Verdana" w:hAnsi="Verdana"/>
-          <w:sz w:val="18"/>
-          <w:szCs w:val="18"/>
-        </w:rPr>
-        <w:t>the research</w:t>
-      </w:r>
-      <w:r>
-        <w:rPr>
-          <w:rFonts w:ascii="Verdana" w:hAnsi="Verdana"/>
-          <w:sz w:val="18"/>
-          <w:szCs w:val="18"/>
-        </w:rPr>
-        <w:t xml:space="preserve"> phase and explain how exactly each of these findings will influence the follow-on stages of the project. </w:t>
-      </w:r>
-    </w:p>
-    <w:p>
-      <w:pPr>
+        <w:t>Playtesting</w:t>
+      </w:r>
+    </w:p>
+    <w:p>
+      <w:pPr>
+        <w:pStyle w:val="ListParagraph"/>
+        <w:numPr>
+          <w:ilvl w:val="0"/>
+          <w:numId w:val="11"/>
+        </w:numPr>
         <w:jc w:val="both"/>
         <w:rPr>
           <w:rFonts w:ascii="Verdana" w:hAnsi="Verdana"/>
@@ -4194,13 +5015,21 @@
           <w:szCs w:val="18"/>
         </w:rPr>
       </w:pPr>
-    </w:p>
-    <w:p>
-      <w:pPr>
+      <w:r>
+        <w:rPr>
+          <w:rFonts w:ascii="Verdana" w:hAnsi="Verdana"/>
+          <w:sz w:val="18"/>
+          <w:szCs w:val="18"/>
+        </w:rPr>
+        <w:t>Data collection and management</w:t>
+      </w:r>
+    </w:p>
+    <w:p>
+      <w:pPr>
+        <w:ind w:left="360"/>
         <w:jc w:val="both"/>
         <w:rPr>
           <w:rFonts w:ascii="Verdana" w:hAnsi="Verdana"/>
-          <w:b/>
           <w:sz w:val="18"/>
           <w:szCs w:val="18"/>
         </w:rPr>
@@ -4215,66 +5044,6 @@
           <w:szCs w:val="18"/>
         </w:rPr>
       </w:pPr>
-      <w:r>
-        <w:rPr>
-          <w:rFonts w:ascii="Verdana" w:hAnsi="Verdana"/>
-          <w:b/>
-          <w:sz w:val="18"/>
-          <w:szCs w:val="18"/>
-        </w:rPr>
-        <w:t>5</w:t>
-      </w:r>
-      <w:r>
-        <w:rPr>
-          <w:rFonts w:ascii="Verdana" w:hAnsi="Verdana"/>
-          <w:b/>
-          <w:sz w:val="18"/>
-          <w:szCs w:val="18"/>
-        </w:rPr>
-        <w:t xml:space="preserve">. </w:t>
-      </w:r>
-      <w:r>
-        <w:rPr>
-          <w:rFonts w:ascii="Verdana" w:hAnsi="Verdana"/>
-          <w:b/>
-          <w:sz w:val="18"/>
-          <w:szCs w:val="18"/>
-        </w:rPr>
-        <w:t xml:space="preserve">Practice </w:t>
-      </w:r>
-      <w:r>
-        <w:rPr>
-          <w:rFonts w:ascii="Verdana" w:hAnsi="Verdana"/>
-          <w:bCs/>
-          <w:sz w:val="18"/>
-          <w:szCs w:val="18"/>
-        </w:rPr>
-        <w:t>~</w:t>
-      </w:r>
-      <w:r>
-        <w:rPr>
-          <w:rFonts w:ascii="Verdana" w:hAnsi="Verdana"/>
-          <w:sz w:val="18"/>
-          <w:szCs w:val="18"/>
-        </w:rPr>
-        <w:t>25</w:t>
-      </w:r>
-      <w:r>
-        <w:rPr>
-          <w:rFonts w:ascii="Verdana" w:hAnsi="Verdana"/>
-          <w:sz w:val="18"/>
-          <w:szCs w:val="18"/>
-        </w:rPr>
-        <w:t>00</w:t>
-      </w:r>
-      <w:r>
-        <w:rPr>
-          <w:rFonts w:ascii="Verdana" w:hAnsi="Verdana"/>
-          <w:sz w:val="18"/>
-          <w:szCs w:val="18"/>
-        </w:rPr>
-        <w:t xml:space="preserve"> words</w:t>
-      </w:r>
     </w:p>
     <w:p>
       <w:pPr>
@@ -6208,7 +6977,6 @@
           <w:szCs w:val="18"/>
           <w:lang w:val="en-US"/>
         </w:rPr>
-        <w:lastRenderedPageBreak/>
         <mc:AlternateContent>
           <mc:Choice Requires="wps">
             <w:drawing>
@@ -6246,7 +7014,7 @@
                         <a:effectLst/>
                         <a:extLst>
                           <a:ext uri="{C572A759-6A51-4108-AA02-DFA0A04FC94B}">
-                            <ma14:wrappingTextBoxFlag xmlns="" xmlns:mo="http://schemas.microsoft.com/office/mac/office/2008/main" xmlns:mv="urn:schemas-microsoft-com:mac:vml" xmlns:o="urn:schemas-microsoft-com:office:office" xmlns:v="urn:schemas-microsoft-com:vml" xmlns:w10="urn:schemas-microsoft-com:office:word" xmlns:w="http://schemas.openxmlformats.org/wordprocessingml/2006/main" xmlns:ma14="http://schemas.microsoft.com/office/mac/drawingml/2011/main"/>
+                            <ma14:wrappingTextBoxFlag xmlns:ma14="http://schemas.microsoft.com/office/mac/drawingml/2011/main" xmlns:w="http://schemas.openxmlformats.org/wordprocessingml/2006/main" xmlns:w10="urn:schemas-microsoft-com:office:word" xmlns:v="urn:schemas-microsoft-com:vml" xmlns:o="urn:schemas-microsoft-com:office:office" xmlns:mv="urn:schemas-microsoft-com:mac:vml" xmlns:mo="http://schemas.microsoft.com/office/mac/office/2008/main" xmlns=""/>
                           </a:ext>
                         </a:extLst>
                       </wps:spPr>
@@ -7858,7 +8626,15 @@
           <w:sz w:val="18"/>
           <w:szCs w:val="18"/>
         </w:rPr>
-        <w:t xml:space="preserve">longer-term future </w:t>
+        <w:t xml:space="preserve">longer-term </w:t>
+      </w:r>
+      <w:r>
+        <w:rPr>
+          <w:rFonts w:ascii="Verdana" w:hAnsi="Verdana"/>
+          <w:sz w:val="18"/>
+          <w:szCs w:val="18"/>
+        </w:rPr>
+        <w:t xml:space="preserve">future </w:t>
       </w:r>
       <w:r>
         <w:rPr>
@@ -8996,7 +9772,6 @@
           <w:sz w:val="18"/>
           <w:szCs w:val="18"/>
         </w:rPr>
-        <w:lastRenderedPageBreak/>
         <w:t>This is a l</w:t>
       </w:r>
       <w:r>
@@ -9250,6 +10025,7 @@
           <w:sz w:val="18"/>
           <w:szCs w:val="18"/>
         </w:rPr>
+        <w:lastRenderedPageBreak/>
         <w:t xml:space="preserve">Ethics: participant </w:t>
       </w:r>
       <w:r>
@@ -10655,6 +11431,92 @@
     </w:lvl>
   </w:abstractNum>
   <w:abstractNum w:abstractNumId="4" w15:restartNumberingAfterBreak="0">
+    <w:nsid w:val="25C77CE5"/>
+    <w:multiLevelType w:val="hybridMultilevel"/>
+    <w:tmpl w:val="80583230"/>
+    <w:lvl w:ilvl="0" w:tplc="0809000F">
+      <w:start w:val="1"/>
+      <w:numFmt w:val="decimal"/>
+      <w:lvlText w:val="%1."/>
+      <w:lvlJc w:val="left"/>
+      <w:pPr>
+        <w:ind w:left="720" w:hanging="360"/>
+      </w:pPr>
+    </w:lvl>
+    <w:lvl w:ilvl="1" w:tplc="08090019" w:tentative="1">
+      <w:start w:val="1"/>
+      <w:numFmt w:val="lowerLetter"/>
+      <w:lvlText w:val="%2."/>
+      <w:lvlJc w:val="left"/>
+      <w:pPr>
+        <w:ind w:left="1440" w:hanging="360"/>
+      </w:pPr>
+    </w:lvl>
+    <w:lvl w:ilvl="2" w:tplc="0809001B" w:tentative="1">
+      <w:start w:val="1"/>
+      <w:numFmt w:val="lowerRoman"/>
+      <w:lvlText w:val="%3."/>
+      <w:lvlJc w:val="right"/>
+      <w:pPr>
+        <w:ind w:left="2160" w:hanging="180"/>
+      </w:pPr>
+    </w:lvl>
+    <w:lvl w:ilvl="3" w:tplc="0809000F" w:tentative="1">
+      <w:start w:val="1"/>
+      <w:numFmt w:val="decimal"/>
+      <w:lvlText w:val="%4."/>
+      <w:lvlJc w:val="left"/>
+      <w:pPr>
+        <w:ind w:left="2880" w:hanging="360"/>
+      </w:pPr>
+    </w:lvl>
+    <w:lvl w:ilvl="4" w:tplc="08090019" w:tentative="1">
+      <w:start w:val="1"/>
+      <w:numFmt w:val="lowerLetter"/>
+      <w:lvlText w:val="%5."/>
+      <w:lvlJc w:val="left"/>
+      <w:pPr>
+        <w:ind w:left="3600" w:hanging="360"/>
+      </w:pPr>
+    </w:lvl>
+    <w:lvl w:ilvl="5" w:tplc="0809001B" w:tentative="1">
+      <w:start w:val="1"/>
+      <w:numFmt w:val="lowerRoman"/>
+      <w:lvlText w:val="%6."/>
+      <w:lvlJc w:val="right"/>
+      <w:pPr>
+        <w:ind w:left="4320" w:hanging="180"/>
+      </w:pPr>
+    </w:lvl>
+    <w:lvl w:ilvl="6" w:tplc="0809000F" w:tentative="1">
+      <w:start w:val="1"/>
+      <w:numFmt w:val="decimal"/>
+      <w:lvlText w:val="%7."/>
+      <w:lvlJc w:val="left"/>
+      <w:pPr>
+        <w:ind w:left="5040" w:hanging="360"/>
+      </w:pPr>
+    </w:lvl>
+    <w:lvl w:ilvl="7" w:tplc="08090019" w:tentative="1">
+      <w:start w:val="1"/>
+      <w:numFmt w:val="lowerLetter"/>
+      <w:lvlText w:val="%8."/>
+      <w:lvlJc w:val="left"/>
+      <w:pPr>
+        <w:ind w:left="5760" w:hanging="360"/>
+      </w:pPr>
+    </w:lvl>
+    <w:lvl w:ilvl="8" w:tplc="0809001B" w:tentative="1">
+      <w:start w:val="1"/>
+      <w:numFmt w:val="lowerRoman"/>
+      <w:lvlText w:val="%9."/>
+      <w:lvlJc w:val="right"/>
+      <w:pPr>
+        <w:ind w:left="6480" w:hanging="180"/>
+      </w:pPr>
+    </w:lvl>
+  </w:abstractNum>
+  <w:abstractNum w:abstractNumId="5" w15:restartNumberingAfterBreak="0">
     <w:nsid w:val="25D63530"/>
     <w:multiLevelType w:val="hybridMultilevel"/>
     <w:tmpl w:val="2DB02EAC"/>
@@ -10747,7 +11609,233 @@
       </w:pPr>
     </w:lvl>
   </w:abstractNum>
-  <w:abstractNum w:abstractNumId="5" w15:restartNumberingAfterBreak="0">
+  <w:abstractNum w:abstractNumId="6" w15:restartNumberingAfterBreak="0">
+    <w:nsid w:val="297644F5"/>
+    <w:multiLevelType w:val="hybridMultilevel"/>
+    <w:tmpl w:val="93CEDB94"/>
+    <w:lvl w:ilvl="0" w:tplc="08090001">
+      <w:start w:val="1"/>
+      <w:numFmt w:val="bullet"/>
+      <w:lvlText w:val=""/>
+      <w:lvlJc w:val="left"/>
+      <w:pPr>
+        <w:ind w:left="720" w:hanging="360"/>
+      </w:pPr>
+      <w:rPr>
+        <w:rFonts w:ascii="Symbol" w:hAnsi="Symbol" w:hint="default"/>
+      </w:rPr>
+    </w:lvl>
+    <w:lvl w:ilvl="1" w:tplc="08090003" w:tentative="1">
+      <w:start w:val="1"/>
+      <w:numFmt w:val="bullet"/>
+      <w:lvlText w:val="o"/>
+      <w:lvlJc w:val="left"/>
+      <w:pPr>
+        <w:ind w:left="1440" w:hanging="360"/>
+      </w:pPr>
+      <w:rPr>
+        <w:rFonts w:ascii="Courier New" w:hAnsi="Courier New" w:cs="Courier New" w:hint="default"/>
+      </w:rPr>
+    </w:lvl>
+    <w:lvl w:ilvl="2" w:tplc="08090005" w:tentative="1">
+      <w:start w:val="1"/>
+      <w:numFmt w:val="bullet"/>
+      <w:lvlText w:val=""/>
+      <w:lvlJc w:val="left"/>
+      <w:pPr>
+        <w:ind w:left="2160" w:hanging="360"/>
+      </w:pPr>
+      <w:rPr>
+        <w:rFonts w:ascii="Wingdings" w:hAnsi="Wingdings" w:hint="default"/>
+      </w:rPr>
+    </w:lvl>
+    <w:lvl w:ilvl="3" w:tplc="08090001" w:tentative="1">
+      <w:start w:val="1"/>
+      <w:numFmt w:val="bullet"/>
+      <w:lvlText w:val=""/>
+      <w:lvlJc w:val="left"/>
+      <w:pPr>
+        <w:ind w:left="2880" w:hanging="360"/>
+      </w:pPr>
+      <w:rPr>
+        <w:rFonts w:ascii="Symbol" w:hAnsi="Symbol" w:hint="default"/>
+      </w:rPr>
+    </w:lvl>
+    <w:lvl w:ilvl="4" w:tplc="08090003" w:tentative="1">
+      <w:start w:val="1"/>
+      <w:numFmt w:val="bullet"/>
+      <w:lvlText w:val="o"/>
+      <w:lvlJc w:val="left"/>
+      <w:pPr>
+        <w:ind w:left="3600" w:hanging="360"/>
+      </w:pPr>
+      <w:rPr>
+        <w:rFonts w:ascii="Courier New" w:hAnsi="Courier New" w:cs="Courier New" w:hint="default"/>
+      </w:rPr>
+    </w:lvl>
+    <w:lvl w:ilvl="5" w:tplc="08090005" w:tentative="1">
+      <w:start w:val="1"/>
+      <w:numFmt w:val="bullet"/>
+      <w:lvlText w:val=""/>
+      <w:lvlJc w:val="left"/>
+      <w:pPr>
+        <w:ind w:left="4320" w:hanging="360"/>
+      </w:pPr>
+      <w:rPr>
+        <w:rFonts w:ascii="Wingdings" w:hAnsi="Wingdings" w:hint="default"/>
+      </w:rPr>
+    </w:lvl>
+    <w:lvl w:ilvl="6" w:tplc="08090001" w:tentative="1">
+      <w:start w:val="1"/>
+      <w:numFmt w:val="bullet"/>
+      <w:lvlText w:val=""/>
+      <w:lvlJc w:val="left"/>
+      <w:pPr>
+        <w:ind w:left="5040" w:hanging="360"/>
+      </w:pPr>
+      <w:rPr>
+        <w:rFonts w:ascii="Symbol" w:hAnsi="Symbol" w:hint="default"/>
+      </w:rPr>
+    </w:lvl>
+    <w:lvl w:ilvl="7" w:tplc="08090003" w:tentative="1">
+      <w:start w:val="1"/>
+      <w:numFmt w:val="bullet"/>
+      <w:lvlText w:val="o"/>
+      <w:lvlJc w:val="left"/>
+      <w:pPr>
+        <w:ind w:left="5760" w:hanging="360"/>
+      </w:pPr>
+      <w:rPr>
+        <w:rFonts w:ascii="Courier New" w:hAnsi="Courier New" w:cs="Courier New" w:hint="default"/>
+      </w:rPr>
+    </w:lvl>
+    <w:lvl w:ilvl="8" w:tplc="08090005" w:tentative="1">
+      <w:start w:val="1"/>
+      <w:numFmt w:val="bullet"/>
+      <w:lvlText w:val=""/>
+      <w:lvlJc w:val="left"/>
+      <w:pPr>
+        <w:ind w:left="6480" w:hanging="360"/>
+      </w:pPr>
+      <w:rPr>
+        <w:rFonts w:ascii="Wingdings" w:hAnsi="Wingdings" w:hint="default"/>
+      </w:rPr>
+    </w:lvl>
+  </w:abstractNum>
+  <w:abstractNum w:abstractNumId="7" w15:restartNumberingAfterBreak="0">
+    <w:nsid w:val="308A67DA"/>
+    <w:multiLevelType w:val="hybridMultilevel"/>
+    <w:tmpl w:val="D7CE906C"/>
+    <w:lvl w:ilvl="0" w:tplc="08090001">
+      <w:start w:val="1"/>
+      <w:numFmt w:val="bullet"/>
+      <w:lvlText w:val=""/>
+      <w:lvlJc w:val="left"/>
+      <w:pPr>
+        <w:ind w:left="720" w:hanging="360"/>
+      </w:pPr>
+      <w:rPr>
+        <w:rFonts w:ascii="Symbol" w:hAnsi="Symbol" w:hint="default"/>
+      </w:rPr>
+    </w:lvl>
+    <w:lvl w:ilvl="1" w:tplc="08090003" w:tentative="1">
+      <w:start w:val="1"/>
+      <w:numFmt w:val="bullet"/>
+      <w:lvlText w:val="o"/>
+      <w:lvlJc w:val="left"/>
+      <w:pPr>
+        <w:ind w:left="1440" w:hanging="360"/>
+      </w:pPr>
+      <w:rPr>
+        <w:rFonts w:ascii="Courier New" w:hAnsi="Courier New" w:cs="Courier New" w:hint="default"/>
+      </w:rPr>
+    </w:lvl>
+    <w:lvl w:ilvl="2" w:tplc="08090005" w:tentative="1">
+      <w:start w:val="1"/>
+      <w:numFmt w:val="bullet"/>
+      <w:lvlText w:val=""/>
+      <w:lvlJc w:val="left"/>
+      <w:pPr>
+        <w:ind w:left="2160" w:hanging="360"/>
+      </w:pPr>
+      <w:rPr>
+        <w:rFonts w:ascii="Wingdings" w:hAnsi="Wingdings" w:hint="default"/>
+      </w:rPr>
+    </w:lvl>
+    <w:lvl w:ilvl="3" w:tplc="08090001" w:tentative="1">
+      <w:start w:val="1"/>
+      <w:numFmt w:val="bullet"/>
+      <w:lvlText w:val=""/>
+      <w:lvlJc w:val="left"/>
+      <w:pPr>
+        <w:ind w:left="2880" w:hanging="360"/>
+      </w:pPr>
+      <w:rPr>
+        <w:rFonts w:ascii="Symbol" w:hAnsi="Symbol" w:hint="default"/>
+      </w:rPr>
+    </w:lvl>
+    <w:lvl w:ilvl="4" w:tplc="08090003" w:tentative="1">
+      <w:start w:val="1"/>
+      <w:numFmt w:val="bullet"/>
+      <w:lvlText w:val="o"/>
+      <w:lvlJc w:val="left"/>
+      <w:pPr>
+        <w:ind w:left="3600" w:hanging="360"/>
+      </w:pPr>
+      <w:rPr>
+        <w:rFonts w:ascii="Courier New" w:hAnsi="Courier New" w:cs="Courier New" w:hint="default"/>
+      </w:rPr>
+    </w:lvl>
+    <w:lvl w:ilvl="5" w:tplc="08090005" w:tentative="1">
+      <w:start w:val="1"/>
+      <w:numFmt w:val="bullet"/>
+      <w:lvlText w:val=""/>
+      <w:lvlJc w:val="left"/>
+      <w:pPr>
+        <w:ind w:left="4320" w:hanging="360"/>
+      </w:pPr>
+      <w:rPr>
+        <w:rFonts w:ascii="Wingdings" w:hAnsi="Wingdings" w:hint="default"/>
+      </w:rPr>
+    </w:lvl>
+    <w:lvl w:ilvl="6" w:tplc="08090001" w:tentative="1">
+      <w:start w:val="1"/>
+      <w:numFmt w:val="bullet"/>
+      <w:lvlText w:val=""/>
+      <w:lvlJc w:val="left"/>
+      <w:pPr>
+        <w:ind w:left="5040" w:hanging="360"/>
+      </w:pPr>
+      <w:rPr>
+        <w:rFonts w:ascii="Symbol" w:hAnsi="Symbol" w:hint="default"/>
+      </w:rPr>
+    </w:lvl>
+    <w:lvl w:ilvl="7" w:tplc="08090003" w:tentative="1">
+      <w:start w:val="1"/>
+      <w:numFmt w:val="bullet"/>
+      <w:lvlText w:val="o"/>
+      <w:lvlJc w:val="left"/>
+      <w:pPr>
+        <w:ind w:left="5760" w:hanging="360"/>
+      </w:pPr>
+      <w:rPr>
+        <w:rFonts w:ascii="Courier New" w:hAnsi="Courier New" w:cs="Courier New" w:hint="default"/>
+      </w:rPr>
+    </w:lvl>
+    <w:lvl w:ilvl="8" w:tplc="08090005" w:tentative="1">
+      <w:start w:val="1"/>
+      <w:numFmt w:val="bullet"/>
+      <w:lvlText w:val=""/>
+      <w:lvlJc w:val="left"/>
+      <w:pPr>
+        <w:ind w:left="6480" w:hanging="360"/>
+      </w:pPr>
+      <w:rPr>
+        <w:rFonts w:ascii="Wingdings" w:hAnsi="Wingdings" w:hint="default"/>
+      </w:rPr>
+    </w:lvl>
+  </w:abstractNum>
+  <w:abstractNum w:abstractNumId="8" w15:restartNumberingAfterBreak="0">
     <w:nsid w:val="6C9A26E8"/>
     <w:multiLevelType w:val="hybridMultilevel"/>
     <w:tmpl w:val="87BA9472"/>
@@ -10860,7 +11948,93 @@
       </w:rPr>
     </w:lvl>
   </w:abstractNum>
-  <w:abstractNum w:abstractNumId="6" w15:restartNumberingAfterBreak="0">
+  <w:abstractNum w:abstractNumId="9" w15:restartNumberingAfterBreak="0">
+    <w:nsid w:val="733C1702"/>
+    <w:multiLevelType w:val="hybridMultilevel"/>
+    <w:tmpl w:val="DB8AB832"/>
+    <w:lvl w:ilvl="0" w:tplc="0809000F">
+      <w:start w:val="1"/>
+      <w:numFmt w:val="decimal"/>
+      <w:lvlText w:val="%1."/>
+      <w:lvlJc w:val="left"/>
+      <w:pPr>
+        <w:ind w:left="720" w:hanging="360"/>
+      </w:pPr>
+    </w:lvl>
+    <w:lvl w:ilvl="1" w:tplc="08090019" w:tentative="1">
+      <w:start w:val="1"/>
+      <w:numFmt w:val="lowerLetter"/>
+      <w:lvlText w:val="%2."/>
+      <w:lvlJc w:val="left"/>
+      <w:pPr>
+        <w:ind w:left="1440" w:hanging="360"/>
+      </w:pPr>
+    </w:lvl>
+    <w:lvl w:ilvl="2" w:tplc="0809001B" w:tentative="1">
+      <w:start w:val="1"/>
+      <w:numFmt w:val="lowerRoman"/>
+      <w:lvlText w:val="%3."/>
+      <w:lvlJc w:val="right"/>
+      <w:pPr>
+        <w:ind w:left="2160" w:hanging="180"/>
+      </w:pPr>
+    </w:lvl>
+    <w:lvl w:ilvl="3" w:tplc="0809000F" w:tentative="1">
+      <w:start w:val="1"/>
+      <w:numFmt w:val="decimal"/>
+      <w:lvlText w:val="%4."/>
+      <w:lvlJc w:val="left"/>
+      <w:pPr>
+        <w:ind w:left="2880" w:hanging="360"/>
+      </w:pPr>
+    </w:lvl>
+    <w:lvl w:ilvl="4" w:tplc="08090019" w:tentative="1">
+      <w:start w:val="1"/>
+      <w:numFmt w:val="lowerLetter"/>
+      <w:lvlText w:val="%5."/>
+      <w:lvlJc w:val="left"/>
+      <w:pPr>
+        <w:ind w:left="3600" w:hanging="360"/>
+      </w:pPr>
+    </w:lvl>
+    <w:lvl w:ilvl="5" w:tplc="0809001B" w:tentative="1">
+      <w:start w:val="1"/>
+      <w:numFmt w:val="lowerRoman"/>
+      <w:lvlText w:val="%6."/>
+      <w:lvlJc w:val="right"/>
+      <w:pPr>
+        <w:ind w:left="4320" w:hanging="180"/>
+      </w:pPr>
+    </w:lvl>
+    <w:lvl w:ilvl="6" w:tplc="0809000F" w:tentative="1">
+      <w:start w:val="1"/>
+      <w:numFmt w:val="decimal"/>
+      <w:lvlText w:val="%7."/>
+      <w:lvlJc w:val="left"/>
+      <w:pPr>
+        <w:ind w:left="5040" w:hanging="360"/>
+      </w:pPr>
+    </w:lvl>
+    <w:lvl w:ilvl="7" w:tplc="08090019" w:tentative="1">
+      <w:start w:val="1"/>
+      <w:numFmt w:val="lowerLetter"/>
+      <w:lvlText w:val="%8."/>
+      <w:lvlJc w:val="left"/>
+      <w:pPr>
+        <w:ind w:left="5760" w:hanging="360"/>
+      </w:pPr>
+    </w:lvl>
+    <w:lvl w:ilvl="8" w:tplc="0809001B" w:tentative="1">
+      <w:start w:val="1"/>
+      <w:numFmt w:val="lowerRoman"/>
+      <w:lvlText w:val="%9."/>
+      <w:lvlJc w:val="right"/>
+      <w:pPr>
+        <w:ind w:left="6480" w:hanging="180"/>
+      </w:pPr>
+    </w:lvl>
+  </w:abstractNum>
+  <w:abstractNum w:abstractNumId="10" w15:restartNumberingAfterBreak="0">
     <w:nsid w:val="73776DC2"/>
     <w:multiLevelType w:val="hybridMultilevel"/>
     <w:tmpl w:val="E018A2FE"/>
@@ -10974,16 +12148,16 @@
     </w:lvl>
   </w:abstractNum>
   <w:num w:numId="1" w16cid:durableId="1017195603">
-    <w:abstractNumId w:val="4"/>
+    <w:abstractNumId w:val="5"/>
   </w:num>
   <w:num w:numId="2" w16cid:durableId="2015305648">
     <w:abstractNumId w:val="3"/>
   </w:num>
   <w:num w:numId="3" w16cid:durableId="155387266">
-    <w:abstractNumId w:val="5"/>
+    <w:abstractNumId w:val="8"/>
   </w:num>
   <w:num w:numId="4" w16cid:durableId="899709632">
-    <w:abstractNumId w:val="6"/>
+    <w:abstractNumId w:val="10"/>
   </w:num>
   <w:num w:numId="5" w16cid:durableId="708459630">
     <w:abstractNumId w:val="0"/>
@@ -10993,6 +12167,18 @@
   </w:num>
   <w:num w:numId="7" w16cid:durableId="1548642568">
     <w:abstractNumId w:val="2"/>
+  </w:num>
+  <w:num w:numId="8" w16cid:durableId="735129710">
+    <w:abstractNumId w:val="6"/>
+  </w:num>
+  <w:num w:numId="9" w16cid:durableId="982275468">
+    <w:abstractNumId w:val="7"/>
+  </w:num>
+  <w:num w:numId="10" w16cid:durableId="1518885861">
+    <w:abstractNumId w:val="4"/>
+  </w:num>
+  <w:num w:numId="11" w16cid:durableId="1438520060">
+    <w:abstractNumId w:val="9"/>
   </w:num>
 </w:numbering>
 </file>
@@ -12307,6 +13493,10 @@
 </file>
 
 <file path=customXml/item1.xml><?xml version="1.0" encoding="utf-8"?>
+<b:Sources xmlns:b="http://schemas.openxmlformats.org/officeDocument/2006/bibliography" xmlns="http://schemas.openxmlformats.org/officeDocument/2006/bibliography" SelectedStyle="/APA.XSL" StyleName="APA"/>
+</file>
+
+<file path=customXml/item2.xml><?xml version="1.0" encoding="utf-8"?>
 <?mso-contentType ?>
 <FormTemplates xmlns="http://schemas.microsoft.com/sharepoint/v3/contenttype/forms">
   <Display>DocumentLibraryForm</Display>
@@ -12315,11 +13505,22 @@
 </FormTemplates>
 </file>
 
-<file path=customXml/item2.xml><?xml version="1.0" encoding="utf-8"?>
-<b:Sources xmlns:b="http://schemas.openxmlformats.org/officeDocument/2006/bibliography" xmlns="http://schemas.openxmlformats.org/officeDocument/2006/bibliography" SelectedStyle="/APA.XSL" StyleName="APA"/>
+<file path=customXml/item3.xml><?xml version="1.0" encoding="utf-8"?>
+<p:properties xmlns:p="http://schemas.microsoft.com/office/2006/metadata/properties" xmlns:xsi="http://www.w3.org/2001/XMLSchema-instance" xmlns:pc="http://schemas.microsoft.com/office/infopath/2007/PartnerControls">
+  <documentManagement>
+    <lcf76f155ced4ddcb4097134ff3c332f xmlns="3ca5950f-9dc6-4fa2-8e6b-e8b0d1a55fc5">
+      <Terms xmlns="http://schemas.microsoft.com/office/infopath/2007/PartnerControls"/>
+    </lcf76f155ced4ddcb4097134ff3c332f>
+    <link xmlns="3ca5950f-9dc6-4fa2-8e6b-e8b0d1a55fc5">
+      <Url xsi:nil="true"/>
+      <Description xsi:nil="true"/>
+    </link>
+    <TaxCatchAll xmlns="da5699a2-2791-44c0-bb0a-d0c081c141e6" xsi:nil="true"/>
+  </documentManagement>
+</p:properties>
 </file>
 
-<file path=customXml/item3.xml><?xml version="1.0" encoding="utf-8"?>
+<file path=customXml/item4.xml><?xml version="1.0" encoding="utf-8"?>
 <ct:contentTypeSchema xmlns:ct="http://schemas.microsoft.com/office/2006/metadata/contentType" xmlns:ma="http://schemas.microsoft.com/office/2006/metadata/properties/metaAttributes" ct:_="" ma:_="" ma:contentTypeName="Document" ma:contentTypeID="0x0101001BC1D44B3665304E9EFFB6B26E5C1EDB" ma:contentTypeVersion="17" ma:contentTypeDescription="Create a new document." ma:contentTypeScope="" ma:versionID="ebe7ffaa3beae6c2692551344dbac989">
   <xsd:schema xmlns:xsd="http://www.w3.org/2001/XMLSchema" xmlns:xs="http://www.w3.org/2001/XMLSchema" xmlns:p="http://schemas.microsoft.com/office/2006/metadata/properties" xmlns:ns2="3ca5950f-9dc6-4fa2-8e6b-e8b0d1a55fc5" xmlns:ns3="da5699a2-2791-44c0-bb0a-d0c081c141e6" targetNamespace="http://schemas.microsoft.com/office/2006/metadata/properties" ma:root="true" ma:fieldsID="fbc6f3879e7a0016066cbb62231de351" ns2:_="" ns3:_="">
     <xsd:import namespace="3ca5950f-9dc6-4fa2-8e6b-e8b0d1a55fc5"/>
@@ -12575,22 +13776,15 @@
 </ct:contentTypeSchema>
 </file>
 
-<file path=customXml/item4.xml><?xml version="1.0" encoding="utf-8"?>
-<p:properties xmlns:p="http://schemas.microsoft.com/office/2006/metadata/properties" xmlns:xsi="http://www.w3.org/2001/XMLSchema-instance" xmlns:pc="http://schemas.microsoft.com/office/infopath/2007/PartnerControls">
-  <documentManagement>
-    <lcf76f155ced4ddcb4097134ff3c332f xmlns="3ca5950f-9dc6-4fa2-8e6b-e8b0d1a55fc5">
-      <Terms xmlns="http://schemas.microsoft.com/office/infopath/2007/PartnerControls"/>
-    </lcf76f155ced4ddcb4097134ff3c332f>
-    <link xmlns="3ca5950f-9dc6-4fa2-8e6b-e8b0d1a55fc5">
-      <Url xsi:nil="true"/>
-      <Description xsi:nil="true"/>
-    </link>
-    <TaxCatchAll xmlns="da5699a2-2791-44c0-bb0a-d0c081c141e6" xsi:nil="true"/>
-  </documentManagement>
-</p:properties>
+<file path=customXml/itemProps1.xml><?xml version="1.0" encoding="utf-8"?>
+<ds:datastoreItem xmlns:ds="http://schemas.openxmlformats.org/officeDocument/2006/customXml" ds:itemID="{191EA17E-4FF3-6543-9328-B87A43C2CF01}">
+  <ds:schemaRefs>
+    <ds:schemaRef ds:uri="http://schemas.openxmlformats.org/officeDocument/2006/bibliography"/>
+  </ds:schemaRefs>
+</ds:datastoreItem>
 </file>
 
-<file path=customXml/itemProps1.xml><?xml version="1.0" encoding="utf-8"?>
+<file path=customXml/itemProps2.xml><?xml version="1.0" encoding="utf-8"?>
 <ds:datastoreItem xmlns:ds="http://schemas.openxmlformats.org/officeDocument/2006/customXml" ds:itemID="{CE597715-63E8-4A9F-B3CC-57F27D3DCBFB}">
   <ds:schemaRefs>
     <ds:schemaRef ds:uri="http://schemas.microsoft.com/sharepoint/v3/contenttype/forms"/>
@@ -12598,15 +13792,18 @@
 </ds:datastoreItem>
 </file>
 
-<file path=customXml/itemProps2.xml><?xml version="1.0" encoding="utf-8"?>
-<ds:datastoreItem xmlns:ds="http://schemas.openxmlformats.org/officeDocument/2006/customXml" ds:itemID="{191EA17E-4FF3-6543-9328-B87A43C2CF01}">
+<file path=customXml/itemProps3.xml><?xml version="1.0" encoding="utf-8"?>
+<ds:datastoreItem xmlns:ds="http://schemas.openxmlformats.org/officeDocument/2006/customXml" ds:itemID="{37169F2F-1A49-4A9E-A13A-BBD6F4DE6A1B}">
   <ds:schemaRefs>
-    <ds:schemaRef ds:uri="http://schemas.openxmlformats.org/officeDocument/2006/bibliography"/>
+    <ds:schemaRef ds:uri="http://schemas.microsoft.com/office/2006/metadata/properties"/>
+    <ds:schemaRef ds:uri="http://schemas.microsoft.com/office/infopath/2007/PartnerControls"/>
+    <ds:schemaRef ds:uri="3ca5950f-9dc6-4fa2-8e6b-e8b0d1a55fc5"/>
+    <ds:schemaRef ds:uri="da5699a2-2791-44c0-bb0a-d0c081c141e6"/>
   </ds:schemaRefs>
 </ds:datastoreItem>
 </file>
 
-<file path=customXml/itemProps3.xml><?xml version="1.0" encoding="utf-8"?>
+<file path=customXml/itemProps4.xml><?xml version="1.0" encoding="utf-8"?>
 <ds:datastoreItem xmlns:ds="http://schemas.openxmlformats.org/officeDocument/2006/customXml" ds:itemID="{F6547193-3E93-40A7-96AB-43C0DF37402B}">
   <ds:schemaRefs>
     <ds:schemaRef ds:uri="http://schemas.microsoft.com/office/2006/metadata/contentType"/>
@@ -12623,15 +13820,4 @@
     <ds:schemaRef ds:uri="http://schemas.microsoft.com/internal/obd"/>
   </ds:schemaRefs>
 </ds:datastoreItem>
-</file>
-
-<file path=customXml/itemProps4.xml><?xml version="1.0" encoding="utf-8"?>
-<ds:datastoreItem xmlns:ds="http://schemas.openxmlformats.org/officeDocument/2006/customXml" ds:itemID="{37169F2F-1A49-4A9E-A13A-BBD6F4DE6A1B}">
-  <ds:schemaRefs>
-    <ds:schemaRef ds:uri="http://schemas.microsoft.com/office/2006/metadata/properties"/>
-    <ds:schemaRef ds:uri="http://schemas.microsoft.com/office/infopath/2007/PartnerControls"/>
-    <ds:schemaRef ds:uri="3ca5950f-9dc6-4fa2-8e6b-e8b0d1a55fc5"/>
-    <ds:schemaRef ds:uri="da5699a2-2791-44c0-bb0a-d0c081c141e6"/>
-  </ds:schemaRefs>
-</ds:datastoreItem>
 </file>
</xml_diff>

<commit_message>
Dissertation changes and iteration 2 videos sorted
</commit_message>
<xml_diff>
--- a/Dis Report.docx
+++ b/Dis Report.docx
@@ -218,7 +218,7 @@
                         <a:effectLst/>
                         <a:extLst>
                           <a:ext uri="{C572A759-6A51-4108-AA02-DFA0A04FC94B}">
-                            <ma14:wrappingTextBoxFlag xmlns:ma14="http://schemas.microsoft.com/office/mac/drawingml/2011/main" xmlns:w="http://schemas.openxmlformats.org/wordprocessingml/2006/main" xmlns:w10="urn:schemas-microsoft-com:office:word" xmlns:v="urn:schemas-microsoft-com:vml" xmlns:o="urn:schemas-microsoft-com:office:office" xmlns:mv="urn:schemas-microsoft-com:mac:vml" xmlns:mo="http://schemas.microsoft.com/office/mac/office/2008/main" xmlns=""/>
+                            <ma14:wrappingTextBoxFlag xmlns="" xmlns:mo="http://schemas.microsoft.com/office/mac/office/2008/main" xmlns:mv="urn:schemas-microsoft-com:mac:vml" xmlns:o="urn:schemas-microsoft-com:office:office" xmlns:v="urn:schemas-microsoft-com:vml" xmlns:w10="urn:schemas-microsoft-com:office:word" xmlns:w="http://schemas.openxmlformats.org/wordprocessingml/2006/main" xmlns:ma14="http://schemas.microsoft.com/office/mac/drawingml/2011/main"/>
                           </a:ext>
                         </a:extLst>
                       </wps:spPr>
@@ -247,45 +247,51 @@
                                 <w:szCs w:val="20"/>
                               </w:rPr>
                             </w:pPr>
+                          </w:p>
+                          <w:p>
                             <w:r>
                               <w:rPr>
-                                <w:rFonts w:ascii="Arial" w:hAnsi="Arial"/>
-                                <w:i/>
-                                <w:sz w:val="20"/>
-                                <w:szCs w:val="20"/>
+                                <w:noProof/>
                               </w:rPr>
-                              <w:t>Screenshot/ image of the work (600 pixels high x 800 pixels wide .jpg</w:t>
-                            </w:r>
-                            <w:r>
-                              <w:rPr>
-                                <w:rFonts w:ascii="Arial" w:hAnsi="Arial"/>
-                                <w:i/>
-                                <w:sz w:val="20"/>
-                                <w:szCs w:val="20"/>
-                              </w:rPr>
-                              <w:t>)</w:t>
-                            </w:r>
-                            <w:r>
-                              <w:rPr>
-                                <w:rFonts w:ascii="Arial" w:hAnsi="Arial"/>
-                                <w:i/>
-                                <w:sz w:val="20"/>
-                                <w:szCs w:val="20"/>
-                              </w:rPr>
-                              <w:br/>
-                              <w:t>This image may be used for the degree show booklet. For white backgrounds please use 1/2pt black border.</w:t>
-                            </w:r>
-                            <w:r>
-                              <w:rPr>
-                                <w:rFonts w:ascii="Arial" w:hAnsi="Arial"/>
-                                <w:i/>
-                                <w:sz w:val="20"/>
-                                <w:szCs w:val="20"/>
-                              </w:rPr>
-                              <w:br/>
+                              <w:drawing>
+                                <wp:inline distT="0" distB="0" distL="0" distR="0" wp14:anchorId="5B404D9B" wp14:editId="6FADD405">
+                                  <wp:extent cx="2694305" cy="3393440"/>
+                                  <wp:effectExtent l="0" t="0" r="0" b="0"/>
+                                  <wp:docPr id="667483272" name="Picture 1" descr="A screenshot of a video game&#10;&#10;AI-generated content may be incorrect."/>
+                                  <wp:cNvGraphicFramePr>
+                                    <a:graphicFrameLocks xmlns:a="http://schemas.openxmlformats.org/drawingml/2006/main" noChangeAspect="1"/>
+                                  </wp:cNvGraphicFramePr>
+                                  <a:graphic xmlns:a="http://schemas.openxmlformats.org/drawingml/2006/main">
+                                    <a:graphicData uri="http://schemas.openxmlformats.org/drawingml/2006/picture">
+                                      <pic:pic xmlns:pic="http://schemas.openxmlformats.org/drawingml/2006/picture">
+                                        <pic:nvPicPr>
+                                          <pic:cNvPr id="667483272" name="Picture 1" descr="A screenshot of a video game&#10;&#10;AI-generated content may be incorrect."/>
+                                          <pic:cNvPicPr>
+                                            <a:picLocks noChangeAspect="1"/>
+                                          </pic:cNvPicPr>
+                                        </pic:nvPicPr>
+                                        <pic:blipFill>
+                                          <a:blip r:embed="rId12"/>
+                                          <a:stretch>
+                                            <a:fillRect/>
+                                          </a:stretch>
+                                        </pic:blipFill>
+                                        <pic:spPr>
+                                          <a:xfrm>
+                                            <a:off x="0" y="0"/>
+                                            <a:ext cx="2694305" cy="3393440"/>
+                                          </a:xfrm>
+                                          <a:prstGeom prst="rect">
+                                            <a:avLst/>
+                                          </a:prstGeom>
+                                        </pic:spPr>
+                                      </pic:pic>
+                                    </a:graphicData>
+                                  </a:graphic>
+                                </wp:inline>
+                              </w:drawing>
                             </w:r>
                           </w:p>
-                          <w:p/>
                         </w:txbxContent>
                       </wps:txbx>
                       <wps:bodyPr rot="0" spcFirstLastPara="0" vertOverflow="overflow" horzOverflow="overflow" vert="horz" wrap="square" lIns="91440" tIns="45720" rIns="91440" bIns="45720" numCol="1" spcCol="0" rtlCol="0" fromWordArt="0" anchor="t" anchorCtr="0" forceAA="0" compatLnSpc="1">
@@ -321,45 +327,51 @@
                           <w:szCs w:val="20"/>
                         </w:rPr>
                       </w:pPr>
+                    </w:p>
+                    <w:p>
                       <w:r>
                         <w:rPr>
-                          <w:rFonts w:ascii="Arial" w:hAnsi="Arial"/>
-                          <w:i/>
-                          <w:sz w:val="20"/>
-                          <w:szCs w:val="20"/>
+                          <w:noProof/>
                         </w:rPr>
-                        <w:t>Screenshot/ image of the work (600 pixels high x 800 pixels wide .jpg</w:t>
-                      </w:r>
-                      <w:r>
-                        <w:rPr>
-                          <w:rFonts w:ascii="Arial" w:hAnsi="Arial"/>
-                          <w:i/>
-                          <w:sz w:val="20"/>
-                          <w:szCs w:val="20"/>
-                        </w:rPr>
-                        <w:t>)</w:t>
-                      </w:r>
-                      <w:r>
-                        <w:rPr>
-                          <w:rFonts w:ascii="Arial" w:hAnsi="Arial"/>
-                          <w:i/>
-                          <w:sz w:val="20"/>
-                          <w:szCs w:val="20"/>
-                        </w:rPr>
-                        <w:br/>
-                        <w:t>This image may be used for the degree show booklet. For white backgrounds please use 1/2pt black border.</w:t>
-                      </w:r>
-                      <w:r>
-                        <w:rPr>
-                          <w:rFonts w:ascii="Arial" w:hAnsi="Arial"/>
-                          <w:i/>
-                          <w:sz w:val="20"/>
-                          <w:szCs w:val="20"/>
-                        </w:rPr>
-                        <w:br/>
+                        <w:drawing>
+                          <wp:inline distT="0" distB="0" distL="0" distR="0" wp14:anchorId="5B404D9B" wp14:editId="6FADD405">
+                            <wp:extent cx="2694305" cy="3393440"/>
+                            <wp:effectExtent l="0" t="0" r="0" b="0"/>
+                            <wp:docPr id="667483272" name="Picture 1" descr="A screenshot of a video game&#10;&#10;AI-generated content may be incorrect."/>
+                            <wp:cNvGraphicFramePr>
+                              <a:graphicFrameLocks xmlns:a="http://schemas.openxmlformats.org/drawingml/2006/main" noChangeAspect="1"/>
+                            </wp:cNvGraphicFramePr>
+                            <a:graphic xmlns:a="http://schemas.openxmlformats.org/drawingml/2006/main">
+                              <a:graphicData uri="http://schemas.openxmlformats.org/drawingml/2006/picture">
+                                <pic:pic xmlns:pic="http://schemas.openxmlformats.org/drawingml/2006/picture">
+                                  <pic:nvPicPr>
+                                    <pic:cNvPr id="667483272" name="Picture 1" descr="A screenshot of a video game&#10;&#10;AI-generated content may be incorrect."/>
+                                    <pic:cNvPicPr>
+                                      <a:picLocks noChangeAspect="1"/>
+                                    </pic:cNvPicPr>
+                                  </pic:nvPicPr>
+                                  <pic:blipFill>
+                                    <a:blip r:embed="rId12"/>
+                                    <a:stretch>
+                                      <a:fillRect/>
+                                    </a:stretch>
+                                  </pic:blipFill>
+                                  <pic:spPr>
+                                    <a:xfrm>
+                                      <a:off x="0" y="0"/>
+                                      <a:ext cx="2694305" cy="3393440"/>
+                                    </a:xfrm>
+                                    <a:prstGeom prst="rect">
+                                      <a:avLst/>
+                                    </a:prstGeom>
+                                  </pic:spPr>
+                                </pic:pic>
+                              </a:graphicData>
+                            </a:graphic>
+                          </wp:inline>
+                        </w:drawing>
                       </w:r>
                     </w:p>
-                    <w:p/>
                   </w:txbxContent>
                 </v:textbox>
                 <w10:wrap type="square"/>
@@ -1417,10 +1429,10 @@
           <w:szCs w:val="20"/>
         </w:rPr>
         <w:sectPr>
-          <w:headerReference w:type="even" r:id="rId12"/>
-          <w:headerReference w:type="default" r:id="rId13"/>
-          <w:footerReference w:type="default" r:id="rId14"/>
-          <w:headerReference w:type="first" r:id="rId15"/>
+          <w:headerReference w:type="even" r:id="rId13"/>
+          <w:headerReference w:type="default" r:id="rId14"/>
+          <w:footerReference w:type="default" r:id="rId15"/>
+          <w:headerReference w:type="first" r:id="rId16"/>
           <w:pgSz w:w="11900" w:h="16840"/>
           <w:pgMar w:top="1440" w:right="1080" w:bottom="1440" w:left="1080" w:header="708" w:footer="708" w:gutter="0"/>
           <w:cols w:space="708"/>
@@ -4828,7 +4840,7 @@
         </w:rPr>
         <w:t xml:space="preserve">If you are new to UWE Bristol Harvard referencing please read the </w:t>
       </w:r>
-      <w:hyperlink r:id="rId16" w:history="1">
+      <w:hyperlink r:id="rId17" w:history="1">
         <w:r>
           <w:rPr>
             <w:rStyle w:val="Hyperlink"/>
@@ -4849,7 +4861,7 @@
         </w:rPr>
         <w:t xml:space="preserve">. Click here for </w:t>
       </w:r>
-      <w:hyperlink r:id="rId17" w:history="1">
+      <w:hyperlink r:id="rId18" w:history="1">
         <w:r>
           <w:rPr>
             <w:rStyle w:val="Hyperlink"/>
@@ -4870,7 +4882,7 @@
         </w:rPr>
         <w:t xml:space="preserve">. Also here for </w:t>
       </w:r>
-      <w:hyperlink r:id="rId18" w:history="1">
+      <w:hyperlink r:id="rId19" w:history="1">
         <w:r>
           <w:rPr>
             <w:rStyle w:val="Hyperlink"/>
@@ -4891,7 +4903,7 @@
         </w:rPr>
         <w:t xml:space="preserve"> (includes when to use quotation marks). Follow guidance here on how to reference the following: </w:t>
       </w:r>
-      <w:hyperlink r:id="rId19" w:anchor="books" w:history="1">
+      <w:hyperlink r:id="rId20" w:anchor="books" w:history="1">
         <w:r>
           <w:rPr>
             <w:rStyle w:val="Hyperlink"/>
@@ -4912,7 +4924,7 @@
         </w:rPr>
         <w:t>, </w:t>
       </w:r>
-      <w:hyperlink r:id="rId20" w:anchor="journalarticles" w:history="1">
+      <w:hyperlink r:id="rId21" w:anchor="journalarticles" w:history="1">
         <w:r>
           <w:rPr>
             <w:rStyle w:val="Hyperlink"/>
@@ -4952,7 +4964,7 @@
         </w:rPr>
         <w:t>, </w:t>
       </w:r>
-      <w:hyperlink r:id="rId21" w:anchor="films" w:history="1">
+      <w:hyperlink r:id="rId22" w:anchor="films" w:history="1">
         <w:r>
           <w:rPr>
             <w:rStyle w:val="Hyperlink"/>
@@ -4982,7 +4994,7 @@
         </w:rPr>
         <w:t> </w:t>
       </w:r>
-      <w:hyperlink r:id="rId22" w:anchor="television" w:history="1">
+      <w:hyperlink r:id="rId23" w:anchor="television" w:history="1">
         <w:r>
           <w:rPr>
             <w:rStyle w:val="Hyperlink"/>
@@ -5003,7 +5015,7 @@
         </w:rPr>
         <w:t xml:space="preserve">, </w:t>
       </w:r>
-      <w:hyperlink r:id="rId23" w:anchor="imagesandillustrations" w:history="1">
+      <w:hyperlink r:id="rId24" w:anchor="imagesandillustrations" w:history="1">
         <w:r>
           <w:rPr>
             <w:rStyle w:val="Hyperlink"/>
@@ -5024,7 +5036,7 @@
         </w:rPr>
         <w:t xml:space="preserve">, </w:t>
       </w:r>
-      <w:hyperlink r:id="rId24" w:anchor="officialpublications" w:history="1">
+      <w:hyperlink r:id="rId25" w:anchor="officialpublications" w:history="1">
         <w:r>
           <w:rPr>
             <w:rStyle w:val="Hyperlink"/>
@@ -5045,7 +5057,7 @@
         </w:rPr>
         <w:t xml:space="preserve">, </w:t>
       </w:r>
-      <w:hyperlink r:id="rId25" w:anchor="webpages" w:history="1">
+      <w:hyperlink r:id="rId26" w:anchor="webpages" w:history="1">
         <w:r>
           <w:rPr>
             <w:rStyle w:val="Hyperlink"/>
@@ -6399,7 +6411,29 @@
           <w:sz w:val="18"/>
           <w:szCs w:val="18"/>
         </w:rPr>
-        <w:t>5.1 Initial Artifct Development</w:t>
+        <w:t>5.1</w:t>
+      </w:r>
+      <w:r>
+        <w:rPr>
+          <w:rFonts w:ascii="Verdana" w:hAnsi="Verdana"/>
+          <w:b/>
+          <w:bCs/>
+          <w:noProof/>
+          <w:sz w:val="18"/>
+          <w:szCs w:val="18"/>
+        </w:rPr>
+        <w:t>.1</w:t>
+      </w:r>
+      <w:r>
+        <w:rPr>
+          <w:rFonts w:ascii="Verdana" w:hAnsi="Verdana"/>
+          <w:b/>
+          <w:bCs/>
+          <w:noProof/>
+          <w:sz w:val="18"/>
+          <w:szCs w:val="18"/>
+        </w:rPr>
+        <w:t xml:space="preserve"> Initial Artifct Development</w:t>
       </w:r>
     </w:p>
     <w:p>
@@ -6407,70 +6441,179 @@
         <w:jc w:val="both"/>
         <w:rPr>
           <w:rFonts w:ascii="Verdana" w:hAnsi="Verdana"/>
-          <w:sz w:val="18"/>
-          <w:szCs w:val="18"/>
-        </w:rPr>
-      </w:pPr>
-      <w:r>
-        <w:rPr>
-          <w:rFonts w:ascii="Verdana" w:hAnsi="Verdana"/>
-          <w:sz w:val="18"/>
-          <w:szCs w:val="18"/>
-        </w:rPr>
-        <w:t xml:space="preserve">The artifact is a 2D side scroller with some verticality similar to the likes of Mario (Nintendo, ) </w:t>
-      </w:r>
-    </w:p>
-    <w:p>
-      <w:pPr>
-        <w:ind w:left="360"/>
+          <w:b/>
+          <w:bCs/>
+          <w:noProof/>
+          <w:sz w:val="18"/>
+          <w:szCs w:val="18"/>
+        </w:rPr>
+      </w:pPr>
+    </w:p>
+    <w:p>
+      <w:pPr>
         <w:jc w:val="both"/>
         <w:rPr>
           <w:rFonts w:ascii="Verdana" w:hAnsi="Verdana"/>
-          <w:sz w:val="18"/>
-          <w:szCs w:val="18"/>
-        </w:rPr>
-      </w:pPr>
+          <w:b/>
+          <w:bCs/>
+          <w:noProof/>
+          <w:sz w:val="18"/>
+          <w:szCs w:val="18"/>
+        </w:rPr>
+      </w:pPr>
+      <w:r>
+        <w:rPr>
+          <w:rFonts w:ascii="Verdana" w:hAnsi="Verdana"/>
+          <w:b/>
+          <w:bCs/>
+          <w:noProof/>
+          <w:sz w:val="18"/>
+          <w:szCs w:val="18"/>
+        </w:rPr>
+        <w:t>5.1.2</w:t>
+      </w:r>
     </w:p>
     <w:p>
       <w:pPr>
         <w:jc w:val="both"/>
         <w:rPr>
           <w:rFonts w:ascii="Verdana" w:hAnsi="Verdana"/>
-          <w:sz w:val="18"/>
-          <w:szCs w:val="18"/>
-        </w:rPr>
-      </w:pPr>
+          <w:noProof/>
+          <w:sz w:val="18"/>
+          <w:szCs w:val="18"/>
+        </w:rPr>
+      </w:pPr>
+      <w:r>
+        <w:rPr>
+          <w:rFonts w:ascii="Verdana" w:hAnsi="Verdana"/>
+          <w:bCs/>
+          <w:noProof/>
+          <w:sz w:val="18"/>
+          <w:szCs w:val="18"/>
+        </w:rPr>
+        <w:t>------------------------------------------------------</w:t>
+      </w:r>
     </w:p>
     <w:p>
       <w:pPr>
         <w:jc w:val="both"/>
         <w:rPr>
           <w:rFonts w:ascii="Verdana" w:hAnsi="Verdana"/>
-          <w:sz w:val="18"/>
-          <w:szCs w:val="18"/>
-        </w:rPr>
-      </w:pPr>
+          <w:color w:val="FF0000"/>
+          <w:sz w:val="18"/>
+          <w:szCs w:val="18"/>
+        </w:rPr>
+      </w:pPr>
+      <w:r>
+        <w:rPr>
+          <w:rFonts w:ascii="Verdana" w:hAnsi="Verdana"/>
+          <w:color w:val="FF0000"/>
+          <w:sz w:val="18"/>
+          <w:szCs w:val="18"/>
+        </w:rPr>
+        <w:t>Now we have arrived at the practice section</w:t>
+      </w:r>
+      <w:r>
+        <w:rPr>
+          <w:rFonts w:ascii="Verdana" w:hAnsi="Verdana"/>
+          <w:color w:val="FF0000"/>
+          <w:sz w:val="18"/>
+          <w:szCs w:val="18"/>
+        </w:rPr>
+        <w:t>, the biggest part of th</w:t>
+      </w:r>
+      <w:r>
+        <w:rPr>
+          <w:rFonts w:ascii="Verdana" w:hAnsi="Verdana"/>
+          <w:color w:val="FF0000"/>
+          <w:sz w:val="18"/>
+          <w:szCs w:val="18"/>
+        </w:rPr>
+        <w:t>is</w:t>
+      </w:r>
+      <w:r>
+        <w:rPr>
+          <w:rFonts w:ascii="Verdana" w:hAnsi="Verdana"/>
+          <w:color w:val="FF0000"/>
+          <w:sz w:val="18"/>
+          <w:szCs w:val="18"/>
+        </w:rPr>
+        <w:t xml:space="preserve"> report</w:t>
+      </w:r>
+      <w:r>
+        <w:rPr>
+          <w:rFonts w:ascii="Verdana" w:hAnsi="Verdana"/>
+          <w:color w:val="FF0000"/>
+          <w:sz w:val="18"/>
+          <w:szCs w:val="18"/>
+        </w:rPr>
+        <w:t xml:space="preserve">. </w:t>
+      </w:r>
+      <w:r>
+        <w:rPr>
+          <w:rFonts w:ascii="Verdana" w:hAnsi="Verdana"/>
+          <w:color w:val="FF0000"/>
+          <w:sz w:val="18"/>
+          <w:szCs w:val="18"/>
+        </w:rPr>
+        <w:t>Here you g</w:t>
+      </w:r>
+      <w:r>
+        <w:rPr>
+          <w:rFonts w:ascii="Verdana" w:hAnsi="Verdana"/>
+          <w:color w:val="FF0000"/>
+          <w:sz w:val="18"/>
+          <w:szCs w:val="18"/>
+        </w:rPr>
+        <w:t xml:space="preserve">uide </w:t>
+      </w:r>
+      <w:r>
+        <w:rPr>
+          <w:rFonts w:ascii="Verdana" w:hAnsi="Verdana"/>
+          <w:color w:val="FF0000"/>
+          <w:sz w:val="18"/>
+          <w:szCs w:val="18"/>
+        </w:rPr>
+        <w:t>the reader</w:t>
+      </w:r>
+      <w:r>
+        <w:rPr>
+          <w:rFonts w:ascii="Verdana" w:hAnsi="Verdana"/>
+          <w:color w:val="FF0000"/>
+          <w:sz w:val="18"/>
+          <w:szCs w:val="18"/>
+        </w:rPr>
+        <w:t xml:space="preserve"> through the practical implementation</w:t>
+      </w:r>
+      <w:r>
+        <w:rPr>
+          <w:rFonts w:ascii="Verdana" w:hAnsi="Verdana"/>
+          <w:color w:val="FF0000"/>
+          <w:sz w:val="18"/>
+          <w:szCs w:val="18"/>
+        </w:rPr>
+        <w:t xml:space="preserve"> stages</w:t>
+      </w:r>
+      <w:r>
+        <w:rPr>
+          <w:rFonts w:ascii="Verdana" w:hAnsi="Verdana"/>
+          <w:color w:val="FF0000"/>
+          <w:sz w:val="18"/>
+          <w:szCs w:val="18"/>
+        </w:rPr>
+        <w:t xml:space="preserve"> of your project. </w:t>
+      </w:r>
     </w:p>
     <w:p>
       <w:pPr>
         <w:jc w:val="both"/>
         <w:rPr>
           <w:rFonts w:ascii="Verdana" w:hAnsi="Verdana"/>
-          <w:noProof/>
-          <w:sz w:val="18"/>
-          <w:szCs w:val="18"/>
-        </w:rPr>
-      </w:pPr>
-      <w:r>
-        <w:rPr>
-          <w:rFonts w:ascii="Verdana" w:hAnsi="Verdana"/>
-          <w:bCs/>
-          <w:noProof/>
-          <w:sz w:val="18"/>
-          <w:szCs w:val="18"/>
-        </w:rPr>
-        <w:t>------------------------------------------------------</w:t>
-      </w:r>
+          <w:color w:val="FF0000"/>
+          <w:sz w:val="18"/>
+          <w:szCs w:val="18"/>
+        </w:rPr>
+      </w:pPr>
     </w:p>
     <w:p>
       <w:pPr>
@@ -6489,34 +6632,34 @@
           <w:sz w:val="18"/>
           <w:szCs w:val="18"/>
         </w:rPr>
-        <w:t>Now we have arrived at the practice section</w:t>
-      </w:r>
-      <w:r>
-        <w:rPr>
-          <w:rFonts w:ascii="Verdana" w:hAnsi="Verdana"/>
-          <w:color w:val="FF0000"/>
-          <w:sz w:val="18"/>
-          <w:szCs w:val="18"/>
-        </w:rPr>
-        <w:t>, the biggest part of th</w:t>
-      </w:r>
-      <w:r>
-        <w:rPr>
-          <w:rFonts w:ascii="Verdana" w:hAnsi="Verdana"/>
-          <w:color w:val="FF0000"/>
-          <w:sz w:val="18"/>
-          <w:szCs w:val="18"/>
-        </w:rPr>
-        <w:t>is</w:t>
-      </w:r>
-      <w:r>
-        <w:rPr>
-          <w:rFonts w:ascii="Verdana" w:hAnsi="Verdana"/>
-          <w:color w:val="FF0000"/>
-          <w:sz w:val="18"/>
-          <w:szCs w:val="18"/>
-        </w:rPr>
-        <w:t xml:space="preserve"> report</w:t>
+        <w:t>D</w:t>
+      </w:r>
+      <w:r>
+        <w:rPr>
+          <w:rFonts w:ascii="Verdana" w:hAnsi="Verdana"/>
+          <w:color w:val="FF0000"/>
+          <w:sz w:val="18"/>
+          <w:szCs w:val="18"/>
+        </w:rPr>
+        <w:t>o</w:t>
+      </w:r>
+      <w:r>
+        <w:rPr>
+          <w:rFonts w:ascii="Verdana" w:hAnsi="Verdana"/>
+          <w:color w:val="FF0000"/>
+          <w:sz w:val="18"/>
+          <w:szCs w:val="18"/>
+        </w:rPr>
+        <w:t xml:space="preserve"> not describe every</w:t>
+      </w:r>
+      <w:r>
+        <w:rPr>
+          <w:rFonts w:ascii="Verdana" w:hAnsi="Verdana"/>
+          <w:color w:val="FF0000"/>
+          <w:sz w:val="18"/>
+          <w:szCs w:val="18"/>
+        </w:rPr>
+        <w:t xml:space="preserve"> detail</w:t>
       </w:r>
       <w:r>
         <w:rPr>
@@ -6534,52 +6677,160 @@
           <w:sz w:val="18"/>
           <w:szCs w:val="18"/>
         </w:rPr>
-        <w:t>Here you g</w:t>
-      </w:r>
-      <w:r>
-        <w:rPr>
-          <w:rFonts w:ascii="Verdana" w:hAnsi="Verdana"/>
-          <w:color w:val="FF0000"/>
-          <w:sz w:val="18"/>
-          <w:szCs w:val="18"/>
-        </w:rPr>
-        <w:t xml:space="preserve">uide </w:t>
-      </w:r>
-      <w:r>
-        <w:rPr>
-          <w:rFonts w:ascii="Verdana" w:hAnsi="Verdana"/>
-          <w:color w:val="FF0000"/>
-          <w:sz w:val="18"/>
-          <w:szCs w:val="18"/>
-        </w:rPr>
-        <w:t>the reader</w:t>
-      </w:r>
-      <w:r>
-        <w:rPr>
-          <w:rFonts w:ascii="Verdana" w:hAnsi="Verdana"/>
-          <w:color w:val="FF0000"/>
-          <w:sz w:val="18"/>
-          <w:szCs w:val="18"/>
-        </w:rPr>
-        <w:t xml:space="preserve"> through the practical implementation</w:t>
-      </w:r>
-      <w:r>
-        <w:rPr>
-          <w:rFonts w:ascii="Verdana" w:hAnsi="Verdana"/>
-          <w:color w:val="FF0000"/>
-          <w:sz w:val="18"/>
-          <w:szCs w:val="18"/>
-        </w:rPr>
-        <w:t xml:space="preserve"> stages</w:t>
-      </w:r>
-      <w:r>
-        <w:rPr>
-          <w:rFonts w:ascii="Verdana" w:hAnsi="Verdana"/>
-          <w:color w:val="FF0000"/>
-          <w:sz w:val="18"/>
-          <w:szCs w:val="18"/>
-        </w:rPr>
-        <w:t xml:space="preserve"> of your project. </w:t>
+        <w:t xml:space="preserve">Instead, </w:t>
+      </w:r>
+      <w:r>
+        <w:rPr>
+          <w:rFonts w:ascii="Verdana" w:hAnsi="Verdana"/>
+          <w:color w:val="FF0000"/>
+          <w:sz w:val="18"/>
+          <w:szCs w:val="18"/>
+        </w:rPr>
+        <w:t>t</w:t>
+      </w:r>
+      <w:r>
+        <w:rPr>
+          <w:rFonts w:ascii="Verdana" w:hAnsi="Verdana"/>
+          <w:color w:val="FF0000"/>
+          <w:sz w:val="18"/>
+          <w:szCs w:val="18"/>
+        </w:rPr>
+        <w:t xml:space="preserve">ry to put together an insightful </w:t>
+      </w:r>
+      <w:r>
+        <w:rPr>
+          <w:rFonts w:ascii="Verdana" w:hAnsi="Verdana"/>
+          <w:color w:val="FF0000"/>
+          <w:sz w:val="18"/>
+          <w:szCs w:val="18"/>
+        </w:rPr>
+        <w:t xml:space="preserve">and focused </w:t>
+      </w:r>
+      <w:r>
+        <w:rPr>
+          <w:rFonts w:ascii="Verdana" w:hAnsi="Verdana"/>
+          <w:color w:val="FF0000"/>
+          <w:sz w:val="18"/>
+          <w:szCs w:val="18"/>
+        </w:rPr>
+        <w:t>discussion by</w:t>
+      </w:r>
+      <w:r>
+        <w:rPr>
+          <w:rFonts w:ascii="Verdana" w:hAnsi="Verdana"/>
+          <w:color w:val="FF0000"/>
+          <w:sz w:val="18"/>
+          <w:szCs w:val="18"/>
+        </w:rPr>
+        <w:t xml:space="preserve"> </w:t>
+      </w:r>
+      <w:r>
+        <w:rPr>
+          <w:rFonts w:ascii="Verdana" w:hAnsi="Verdana"/>
+          <w:color w:val="FF0000"/>
+          <w:sz w:val="18"/>
+          <w:szCs w:val="18"/>
+        </w:rPr>
+        <w:t xml:space="preserve">selecting </w:t>
+      </w:r>
+      <w:r>
+        <w:rPr>
+          <w:rFonts w:ascii="Verdana" w:hAnsi="Verdana"/>
+          <w:color w:val="FF0000"/>
+          <w:sz w:val="18"/>
+          <w:szCs w:val="18"/>
+        </w:rPr>
+        <w:t>the</w:t>
+      </w:r>
+      <w:r>
+        <w:rPr>
+          <w:rFonts w:ascii="Verdana" w:hAnsi="Verdana"/>
+          <w:color w:val="FF0000"/>
+          <w:sz w:val="18"/>
+          <w:szCs w:val="18"/>
+        </w:rPr>
+        <w:t xml:space="preserve"> project-critical topics</w:t>
+      </w:r>
+      <w:r>
+        <w:rPr>
+          <w:rFonts w:ascii="Verdana" w:hAnsi="Verdana"/>
+          <w:color w:val="FF0000"/>
+          <w:sz w:val="18"/>
+          <w:szCs w:val="18"/>
+        </w:rPr>
+        <w:t xml:space="preserve"> or stages</w:t>
+      </w:r>
+      <w:r>
+        <w:rPr>
+          <w:rFonts w:ascii="Verdana" w:hAnsi="Verdana"/>
+          <w:color w:val="FF0000"/>
+          <w:sz w:val="18"/>
+          <w:szCs w:val="18"/>
+        </w:rPr>
+        <w:t xml:space="preserve">. </w:t>
+      </w:r>
+      <w:r>
+        <w:rPr>
+          <w:rFonts w:ascii="Verdana" w:hAnsi="Verdana"/>
+          <w:color w:val="FF0000"/>
+          <w:sz w:val="18"/>
+          <w:szCs w:val="18"/>
+        </w:rPr>
+        <w:t xml:space="preserve">Tell the reader what these are and why they were </w:t>
+      </w:r>
+      <w:r>
+        <w:rPr>
+          <w:rFonts w:ascii="Verdana" w:hAnsi="Verdana"/>
+          <w:color w:val="FF0000"/>
+          <w:sz w:val="18"/>
+          <w:szCs w:val="18"/>
+        </w:rPr>
+        <w:t xml:space="preserve">so </w:t>
+      </w:r>
+      <w:r>
+        <w:rPr>
+          <w:rFonts w:ascii="Verdana" w:hAnsi="Verdana"/>
+          <w:color w:val="FF0000"/>
+          <w:sz w:val="18"/>
+          <w:szCs w:val="18"/>
+        </w:rPr>
+        <w:t>critical.</w:t>
+      </w:r>
+      <w:r>
+        <w:rPr>
+          <w:rFonts w:ascii="Verdana" w:hAnsi="Verdana"/>
+          <w:color w:val="FF0000"/>
+          <w:sz w:val="18"/>
+          <w:szCs w:val="18"/>
+        </w:rPr>
+        <w:t xml:space="preserve"> Then lead the reader through. </w:t>
+      </w:r>
+      <w:r>
+        <w:rPr>
+          <w:rFonts w:ascii="Verdana" w:hAnsi="Verdana"/>
+          <w:color w:val="FF0000"/>
+          <w:sz w:val="18"/>
+          <w:szCs w:val="18"/>
+        </w:rPr>
+        <w:t>Make it clear</w:t>
+      </w:r>
+      <w:r>
+        <w:rPr>
+          <w:rFonts w:ascii="Verdana" w:hAnsi="Verdana"/>
+          <w:color w:val="FF0000"/>
+          <w:sz w:val="18"/>
+          <w:szCs w:val="18"/>
+        </w:rPr>
+        <w:t xml:space="preserve"> to your reader when one topic / stage is done and the next one starts</w:t>
+      </w:r>
+      <w:r>
+        <w:rPr>
+          <w:rFonts w:ascii="Verdana" w:hAnsi="Verdana"/>
+          <w:color w:val="FF0000"/>
+          <w:sz w:val="18"/>
+          <w:szCs w:val="18"/>
+        </w:rPr>
+        <w:t xml:space="preserve"> so they don’t get lost.</w:t>
       </w:r>
     </w:p>
     <w:p>
@@ -6619,235 +6870,6 @@
           <w:sz w:val="18"/>
           <w:szCs w:val="18"/>
         </w:rPr>
-        <w:t>o</w:t>
-      </w:r>
-      <w:r>
-        <w:rPr>
-          <w:rFonts w:ascii="Verdana" w:hAnsi="Verdana"/>
-          <w:color w:val="FF0000"/>
-          <w:sz w:val="18"/>
-          <w:szCs w:val="18"/>
-        </w:rPr>
-        <w:t xml:space="preserve"> not describe every</w:t>
-      </w:r>
-      <w:r>
-        <w:rPr>
-          <w:rFonts w:ascii="Verdana" w:hAnsi="Verdana"/>
-          <w:color w:val="FF0000"/>
-          <w:sz w:val="18"/>
-          <w:szCs w:val="18"/>
-        </w:rPr>
-        <w:t xml:space="preserve"> detail</w:t>
-      </w:r>
-      <w:r>
-        <w:rPr>
-          <w:rFonts w:ascii="Verdana" w:hAnsi="Verdana"/>
-          <w:color w:val="FF0000"/>
-          <w:sz w:val="18"/>
-          <w:szCs w:val="18"/>
-        </w:rPr>
-        <w:t xml:space="preserve">. </w:t>
-      </w:r>
-      <w:r>
-        <w:rPr>
-          <w:rFonts w:ascii="Verdana" w:hAnsi="Verdana"/>
-          <w:color w:val="FF0000"/>
-          <w:sz w:val="18"/>
-          <w:szCs w:val="18"/>
-        </w:rPr>
-        <w:t xml:space="preserve">Instead, </w:t>
-      </w:r>
-      <w:r>
-        <w:rPr>
-          <w:rFonts w:ascii="Verdana" w:hAnsi="Verdana"/>
-          <w:color w:val="FF0000"/>
-          <w:sz w:val="18"/>
-          <w:szCs w:val="18"/>
-        </w:rPr>
-        <w:t>t</w:t>
-      </w:r>
-      <w:r>
-        <w:rPr>
-          <w:rFonts w:ascii="Verdana" w:hAnsi="Verdana"/>
-          <w:color w:val="FF0000"/>
-          <w:sz w:val="18"/>
-          <w:szCs w:val="18"/>
-        </w:rPr>
-        <w:t xml:space="preserve">ry to put together an insightful </w:t>
-      </w:r>
-      <w:r>
-        <w:rPr>
-          <w:rFonts w:ascii="Verdana" w:hAnsi="Verdana"/>
-          <w:color w:val="FF0000"/>
-          <w:sz w:val="18"/>
-          <w:szCs w:val="18"/>
-        </w:rPr>
-        <w:t xml:space="preserve">and focused </w:t>
-      </w:r>
-      <w:r>
-        <w:rPr>
-          <w:rFonts w:ascii="Verdana" w:hAnsi="Verdana"/>
-          <w:color w:val="FF0000"/>
-          <w:sz w:val="18"/>
-          <w:szCs w:val="18"/>
-        </w:rPr>
-        <w:t>discussion by</w:t>
-      </w:r>
-      <w:r>
-        <w:rPr>
-          <w:rFonts w:ascii="Verdana" w:hAnsi="Verdana"/>
-          <w:color w:val="FF0000"/>
-          <w:sz w:val="18"/>
-          <w:szCs w:val="18"/>
-        </w:rPr>
-        <w:t xml:space="preserve"> </w:t>
-      </w:r>
-      <w:r>
-        <w:rPr>
-          <w:rFonts w:ascii="Verdana" w:hAnsi="Verdana"/>
-          <w:color w:val="FF0000"/>
-          <w:sz w:val="18"/>
-          <w:szCs w:val="18"/>
-        </w:rPr>
-        <w:t xml:space="preserve">selecting </w:t>
-      </w:r>
-      <w:r>
-        <w:rPr>
-          <w:rFonts w:ascii="Verdana" w:hAnsi="Verdana"/>
-          <w:color w:val="FF0000"/>
-          <w:sz w:val="18"/>
-          <w:szCs w:val="18"/>
-        </w:rPr>
-        <w:t>the</w:t>
-      </w:r>
-      <w:r>
-        <w:rPr>
-          <w:rFonts w:ascii="Verdana" w:hAnsi="Verdana"/>
-          <w:color w:val="FF0000"/>
-          <w:sz w:val="18"/>
-          <w:szCs w:val="18"/>
-        </w:rPr>
-        <w:t xml:space="preserve"> project-critical topics</w:t>
-      </w:r>
-      <w:r>
-        <w:rPr>
-          <w:rFonts w:ascii="Verdana" w:hAnsi="Verdana"/>
-          <w:color w:val="FF0000"/>
-          <w:sz w:val="18"/>
-          <w:szCs w:val="18"/>
-        </w:rPr>
-        <w:t xml:space="preserve"> or stages</w:t>
-      </w:r>
-      <w:r>
-        <w:rPr>
-          <w:rFonts w:ascii="Verdana" w:hAnsi="Verdana"/>
-          <w:color w:val="FF0000"/>
-          <w:sz w:val="18"/>
-          <w:szCs w:val="18"/>
-        </w:rPr>
-        <w:t xml:space="preserve">. </w:t>
-      </w:r>
-      <w:r>
-        <w:rPr>
-          <w:rFonts w:ascii="Verdana" w:hAnsi="Verdana"/>
-          <w:color w:val="FF0000"/>
-          <w:sz w:val="18"/>
-          <w:szCs w:val="18"/>
-        </w:rPr>
-        <w:t xml:space="preserve">Tell the reader what these are and why they were </w:t>
-      </w:r>
-      <w:r>
-        <w:rPr>
-          <w:rFonts w:ascii="Verdana" w:hAnsi="Verdana"/>
-          <w:color w:val="FF0000"/>
-          <w:sz w:val="18"/>
-          <w:szCs w:val="18"/>
-        </w:rPr>
-        <w:t xml:space="preserve">so </w:t>
-      </w:r>
-      <w:r>
-        <w:rPr>
-          <w:rFonts w:ascii="Verdana" w:hAnsi="Verdana"/>
-          <w:color w:val="FF0000"/>
-          <w:sz w:val="18"/>
-          <w:szCs w:val="18"/>
-        </w:rPr>
-        <w:t>critical.</w:t>
-      </w:r>
-      <w:r>
-        <w:rPr>
-          <w:rFonts w:ascii="Verdana" w:hAnsi="Verdana"/>
-          <w:color w:val="FF0000"/>
-          <w:sz w:val="18"/>
-          <w:szCs w:val="18"/>
-        </w:rPr>
-        <w:t xml:space="preserve"> Then lead the reader through. </w:t>
-      </w:r>
-      <w:r>
-        <w:rPr>
-          <w:rFonts w:ascii="Verdana" w:hAnsi="Verdana"/>
-          <w:color w:val="FF0000"/>
-          <w:sz w:val="18"/>
-          <w:szCs w:val="18"/>
-        </w:rPr>
-        <w:t>Make it clear</w:t>
-      </w:r>
-      <w:r>
-        <w:rPr>
-          <w:rFonts w:ascii="Verdana" w:hAnsi="Verdana"/>
-          <w:color w:val="FF0000"/>
-          <w:sz w:val="18"/>
-          <w:szCs w:val="18"/>
-        </w:rPr>
-        <w:t xml:space="preserve"> to your reader when one topic / stage is done and the next one starts</w:t>
-      </w:r>
-      <w:r>
-        <w:rPr>
-          <w:rFonts w:ascii="Verdana" w:hAnsi="Verdana"/>
-          <w:color w:val="FF0000"/>
-          <w:sz w:val="18"/>
-          <w:szCs w:val="18"/>
-        </w:rPr>
-        <w:t xml:space="preserve"> so they don’t get lost.</w:t>
-      </w:r>
-    </w:p>
-    <w:p>
-      <w:pPr>
-        <w:jc w:val="both"/>
-        <w:rPr>
-          <w:rFonts w:ascii="Verdana" w:hAnsi="Verdana"/>
-          <w:color w:val="FF0000"/>
-          <w:sz w:val="18"/>
-          <w:szCs w:val="18"/>
-        </w:rPr>
-      </w:pPr>
-    </w:p>
-    <w:p>
-      <w:pPr>
-        <w:jc w:val="both"/>
-        <w:rPr>
-          <w:rFonts w:ascii="Verdana" w:hAnsi="Verdana"/>
-          <w:color w:val="FF0000"/>
-          <w:sz w:val="18"/>
-          <w:szCs w:val="18"/>
-        </w:rPr>
-      </w:pPr>
-      <w:r>
-        <w:rPr>
-          <w:rFonts w:ascii="Verdana" w:hAnsi="Verdana"/>
-          <w:color w:val="FF0000"/>
-          <w:sz w:val="18"/>
-          <w:szCs w:val="18"/>
-        </w:rPr>
-        <w:t>D</w:t>
-      </w:r>
-      <w:r>
-        <w:rPr>
-          <w:rFonts w:ascii="Verdana" w:hAnsi="Verdana"/>
-          <w:color w:val="FF0000"/>
-          <w:sz w:val="18"/>
-          <w:szCs w:val="18"/>
-        </w:rPr>
         <w:t>emonstrate project management</w:t>
       </w:r>
       <w:r>
@@ -6893,16 +6915,7 @@
           <w:sz w:val="18"/>
           <w:szCs w:val="18"/>
         </w:rPr>
-        <w:t xml:space="preserve">terative development is often key when </w:t>
-      </w:r>
-      <w:r>
-        <w:rPr>
-          <w:rFonts w:ascii="Verdana" w:hAnsi="Verdana"/>
-          <w:color w:val="FF0000"/>
-          <w:sz w:val="18"/>
-          <w:szCs w:val="18"/>
-        </w:rPr>
-        <w:t>it comes to practice.</w:t>
+        <w:t>terative development is often key when it comes to practice.</w:t>
       </w:r>
       <w:r>
         <w:rPr>
@@ -8492,7 +8505,7 @@
                         <a:effectLst/>
                         <a:extLst>
                           <a:ext uri="{C572A759-6A51-4108-AA02-DFA0A04FC94B}">
-                            <ma14:wrappingTextBoxFlag xmlns:ma14="http://schemas.microsoft.com/office/mac/drawingml/2011/main" xmlns:w="http://schemas.openxmlformats.org/wordprocessingml/2006/main" xmlns:w10="urn:schemas-microsoft-com:office:word" xmlns:v="urn:schemas-microsoft-com:vml" xmlns:o="urn:schemas-microsoft-com:office:office" xmlns:mv="urn:schemas-microsoft-com:mac:vml" xmlns:mo="http://schemas.microsoft.com/office/mac/office/2008/main" xmlns=""/>
+                            <ma14:wrappingTextBoxFlag xmlns="" xmlns:mo="http://schemas.microsoft.com/office/mac/office/2008/main" xmlns:mv="urn:schemas-microsoft-com:mac:vml" xmlns:o="urn:schemas-microsoft-com:office:office" xmlns:v="urn:schemas-microsoft-com:vml" xmlns:w10="urn:schemas-microsoft-com:office:word" xmlns:w="http://schemas.openxmlformats.org/wordprocessingml/2006/main" xmlns:ma14="http://schemas.microsoft.com/office/mac/drawingml/2011/main"/>
                           </a:ext>
                         </a:extLst>
                       </wps:spPr>
@@ -8539,7 +8552,7 @@
                                           </pic:cNvPicPr>
                                         </pic:nvPicPr>
                                         <pic:blipFill>
-                                          <a:blip r:embed="rId26">
+                                          <a:blip r:embed="rId27">
                                             <a:extLst>
                                               <a:ext uri="{28A0092B-C50C-407E-A947-70E740481C1C}">
                                                 <a14:useLocalDpi xmlns:a14="http://schemas.microsoft.com/office/drawing/2010/main" val="0"/>
@@ -8620,7 +8633,7 @@
                                     </pic:cNvPicPr>
                                   </pic:nvPicPr>
                                   <pic:blipFill>
-                                    <a:blip r:embed="rId26">
+                                    <a:blip r:embed="rId27">
                                       <a:extLst>
                                         <a:ext uri="{28A0092B-C50C-407E-A947-70E740481C1C}">
                                           <a14:useLocalDpi xmlns:a14="http://schemas.microsoft.com/office/drawing/2010/main" val="0"/>
@@ -9304,53 +9317,116 @@
           <w:sz w:val="18"/>
           <w:szCs w:val="18"/>
         </w:rPr>
+        <w:t xml:space="preserve">Look back and </w:t>
+      </w:r>
+      <w:r>
+        <w:rPr>
+          <w:rFonts w:ascii="Verdana" w:hAnsi="Verdana"/>
+          <w:color w:val="FF0000"/>
+          <w:sz w:val="18"/>
+          <w:szCs w:val="18"/>
+        </w:rPr>
+        <w:t>close the loop</w:t>
+      </w:r>
+      <w:r>
+        <w:rPr>
+          <w:rFonts w:ascii="Verdana" w:hAnsi="Verdana"/>
+          <w:color w:val="FF0000"/>
+          <w:sz w:val="18"/>
+          <w:szCs w:val="18"/>
+        </w:rPr>
+        <w:t xml:space="preserve">: </w:t>
+      </w:r>
+      <w:r>
+        <w:rPr>
+          <w:rFonts w:ascii="Verdana" w:hAnsi="Verdana"/>
+          <w:color w:val="FF0000"/>
+          <w:sz w:val="18"/>
+          <w:szCs w:val="18"/>
+        </w:rPr>
+        <w:t xml:space="preserve">how and </w:t>
+      </w:r>
+      <w:r>
+        <w:rPr>
+          <w:rFonts w:ascii="Verdana" w:hAnsi="Verdana"/>
+          <w:color w:val="FF0000"/>
+          <w:sz w:val="18"/>
+          <w:szCs w:val="18"/>
+        </w:rPr>
+        <w:t>to what extent</w:t>
+      </w:r>
+      <w:r>
+        <w:rPr>
+          <w:rFonts w:ascii="Verdana" w:hAnsi="Verdana"/>
+          <w:color w:val="FF0000"/>
+          <w:sz w:val="18"/>
+          <w:szCs w:val="18"/>
+        </w:rPr>
+        <w:t xml:space="preserve"> does</w:t>
+      </w:r>
+      <w:r>
+        <w:rPr>
+          <w:rFonts w:ascii="Verdana" w:hAnsi="Verdana"/>
+          <w:color w:val="FF0000"/>
+          <w:sz w:val="18"/>
+          <w:szCs w:val="18"/>
+        </w:rPr>
+        <w:t xml:space="preserve"> </w:t>
+      </w:r>
+      <w:r>
+        <w:rPr>
+          <w:rFonts w:ascii="Verdana" w:hAnsi="Verdana"/>
+          <w:color w:val="FF0000"/>
+          <w:sz w:val="18"/>
+          <w:szCs w:val="18"/>
+        </w:rPr>
+        <w:t xml:space="preserve">the project respond to the research questions? </w:t>
+      </w:r>
+      <w:r>
+        <w:rPr>
+          <w:rFonts w:ascii="Verdana" w:eastAsia="Times New Roman" w:hAnsi="Verdana" w:cs="Times New Roman"/>
+          <w:color w:val="FF0000"/>
+          <w:sz w:val="18"/>
+          <w:szCs w:val="18"/>
+        </w:rPr>
+        <w:t>In hindsight</w:t>
+      </w:r>
+      <w:r>
+        <w:rPr>
+          <w:rFonts w:ascii="Verdana" w:hAnsi="Verdana"/>
+          <w:color w:val="FF0000"/>
+          <w:sz w:val="18"/>
+          <w:szCs w:val="18"/>
+        </w:rPr>
+        <w:t xml:space="preserve">, were the methods and processes you chose the right ones? </w:t>
+      </w:r>
+      <w:r>
+        <w:rPr>
+          <w:rFonts w:ascii="Verdana" w:hAnsi="Verdana"/>
+          <w:color w:val="FF0000"/>
+          <w:sz w:val="18"/>
+          <w:szCs w:val="18"/>
+        </w:rPr>
+        <w:t xml:space="preserve">You want to underline the achievements of the project, but at </w:t>
+      </w:r>
+      <w:r>
+        <w:rPr>
+          <w:rFonts w:ascii="Verdana" w:hAnsi="Verdana"/>
+          <w:color w:val="FF0000"/>
+          <w:sz w:val="18"/>
+          <w:szCs w:val="18"/>
+        </w:rPr>
         <w:lastRenderedPageBreak/>
-        <w:t xml:space="preserve">Look back and </w:t>
-      </w:r>
-      <w:r>
-        <w:rPr>
-          <w:rFonts w:ascii="Verdana" w:hAnsi="Verdana"/>
-          <w:color w:val="FF0000"/>
-          <w:sz w:val="18"/>
-          <w:szCs w:val="18"/>
-        </w:rPr>
-        <w:t>close the loop</w:t>
-      </w:r>
-      <w:r>
-        <w:rPr>
-          <w:rFonts w:ascii="Verdana" w:hAnsi="Verdana"/>
-          <w:color w:val="FF0000"/>
-          <w:sz w:val="18"/>
-          <w:szCs w:val="18"/>
-        </w:rPr>
-        <w:t xml:space="preserve">: </w:t>
-      </w:r>
-      <w:r>
-        <w:rPr>
-          <w:rFonts w:ascii="Verdana" w:hAnsi="Verdana"/>
-          <w:color w:val="FF0000"/>
-          <w:sz w:val="18"/>
-          <w:szCs w:val="18"/>
-        </w:rPr>
-        <w:t xml:space="preserve">how and </w:t>
-      </w:r>
-      <w:r>
-        <w:rPr>
-          <w:rFonts w:ascii="Verdana" w:hAnsi="Verdana"/>
-          <w:color w:val="FF0000"/>
-          <w:sz w:val="18"/>
-          <w:szCs w:val="18"/>
-        </w:rPr>
-        <w:t>to what extent</w:t>
-      </w:r>
-      <w:r>
-        <w:rPr>
-          <w:rFonts w:ascii="Verdana" w:hAnsi="Verdana"/>
-          <w:color w:val="FF0000"/>
-          <w:sz w:val="18"/>
-          <w:szCs w:val="18"/>
-        </w:rPr>
-        <w:t xml:space="preserve"> does</w:t>
+        <w:t xml:space="preserve">the same time not </w:t>
+      </w:r>
+      <w:r>
+        <w:rPr>
+          <w:rFonts w:ascii="Verdana" w:hAnsi="Verdana"/>
+          <w:color w:val="FF0000"/>
+          <w:sz w:val="18"/>
+          <w:szCs w:val="18"/>
+        </w:rPr>
+        <w:t>hide</w:t>
       </w:r>
       <w:r>
         <w:rPr>
@@ -9368,43 +9444,25 @@
           <w:sz w:val="18"/>
           <w:szCs w:val="18"/>
         </w:rPr>
-        <w:t xml:space="preserve">the project respond to the research questions? </w:t>
-      </w:r>
-      <w:r>
-        <w:rPr>
-          <w:rFonts w:ascii="Verdana" w:eastAsia="Times New Roman" w:hAnsi="Verdana" w:cs="Times New Roman"/>
-          <w:color w:val="FF0000"/>
-          <w:sz w:val="18"/>
-          <w:szCs w:val="18"/>
-        </w:rPr>
-        <w:t>In hindsight</w:t>
-      </w:r>
-      <w:r>
-        <w:rPr>
-          <w:rFonts w:ascii="Verdana" w:hAnsi="Verdana"/>
-          <w:color w:val="FF0000"/>
-          <w:sz w:val="18"/>
-          <w:szCs w:val="18"/>
-        </w:rPr>
-        <w:t xml:space="preserve">, were the methods and processes you chose the right ones? </w:t>
-      </w:r>
-      <w:r>
-        <w:rPr>
-          <w:rFonts w:ascii="Verdana" w:hAnsi="Verdana"/>
-          <w:color w:val="FF0000"/>
-          <w:sz w:val="18"/>
-          <w:szCs w:val="18"/>
-        </w:rPr>
-        <w:t xml:space="preserve">You want to underline the achievements of the project, but at the same time not </w:t>
-      </w:r>
-      <w:r>
-        <w:rPr>
-          <w:rFonts w:ascii="Verdana" w:hAnsi="Verdana"/>
-          <w:color w:val="FF0000"/>
-          <w:sz w:val="18"/>
-          <w:szCs w:val="18"/>
-        </w:rPr>
-        <w:t>hide</w:t>
+        <w:t xml:space="preserve">any </w:t>
+      </w:r>
+      <w:r>
+        <w:rPr>
+          <w:rFonts w:ascii="Verdana" w:hAnsi="Verdana"/>
+          <w:color w:val="FF0000"/>
+          <w:sz w:val="18"/>
+          <w:szCs w:val="18"/>
+        </w:rPr>
+        <w:t>obvious omissions</w:t>
+      </w:r>
+      <w:r>
+        <w:rPr>
+          <w:rFonts w:ascii="Verdana" w:hAnsi="Verdana"/>
+          <w:color w:val="FF0000"/>
+          <w:sz w:val="18"/>
+          <w:szCs w:val="18"/>
+        </w:rPr>
+        <w:t xml:space="preserve"> or</w:t>
       </w:r>
       <w:r>
         <w:rPr>
@@ -9422,25 +9480,25 @@
           <w:sz w:val="18"/>
           <w:szCs w:val="18"/>
         </w:rPr>
-        <w:t xml:space="preserve">any </w:t>
-      </w:r>
-      <w:r>
-        <w:rPr>
-          <w:rFonts w:ascii="Verdana" w:hAnsi="Verdana"/>
-          <w:color w:val="FF0000"/>
-          <w:sz w:val="18"/>
-          <w:szCs w:val="18"/>
-        </w:rPr>
-        <w:t>obvious omissions</w:t>
-      </w:r>
-      <w:r>
-        <w:rPr>
-          <w:rFonts w:ascii="Verdana" w:hAnsi="Verdana"/>
-          <w:color w:val="FF0000"/>
-          <w:sz w:val="18"/>
-          <w:szCs w:val="18"/>
-        </w:rPr>
-        <w:t xml:space="preserve"> or</w:t>
+        <w:t>shortcomings</w:t>
+      </w:r>
+      <w:r>
+        <w:rPr>
+          <w:rFonts w:ascii="Verdana" w:hAnsi="Verdana"/>
+          <w:color w:val="FF0000"/>
+          <w:sz w:val="18"/>
+          <w:szCs w:val="18"/>
+        </w:rPr>
+        <w:t>.</w:t>
+      </w:r>
+      <w:r>
+        <w:rPr>
+          <w:rFonts w:ascii="Verdana" w:hAnsi="Verdana"/>
+          <w:color w:val="FF0000"/>
+          <w:sz w:val="18"/>
+          <w:szCs w:val="18"/>
+        </w:rPr>
+        <w:t xml:space="preserve"> Honesty about obvious flaws demonstrates awareness and insight.</w:t>
       </w:r>
       <w:r>
         <w:rPr>
@@ -9451,49 +9509,423 @@
         </w:rPr>
         <w:t xml:space="preserve"> </w:t>
       </w:r>
-      <w:r>
-        <w:rPr>
-          <w:rFonts w:ascii="Verdana" w:hAnsi="Verdana"/>
-          <w:color w:val="FF0000"/>
-          <w:sz w:val="18"/>
-          <w:szCs w:val="18"/>
-        </w:rPr>
-        <w:t>shortcomings</w:t>
-      </w:r>
-      <w:r>
-        <w:rPr>
-          <w:rFonts w:ascii="Verdana" w:hAnsi="Verdana"/>
-          <w:color w:val="FF0000"/>
-          <w:sz w:val="18"/>
-          <w:szCs w:val="18"/>
-        </w:rPr>
-        <w:t>.</w:t>
-      </w:r>
-      <w:r>
-        <w:rPr>
-          <w:rFonts w:ascii="Verdana" w:hAnsi="Verdana"/>
-          <w:color w:val="FF0000"/>
-          <w:sz w:val="18"/>
-          <w:szCs w:val="18"/>
-        </w:rPr>
-        <w:t xml:space="preserve"> Honesty about obvious flaws demonstrates awareness and insight.</w:t>
-      </w:r>
-      <w:r>
-        <w:rPr>
-          <w:rFonts w:ascii="Verdana" w:hAnsi="Verdana"/>
-          <w:color w:val="FF0000"/>
+    </w:p>
+    <w:p>
+      <w:pPr>
+        <w:jc w:val="both"/>
+        <w:rPr>
+          <w:rFonts w:ascii="Verdana" w:hAnsi="Verdana"/>
+          <w:color w:val="FF0000"/>
+          <w:sz w:val="18"/>
+          <w:szCs w:val="18"/>
+        </w:rPr>
+      </w:pPr>
+    </w:p>
+    <w:p>
+      <w:pPr>
+        <w:jc w:val="both"/>
+        <w:rPr>
+          <w:rFonts w:ascii="Verdana" w:hAnsi="Verdana"/>
+          <w:color w:val="FF0000"/>
+          <w:sz w:val="18"/>
+          <w:szCs w:val="18"/>
+        </w:rPr>
+      </w:pPr>
+      <w:r>
+        <w:rPr>
+          <w:rFonts w:ascii="Verdana" w:hAnsi="Verdana"/>
+          <w:color w:val="FF0000"/>
+          <w:sz w:val="18"/>
+          <w:szCs w:val="18"/>
+        </w:rPr>
+        <w:t>Is there anything that would</w:t>
+      </w:r>
+      <w:r>
+        <w:rPr>
+          <w:rFonts w:ascii="Verdana" w:hAnsi="Verdana"/>
+          <w:color w:val="FF0000"/>
+          <w:sz w:val="18"/>
+          <w:szCs w:val="18"/>
+        </w:rPr>
+        <w:t xml:space="preserve"> make </w:t>
+      </w:r>
+      <w:r>
+        <w:rPr>
+          <w:rFonts w:ascii="Verdana" w:hAnsi="Verdana"/>
+          <w:color w:val="FF0000"/>
+          <w:sz w:val="18"/>
+          <w:szCs w:val="18"/>
+        </w:rPr>
+        <w:t>this</w:t>
+      </w:r>
+      <w:r>
+        <w:rPr>
+          <w:rFonts w:ascii="Verdana" w:hAnsi="Verdana"/>
+          <w:color w:val="FF0000"/>
+          <w:sz w:val="18"/>
+          <w:szCs w:val="18"/>
+        </w:rPr>
+        <w:t xml:space="preserve"> project </w:t>
+      </w:r>
+      <w:r>
+        <w:rPr>
+          <w:rFonts w:ascii="Verdana" w:hAnsi="Verdana"/>
+          <w:i/>
+          <w:color w:val="FF0000"/>
+          <w:sz w:val="18"/>
+          <w:szCs w:val="18"/>
+        </w:rPr>
+        <w:t>original</w:t>
+      </w:r>
+      <w:r>
+        <w:rPr>
+          <w:rFonts w:ascii="Verdana" w:hAnsi="Verdana"/>
+          <w:color w:val="FF0000"/>
+          <w:sz w:val="18"/>
+          <w:szCs w:val="18"/>
+        </w:rPr>
+        <w:t xml:space="preserve"> in a professional sense; e.g. have you discovered </w:t>
+      </w:r>
+      <w:r>
+        <w:rPr>
+          <w:rFonts w:ascii="Verdana" w:hAnsi="Verdana"/>
+          <w:color w:val="FF0000"/>
+          <w:sz w:val="18"/>
+          <w:szCs w:val="18"/>
+        </w:rPr>
+        <w:t>a</w:t>
+      </w:r>
+      <w:r>
+        <w:rPr>
+          <w:rFonts w:ascii="Verdana" w:hAnsi="Verdana"/>
+          <w:color w:val="FF0000"/>
+          <w:sz w:val="18"/>
+          <w:szCs w:val="18"/>
+        </w:rPr>
+        <w:t xml:space="preserve"> new method as you went along? </w:t>
+      </w:r>
+      <w:r>
+        <w:rPr>
+          <w:rFonts w:ascii="Verdana" w:hAnsi="Verdana"/>
+          <w:color w:val="FF0000"/>
+          <w:sz w:val="18"/>
+          <w:szCs w:val="18"/>
+        </w:rPr>
+        <w:t>Or a n</w:t>
+      </w:r>
+      <w:r>
+        <w:rPr>
+          <w:rFonts w:ascii="Verdana" w:hAnsi="Verdana"/>
+          <w:color w:val="FF0000"/>
+          <w:sz w:val="18"/>
+          <w:szCs w:val="18"/>
+        </w:rPr>
+        <w:t xml:space="preserve">ew </w:t>
+      </w:r>
+      <w:r>
+        <w:rPr>
+          <w:rFonts w:ascii="Verdana" w:hAnsi="Verdana"/>
+          <w:color w:val="FF0000"/>
+          <w:sz w:val="18"/>
+          <w:szCs w:val="18"/>
+        </w:rPr>
+        <w:t xml:space="preserve">conceptual </w:t>
+      </w:r>
+      <w:r>
+        <w:rPr>
+          <w:rFonts w:ascii="Verdana" w:hAnsi="Verdana"/>
+          <w:color w:val="FF0000"/>
+          <w:sz w:val="18"/>
+          <w:szCs w:val="18"/>
+        </w:rPr>
+        <w:t>model that might help other</w:t>
+      </w:r>
+      <w:r>
+        <w:rPr>
+          <w:rFonts w:ascii="Verdana" w:hAnsi="Verdana"/>
+          <w:color w:val="FF0000"/>
+          <w:sz w:val="18"/>
+          <w:szCs w:val="18"/>
+        </w:rPr>
+        <w:t xml:space="preserve">s understand </w:t>
+      </w:r>
+      <w:r>
+        <w:rPr>
+          <w:rFonts w:ascii="Verdana" w:hAnsi="Verdana"/>
+          <w:color w:val="FF0000"/>
+          <w:sz w:val="18"/>
+          <w:szCs w:val="18"/>
+        </w:rPr>
+        <w:t xml:space="preserve">a </w:t>
+      </w:r>
+      <w:r>
+        <w:rPr>
+          <w:rFonts w:ascii="Verdana" w:hAnsi="Verdana"/>
+          <w:color w:val="FF0000"/>
+          <w:sz w:val="18"/>
+          <w:szCs w:val="18"/>
+        </w:rPr>
+        <w:t>process better? Perhaps you’ve d</w:t>
+      </w:r>
+      <w:r>
+        <w:rPr>
+          <w:rFonts w:ascii="Verdana" w:hAnsi="Verdana"/>
+          <w:color w:val="FF0000"/>
+          <w:sz w:val="18"/>
+          <w:szCs w:val="18"/>
+        </w:rPr>
+        <w:t>eveloped a</w:t>
+      </w:r>
+      <w:r>
+        <w:rPr>
+          <w:rFonts w:ascii="Verdana" w:hAnsi="Verdana"/>
+          <w:color w:val="FF0000"/>
+          <w:sz w:val="18"/>
+          <w:szCs w:val="18"/>
+        </w:rPr>
+        <w:t xml:space="preserve"> more</w:t>
+      </w:r>
+      <w:r>
+        <w:rPr>
+          <w:rFonts w:ascii="Verdana" w:hAnsi="Verdana"/>
+          <w:color w:val="FF0000"/>
+          <w:sz w:val="18"/>
+          <w:szCs w:val="18"/>
+        </w:rPr>
+        <w:t xml:space="preserve"> efficient workflow for research or practice</w:t>
+      </w:r>
+      <w:r>
+        <w:rPr>
+          <w:rFonts w:ascii="Verdana" w:hAnsi="Verdana"/>
+          <w:color w:val="FF0000"/>
+          <w:sz w:val="18"/>
+          <w:szCs w:val="18"/>
+        </w:rPr>
+        <w:t>? Streamlined some process</w:t>
+      </w:r>
+      <w:r>
+        <w:rPr>
+          <w:rFonts w:ascii="Verdana" w:hAnsi="Verdana"/>
+          <w:color w:val="FF0000"/>
+          <w:sz w:val="18"/>
+          <w:szCs w:val="18"/>
+        </w:rPr>
+        <w:t>es</w:t>
+      </w:r>
+      <w:r>
+        <w:rPr>
+          <w:rFonts w:ascii="Verdana" w:hAnsi="Verdana"/>
+          <w:color w:val="FF0000"/>
+          <w:sz w:val="18"/>
+          <w:szCs w:val="18"/>
+        </w:rPr>
+        <w:t xml:space="preserve">? </w:t>
+      </w:r>
+      <w:r>
+        <w:rPr>
+          <w:rFonts w:ascii="Verdana" w:hAnsi="Verdana"/>
+          <w:color w:val="FF0000"/>
+          <w:sz w:val="18"/>
+          <w:szCs w:val="18"/>
+        </w:rPr>
+        <w:t xml:space="preserve">Combined some tools or methods </w:t>
+      </w:r>
+      <w:r>
+        <w:rPr>
+          <w:rFonts w:ascii="Verdana" w:hAnsi="Verdana"/>
+          <w:color w:val="FF0000"/>
+          <w:sz w:val="18"/>
+          <w:szCs w:val="18"/>
+        </w:rPr>
+        <w:t xml:space="preserve">or contexts </w:t>
+      </w:r>
+      <w:r>
+        <w:rPr>
+          <w:rFonts w:ascii="Verdana" w:hAnsi="Verdana"/>
+          <w:color w:val="FF0000"/>
+          <w:sz w:val="18"/>
+          <w:szCs w:val="18"/>
+        </w:rPr>
+        <w:t xml:space="preserve">in new and efficient ways? Perhaps you have arrived at an artistic or expressive practice outcome? Improved </w:t>
+      </w:r>
+      <w:r>
+        <w:rPr>
+          <w:rFonts w:ascii="Verdana" w:hAnsi="Verdana"/>
+          <w:color w:val="FF0000"/>
+          <w:sz w:val="18"/>
+          <w:szCs w:val="18"/>
+        </w:rPr>
+        <w:t xml:space="preserve">on </w:t>
+      </w:r>
+      <w:r>
+        <w:rPr>
+          <w:rFonts w:ascii="Verdana" w:hAnsi="Verdana"/>
+          <w:color w:val="FF0000"/>
+          <w:sz w:val="18"/>
+          <w:szCs w:val="18"/>
+        </w:rPr>
+        <w:t xml:space="preserve">a </w:t>
+      </w:r>
+      <w:r>
+        <w:rPr>
+          <w:rFonts w:ascii="Verdana" w:hAnsi="Verdana"/>
+          <w:color w:val="FF0000"/>
+          <w:sz w:val="18"/>
+          <w:szCs w:val="18"/>
+        </w:rPr>
+        <w:t>service design</w:t>
+      </w:r>
+      <w:r>
+        <w:rPr>
+          <w:rFonts w:ascii="Verdana" w:hAnsi="Verdana"/>
+          <w:color w:val="FF0000"/>
+          <w:sz w:val="18"/>
+          <w:szCs w:val="18"/>
+        </w:rPr>
+        <w:t xml:space="preserve"> by r</w:t>
+      </w:r>
+      <w:r>
+        <w:rPr>
+          <w:rFonts w:ascii="Verdana" w:hAnsi="Verdana"/>
+          <w:color w:val="FF0000"/>
+          <w:sz w:val="18"/>
+          <w:szCs w:val="18"/>
+        </w:rPr>
+        <w:t>emov</w:t>
+      </w:r>
+      <w:r>
+        <w:rPr>
+          <w:rFonts w:ascii="Verdana" w:hAnsi="Verdana"/>
+          <w:color w:val="FF0000"/>
+          <w:sz w:val="18"/>
+          <w:szCs w:val="18"/>
+        </w:rPr>
+        <w:t>ing</w:t>
+      </w:r>
+      <w:r>
+        <w:rPr>
+          <w:rFonts w:ascii="Verdana" w:hAnsi="Verdana"/>
+          <w:color w:val="FF0000"/>
+          <w:sz w:val="18"/>
+          <w:szCs w:val="18"/>
+        </w:rPr>
+        <w:t xml:space="preserve"> an obstacle in </w:t>
+      </w:r>
+      <w:r>
+        <w:rPr>
+          <w:rFonts w:ascii="Verdana" w:hAnsi="Verdana"/>
+          <w:color w:val="FF0000"/>
+          <w:sz w:val="18"/>
+          <w:szCs w:val="18"/>
+        </w:rPr>
+        <w:t xml:space="preserve">the </w:t>
+      </w:r>
+      <w:r>
+        <w:rPr>
+          <w:rFonts w:ascii="Verdana" w:hAnsi="Verdana"/>
+          <w:color w:val="FF0000"/>
+          <w:sz w:val="18"/>
+          <w:szCs w:val="18"/>
+        </w:rPr>
+        <w:t>experience flow?</w:t>
+      </w:r>
+    </w:p>
+    <w:p>
+      <w:pPr>
+        <w:jc w:val="both"/>
+        <w:rPr>
+          <w:rFonts w:ascii="Verdana" w:hAnsi="Verdana"/>
+          <w:b/>
+          <w:sz w:val="18"/>
+          <w:szCs w:val="18"/>
+        </w:rPr>
+      </w:pPr>
+    </w:p>
+    <w:p>
+      <w:pPr>
+        <w:jc w:val="both"/>
+        <w:rPr>
+          <w:rFonts w:ascii="Verdana" w:hAnsi="Verdana"/>
+          <w:b/>
+          <w:sz w:val="18"/>
+          <w:szCs w:val="18"/>
+        </w:rPr>
+      </w:pPr>
+    </w:p>
+    <w:p>
+      <w:pPr>
+        <w:jc w:val="both"/>
+        <w:rPr>
+          <w:rFonts w:ascii="Verdana" w:hAnsi="Verdana"/>
+          <w:sz w:val="18"/>
+          <w:szCs w:val="18"/>
+        </w:rPr>
+      </w:pPr>
+      <w:r>
+        <w:rPr>
+          <w:rFonts w:ascii="Verdana" w:hAnsi="Verdana"/>
+          <w:b/>
+          <w:sz w:val="18"/>
+          <w:szCs w:val="18"/>
+        </w:rPr>
+        <w:t>7</w:t>
+      </w:r>
+      <w:r>
+        <w:rPr>
+          <w:rFonts w:ascii="Verdana" w:hAnsi="Verdana"/>
+          <w:b/>
+          <w:sz w:val="18"/>
+          <w:szCs w:val="18"/>
+        </w:rPr>
+        <w:t xml:space="preserve">. </w:t>
+      </w:r>
+      <w:r>
+        <w:rPr>
+          <w:rFonts w:ascii="Verdana" w:hAnsi="Verdana"/>
+          <w:b/>
+          <w:sz w:val="18"/>
+          <w:szCs w:val="18"/>
+        </w:rPr>
+        <w:t>Conclusion and recommendations</w:t>
+      </w:r>
+      <w:r>
+        <w:rPr>
+          <w:rFonts w:ascii="Verdana" w:hAnsi="Verdana"/>
           <w:sz w:val="18"/>
           <w:szCs w:val="18"/>
         </w:rPr>
         <w:t xml:space="preserve"> </w:t>
       </w:r>
+      <w:r>
+        <w:rPr>
+          <w:rFonts w:ascii="Verdana" w:hAnsi="Verdana"/>
+          <w:sz w:val="18"/>
+          <w:szCs w:val="18"/>
+        </w:rPr>
+        <w:t>~</w:t>
+      </w:r>
+      <w:r>
+        <w:rPr>
+          <w:rFonts w:ascii="Verdana" w:hAnsi="Verdana"/>
+          <w:sz w:val="18"/>
+          <w:szCs w:val="18"/>
+        </w:rPr>
+        <w:t>4</w:t>
+      </w:r>
+      <w:r>
+        <w:rPr>
+          <w:rFonts w:ascii="Verdana" w:hAnsi="Verdana"/>
+          <w:sz w:val="18"/>
+          <w:szCs w:val="18"/>
+        </w:rPr>
+        <w:t>00</w:t>
+      </w:r>
     </w:p>
     <w:p>
       <w:pPr>
         <w:jc w:val="both"/>
         <w:rPr>
           <w:rFonts w:ascii="Verdana" w:hAnsi="Verdana"/>
-          <w:color w:val="FF0000"/>
           <w:sz w:val="18"/>
           <w:szCs w:val="18"/>
         </w:rPr>
@@ -9516,179 +9948,415 @@
           <w:sz w:val="18"/>
           <w:szCs w:val="18"/>
         </w:rPr>
-        <w:t>Is there anything that would</w:t>
-      </w:r>
-      <w:r>
-        <w:rPr>
-          <w:rFonts w:ascii="Verdana" w:hAnsi="Verdana"/>
-          <w:color w:val="FF0000"/>
-          <w:sz w:val="18"/>
-          <w:szCs w:val="18"/>
-        </w:rPr>
-        <w:t xml:space="preserve"> make </w:t>
-      </w:r>
-      <w:r>
-        <w:rPr>
-          <w:rFonts w:ascii="Verdana" w:hAnsi="Verdana"/>
-          <w:color w:val="FF0000"/>
-          <w:sz w:val="18"/>
-          <w:szCs w:val="18"/>
-        </w:rPr>
-        <w:t>this</w:t>
-      </w:r>
-      <w:r>
-        <w:rPr>
-          <w:rFonts w:ascii="Verdana" w:hAnsi="Verdana"/>
-          <w:color w:val="FF0000"/>
-          <w:sz w:val="18"/>
-          <w:szCs w:val="18"/>
-        </w:rPr>
-        <w:t xml:space="preserve"> project </w:t>
-      </w:r>
-      <w:r>
-        <w:rPr>
-          <w:rFonts w:ascii="Verdana" w:hAnsi="Verdana"/>
-          <w:i/>
-          <w:color w:val="FF0000"/>
-          <w:sz w:val="18"/>
-          <w:szCs w:val="18"/>
-        </w:rPr>
-        <w:t>original</w:t>
-      </w:r>
-      <w:r>
-        <w:rPr>
-          <w:rFonts w:ascii="Verdana" w:hAnsi="Verdana"/>
-          <w:color w:val="FF0000"/>
-          <w:sz w:val="18"/>
-          <w:szCs w:val="18"/>
-        </w:rPr>
-        <w:t xml:space="preserve"> in a professional sense; e.g. have you discovered </w:t>
-      </w:r>
-      <w:r>
-        <w:rPr>
-          <w:rFonts w:ascii="Verdana" w:hAnsi="Verdana"/>
-          <w:color w:val="FF0000"/>
-          <w:sz w:val="18"/>
-          <w:szCs w:val="18"/>
-        </w:rPr>
-        <w:t>a</w:t>
-      </w:r>
-      <w:r>
-        <w:rPr>
-          <w:rFonts w:ascii="Verdana" w:hAnsi="Verdana"/>
-          <w:color w:val="FF0000"/>
-          <w:sz w:val="18"/>
-          <w:szCs w:val="18"/>
-        </w:rPr>
-        <w:t xml:space="preserve"> new method as you went along? </w:t>
-      </w:r>
-      <w:r>
-        <w:rPr>
-          <w:rFonts w:ascii="Verdana" w:hAnsi="Verdana"/>
-          <w:color w:val="FF0000"/>
-          <w:sz w:val="18"/>
-          <w:szCs w:val="18"/>
-        </w:rPr>
-        <w:t>Or a n</w:t>
-      </w:r>
-      <w:r>
-        <w:rPr>
-          <w:rFonts w:ascii="Verdana" w:hAnsi="Verdana"/>
-          <w:color w:val="FF0000"/>
-          <w:sz w:val="18"/>
-          <w:szCs w:val="18"/>
-        </w:rPr>
-        <w:t xml:space="preserve">ew </w:t>
-      </w:r>
-      <w:r>
-        <w:rPr>
-          <w:rFonts w:ascii="Verdana" w:hAnsi="Verdana"/>
-          <w:color w:val="FF0000"/>
-          <w:sz w:val="18"/>
-          <w:szCs w:val="18"/>
-        </w:rPr>
-        <w:t xml:space="preserve">conceptual </w:t>
-      </w:r>
-      <w:r>
-        <w:rPr>
-          <w:rFonts w:ascii="Verdana" w:hAnsi="Verdana"/>
-          <w:color w:val="FF0000"/>
-          <w:sz w:val="18"/>
-          <w:szCs w:val="18"/>
-        </w:rPr>
-        <w:t>model that might help other</w:t>
-      </w:r>
-      <w:r>
-        <w:rPr>
-          <w:rFonts w:ascii="Verdana" w:hAnsi="Verdana"/>
-          <w:color w:val="FF0000"/>
-          <w:sz w:val="18"/>
-          <w:szCs w:val="18"/>
-        </w:rPr>
-        <w:t xml:space="preserve">s understand </w:t>
-      </w:r>
-      <w:r>
-        <w:rPr>
-          <w:rFonts w:ascii="Verdana" w:hAnsi="Verdana"/>
-          <w:color w:val="FF0000"/>
-          <w:sz w:val="18"/>
-          <w:szCs w:val="18"/>
-        </w:rPr>
-        <w:t xml:space="preserve">a </w:t>
-      </w:r>
-      <w:r>
-        <w:rPr>
-          <w:rFonts w:ascii="Verdana" w:hAnsi="Verdana"/>
-          <w:color w:val="FF0000"/>
-          <w:sz w:val="18"/>
-          <w:szCs w:val="18"/>
-        </w:rPr>
-        <w:t>process better? Perhaps you’ve d</w:t>
-      </w:r>
-      <w:r>
-        <w:rPr>
-          <w:rFonts w:ascii="Verdana" w:hAnsi="Verdana"/>
-          <w:color w:val="FF0000"/>
-          <w:sz w:val="18"/>
-          <w:szCs w:val="18"/>
-        </w:rPr>
-        <w:t>eveloped a</w:t>
-      </w:r>
-      <w:r>
-        <w:rPr>
-          <w:rFonts w:ascii="Verdana" w:hAnsi="Verdana"/>
-          <w:color w:val="FF0000"/>
-          <w:sz w:val="18"/>
-          <w:szCs w:val="18"/>
-        </w:rPr>
-        <w:t xml:space="preserve"> more</w:t>
-      </w:r>
-      <w:r>
-        <w:rPr>
-          <w:rFonts w:ascii="Verdana" w:hAnsi="Verdana"/>
-          <w:color w:val="FF0000"/>
-          <w:sz w:val="18"/>
-          <w:szCs w:val="18"/>
-        </w:rPr>
-        <w:t xml:space="preserve"> efficient workflow for research or practice</w:t>
-      </w:r>
-      <w:r>
-        <w:rPr>
-          <w:rFonts w:ascii="Verdana" w:hAnsi="Verdana"/>
-          <w:color w:val="FF0000"/>
-          <w:sz w:val="18"/>
-          <w:szCs w:val="18"/>
-        </w:rPr>
-        <w:t>? Streamlined some process</w:t>
-      </w:r>
-      <w:r>
-        <w:rPr>
-          <w:rFonts w:ascii="Verdana" w:hAnsi="Verdana"/>
-          <w:color w:val="FF0000"/>
-          <w:sz w:val="18"/>
-          <w:szCs w:val="18"/>
-        </w:rPr>
-        <w:t>es</w:t>
+        <w:t xml:space="preserve">This section </w:t>
+      </w:r>
+      <w:r>
+        <w:rPr>
+          <w:rFonts w:ascii="Verdana" w:hAnsi="Verdana"/>
+          <w:color w:val="FF0000"/>
+          <w:sz w:val="18"/>
+          <w:szCs w:val="18"/>
+        </w:rPr>
+        <w:t>should</w:t>
+      </w:r>
+      <w:r>
+        <w:rPr>
+          <w:rFonts w:ascii="Verdana" w:hAnsi="Verdana"/>
+          <w:color w:val="FF0000"/>
+          <w:sz w:val="18"/>
+          <w:szCs w:val="18"/>
+        </w:rPr>
+        <w:t xml:space="preserve"> draw</w:t>
+      </w:r>
+      <w:r>
+        <w:rPr>
+          <w:rFonts w:ascii="Verdana" w:hAnsi="Verdana"/>
+          <w:color w:val="FF0000"/>
+          <w:sz w:val="18"/>
+          <w:szCs w:val="18"/>
+        </w:rPr>
+        <w:t xml:space="preserve"> conclusions from </w:t>
+      </w:r>
+      <w:r>
+        <w:rPr>
+          <w:rFonts w:ascii="Verdana" w:hAnsi="Verdana"/>
+          <w:color w:val="FF0000"/>
+          <w:sz w:val="18"/>
+          <w:szCs w:val="18"/>
+        </w:rPr>
+        <w:t xml:space="preserve">completed </w:t>
+      </w:r>
+      <w:r>
+        <w:rPr>
+          <w:rFonts w:ascii="Verdana" w:hAnsi="Verdana"/>
+          <w:color w:val="FF0000"/>
+          <w:sz w:val="18"/>
+          <w:szCs w:val="18"/>
+        </w:rPr>
+        <w:t xml:space="preserve">research and practical work. </w:t>
+      </w:r>
+    </w:p>
+    <w:p>
+      <w:pPr>
+        <w:jc w:val="both"/>
+        <w:rPr>
+          <w:rFonts w:ascii="Verdana" w:hAnsi="Verdana"/>
+          <w:color w:val="FF0000"/>
+          <w:sz w:val="18"/>
+          <w:szCs w:val="18"/>
+        </w:rPr>
+      </w:pPr>
+    </w:p>
+    <w:p>
+      <w:pPr>
+        <w:jc w:val="both"/>
+        <w:rPr>
+          <w:rFonts w:ascii="Verdana" w:hAnsi="Verdana"/>
+          <w:color w:val="FF0000"/>
+          <w:sz w:val="18"/>
+          <w:szCs w:val="18"/>
+        </w:rPr>
+      </w:pPr>
+      <w:r>
+        <w:rPr>
+          <w:rFonts w:ascii="Verdana" w:hAnsi="Verdana"/>
+          <w:color w:val="FF0000"/>
+          <w:sz w:val="18"/>
+          <w:szCs w:val="18"/>
+        </w:rPr>
+        <w:t>Make some recommendations here for next steps or further work.</w:t>
+      </w:r>
+      <w:r>
+        <w:rPr>
+          <w:rFonts w:ascii="Verdana" w:hAnsi="Verdana"/>
+          <w:color w:val="FF0000"/>
+          <w:sz w:val="18"/>
+          <w:szCs w:val="18"/>
+        </w:rPr>
+        <w:t xml:space="preserve"> Imagine another student or professional picks up the project from where you left it. What would you recommend them to do?</w:t>
+      </w:r>
+    </w:p>
+    <w:p>
+      <w:pPr>
+        <w:jc w:val="both"/>
+        <w:rPr>
+          <w:rFonts w:ascii="Verdana" w:hAnsi="Verdana"/>
+          <w:color w:val="FF0000"/>
+          <w:sz w:val="18"/>
+          <w:szCs w:val="18"/>
+        </w:rPr>
+      </w:pPr>
+    </w:p>
+    <w:p>
+      <w:pPr>
+        <w:jc w:val="both"/>
+        <w:rPr>
+          <w:rFonts w:ascii="Verdana" w:hAnsi="Verdana"/>
+          <w:color w:val="FF0000"/>
+          <w:sz w:val="18"/>
+          <w:szCs w:val="18"/>
+        </w:rPr>
+      </w:pPr>
+      <w:r>
+        <w:rPr>
+          <w:rFonts w:ascii="Verdana" w:hAnsi="Verdana"/>
+          <w:color w:val="FF0000"/>
+          <w:sz w:val="18"/>
+          <w:szCs w:val="18"/>
+        </w:rPr>
+        <w:t xml:space="preserve">Also think about the impact </w:t>
+      </w:r>
+      <w:r>
+        <w:rPr>
+          <w:rFonts w:ascii="Verdana" w:hAnsi="Verdana"/>
+          <w:color w:val="FF0000"/>
+          <w:sz w:val="18"/>
+          <w:szCs w:val="18"/>
+        </w:rPr>
+        <w:t>that</w:t>
+      </w:r>
+      <w:r>
+        <w:rPr>
+          <w:rFonts w:ascii="Verdana" w:hAnsi="Verdana"/>
+          <w:color w:val="FF0000"/>
+          <w:sz w:val="18"/>
+          <w:szCs w:val="18"/>
+        </w:rPr>
+        <w:t xml:space="preserve"> could be achieved in the wider field. What</w:t>
+      </w:r>
+      <w:r>
+        <w:rPr>
+          <w:rFonts w:ascii="Verdana" w:hAnsi="Verdana"/>
+          <w:color w:val="FF0000"/>
+          <w:sz w:val="18"/>
+          <w:szCs w:val="18"/>
+        </w:rPr>
+        <w:t xml:space="preserve"> </w:t>
+      </w:r>
+      <w:r>
+        <w:rPr>
+          <w:rFonts w:ascii="Verdana" w:hAnsi="Verdana"/>
+          <w:color w:val="FF0000"/>
+          <w:sz w:val="18"/>
+          <w:szCs w:val="18"/>
+        </w:rPr>
+        <w:t>could</w:t>
+      </w:r>
+      <w:r>
+        <w:rPr>
+          <w:rFonts w:ascii="Verdana" w:hAnsi="Verdana"/>
+          <w:color w:val="FF0000"/>
+          <w:sz w:val="18"/>
+          <w:szCs w:val="18"/>
+        </w:rPr>
+        <w:t xml:space="preserve"> be</w:t>
+      </w:r>
+      <w:r>
+        <w:rPr>
+          <w:rFonts w:ascii="Verdana" w:hAnsi="Verdana"/>
+          <w:color w:val="FF0000"/>
+          <w:sz w:val="18"/>
+          <w:szCs w:val="18"/>
+        </w:rPr>
+        <w:t xml:space="preserve"> the </w:t>
+      </w:r>
+      <w:r>
+        <w:rPr>
+          <w:rFonts w:ascii="Verdana" w:hAnsi="Verdana"/>
+          <w:color w:val="FF0000"/>
+          <w:sz w:val="18"/>
+          <w:szCs w:val="18"/>
+        </w:rPr>
+        <w:t xml:space="preserve">longer-term future </w:t>
+      </w:r>
+      <w:r>
+        <w:rPr>
+          <w:rFonts w:ascii="Verdana" w:hAnsi="Verdana"/>
+          <w:color w:val="FF0000"/>
+          <w:sz w:val="18"/>
+          <w:szCs w:val="18"/>
+        </w:rPr>
+        <w:t xml:space="preserve">of this project </w:t>
+      </w:r>
+      <w:r>
+        <w:rPr>
+          <w:rFonts w:ascii="Verdana" w:hAnsi="Verdana"/>
+          <w:color w:val="FF0000"/>
+          <w:sz w:val="18"/>
+          <w:szCs w:val="18"/>
+        </w:rPr>
+        <w:t>beyond UWE</w:t>
+      </w:r>
+      <w:r>
+        <w:rPr>
+          <w:rFonts w:ascii="Verdana" w:hAnsi="Verdana"/>
+          <w:color w:val="FF0000"/>
+          <w:sz w:val="18"/>
+          <w:szCs w:val="18"/>
+        </w:rPr>
+        <w:t>?</w:t>
+      </w:r>
+      <w:r>
+        <w:rPr>
+          <w:rFonts w:ascii="Verdana" w:hAnsi="Verdana"/>
+          <w:color w:val="FF0000"/>
+          <w:sz w:val="18"/>
+          <w:szCs w:val="18"/>
+        </w:rPr>
+        <w:t xml:space="preserve"> A conference? An academic journal? An audiovisual festival? A </w:t>
+      </w:r>
+      <w:r>
+        <w:rPr>
+          <w:rFonts w:ascii="Verdana" w:hAnsi="Verdana"/>
+          <w:color w:val="FF0000"/>
+          <w:sz w:val="18"/>
+          <w:szCs w:val="18"/>
+        </w:rPr>
+        <w:t xml:space="preserve">creative </w:t>
+      </w:r>
+      <w:r>
+        <w:rPr>
+          <w:rFonts w:ascii="Verdana" w:hAnsi="Verdana"/>
+          <w:color w:val="FF0000"/>
+          <w:sz w:val="18"/>
+          <w:szCs w:val="18"/>
+        </w:rPr>
+        <w:t>competition?</w:t>
+      </w:r>
+      <w:r>
+        <w:rPr>
+          <w:rFonts w:ascii="Verdana" w:hAnsi="Verdana"/>
+          <w:color w:val="FF0000"/>
+          <w:sz w:val="18"/>
+          <w:szCs w:val="18"/>
+        </w:rPr>
+        <w:t xml:space="preserve"> </w:t>
+      </w:r>
+    </w:p>
+    <w:p>
+      <w:pPr>
+        <w:jc w:val="both"/>
+        <w:rPr>
+          <w:rFonts w:ascii="Verdana" w:hAnsi="Verdana"/>
+          <w:color w:val="FF0000"/>
+          <w:sz w:val="18"/>
+          <w:szCs w:val="18"/>
+        </w:rPr>
+      </w:pPr>
+    </w:p>
+    <w:p>
+      <w:pPr>
+        <w:jc w:val="both"/>
+        <w:rPr>
+          <w:rFonts w:ascii="Verdana" w:hAnsi="Verdana"/>
+          <w:color w:val="FF0000"/>
+          <w:sz w:val="18"/>
+          <w:szCs w:val="18"/>
+        </w:rPr>
+      </w:pPr>
+      <w:r>
+        <w:rPr>
+          <w:rFonts w:ascii="Verdana" w:hAnsi="Verdana"/>
+          <w:color w:val="FF0000"/>
+          <w:sz w:val="18"/>
+          <w:szCs w:val="18"/>
+        </w:rPr>
+        <w:t xml:space="preserve">How </w:t>
+      </w:r>
+      <w:r>
+        <w:rPr>
+          <w:rFonts w:ascii="Verdana" w:hAnsi="Verdana"/>
+          <w:color w:val="FF0000"/>
+          <w:sz w:val="18"/>
+          <w:szCs w:val="18"/>
+        </w:rPr>
+        <w:t xml:space="preserve">might </w:t>
+      </w:r>
+      <w:r>
+        <w:rPr>
+          <w:rFonts w:ascii="Verdana" w:hAnsi="Verdana"/>
+          <w:color w:val="FF0000"/>
+          <w:sz w:val="18"/>
+          <w:szCs w:val="18"/>
+        </w:rPr>
+        <w:t>this project</w:t>
+      </w:r>
+      <w:r>
+        <w:rPr>
+          <w:rFonts w:ascii="Verdana" w:hAnsi="Verdana"/>
+          <w:color w:val="FF0000"/>
+          <w:sz w:val="18"/>
+          <w:szCs w:val="18"/>
+        </w:rPr>
+        <w:t xml:space="preserve"> benefit </w:t>
+      </w:r>
+      <w:r>
+        <w:rPr>
+          <w:rFonts w:ascii="Verdana" w:hAnsi="Verdana"/>
+          <w:color w:val="FF0000"/>
+          <w:sz w:val="18"/>
+          <w:szCs w:val="18"/>
+        </w:rPr>
+        <w:t xml:space="preserve">other </w:t>
+      </w:r>
+      <w:r>
+        <w:rPr>
+          <w:rFonts w:ascii="Verdana" w:hAnsi="Verdana"/>
+          <w:color w:val="FF0000"/>
+          <w:sz w:val="18"/>
+          <w:szCs w:val="18"/>
+        </w:rPr>
+        <w:t xml:space="preserve">users, professionals, society? </w:t>
+      </w:r>
+      <w:r>
+        <w:rPr>
+          <w:rFonts w:ascii="Verdana" w:hAnsi="Verdana"/>
+          <w:color w:val="FF0000"/>
+          <w:sz w:val="18"/>
+          <w:szCs w:val="18"/>
+        </w:rPr>
+        <w:t xml:space="preserve">Does </w:t>
+      </w:r>
+      <w:r>
+        <w:rPr>
+          <w:rFonts w:ascii="Verdana" w:hAnsi="Verdana"/>
+          <w:color w:val="FF0000"/>
+          <w:sz w:val="18"/>
+          <w:szCs w:val="18"/>
+        </w:rPr>
+        <w:t>the project</w:t>
+      </w:r>
+      <w:r>
+        <w:rPr>
+          <w:rFonts w:ascii="Verdana" w:hAnsi="Verdana"/>
+          <w:color w:val="FF0000"/>
+          <w:sz w:val="18"/>
+          <w:szCs w:val="18"/>
+        </w:rPr>
+        <w:t xml:space="preserve"> have any</w:t>
+      </w:r>
+      <w:r>
+        <w:rPr>
+          <w:rFonts w:ascii="Verdana" w:hAnsi="Verdana"/>
+          <w:color w:val="FF0000"/>
+          <w:sz w:val="18"/>
+          <w:szCs w:val="18"/>
+        </w:rPr>
+        <w:t xml:space="preserve"> commercial potential for example? </w:t>
+      </w:r>
+      <w:r>
+        <w:rPr>
+          <w:rFonts w:ascii="Verdana" w:hAnsi="Verdana"/>
+          <w:color w:val="FF0000"/>
+          <w:sz w:val="18"/>
+          <w:szCs w:val="18"/>
+        </w:rPr>
+        <w:t xml:space="preserve">Could it become a sellable product? </w:t>
+      </w:r>
+      <w:r>
+        <w:rPr>
+          <w:rFonts w:ascii="Verdana" w:hAnsi="Verdana"/>
+          <w:color w:val="FF0000"/>
+          <w:sz w:val="18"/>
+          <w:szCs w:val="18"/>
+        </w:rPr>
+        <w:t xml:space="preserve">Or </w:t>
+      </w:r>
+      <w:r>
+        <w:rPr>
+          <w:rFonts w:ascii="Verdana" w:hAnsi="Verdana"/>
+          <w:color w:val="FF0000"/>
+          <w:sz w:val="18"/>
+          <w:szCs w:val="18"/>
+        </w:rPr>
+        <w:t>sh</w:t>
+      </w:r>
+      <w:r>
+        <w:rPr>
+          <w:rFonts w:ascii="Verdana" w:hAnsi="Verdana"/>
+          <w:color w:val="FF0000"/>
+          <w:sz w:val="18"/>
+          <w:szCs w:val="18"/>
+        </w:rPr>
+        <w:t xml:space="preserve">ould </w:t>
+      </w:r>
+      <w:r>
+        <w:rPr>
+          <w:rFonts w:ascii="Verdana" w:hAnsi="Verdana"/>
+          <w:color w:val="FF0000"/>
+          <w:sz w:val="18"/>
+          <w:szCs w:val="18"/>
+        </w:rPr>
+        <w:t>the code</w:t>
+      </w:r>
+      <w:r>
+        <w:rPr>
+          <w:rFonts w:ascii="Verdana" w:hAnsi="Verdana"/>
+          <w:color w:val="FF0000"/>
+          <w:sz w:val="18"/>
+          <w:szCs w:val="18"/>
+        </w:rPr>
+        <w:t xml:space="preserve"> become a creative commons resource</w:t>
       </w:r>
       <w:r>
         <w:rPr>
@@ -9699,121 +10367,64 @@
         </w:rPr>
         <w:t xml:space="preserve">? </w:t>
       </w:r>
-      <w:r>
-        <w:rPr>
-          <w:rFonts w:ascii="Verdana" w:hAnsi="Verdana"/>
-          <w:color w:val="FF0000"/>
-          <w:sz w:val="18"/>
-          <w:szCs w:val="18"/>
-        </w:rPr>
-        <w:t xml:space="preserve">Combined some tools or methods </w:t>
-      </w:r>
-      <w:r>
-        <w:rPr>
-          <w:rFonts w:ascii="Verdana" w:hAnsi="Verdana"/>
-          <w:color w:val="FF0000"/>
-          <w:sz w:val="18"/>
-          <w:szCs w:val="18"/>
-        </w:rPr>
-        <w:t xml:space="preserve">or contexts </w:t>
-      </w:r>
-      <w:r>
-        <w:rPr>
-          <w:rFonts w:ascii="Verdana" w:hAnsi="Verdana"/>
-          <w:color w:val="FF0000"/>
-          <w:sz w:val="18"/>
-          <w:szCs w:val="18"/>
-        </w:rPr>
-        <w:t xml:space="preserve">in new and efficient ways? Perhaps you have arrived at an artistic or expressive practice outcome? Improved </w:t>
-      </w:r>
-      <w:r>
-        <w:rPr>
-          <w:rFonts w:ascii="Verdana" w:hAnsi="Verdana"/>
-          <w:color w:val="FF0000"/>
-          <w:sz w:val="18"/>
-          <w:szCs w:val="18"/>
-        </w:rPr>
-        <w:t xml:space="preserve">on </w:t>
-      </w:r>
-      <w:r>
-        <w:rPr>
-          <w:rFonts w:ascii="Verdana" w:hAnsi="Verdana"/>
-          <w:color w:val="FF0000"/>
-          <w:sz w:val="18"/>
-          <w:szCs w:val="18"/>
-        </w:rPr>
-        <w:t xml:space="preserve">a </w:t>
-      </w:r>
-      <w:r>
-        <w:rPr>
-          <w:rFonts w:ascii="Verdana" w:hAnsi="Verdana"/>
-          <w:color w:val="FF0000"/>
-          <w:sz w:val="18"/>
-          <w:szCs w:val="18"/>
-        </w:rPr>
-        <w:t>service design</w:t>
-      </w:r>
-      <w:r>
-        <w:rPr>
-          <w:rFonts w:ascii="Verdana" w:hAnsi="Verdana"/>
-          <w:color w:val="FF0000"/>
-          <w:sz w:val="18"/>
-          <w:szCs w:val="18"/>
-        </w:rPr>
-        <w:t xml:space="preserve"> by r</w:t>
-      </w:r>
-      <w:r>
-        <w:rPr>
-          <w:rFonts w:ascii="Verdana" w:hAnsi="Verdana"/>
-          <w:color w:val="FF0000"/>
-          <w:sz w:val="18"/>
-          <w:szCs w:val="18"/>
-        </w:rPr>
-        <w:t>emov</w:t>
-      </w:r>
-      <w:r>
-        <w:rPr>
-          <w:rFonts w:ascii="Verdana" w:hAnsi="Verdana"/>
-          <w:color w:val="FF0000"/>
-          <w:sz w:val="18"/>
-          <w:szCs w:val="18"/>
-        </w:rPr>
-        <w:t>ing</w:t>
-      </w:r>
-      <w:r>
-        <w:rPr>
-          <w:rFonts w:ascii="Verdana" w:hAnsi="Verdana"/>
-          <w:color w:val="FF0000"/>
-          <w:sz w:val="18"/>
-          <w:szCs w:val="18"/>
-        </w:rPr>
-        <w:t xml:space="preserve"> an obstacle in </w:t>
-      </w:r>
-      <w:r>
-        <w:rPr>
-          <w:rFonts w:ascii="Verdana" w:hAnsi="Verdana"/>
-          <w:color w:val="FF0000"/>
-          <w:sz w:val="18"/>
-          <w:szCs w:val="18"/>
-        </w:rPr>
-        <w:t xml:space="preserve">the </w:t>
-      </w:r>
-      <w:r>
-        <w:rPr>
-          <w:rFonts w:ascii="Verdana" w:hAnsi="Verdana"/>
-          <w:color w:val="FF0000"/>
-          <w:sz w:val="18"/>
-          <w:szCs w:val="18"/>
-        </w:rPr>
-        <w:t>experience flow?</w:t>
-      </w:r>
     </w:p>
     <w:p>
       <w:pPr>
         <w:jc w:val="both"/>
         <w:rPr>
           <w:rFonts w:ascii="Verdana" w:hAnsi="Verdana"/>
+          <w:color w:val="FF0000"/>
+          <w:sz w:val="18"/>
+          <w:szCs w:val="18"/>
+        </w:rPr>
+      </w:pPr>
+    </w:p>
+    <w:p>
+      <w:pPr>
+        <w:jc w:val="both"/>
+        <w:rPr>
+          <w:rFonts w:ascii="Verdana" w:hAnsi="Verdana"/>
+          <w:color w:val="FF0000"/>
+          <w:sz w:val="18"/>
+          <w:szCs w:val="18"/>
+        </w:rPr>
+      </w:pPr>
+      <w:r>
+        <w:rPr>
+          <w:rFonts w:ascii="Verdana" w:hAnsi="Verdana"/>
+          <w:color w:val="FF0000"/>
+          <w:sz w:val="18"/>
+          <w:szCs w:val="18"/>
+        </w:rPr>
+        <w:t>Find a useful sentence to end this report with. It is always beneficial to end on a positive.</w:t>
+      </w:r>
+      <w:r>
+        <w:rPr>
+          <w:rFonts w:ascii="Verdana" w:hAnsi="Verdana"/>
+          <w:color w:val="FF0000"/>
+          <w:sz w:val="18"/>
+          <w:szCs w:val="18"/>
+        </w:rPr>
+        <w:t xml:space="preserve"> </w:t>
+      </w:r>
+    </w:p>
+    <w:p>
+      <w:pPr>
+        <w:jc w:val="both"/>
+        <w:rPr>
+          <w:rFonts w:ascii="Verdana" w:hAnsi="Verdana"/>
+          <w:sz w:val="18"/>
+          <w:szCs w:val="18"/>
+        </w:rPr>
+      </w:pPr>
+    </w:p>
+    <w:p>
+      <w:pPr>
+        <w:jc w:val="both"/>
+        <w:rPr>
+          <w:rFonts w:ascii="Verdana" w:hAnsi="Verdana"/>
           <w:b/>
+          <w:noProof/>
           <w:sz w:val="18"/>
           <w:szCs w:val="18"/>
         </w:rPr>
@@ -9825,50 +10436,78 @@
         <w:rPr>
           <w:rFonts w:ascii="Verdana" w:hAnsi="Verdana"/>
           <w:b/>
-          <w:sz w:val="18"/>
-          <w:szCs w:val="18"/>
-        </w:rPr>
-      </w:pPr>
+          <w:noProof/>
+          <w:sz w:val="18"/>
+          <w:szCs w:val="18"/>
+        </w:rPr>
+      </w:pPr>
+      <w:r>
+        <w:rPr>
+          <w:rFonts w:ascii="Verdana" w:hAnsi="Verdana"/>
+          <w:b/>
+          <w:noProof/>
+          <w:sz w:val="18"/>
+          <w:szCs w:val="18"/>
+        </w:rPr>
+        <w:t>8</w:t>
+      </w:r>
+      <w:r>
+        <w:rPr>
+          <w:rFonts w:ascii="Verdana" w:hAnsi="Verdana"/>
+          <w:b/>
+          <w:noProof/>
+          <w:sz w:val="18"/>
+          <w:szCs w:val="18"/>
+        </w:rPr>
+        <w:t xml:space="preserve">. </w:t>
+      </w:r>
+      <w:r>
+        <w:rPr>
+          <w:rFonts w:ascii="Verdana" w:hAnsi="Verdana"/>
+          <w:b/>
+          <w:noProof/>
+          <w:sz w:val="18"/>
+          <w:szCs w:val="18"/>
+        </w:rPr>
+        <w:t>References</w:t>
+      </w:r>
     </w:p>
     <w:p>
       <w:pPr>
         <w:jc w:val="both"/>
         <w:rPr>
           <w:rFonts w:ascii="Verdana" w:hAnsi="Verdana"/>
-          <w:sz w:val="18"/>
-          <w:szCs w:val="18"/>
-        </w:rPr>
-      </w:pPr>
-      <w:r>
-        <w:rPr>
-          <w:rFonts w:ascii="Verdana" w:hAnsi="Verdana"/>
           <w:b/>
-          <w:sz w:val="18"/>
-          <w:szCs w:val="18"/>
-        </w:rPr>
-        <w:t>7</w:t>
-      </w:r>
-      <w:r>
-        <w:rPr>
-          <w:rFonts w:ascii="Verdana" w:hAnsi="Verdana"/>
-          <w:b/>
-          <w:sz w:val="18"/>
-          <w:szCs w:val="18"/>
-        </w:rPr>
-        <w:t xml:space="preserve">. </w:t>
-      </w:r>
-      <w:r>
-        <w:rPr>
-          <w:rFonts w:ascii="Verdana" w:hAnsi="Verdana"/>
-          <w:b/>
-          <w:sz w:val="18"/>
-          <w:szCs w:val="18"/>
-        </w:rPr>
-        <w:t>Conclusion and recommendations</w:t>
-      </w:r>
-      <w:r>
-        <w:rPr>
-          <w:rFonts w:ascii="Verdana" w:hAnsi="Verdana"/>
+          <w:noProof/>
+          <w:sz w:val="18"/>
+          <w:szCs w:val="18"/>
+        </w:rPr>
+      </w:pPr>
+    </w:p>
+    <w:p>
+      <w:pPr>
+        <w:jc w:val="both"/>
+        <w:rPr>
+          <w:rFonts w:ascii="Verdana" w:hAnsi="Verdana"/>
+          <w:sz w:val="18"/>
+          <w:szCs w:val="18"/>
+        </w:rPr>
+      </w:pPr>
+      <w:r>
+        <w:rPr>
+          <w:rFonts w:ascii="Verdana" w:hAnsi="Verdana"/>
+          <w:bCs/>
+          <w:noProof/>
+          <w:sz w:val="18"/>
+          <w:szCs w:val="18"/>
+        </w:rPr>
+        <w:t>Matther Barr and Alicia Copeland-Stewart(May 6,</w:t>
+      </w:r>
+      <w:r>
+        <w:rPr>
+          <w:rFonts w:ascii="Verdana" w:hAnsi="Verdana"/>
+          <w:bCs/>
+          <w:noProof/>
           <w:sz w:val="18"/>
           <w:szCs w:val="18"/>
         </w:rPr>
@@ -9877,631 +10516,14 @@
       <w:r>
         <w:rPr>
           <w:rFonts w:ascii="Verdana" w:hAnsi="Verdana"/>
-          <w:sz w:val="18"/>
-          <w:szCs w:val="18"/>
-        </w:rPr>
-        <w:t>~</w:t>
-      </w:r>
-      <w:r>
-        <w:rPr>
-          <w:rFonts w:ascii="Verdana" w:hAnsi="Verdana"/>
-          <w:sz w:val="18"/>
-          <w:szCs w:val="18"/>
-        </w:rPr>
-        <w:t>4</w:t>
-      </w:r>
-      <w:r>
-        <w:rPr>
-          <w:rFonts w:ascii="Verdana" w:hAnsi="Verdana"/>
-          <w:sz w:val="18"/>
-          <w:szCs w:val="18"/>
-        </w:rPr>
-        <w:t>00</w:t>
-      </w:r>
-    </w:p>
-    <w:p>
-      <w:pPr>
-        <w:jc w:val="both"/>
-        <w:rPr>
-          <w:rFonts w:ascii="Verdana" w:hAnsi="Verdana"/>
-          <w:sz w:val="18"/>
-          <w:szCs w:val="18"/>
-        </w:rPr>
-      </w:pPr>
-    </w:p>
-    <w:p>
-      <w:pPr>
-        <w:jc w:val="both"/>
-        <w:rPr>
-          <w:rFonts w:ascii="Verdana" w:hAnsi="Verdana"/>
-          <w:color w:val="FF0000"/>
-          <w:sz w:val="18"/>
-          <w:szCs w:val="18"/>
-        </w:rPr>
-      </w:pPr>
-      <w:r>
-        <w:rPr>
-          <w:rFonts w:ascii="Verdana" w:hAnsi="Verdana"/>
-          <w:color w:val="FF0000"/>
-          <w:sz w:val="18"/>
-          <w:szCs w:val="18"/>
-        </w:rPr>
-        <w:t xml:space="preserve">This section </w:t>
-      </w:r>
-      <w:r>
-        <w:rPr>
-          <w:rFonts w:ascii="Verdana" w:hAnsi="Verdana"/>
-          <w:color w:val="FF0000"/>
-          <w:sz w:val="18"/>
-          <w:szCs w:val="18"/>
-        </w:rPr>
-        <w:t>should</w:t>
-      </w:r>
-      <w:r>
-        <w:rPr>
-          <w:rFonts w:ascii="Verdana" w:hAnsi="Verdana"/>
-          <w:color w:val="FF0000"/>
-          <w:sz w:val="18"/>
-          <w:szCs w:val="18"/>
-        </w:rPr>
-        <w:t xml:space="preserve"> draw</w:t>
-      </w:r>
-      <w:r>
-        <w:rPr>
-          <w:rFonts w:ascii="Verdana" w:hAnsi="Verdana"/>
-          <w:color w:val="FF0000"/>
-          <w:sz w:val="18"/>
-          <w:szCs w:val="18"/>
-        </w:rPr>
-        <w:t xml:space="preserve"> conclusions from </w:t>
-      </w:r>
-      <w:r>
-        <w:rPr>
-          <w:rFonts w:ascii="Verdana" w:hAnsi="Verdana"/>
-          <w:color w:val="FF0000"/>
-          <w:sz w:val="18"/>
-          <w:szCs w:val="18"/>
-        </w:rPr>
-        <w:t xml:space="preserve">completed </w:t>
-      </w:r>
-      <w:r>
-        <w:rPr>
-          <w:rFonts w:ascii="Verdana" w:hAnsi="Verdana"/>
-          <w:color w:val="FF0000"/>
-          <w:sz w:val="18"/>
-          <w:szCs w:val="18"/>
-        </w:rPr>
-        <w:t xml:space="preserve">research and practical work. </w:t>
-      </w:r>
-    </w:p>
-    <w:p>
-      <w:pPr>
-        <w:jc w:val="both"/>
-        <w:rPr>
-          <w:rFonts w:ascii="Verdana" w:hAnsi="Verdana"/>
-          <w:color w:val="FF0000"/>
-          <w:sz w:val="18"/>
-          <w:szCs w:val="18"/>
-        </w:rPr>
-      </w:pPr>
-    </w:p>
-    <w:p>
-      <w:pPr>
-        <w:jc w:val="both"/>
-        <w:rPr>
-          <w:rFonts w:ascii="Verdana" w:hAnsi="Verdana"/>
-          <w:color w:val="FF0000"/>
-          <w:sz w:val="18"/>
-          <w:szCs w:val="18"/>
-        </w:rPr>
-      </w:pPr>
-      <w:r>
-        <w:rPr>
-          <w:rFonts w:ascii="Verdana" w:hAnsi="Verdana"/>
-          <w:color w:val="FF0000"/>
-          <w:sz w:val="18"/>
-          <w:szCs w:val="18"/>
-        </w:rPr>
-        <w:t>Make some recommendations here for next steps or further work.</w:t>
-      </w:r>
-      <w:r>
-        <w:rPr>
-          <w:rFonts w:ascii="Verdana" w:hAnsi="Verdana"/>
-          <w:color w:val="FF0000"/>
-          <w:sz w:val="18"/>
-          <w:szCs w:val="18"/>
-        </w:rPr>
-        <w:t xml:space="preserve"> Imagine another student or professional picks up the project from where you left it. What would you recommend them to do?</w:t>
-      </w:r>
-    </w:p>
-    <w:p>
-      <w:pPr>
-        <w:jc w:val="both"/>
-        <w:rPr>
-          <w:rFonts w:ascii="Verdana" w:hAnsi="Verdana"/>
-          <w:color w:val="FF0000"/>
-          <w:sz w:val="18"/>
-          <w:szCs w:val="18"/>
-        </w:rPr>
-      </w:pPr>
-    </w:p>
-    <w:p>
-      <w:pPr>
-        <w:jc w:val="both"/>
-        <w:rPr>
-          <w:rFonts w:ascii="Verdana" w:hAnsi="Verdana"/>
-          <w:color w:val="FF0000"/>
-          <w:sz w:val="18"/>
-          <w:szCs w:val="18"/>
-        </w:rPr>
-      </w:pPr>
-      <w:r>
-        <w:rPr>
-          <w:rFonts w:ascii="Verdana" w:hAnsi="Verdana"/>
-          <w:color w:val="FF0000"/>
-          <w:sz w:val="18"/>
-          <w:szCs w:val="18"/>
-        </w:rPr>
-        <w:t xml:space="preserve">Also think about the impact </w:t>
-      </w:r>
-      <w:r>
-        <w:rPr>
-          <w:rFonts w:ascii="Verdana" w:hAnsi="Verdana"/>
-          <w:color w:val="FF0000"/>
-          <w:sz w:val="18"/>
-          <w:szCs w:val="18"/>
-        </w:rPr>
-        <w:t>that</w:t>
-      </w:r>
-      <w:r>
-        <w:rPr>
-          <w:rFonts w:ascii="Verdana" w:hAnsi="Verdana"/>
-          <w:color w:val="FF0000"/>
-          <w:sz w:val="18"/>
-          <w:szCs w:val="18"/>
-        </w:rPr>
-        <w:t xml:space="preserve"> could be achieved in the wider field. What</w:t>
-      </w:r>
-      <w:r>
-        <w:rPr>
-          <w:rFonts w:ascii="Verdana" w:hAnsi="Verdana"/>
-          <w:color w:val="FF0000"/>
-          <w:sz w:val="18"/>
-          <w:szCs w:val="18"/>
-        </w:rPr>
-        <w:t xml:space="preserve"> </w:t>
-      </w:r>
-      <w:r>
-        <w:rPr>
-          <w:rFonts w:ascii="Verdana" w:hAnsi="Verdana"/>
-          <w:color w:val="FF0000"/>
-          <w:sz w:val="18"/>
-          <w:szCs w:val="18"/>
-        </w:rPr>
-        <w:t>could</w:t>
-      </w:r>
-      <w:r>
-        <w:rPr>
-          <w:rFonts w:ascii="Verdana" w:hAnsi="Verdana"/>
-          <w:color w:val="FF0000"/>
-          <w:sz w:val="18"/>
-          <w:szCs w:val="18"/>
-        </w:rPr>
-        <w:t xml:space="preserve"> be</w:t>
-      </w:r>
-      <w:r>
-        <w:rPr>
-          <w:rFonts w:ascii="Verdana" w:hAnsi="Verdana"/>
-          <w:color w:val="FF0000"/>
-          <w:sz w:val="18"/>
-          <w:szCs w:val="18"/>
-        </w:rPr>
-        <w:t xml:space="preserve"> the </w:t>
-      </w:r>
-      <w:r>
-        <w:rPr>
-          <w:rFonts w:ascii="Verdana" w:hAnsi="Verdana"/>
-          <w:color w:val="FF0000"/>
-          <w:sz w:val="18"/>
-          <w:szCs w:val="18"/>
-        </w:rPr>
-        <w:t xml:space="preserve">longer-term future </w:t>
-      </w:r>
-      <w:r>
-        <w:rPr>
-          <w:rFonts w:ascii="Verdana" w:hAnsi="Verdana"/>
-          <w:color w:val="FF0000"/>
-          <w:sz w:val="18"/>
-          <w:szCs w:val="18"/>
-        </w:rPr>
-        <w:t xml:space="preserve">of this project </w:t>
-      </w:r>
-      <w:r>
-        <w:rPr>
-          <w:rFonts w:ascii="Verdana" w:hAnsi="Verdana"/>
-          <w:color w:val="FF0000"/>
-          <w:sz w:val="18"/>
-          <w:szCs w:val="18"/>
-        </w:rPr>
-        <w:t>beyond UWE</w:t>
-      </w:r>
-      <w:r>
-        <w:rPr>
-          <w:rFonts w:ascii="Verdana" w:hAnsi="Verdana"/>
-          <w:color w:val="FF0000"/>
-          <w:sz w:val="18"/>
-          <w:szCs w:val="18"/>
-        </w:rPr>
-        <w:t>?</w:t>
-      </w:r>
-      <w:r>
-        <w:rPr>
-          <w:rFonts w:ascii="Verdana" w:hAnsi="Verdana"/>
-          <w:color w:val="FF0000"/>
-          <w:sz w:val="18"/>
-          <w:szCs w:val="18"/>
-        </w:rPr>
-        <w:t xml:space="preserve"> A conference? An academic journal? An audiovisual festival? A </w:t>
-      </w:r>
-      <w:r>
-        <w:rPr>
-          <w:rFonts w:ascii="Verdana" w:hAnsi="Verdana"/>
-          <w:color w:val="FF0000"/>
-          <w:sz w:val="18"/>
-          <w:szCs w:val="18"/>
-        </w:rPr>
-        <w:t xml:space="preserve">creative </w:t>
-      </w:r>
-      <w:r>
-        <w:rPr>
-          <w:rFonts w:ascii="Verdana" w:hAnsi="Verdana"/>
-          <w:color w:val="FF0000"/>
-          <w:sz w:val="18"/>
-          <w:szCs w:val="18"/>
-        </w:rPr>
-        <w:t>competition?</w:t>
-      </w:r>
-      <w:r>
-        <w:rPr>
-          <w:rFonts w:ascii="Verdana" w:hAnsi="Verdana"/>
-          <w:color w:val="FF0000"/>
-          <w:sz w:val="18"/>
-          <w:szCs w:val="18"/>
-        </w:rPr>
-        <w:t xml:space="preserve"> </w:t>
-      </w:r>
-    </w:p>
-    <w:p>
-      <w:pPr>
-        <w:jc w:val="both"/>
-        <w:rPr>
-          <w:rFonts w:ascii="Verdana" w:hAnsi="Verdana"/>
-          <w:color w:val="FF0000"/>
-          <w:sz w:val="18"/>
-          <w:szCs w:val="18"/>
-        </w:rPr>
-      </w:pPr>
-    </w:p>
-    <w:p>
-      <w:pPr>
-        <w:jc w:val="both"/>
-        <w:rPr>
-          <w:rFonts w:ascii="Verdana" w:hAnsi="Verdana"/>
-          <w:color w:val="FF0000"/>
-          <w:sz w:val="18"/>
-          <w:szCs w:val="18"/>
-        </w:rPr>
-      </w:pPr>
-      <w:r>
-        <w:rPr>
-          <w:rFonts w:ascii="Verdana" w:hAnsi="Verdana"/>
-          <w:color w:val="FF0000"/>
-          <w:sz w:val="18"/>
-          <w:szCs w:val="18"/>
-        </w:rPr>
-        <w:t xml:space="preserve">How </w:t>
-      </w:r>
-      <w:r>
-        <w:rPr>
-          <w:rFonts w:ascii="Verdana" w:hAnsi="Verdana"/>
-          <w:color w:val="FF0000"/>
-          <w:sz w:val="18"/>
-          <w:szCs w:val="18"/>
-        </w:rPr>
-        <w:t xml:space="preserve">might </w:t>
-      </w:r>
-      <w:r>
-        <w:rPr>
-          <w:rFonts w:ascii="Verdana" w:hAnsi="Verdana"/>
-          <w:color w:val="FF0000"/>
-          <w:sz w:val="18"/>
-          <w:szCs w:val="18"/>
-        </w:rPr>
-        <w:t>this project</w:t>
-      </w:r>
-      <w:r>
-        <w:rPr>
-          <w:rFonts w:ascii="Verdana" w:hAnsi="Verdana"/>
-          <w:color w:val="FF0000"/>
-          <w:sz w:val="18"/>
-          <w:szCs w:val="18"/>
-        </w:rPr>
-        <w:t xml:space="preserve"> benefit </w:t>
-      </w:r>
-      <w:r>
-        <w:rPr>
-          <w:rFonts w:ascii="Verdana" w:hAnsi="Verdana"/>
-          <w:color w:val="FF0000"/>
-          <w:sz w:val="18"/>
-          <w:szCs w:val="18"/>
-        </w:rPr>
-        <w:t xml:space="preserve">other </w:t>
-      </w:r>
-      <w:r>
-        <w:rPr>
-          <w:rFonts w:ascii="Verdana" w:hAnsi="Verdana"/>
-          <w:color w:val="FF0000"/>
-          <w:sz w:val="18"/>
-          <w:szCs w:val="18"/>
-        </w:rPr>
-        <w:t xml:space="preserve">users, professionals, society? </w:t>
-      </w:r>
-      <w:r>
-        <w:rPr>
-          <w:rFonts w:ascii="Verdana" w:hAnsi="Verdana"/>
-          <w:color w:val="FF0000"/>
-          <w:sz w:val="18"/>
-          <w:szCs w:val="18"/>
-        </w:rPr>
-        <w:t xml:space="preserve">Does </w:t>
-      </w:r>
-      <w:r>
-        <w:rPr>
-          <w:rFonts w:ascii="Verdana" w:hAnsi="Verdana"/>
-          <w:color w:val="FF0000"/>
-          <w:sz w:val="18"/>
-          <w:szCs w:val="18"/>
-        </w:rPr>
-        <w:t>the project</w:t>
-      </w:r>
-      <w:r>
-        <w:rPr>
-          <w:rFonts w:ascii="Verdana" w:hAnsi="Verdana"/>
-          <w:color w:val="FF0000"/>
-          <w:sz w:val="18"/>
-          <w:szCs w:val="18"/>
-        </w:rPr>
-        <w:t xml:space="preserve"> have any</w:t>
-      </w:r>
-      <w:r>
-        <w:rPr>
-          <w:rFonts w:ascii="Verdana" w:hAnsi="Verdana"/>
-          <w:color w:val="FF0000"/>
-          <w:sz w:val="18"/>
-          <w:szCs w:val="18"/>
-        </w:rPr>
-        <w:t xml:space="preserve"> commercial potential for example? </w:t>
-      </w:r>
-      <w:r>
-        <w:rPr>
-          <w:rFonts w:ascii="Verdana" w:hAnsi="Verdana"/>
-          <w:color w:val="FF0000"/>
-          <w:sz w:val="18"/>
-          <w:szCs w:val="18"/>
-        </w:rPr>
-        <w:t xml:space="preserve">Could it become a sellable product? </w:t>
-      </w:r>
-      <w:r>
-        <w:rPr>
-          <w:rFonts w:ascii="Verdana" w:hAnsi="Verdana"/>
-          <w:color w:val="FF0000"/>
-          <w:sz w:val="18"/>
-          <w:szCs w:val="18"/>
-        </w:rPr>
-        <w:t xml:space="preserve">Or </w:t>
-      </w:r>
-      <w:r>
-        <w:rPr>
-          <w:rFonts w:ascii="Verdana" w:hAnsi="Verdana"/>
-          <w:color w:val="FF0000"/>
-          <w:sz w:val="18"/>
-          <w:szCs w:val="18"/>
-        </w:rPr>
-        <w:t>sh</w:t>
-      </w:r>
-      <w:r>
-        <w:rPr>
-          <w:rFonts w:ascii="Verdana" w:hAnsi="Verdana"/>
-          <w:color w:val="FF0000"/>
-          <w:sz w:val="18"/>
-          <w:szCs w:val="18"/>
-        </w:rPr>
-        <w:t xml:space="preserve">ould </w:t>
-      </w:r>
-      <w:r>
-        <w:rPr>
-          <w:rFonts w:ascii="Verdana" w:hAnsi="Verdana"/>
-          <w:color w:val="FF0000"/>
-          <w:sz w:val="18"/>
-          <w:szCs w:val="18"/>
-        </w:rPr>
-        <w:t>the code</w:t>
-      </w:r>
-      <w:r>
-        <w:rPr>
-          <w:rFonts w:ascii="Verdana" w:hAnsi="Verdana"/>
-          <w:color w:val="FF0000"/>
-          <w:sz w:val="18"/>
-          <w:szCs w:val="18"/>
-        </w:rPr>
-        <w:t xml:space="preserve"> become a creative commons resource</w:t>
-      </w:r>
-      <w:r>
-        <w:rPr>
-          <w:rFonts w:ascii="Verdana" w:hAnsi="Verdana"/>
-          <w:color w:val="FF0000"/>
-          <w:sz w:val="18"/>
-          <w:szCs w:val="18"/>
-        </w:rPr>
-        <w:t xml:space="preserve">? </w:t>
-      </w:r>
-    </w:p>
-    <w:p>
-      <w:pPr>
-        <w:jc w:val="both"/>
-        <w:rPr>
-          <w:rFonts w:ascii="Verdana" w:hAnsi="Verdana"/>
-          <w:color w:val="FF0000"/>
-          <w:sz w:val="18"/>
-          <w:szCs w:val="18"/>
-        </w:rPr>
-      </w:pPr>
-    </w:p>
-    <w:p>
-      <w:pPr>
-        <w:jc w:val="both"/>
-        <w:rPr>
-          <w:rFonts w:ascii="Verdana" w:hAnsi="Verdana"/>
-          <w:color w:val="FF0000"/>
-          <w:sz w:val="18"/>
-          <w:szCs w:val="18"/>
-        </w:rPr>
-      </w:pPr>
-      <w:r>
-        <w:rPr>
-          <w:rFonts w:ascii="Verdana" w:hAnsi="Verdana"/>
-          <w:color w:val="FF0000"/>
-          <w:sz w:val="18"/>
-          <w:szCs w:val="18"/>
-        </w:rPr>
-        <w:t>Find a useful sentence to end this report with. It is always beneficial to end on a positive.</w:t>
-      </w:r>
-      <w:r>
-        <w:rPr>
-          <w:rFonts w:ascii="Verdana" w:hAnsi="Verdana"/>
-          <w:color w:val="FF0000"/>
-          <w:sz w:val="18"/>
-          <w:szCs w:val="18"/>
-        </w:rPr>
-        <w:t xml:space="preserve"> </w:t>
-      </w:r>
-    </w:p>
-    <w:p>
-      <w:pPr>
-        <w:jc w:val="both"/>
-        <w:rPr>
-          <w:rFonts w:ascii="Verdana" w:hAnsi="Verdana"/>
-          <w:sz w:val="18"/>
-          <w:szCs w:val="18"/>
-        </w:rPr>
-      </w:pPr>
-    </w:p>
-    <w:p>
-      <w:pPr>
-        <w:jc w:val="both"/>
-        <w:rPr>
-          <w:rFonts w:ascii="Verdana" w:hAnsi="Verdana"/>
-          <w:b/>
-          <w:noProof/>
-          <w:sz w:val="18"/>
-          <w:szCs w:val="18"/>
-        </w:rPr>
-      </w:pPr>
-    </w:p>
-    <w:p>
-      <w:pPr>
-        <w:jc w:val="both"/>
-        <w:rPr>
-          <w:rFonts w:ascii="Verdana" w:hAnsi="Verdana"/>
-          <w:b/>
-          <w:noProof/>
-          <w:sz w:val="18"/>
-          <w:szCs w:val="18"/>
-        </w:rPr>
-      </w:pPr>
-      <w:r>
-        <w:rPr>
-          <w:rFonts w:ascii="Verdana" w:hAnsi="Verdana"/>
-          <w:b/>
-          <w:noProof/>
-          <w:sz w:val="18"/>
-          <w:szCs w:val="18"/>
-        </w:rPr>
-        <w:t>8</w:t>
-      </w:r>
-      <w:r>
-        <w:rPr>
-          <w:rFonts w:ascii="Verdana" w:hAnsi="Verdana"/>
-          <w:b/>
-          <w:noProof/>
-          <w:sz w:val="18"/>
-          <w:szCs w:val="18"/>
-        </w:rPr>
-        <w:t xml:space="preserve">. </w:t>
-      </w:r>
-      <w:r>
-        <w:rPr>
-          <w:rFonts w:ascii="Verdana" w:hAnsi="Verdana"/>
-          <w:b/>
-          <w:noProof/>
-          <w:sz w:val="18"/>
-          <w:szCs w:val="18"/>
-        </w:rPr>
-        <w:t>References</w:t>
-      </w:r>
-    </w:p>
-    <w:p>
-      <w:pPr>
-        <w:jc w:val="both"/>
-        <w:rPr>
-          <w:rFonts w:ascii="Verdana" w:hAnsi="Verdana"/>
-          <w:b/>
-          <w:noProof/>
-          <w:sz w:val="18"/>
-          <w:szCs w:val="18"/>
-        </w:rPr>
-      </w:pPr>
-    </w:p>
-    <w:p>
-      <w:pPr>
-        <w:jc w:val="both"/>
-        <w:rPr>
-          <w:rFonts w:ascii="Verdana" w:hAnsi="Verdana"/>
-          <w:sz w:val="18"/>
-          <w:szCs w:val="18"/>
-        </w:rPr>
-      </w:pPr>
-      <w:r>
-        <w:rPr>
-          <w:rFonts w:ascii="Verdana" w:hAnsi="Verdana"/>
           <w:bCs/>
           <w:noProof/>
           <w:sz w:val="18"/>
           <w:szCs w:val="18"/>
         </w:rPr>
-        <w:t>Matther Barr and Alicia Copeland-Stewart(May 6,</w:t>
-      </w:r>
-      <w:r>
-        <w:rPr>
-          <w:rFonts w:ascii="Verdana" w:hAnsi="Verdana"/>
-          <w:bCs/>
-          <w:noProof/>
-          <w:sz w:val="18"/>
-          <w:szCs w:val="18"/>
-        </w:rPr>
-        <w:t xml:space="preserve"> </w:t>
-      </w:r>
-      <w:r>
-        <w:rPr>
-          <w:rFonts w:ascii="Verdana" w:hAnsi="Verdana"/>
-          <w:bCs/>
-          <w:noProof/>
-          <w:sz w:val="18"/>
-          <w:szCs w:val="18"/>
-        </w:rPr>
         <w:t xml:space="preserve"> 2021) Playing Video Games During the COVID-19 Pandemic and Effects on players’ Well-Being. Available from: </w:t>
       </w:r>
-      <w:hyperlink r:id="rId27" w:anchor="core-collateral-self-citation" w:history="1">
+      <w:hyperlink r:id="rId28" w:anchor="core-collateral-self-citation" w:history="1">
         <w:r>
           <w:rPr>
             <w:rStyle w:val="Hyperlink"/>
@@ -10654,7 +10676,7 @@
         </w:rPr>
         <w:t xml:space="preserve"> </w:t>
       </w:r>
-      <w:hyperlink r:id="rId28" w:history="1">
+      <w:hyperlink r:id="rId29" w:history="1">
         <w:r>
           <w:rPr>
             <w:rStyle w:val="Hyperlink"/>
@@ -10664,18 +10686,7 @@
             <w:sz w:val="18"/>
             <w:szCs w:val="18"/>
           </w:rPr>
-          <w:t>https://www.thegamingeconomy.com/2020/03/1</w:t>
-        </w:r>
-        <w:r>
-          <w:rPr>
-            <w:rStyle w:val="Hyperlink"/>
-            <w:rFonts w:ascii="Verdana" w:hAnsi="Verdana"/>
-            <w:bCs/>
-            <w:noProof/>
-            <w:sz w:val="18"/>
-            <w:szCs w:val="18"/>
-          </w:rPr>
-          <w:t>9/tencent-revenue-up-21-video-game-usage-rises-amid-covid-19/</w:t>
+          <w:t>https://www.thegamingeconomy.com/2020/03/19/tencent-revenue-up-21-video-game-usage-rises-amid-covid-19/</w:t>
         </w:r>
       </w:hyperlink>
       <w:r>
@@ -10813,7 +10824,7 @@
         </w:rPr>
         <w:t xml:space="preserve"> Available from: </w:t>
       </w:r>
-      <w:hyperlink r:id="rId29" w:history="1">
+      <w:hyperlink r:id="rId30" w:history="1">
         <w:r>
           <w:rPr>
             <w:rStyle w:val="Hyperlink"/>
@@ -10950,7 +10961,7 @@
         </w:rPr>
         <w:t xml:space="preserve">Top Hat (Sept 16, 2019) Visual Learning Definition and meaning. Available from: </w:t>
       </w:r>
-      <w:hyperlink r:id="rId30" w:history="1">
+      <w:hyperlink r:id="rId31" w:history="1">
         <w:r>
           <w:rPr>
             <w:rStyle w:val="Hyperlink"/>
@@ -11227,7 +11238,7 @@
         </w:rPr>
         <w:t xml:space="preserve">Available from: </w:t>
       </w:r>
-      <w:hyperlink r:id="rId31" w:anchor="Abs1" w:history="1">
+      <w:hyperlink r:id="rId32" w:anchor="Abs1" w:history="1">
         <w:r>
           <w:rPr>
             <w:rStyle w:val="Hyperlink"/>
@@ -11328,7 +11339,7 @@
         </w:rPr>
         <w:t xml:space="preserve">. Available from: </w:t>
       </w:r>
-      <w:hyperlink r:id="rId32" w:history="1">
+      <w:hyperlink r:id="rId33" w:history="1">
         <w:r>
           <w:rPr>
             <w:rStyle w:val="Hyperlink"/>
@@ -11397,7 +11408,7 @@
         </w:rPr>
         <w:t xml:space="preserve">Samba Recovery (Mar 4, 2025) Average Human Attention Span Statistics &amp; Facts [2024]. Available from: </w:t>
       </w:r>
-      <w:hyperlink r:id="rId33" w:history="1">
+      <w:hyperlink r:id="rId34" w:history="1">
         <w:r>
           <w:rPr>
             <w:rStyle w:val="Hyperlink"/>
@@ -11490,7 +11501,7 @@
         </w:rPr>
         <w:t xml:space="preserve">. Available from: </w:t>
       </w:r>
-      <w:hyperlink r:id="rId34" w:history="1">
+      <w:hyperlink r:id="rId35" w:history="1">
         <w:r>
           <w:rPr>
             <w:rStyle w:val="Hyperlink"/>
@@ -11641,7 +11652,7 @@
         </w:rPr>
         <w:t xml:space="preserve"> (Jun 27, 2022) Exploring the Benefits of Art-Based Kinesthetic Activities in the College Classroom. Available from: </w:t>
       </w:r>
-      <w:hyperlink r:id="rId35" w:history="1">
+      <w:hyperlink r:id="rId36" w:history="1">
         <w:r>
           <w:rPr>
             <w:rStyle w:val="Hyperlink"/>
@@ -11727,7 +11738,7 @@
         </w:rPr>
         <w:t xml:space="preserve">. Available from: </w:t>
       </w:r>
-      <w:hyperlink r:id="rId36" w:history="1">
+      <w:hyperlink r:id="rId37" w:history="1">
         <w:r>
           <w:rPr>
             <w:rStyle w:val="Hyperlink"/>
@@ -11854,7 +11865,7 @@
         </w:rPr>
         <w:t xml:space="preserve">Veli-Matti Karhulahti (Sept, 2013) A Kinesthetic Theory of Videogames: Time-Critical Challenge and Aporetic Rhematic. Available from: </w:t>
       </w:r>
-      <w:hyperlink r:id="rId37" w:history="1">
+      <w:hyperlink r:id="rId38" w:history="1">
         <w:r>
           <w:rPr>
             <w:rStyle w:val="Hyperlink"/>
@@ -12037,7 +12048,15 @@
           <w:sz w:val="18"/>
           <w:szCs w:val="18"/>
         </w:rPr>
-        <w:t>. Available from:</w:t>
+        <w:t xml:space="preserve">. Available </w:t>
+      </w:r>
+      <w:r>
+        <w:rPr>
+          <w:rFonts w:ascii="Verdana" w:hAnsi="Verdana"/>
+          <w:sz w:val="18"/>
+          <w:szCs w:val="18"/>
+        </w:rPr>
+        <w:t>from:</w:t>
       </w:r>
       <w:r>
         <w:rPr>
@@ -12123,7 +12142,7 @@
         </w:rPr>
         <w:t xml:space="preserve"> (no date) Pattern Recognition. Available from: </w:t>
       </w:r>
-      <w:hyperlink r:id="rId38" w:history="1">
+      <w:hyperlink r:id="rId39" w:history="1">
         <w:r>
           <w:rPr>
             <w:rStyle w:val="Hyperlink"/>
@@ -12278,7 +12297,7 @@
         </w:rPr>
         <w:t xml:space="preserve">Anon (Aug 23, 2024) Exploring Cognitive Skills: Pattern Recognition. Available from: </w:t>
       </w:r>
-      <w:hyperlink r:id="rId39" w:history="1">
+      <w:hyperlink r:id="rId40" w:history="1">
         <w:r>
           <w:rPr>
             <w:rStyle w:val="Hyperlink"/>
@@ -12355,7 +12374,7 @@
         </w:rPr>
         <w:t xml:space="preserve">ns. Available from: </w:t>
       </w:r>
-      <w:hyperlink r:id="rId40" w:history="1">
+      <w:hyperlink r:id="rId41" w:history="1">
         <w:r>
           <w:rPr>
             <w:rStyle w:val="Hyperlink"/>
@@ -12424,7 +12443,7 @@
         </w:rPr>
         <w:t xml:space="preserve">Jennifer Logan (Mar 13, 2023) What is the Neocortex?. Available from: </w:t>
       </w:r>
-      <w:hyperlink r:id="rId41" w:history="1">
+      <w:hyperlink r:id="rId42" w:history="1">
         <w:r>
           <w:rPr>
             <w:rStyle w:val="Hyperlink"/>
@@ -12441,15 +12460,7 @@
           <w:sz w:val="18"/>
           <w:szCs w:val="18"/>
         </w:rPr>
-        <w:t xml:space="preserve">. </w:t>
-      </w:r>
-      <w:r>
-        <w:rPr>
-          <w:rFonts w:ascii="Verdana" w:hAnsi="Verdana"/>
-          <w:sz w:val="18"/>
-          <w:szCs w:val="18"/>
-        </w:rPr>
-        <w:t xml:space="preserve"> </w:t>
+        <w:t xml:space="preserve">.  </w:t>
       </w:r>
       <w:r>
         <w:rPr>
@@ -12501,7 +12512,7 @@
         </w:rPr>
         <w:t xml:space="preserve">Miryam Naddaf and Nature Magazine (Sept 27, 2024) How Your Brain Detects Patters without Conscious Thought. Available from: </w:t>
       </w:r>
-      <w:hyperlink r:id="rId42" w:history="1">
+      <w:hyperlink r:id="rId43" w:anchor=":~:text=The%20human%20brain%20is%20constantly,brain%20tissue%20for%20medical%20reasons" w:history="1">
         <w:r>
           <w:rPr>
             <w:rStyle w:val="Hyperlink"/>
@@ -12586,7 +12597,7 @@
         </w:rPr>
         <w:t xml:space="preserve"> (May 31, 2018) This is your brain detecting patterns. Available from: </w:t>
       </w:r>
-      <w:hyperlink r:id="rId43" w:history="1">
+      <w:hyperlink r:id="rId44" w:history="1">
         <w:r>
           <w:rPr>
             <w:rStyle w:val="Hyperlink"/>
@@ -12921,7 +12932,7 @@
         </w:rPr>
         <w:t xml:space="preserve">[Online] Available from </w:t>
       </w:r>
-      <w:hyperlink r:id="rId44" w:history="1">
+      <w:hyperlink r:id="rId45" w:history="1">
         <w:r>
           <w:rPr>
             <w:rStyle w:val="Hyperlink"/>
@@ -12950,7 +12961,6 @@
           <w:sz w:val="18"/>
           <w:szCs w:val="18"/>
         </w:rPr>
-        <w:lastRenderedPageBreak/>
         <w:t>[last access: 23</w:t>
       </w:r>
       <w:r>
@@ -16211,6 +16221,7 @@
   <w:style w:type="character" w:default="1" w:styleId="DefaultParagraphFont">
     <w:name w:val="Default Paragraph Font"/>
     <w:uiPriority w:val="1"/>
+    <w:semiHidden/>
     <w:unhideWhenUsed/>
   </w:style>
   <w:style w:type="table" w:default="1" w:styleId="TableNormal">
@@ -17135,10 +17146,6 @@
 </file>
 
 <file path=customXml/item1.xml><?xml version="1.0" encoding="utf-8"?>
-<b:Sources xmlns:b="http://schemas.openxmlformats.org/officeDocument/2006/bibliography" xmlns="http://schemas.openxmlformats.org/officeDocument/2006/bibliography" SelectedStyle="/APA.XSL" StyleName="APA"/>
-</file>
-
-<file path=customXml/item2.xml><?xml version="1.0" encoding="utf-8"?>
 <?mso-contentType ?>
 <FormTemplates xmlns="http://schemas.microsoft.com/sharepoint/v3/contenttype/forms">
   <Display>DocumentLibraryForm</Display>
@@ -17147,22 +17154,11 @@
 </FormTemplates>
 </file>
 
-<file path=customXml/item3.xml><?xml version="1.0" encoding="utf-8"?>
-<p:properties xmlns:p="http://schemas.microsoft.com/office/2006/metadata/properties" xmlns:xsi="http://www.w3.org/2001/XMLSchema-instance" xmlns:pc="http://schemas.microsoft.com/office/infopath/2007/PartnerControls">
-  <documentManagement>
-    <lcf76f155ced4ddcb4097134ff3c332f xmlns="3ca5950f-9dc6-4fa2-8e6b-e8b0d1a55fc5">
-      <Terms xmlns="http://schemas.microsoft.com/office/infopath/2007/PartnerControls"/>
-    </lcf76f155ced4ddcb4097134ff3c332f>
-    <link xmlns="3ca5950f-9dc6-4fa2-8e6b-e8b0d1a55fc5">
-      <Url xsi:nil="true"/>
-      <Description xsi:nil="true"/>
-    </link>
-    <TaxCatchAll xmlns="da5699a2-2791-44c0-bb0a-d0c081c141e6" xsi:nil="true"/>
-  </documentManagement>
-</p:properties>
+<file path=customXml/item2.xml><?xml version="1.0" encoding="utf-8"?>
+<b:Sources xmlns:b="http://schemas.openxmlformats.org/officeDocument/2006/bibliography" xmlns="http://schemas.openxmlformats.org/officeDocument/2006/bibliography" SelectedStyle="/APA.XSL" StyleName="APA"/>
 </file>
 
-<file path=customXml/item4.xml><?xml version="1.0" encoding="utf-8"?>
+<file path=customXml/item3.xml><?xml version="1.0" encoding="utf-8"?>
 <ct:contentTypeSchema xmlns:ct="http://schemas.microsoft.com/office/2006/metadata/contentType" xmlns:ma="http://schemas.microsoft.com/office/2006/metadata/properties/metaAttributes" ct:_="" ma:_="" ma:contentTypeName="Document" ma:contentTypeID="0x0101001BC1D44B3665304E9EFFB6B26E5C1EDB" ma:contentTypeVersion="17" ma:contentTypeDescription="Create a new document." ma:contentTypeScope="" ma:versionID="ebe7ffaa3beae6c2692551344dbac989">
   <xsd:schema xmlns:xsd="http://www.w3.org/2001/XMLSchema" xmlns:xs="http://www.w3.org/2001/XMLSchema" xmlns:p="http://schemas.microsoft.com/office/2006/metadata/properties" xmlns:ns2="3ca5950f-9dc6-4fa2-8e6b-e8b0d1a55fc5" xmlns:ns3="da5699a2-2791-44c0-bb0a-d0c081c141e6" targetNamespace="http://schemas.microsoft.com/office/2006/metadata/properties" ma:root="true" ma:fieldsID="fbc6f3879e7a0016066cbb62231de351" ns2:_="" ns3:_="">
     <xsd:import namespace="3ca5950f-9dc6-4fa2-8e6b-e8b0d1a55fc5"/>
@@ -17418,7 +17414,30 @@
 </ct:contentTypeSchema>
 </file>
 
+<file path=customXml/item4.xml><?xml version="1.0" encoding="utf-8"?>
+<p:properties xmlns:p="http://schemas.microsoft.com/office/2006/metadata/properties" xmlns:xsi="http://www.w3.org/2001/XMLSchema-instance" xmlns:pc="http://schemas.microsoft.com/office/infopath/2007/PartnerControls">
+  <documentManagement>
+    <lcf76f155ced4ddcb4097134ff3c332f xmlns="3ca5950f-9dc6-4fa2-8e6b-e8b0d1a55fc5">
+      <Terms xmlns="http://schemas.microsoft.com/office/infopath/2007/PartnerControls"/>
+    </lcf76f155ced4ddcb4097134ff3c332f>
+    <link xmlns="3ca5950f-9dc6-4fa2-8e6b-e8b0d1a55fc5">
+      <Url xsi:nil="true"/>
+      <Description xsi:nil="true"/>
+    </link>
+    <TaxCatchAll xmlns="da5699a2-2791-44c0-bb0a-d0c081c141e6" xsi:nil="true"/>
+  </documentManagement>
+</p:properties>
+</file>
+
 <file path=customXml/itemProps1.xml><?xml version="1.0" encoding="utf-8"?>
+<ds:datastoreItem xmlns:ds="http://schemas.openxmlformats.org/officeDocument/2006/customXml" ds:itemID="{CE597715-63E8-4A9F-B3CC-57F27D3DCBFB}">
+  <ds:schemaRefs>
+    <ds:schemaRef ds:uri="http://schemas.microsoft.com/sharepoint/v3/contenttype/forms"/>
+  </ds:schemaRefs>
+</ds:datastoreItem>
+</file>
+
+<file path=customXml/itemProps2.xml><?xml version="1.0" encoding="utf-8"?>
 <ds:datastoreItem xmlns:ds="http://schemas.openxmlformats.org/officeDocument/2006/customXml" ds:itemID="{191EA17E-4FF3-6543-9328-B87A43C2CF01}">
   <ds:schemaRefs>
     <ds:schemaRef ds:uri="http://schemas.openxmlformats.org/officeDocument/2006/bibliography"/>
@@ -17426,26 +17445,7 @@
 </ds:datastoreItem>
 </file>
 
-<file path=customXml/itemProps2.xml><?xml version="1.0" encoding="utf-8"?>
-<ds:datastoreItem xmlns:ds="http://schemas.openxmlformats.org/officeDocument/2006/customXml" ds:itemID="{CE597715-63E8-4A9F-B3CC-57F27D3DCBFB}">
-  <ds:schemaRefs>
-    <ds:schemaRef ds:uri="http://schemas.microsoft.com/sharepoint/v3/contenttype/forms"/>
-  </ds:schemaRefs>
-</ds:datastoreItem>
-</file>
-
 <file path=customXml/itemProps3.xml><?xml version="1.0" encoding="utf-8"?>
-<ds:datastoreItem xmlns:ds="http://schemas.openxmlformats.org/officeDocument/2006/customXml" ds:itemID="{37169F2F-1A49-4A9E-A13A-BBD6F4DE6A1B}">
-  <ds:schemaRefs>
-    <ds:schemaRef ds:uri="http://schemas.microsoft.com/office/2006/metadata/properties"/>
-    <ds:schemaRef ds:uri="http://schemas.microsoft.com/office/infopath/2007/PartnerControls"/>
-    <ds:schemaRef ds:uri="3ca5950f-9dc6-4fa2-8e6b-e8b0d1a55fc5"/>
-    <ds:schemaRef ds:uri="da5699a2-2791-44c0-bb0a-d0c081c141e6"/>
-  </ds:schemaRefs>
-</ds:datastoreItem>
-</file>
-
-<file path=customXml/itemProps4.xml><?xml version="1.0" encoding="utf-8"?>
 <ds:datastoreItem xmlns:ds="http://schemas.openxmlformats.org/officeDocument/2006/customXml" ds:itemID="{F6547193-3E93-40A7-96AB-43C0DF37402B}">
   <ds:schemaRefs>
     <ds:schemaRef ds:uri="http://schemas.microsoft.com/office/2006/metadata/contentType"/>
@@ -17462,4 +17462,15 @@
     <ds:schemaRef ds:uri="http://schemas.microsoft.com/internal/obd"/>
   </ds:schemaRefs>
 </ds:datastoreItem>
+</file>
+
+<file path=customXml/itemProps4.xml><?xml version="1.0" encoding="utf-8"?>
+<ds:datastoreItem xmlns:ds="http://schemas.openxmlformats.org/officeDocument/2006/customXml" ds:itemID="{37169F2F-1A49-4A9E-A13A-BBD6F4DE6A1B}">
+  <ds:schemaRefs>
+    <ds:schemaRef ds:uri="http://schemas.microsoft.com/office/2006/metadata/properties"/>
+    <ds:schemaRef ds:uri="http://schemas.microsoft.com/office/infopath/2007/PartnerControls"/>
+    <ds:schemaRef ds:uri="3ca5950f-9dc6-4fa2-8e6b-e8b0d1a55fc5"/>
+    <ds:schemaRef ds:uri="da5699a2-2791-44c0-bb0a-d0c081c141e6"/>
+  </ds:schemaRefs>
+</ds:datastoreItem>
 </file>
</xml_diff>

<commit_message>
Started talking about each features implementation
</commit_message>
<xml_diff>
--- a/Dis Report.docx
+++ b/Dis Report.docx
@@ -218,7 +218,7 @@
                         <a:effectLst/>
                         <a:extLst>
                           <a:ext uri="{C572A759-6A51-4108-AA02-DFA0A04FC94B}">
-                            <ma14:wrappingTextBoxFlag xmlns="" xmlns:mo="http://schemas.microsoft.com/office/mac/office/2008/main" xmlns:mv="urn:schemas-microsoft-com:mac:vml" xmlns:o="urn:schemas-microsoft-com:office:office" xmlns:v="urn:schemas-microsoft-com:vml" xmlns:w10="urn:schemas-microsoft-com:office:word" xmlns:w="http://schemas.openxmlformats.org/wordprocessingml/2006/main" xmlns:ma14="http://schemas.microsoft.com/office/mac/drawingml/2011/main"/>
+                            <ma14:wrappingTextBoxFlag xmlns:ma14="http://schemas.microsoft.com/office/mac/drawingml/2011/main" xmlns:w="http://schemas.openxmlformats.org/wordprocessingml/2006/main" xmlns:w10="urn:schemas-microsoft-com:office:word" xmlns:v="urn:schemas-microsoft-com:vml" xmlns:o="urn:schemas-microsoft-com:office:office" xmlns:mv="urn:schemas-microsoft-com:mac:vml" xmlns:mo="http://schemas.microsoft.com/office/mac/office/2008/main" xmlns=""/>
                           </a:ext>
                         </a:extLst>
                       </wps:spPr>
@@ -5616,7 +5616,7 @@
                         <a:effectLst/>
                         <a:extLst>
                           <a:ext uri="{C572A759-6A51-4108-AA02-DFA0A04FC94B}">
-                            <ma14:wrappingTextBoxFlag xmlns="" xmlns:mo="http://schemas.microsoft.com/office/mac/office/2008/main" xmlns:mv="urn:schemas-microsoft-com:mac:vml" xmlns:o="urn:schemas-microsoft-com:office:office" xmlns:v="urn:schemas-microsoft-com:vml" xmlns:w10="urn:schemas-microsoft-com:office:word" xmlns:w="http://schemas.openxmlformats.org/wordprocessingml/2006/main" xmlns:ma14="http://schemas.microsoft.com/office/mac/drawingml/2011/main"/>
+                            <ma14:wrappingTextBoxFlag xmlns:ma14="http://schemas.microsoft.com/office/mac/drawingml/2011/main" xmlns:w="http://schemas.openxmlformats.org/wordprocessingml/2006/main" xmlns:w10="urn:schemas-microsoft-com:office:word" xmlns:v="urn:schemas-microsoft-com:vml" xmlns:o="urn:schemas-microsoft-com:office:office" xmlns:mv="urn:schemas-microsoft-com:mac:vml" xmlns:mo="http://schemas.microsoft.com/office/mac/office/2008/main" xmlns=""/>
                           </a:ext>
                         </a:extLst>
                       </wps:spPr>
@@ -6338,7 +6338,23 @@
           <w:sz w:val="18"/>
           <w:szCs w:val="18"/>
         </w:rPr>
-        <w:t>This section of the project will guide the reader through how each stage of the implementation worked and how each component was made being combined to create the final artifact. It will breakdown how the player component works, how the level design was iterated upon and how implementation of player feedback alongside research was used to create the second and final iteration of the artifacts tutorial levels.</w:t>
+        <w:t xml:space="preserve">This section of the project will guide the reader through how each stage of the implementation worked and how each component was made being combined to create the final artifact. It will breakdown how the player component works, how the level design was iterated upon and how implementation of player feedback alongside research was used to create the second and final iteration of the </w:t>
+      </w:r>
+      <w:r>
+        <w:rPr>
+          <w:rFonts w:ascii="Verdana" w:hAnsi="Verdana"/>
+          <w:sz w:val="18"/>
+          <w:szCs w:val="18"/>
+        </w:rPr>
+        <w:t>artifact’s</w:t>
+      </w:r>
+      <w:r>
+        <w:rPr>
+          <w:rFonts w:ascii="Verdana" w:hAnsi="Verdana"/>
+          <w:sz w:val="18"/>
+          <w:szCs w:val="18"/>
+        </w:rPr>
+        <w:t xml:space="preserve"> tutorial levels.</w:t>
       </w:r>
     </w:p>
     <w:p>
@@ -6507,23 +6523,23 @@
           <w:sz w:val="18"/>
           <w:szCs w:val="18"/>
         </w:rPr>
-        <w:t xml:space="preserve">While New </w:t>
-      </w:r>
-      <w:r>
-        <w:rPr>
-          <w:rFonts w:ascii="Verdana" w:hAnsi="Verdana"/>
-          <w:sz w:val="18"/>
-          <w:szCs w:val="18"/>
-        </w:rPr>
-        <w:t>Super Mario Bros DS</w:t>
-      </w:r>
-      <w:r>
-        <w:rPr>
-          <w:rFonts w:ascii="Verdana" w:hAnsi="Verdana"/>
-          <w:sz w:val="18"/>
-          <w:szCs w:val="18"/>
-        </w:rPr>
-        <w:t xml:space="preserve"> gives a solid but simple move set more complex moves were desired in order to give players more control over their characters </w:t>
+        <w:t xml:space="preserve">While New Super Mario Bros DS gives a solid but simple move set more complex moves were desired </w:t>
+      </w:r>
+      <w:r>
+        <w:rPr>
+          <w:rFonts w:ascii="Verdana" w:hAnsi="Verdana"/>
+          <w:sz w:val="18"/>
+          <w:szCs w:val="18"/>
+        </w:rPr>
+        <w:t>to</w:t>
+      </w:r>
+      <w:r>
+        <w:rPr>
+          <w:rFonts w:ascii="Verdana" w:hAnsi="Verdana"/>
+          <w:sz w:val="18"/>
+          <w:szCs w:val="18"/>
+        </w:rPr>
+        <w:t xml:space="preserve"> give players more control over their characters </w:t>
       </w:r>
       <w:r>
         <w:rPr>
@@ -6563,7 +6579,23 @@
           <w:sz w:val="18"/>
           <w:szCs w:val="18"/>
         </w:rPr>
-        <w:t xml:space="preserve">and shown in figure 1 requires the player to press an input at the correct time in order to correctly parry. This system adds a layer of skill to the game and while optional in Cuphead will be used in a similar fashion to give the player movement in the artifact. </w:t>
+        <w:t xml:space="preserve">and shown in figure 1 requires the player to press an input at the correct time </w:t>
+      </w:r>
+      <w:r>
+        <w:rPr>
+          <w:rFonts w:ascii="Verdana" w:hAnsi="Verdana"/>
+          <w:sz w:val="18"/>
+          <w:szCs w:val="18"/>
+        </w:rPr>
+        <w:t>to</w:t>
+      </w:r>
+      <w:r>
+        <w:rPr>
+          <w:rFonts w:ascii="Verdana" w:hAnsi="Verdana"/>
+          <w:sz w:val="18"/>
+          <w:szCs w:val="18"/>
+        </w:rPr>
+        <w:t xml:space="preserve"> correctly parry. This system adds a layer of skill to the game and while optional in Cuphead will be used in a similar fashion to give the player movement in the artifact. </w:t>
       </w:r>
     </w:p>
     <w:p>
@@ -6594,16 +6626,7 @@
           <w:sz w:val="16"/>
           <w:szCs w:val="16"/>
         </w:rPr>
-        <w:t xml:space="preserve">Tutorial level of Cuphead showing the “Parry Slap” system </w:t>
-      </w:r>
-      <w:r>
-        <w:rPr>
-          <w:rFonts w:ascii="Verdana" w:hAnsi="Verdana"/>
-          <w:noProof/>
-          <w:sz w:val="16"/>
-          <w:szCs w:val="16"/>
-        </w:rPr>
-        <w:t>(Studio MDHR, 2017)</w:t>
+        <w:t>Tutorial level of Cuphead showing the “Parry Slap” system (Studio MDHR, 2017)</w:t>
       </w:r>
     </w:p>
     <w:p>
@@ -6968,7 +6991,7 @@
                         <a:effectLst/>
                         <a:extLst>
                           <a:ext uri="{C572A759-6A51-4108-AA02-DFA0A04FC94B}">
-                            <ma14:wrappingTextBoxFlag xmlns="" xmlns:mo="http://schemas.microsoft.com/office/mac/office/2008/main" xmlns:mv="urn:schemas-microsoft-com:mac:vml" xmlns:o="urn:schemas-microsoft-com:office:office" xmlns:v="urn:schemas-microsoft-com:vml" xmlns:w10="urn:schemas-microsoft-com:office:word" xmlns:w="http://schemas.openxmlformats.org/wordprocessingml/2006/main" xmlns:ma14="http://schemas.microsoft.com/office/mac/drawingml/2011/main"/>
+                            <ma14:wrappingTextBoxFlag xmlns:ma14="http://schemas.microsoft.com/office/mac/drawingml/2011/main" xmlns:w="http://schemas.openxmlformats.org/wordprocessingml/2006/main" xmlns:w10="urn:schemas-microsoft-com:office:word" xmlns:v="urn:schemas-microsoft-com:vml" xmlns:o="urn:schemas-microsoft-com:office:office" xmlns:mv="urn:schemas-microsoft-com:mac:vml" xmlns:mo="http://schemas.microsoft.com/office/mac/office/2008/main" xmlns=""/>
                           </a:ext>
                         </a:extLst>
                       </wps:spPr>
@@ -7155,7 +7178,7 @@
                         <a:effectLst/>
                         <a:extLst>
                           <a:ext uri="{C572A759-6A51-4108-AA02-DFA0A04FC94B}">
-                            <ma14:wrappingTextBoxFlag xmlns="" xmlns:mo="http://schemas.microsoft.com/office/mac/office/2008/main" xmlns:mv="urn:schemas-microsoft-com:mac:vml" xmlns:o="urn:schemas-microsoft-com:office:office" xmlns:v="urn:schemas-microsoft-com:vml" xmlns:w10="urn:schemas-microsoft-com:office:word" xmlns:w="http://schemas.openxmlformats.org/wordprocessingml/2006/main" xmlns:ma14="http://schemas.microsoft.com/office/mac/drawingml/2011/main"/>
+                            <ma14:wrappingTextBoxFlag xmlns:ma14="http://schemas.microsoft.com/office/mac/drawingml/2011/main" xmlns:w="http://schemas.openxmlformats.org/wordprocessingml/2006/main" xmlns:w10="urn:schemas-microsoft-com:office:word" xmlns:v="urn:schemas-microsoft-com:vml" xmlns:o="urn:schemas-microsoft-com:office:office" xmlns:mv="urn:schemas-microsoft-com:mac:vml" xmlns:mo="http://schemas.microsoft.com/office/mac/office/2008/main" xmlns=""/>
                           </a:ext>
                         </a:extLst>
                       </wps:spPr>
@@ -7514,7 +7537,7 @@
                         <a:effectLst/>
                         <a:extLst>
                           <a:ext uri="{C572A759-6A51-4108-AA02-DFA0A04FC94B}">
-                            <ma14:wrappingTextBoxFlag xmlns="" xmlns:mo="http://schemas.microsoft.com/office/mac/office/2008/main" xmlns:mv="urn:schemas-microsoft-com:mac:vml" xmlns:o="urn:schemas-microsoft-com:office:office" xmlns:v="urn:schemas-microsoft-com:vml" xmlns:w10="urn:schemas-microsoft-com:office:word" xmlns:w="http://schemas.openxmlformats.org/wordprocessingml/2006/main" xmlns:ma14="http://schemas.microsoft.com/office/mac/drawingml/2011/main"/>
+                            <ma14:wrappingTextBoxFlag xmlns:ma14="http://schemas.microsoft.com/office/mac/drawingml/2011/main" xmlns:w="http://schemas.openxmlformats.org/wordprocessingml/2006/main" xmlns:w10="urn:schemas-microsoft-com:office:word" xmlns:v="urn:schemas-microsoft-com:vml" xmlns:o="urn:schemas-microsoft-com:office:office" xmlns:mv="urn:schemas-microsoft-com:mac:vml" xmlns:mo="http://schemas.microsoft.com/office/mac/office/2008/main" xmlns=""/>
                           </a:ext>
                         </a:extLst>
                       </wps:spPr>
@@ -7770,39 +7793,15 @@
           <w:sz w:val="18"/>
           <w:szCs w:val="18"/>
         </w:rPr>
-        <w:t>Box Collider 2D component</w:t>
-      </w:r>
-      <w:r>
-        <w:rPr>
-          <w:rFonts w:ascii="Verdana" w:hAnsi="Verdana"/>
-          <w:sz w:val="18"/>
-          <w:szCs w:val="18"/>
-        </w:rPr>
-        <w:t xml:space="preserve"> (Unity Technologies, 2024) which provides the sprite with a box collider allowing it to interact with then environment. </w:t>
-      </w:r>
-      <w:r>
-        <w:rPr>
-          <w:rFonts w:ascii="Verdana" w:hAnsi="Verdana"/>
-          <w:sz w:val="18"/>
-          <w:szCs w:val="18"/>
-        </w:rPr>
-        <w:t xml:space="preserve">A Rigidbody 2D </w:t>
-      </w:r>
-      <w:r>
-        <w:rPr>
-          <w:rFonts w:ascii="Verdana" w:hAnsi="Verdana"/>
-          <w:sz w:val="18"/>
-          <w:szCs w:val="18"/>
-        </w:rPr>
-        <w:t>(Unity Technologies, 2024)</w:t>
-      </w:r>
-      <w:r>
-        <w:rPr>
-          <w:rFonts w:ascii="Verdana" w:hAnsi="Verdana"/>
-          <w:sz w:val="18"/>
-          <w:szCs w:val="18"/>
-        </w:rPr>
-        <w:t xml:space="preserve"> component is attached to give physics such as gravity to the player as well as any physics-based behaviour like drag and mass. Finally, a C# script was attached which will control all the movement logic for the player which will be looked at deeper in the next section. These components are essential to creating simple player movement and provide all the tools to add extra movement abilities. Figure 4 shows the </w:t>
+        <w:t xml:space="preserve">Box Collider 2D component (Unity Technologies, 2024) which provides the sprite with a box collider allowing it to interact with then environment. </w:t>
+      </w:r>
+      <w:r>
+        <w:rPr>
+          <w:rFonts w:ascii="Verdana" w:hAnsi="Verdana"/>
+          <w:sz w:val="18"/>
+          <w:szCs w:val="18"/>
+        </w:rPr>
+        <w:t xml:space="preserve">A Rigidbody 2D (Unity Technologies, 2024) component is attached to give physics such as gravity to the player as well as any physics-based behaviour like drag and mass. Finally, a C# script was attached which will control all the movement logic for the player which will be looked at deeper in the next section. These components are essential to creating simple player movement and provide all the tools to add extra movement abilities. Figure 4 shows the </w:t>
       </w:r>
       <w:r>
         <w:rPr>
@@ -7924,12 +7923,16 @@
         <w:jc w:val="both"/>
         <w:rPr>
           <w:rFonts w:ascii="Verdana" w:hAnsi="Verdana"/>
-          <w:noProof/>
-          <w:sz w:val="18"/>
-          <w:szCs w:val="18"/>
-        </w:rPr>
-      </w:pPr>
-      <w:r>
+          <w:b/>
+          <w:noProof/>
+          <w:sz w:val="18"/>
+          <w:szCs w:val="18"/>
+        </w:rPr>
+      </w:pPr>
+    </w:p>
+    <w:p>
+      <w:pPr>
+        <w:jc w:val="both"/>
         <w:rPr>
           <w:rFonts w:ascii="Verdana" w:hAnsi="Verdana"/>
           <w:bCs/>
@@ -7937,6 +7940,473 @@
           <w:sz w:val="18"/>
           <w:szCs w:val="18"/>
         </w:rPr>
+      </w:pPr>
+      <w:r>
+        <w:rPr>
+          <w:rFonts w:ascii="Verdana" w:hAnsi="Verdana"/>
+          <w:bCs/>
+          <w:noProof/>
+          <w:sz w:val="18"/>
+          <w:szCs w:val="18"/>
+        </w:rPr>
+        <w:t xml:space="preserve">The next section will be going over how the player movement was implemented and any key points around it. As a reminder the  main movement options the player has is horizontal movement, jumping, dashing, parrying, wall climbing and wall sliding. </w:t>
+      </w:r>
+      <w:r>
+        <w:rPr>
+          <w:rFonts w:ascii="Verdana" w:hAnsi="Verdana"/>
+          <w:bCs/>
+          <w:noProof/>
+          <w:sz w:val="18"/>
+          <w:szCs w:val="18"/>
+        </w:rPr>
+        <w:t>Each part was tested and iterated to get the feeling of the character correct as it was critical it felt good for the players. If any part of the movement was wrong then the flow of the game might have beem disrupted interupting with the playtest section of the project.</w:t>
+      </w:r>
+    </w:p>
+    <w:p>
+      <w:pPr>
+        <w:jc w:val="both"/>
+        <w:rPr>
+          <w:rFonts w:ascii="Verdana" w:hAnsi="Verdana"/>
+          <w:bCs/>
+          <w:noProof/>
+          <w:sz w:val="18"/>
+          <w:szCs w:val="18"/>
+        </w:rPr>
+      </w:pPr>
+    </w:p>
+    <w:p>
+      <w:pPr>
+        <w:jc w:val="both"/>
+        <w:rPr>
+          <w:rFonts w:ascii="Verdana" w:hAnsi="Verdana"/>
+          <w:sz w:val="18"/>
+          <w:szCs w:val="18"/>
+        </w:rPr>
+      </w:pPr>
+      <w:r>
+        <w:rPr>
+          <w:rFonts w:ascii="Verdana" w:hAnsi="Verdana"/>
+          <w:bCs/>
+          <w:noProof/>
+          <w:sz w:val="18"/>
+          <w:szCs w:val="18"/>
+        </w:rPr>
+        <w:t xml:space="preserve">The horizontal movement was created by </w:t>
+      </w:r>
+      <w:r>
+        <w:rPr>
+          <w:rFonts w:ascii="Verdana" w:hAnsi="Verdana"/>
+          <w:bCs/>
+          <w:noProof/>
+          <w:sz w:val="18"/>
+          <w:szCs w:val="18"/>
+        </w:rPr>
+        <w:t>retriev</w:t>
+      </w:r>
+      <w:r>
+        <w:rPr>
+          <w:rFonts w:ascii="Verdana" w:hAnsi="Verdana"/>
+          <w:bCs/>
+          <w:noProof/>
+          <w:sz w:val="18"/>
+          <w:szCs w:val="18"/>
+        </w:rPr>
+        <w:t xml:space="preserve">ing </w:t>
+      </w:r>
+      <w:r>
+        <w:rPr>
+          <w:rFonts w:ascii="Verdana" w:hAnsi="Verdana"/>
+          <w:bCs/>
+          <w:noProof/>
+          <w:sz w:val="18"/>
+          <w:szCs w:val="18"/>
+        </w:rPr>
+        <w:t>the horizontal input using the Unity input system</w:t>
+      </w:r>
+      <w:r>
+        <w:rPr>
+          <w:rFonts w:ascii="Verdana" w:hAnsi="Verdana"/>
+          <w:bCs/>
+          <w:noProof/>
+          <w:sz w:val="18"/>
+          <w:szCs w:val="18"/>
+        </w:rPr>
+        <w:t xml:space="preserve"> which gives a float between -1 and 1. There are a variety of different methods for moving the player character however the decision for this project was to use the Ridigbody 2D as a physics based approach often feels more fluid than moving the physicals characters world position. Moving the player with only the horizontal value would result in slow movement so a variable called </w:t>
+      </w:r>
+      <w:r>
+        <w:rPr>
+          <w:rFonts w:ascii="Courier" w:hAnsi="Courier"/>
+          <w:sz w:val="18"/>
+          <w:szCs w:val="18"/>
+        </w:rPr>
+        <w:t>s</w:t>
+      </w:r>
+      <w:r>
+        <w:rPr>
+          <w:rFonts w:ascii="Courier" w:hAnsi="Courier"/>
+          <w:sz w:val="18"/>
+          <w:szCs w:val="18"/>
+        </w:rPr>
+        <w:t>peed</w:t>
+      </w:r>
+      <w:r>
+        <w:rPr>
+          <w:rFonts w:ascii="Courier" w:hAnsi="Courier"/>
+          <w:sz w:val="18"/>
+          <w:szCs w:val="18"/>
+        </w:rPr>
+        <w:t xml:space="preserve"> </w:t>
+      </w:r>
+      <w:r>
+        <w:rPr>
+          <w:rFonts w:ascii="Verdana" w:hAnsi="Verdana"/>
+          <w:sz w:val="18"/>
+          <w:szCs w:val="18"/>
+        </w:rPr>
+        <w:t>was used that multiplies</w:t>
+      </w:r>
+      <w:r>
+        <w:rPr>
+          <w:rFonts w:ascii="Verdana" w:hAnsi="Verdana"/>
+          <w:sz w:val="18"/>
+          <w:szCs w:val="18"/>
+        </w:rPr>
+        <w:t xml:space="preserve"> with the</w:t>
+      </w:r>
+      <w:r>
+        <w:rPr>
+          <w:rFonts w:ascii="Verdana" w:hAnsi="Verdana"/>
+          <w:sz w:val="18"/>
+          <w:szCs w:val="18"/>
+        </w:rPr>
+        <w:t xml:space="preserve"> </w:t>
+      </w:r>
+      <w:r>
+        <w:rPr>
+          <w:rFonts w:ascii="Verdana" w:hAnsi="Verdana"/>
+          <w:sz w:val="18"/>
+          <w:szCs w:val="18"/>
+        </w:rPr>
+        <w:t xml:space="preserve">value stored in </w:t>
+      </w:r>
+      <w:r>
+        <w:rPr>
+          <w:rFonts w:ascii="Courier" w:hAnsi="Courier"/>
+          <w:sz w:val="18"/>
+          <w:szCs w:val="18"/>
+        </w:rPr>
+        <w:t xml:space="preserve">horizontal </w:t>
+      </w:r>
+      <w:r>
+        <w:rPr>
+          <w:rFonts w:ascii="Verdana" w:hAnsi="Verdana"/>
+          <w:sz w:val="18"/>
+          <w:szCs w:val="18"/>
+        </w:rPr>
+        <w:t xml:space="preserve">to </w:t>
+      </w:r>
+      <w:r>
+        <w:rPr>
+          <w:rFonts w:ascii="Verdana" w:hAnsi="Verdana"/>
+          <w:sz w:val="18"/>
+          <w:szCs w:val="18"/>
+        </w:rPr>
+        <w:t xml:space="preserve">apply a force to the Rigidbody 2D component. </w:t>
+      </w:r>
+      <w:r>
+        <w:rPr>
+          <w:rFonts w:ascii="Verdana" w:hAnsi="Verdana"/>
+          <w:sz w:val="18"/>
+          <w:szCs w:val="18"/>
+        </w:rPr>
+        <w:t xml:space="preserve">The </w:t>
+      </w:r>
+      <w:r>
+        <w:rPr>
+          <w:rFonts w:ascii="Verdana" w:hAnsi="Verdana"/>
+          <w:sz w:val="18"/>
+          <w:szCs w:val="18"/>
+        </w:rPr>
+        <w:t>pseudocode</w:t>
+      </w:r>
+      <w:r>
+        <w:rPr>
+          <w:rFonts w:ascii="Verdana" w:hAnsi="Verdana"/>
+          <w:sz w:val="18"/>
+          <w:szCs w:val="18"/>
+        </w:rPr>
+        <w:t xml:space="preserve"> shown below is an example of how this works:</w:t>
+      </w:r>
+    </w:p>
+    <w:p>
+      <w:pPr>
+        <w:jc w:val="both"/>
+        <w:rPr>
+          <w:rFonts w:ascii="Verdana" w:hAnsi="Verdana"/>
+          <w:sz w:val="18"/>
+          <w:szCs w:val="18"/>
+        </w:rPr>
+      </w:pPr>
+    </w:p>
+    <w:p>
+      <w:pPr>
+        <w:jc w:val="both"/>
+        <w:rPr>
+          <w:rFonts w:ascii="Courier" w:hAnsi="Courier"/>
+          <w:sz w:val="18"/>
+          <w:szCs w:val="18"/>
+        </w:rPr>
+      </w:pPr>
+      <w:r>
+        <w:rPr>
+          <w:rFonts w:ascii="Courier" w:hAnsi="Courier"/>
+          <w:sz w:val="18"/>
+          <w:szCs w:val="18"/>
+        </w:rPr>
+        <w:t>horizontal = input.horizontal</w:t>
+      </w:r>
+    </w:p>
+    <w:p>
+      <w:pPr>
+        <w:jc w:val="both"/>
+        <w:rPr>
+          <w:rFonts w:ascii="Courier" w:hAnsi="Courier"/>
+          <w:sz w:val="18"/>
+          <w:szCs w:val="18"/>
+        </w:rPr>
+      </w:pPr>
+      <w:r>
+        <w:rPr>
+          <w:rFonts w:ascii="Courier" w:hAnsi="Courier"/>
+          <w:sz w:val="18"/>
+          <w:szCs w:val="18"/>
+        </w:rPr>
+        <w:lastRenderedPageBreak/>
+        <w:t>rb.velocity = Vector2 (horizontal*speed, rb.velocity.y</w:t>
+      </w:r>
+    </w:p>
+    <w:p>
+      <w:pPr>
+        <w:jc w:val="both"/>
+        <w:rPr>
+          <w:rFonts w:ascii="Courier" w:hAnsi="Courier"/>
+          <w:sz w:val="18"/>
+          <w:szCs w:val="18"/>
+        </w:rPr>
+      </w:pPr>
+    </w:p>
+    <w:p>
+      <w:pPr>
+        <w:jc w:val="both"/>
+        <w:rPr>
+          <w:rFonts w:ascii="Verdana" w:hAnsi="Verdana"/>
+          <w:sz w:val="18"/>
+          <w:szCs w:val="18"/>
+        </w:rPr>
+      </w:pPr>
+      <w:r>
+        <w:rPr>
+          <w:rFonts w:ascii="Verdana" w:hAnsi="Verdana"/>
+          <w:sz w:val="18"/>
+          <w:szCs w:val="18"/>
+        </w:rPr>
+        <w:t xml:space="preserve">Early player feedback was considered when finding the correct speed value as it being too fast would lead to the player being able to complete jumps meant for other abilities and to slow reducing the enjoyment and overall feel of the game. </w:t>
+      </w:r>
+    </w:p>
+    <w:p>
+      <w:pPr>
+        <w:jc w:val="both"/>
+        <w:rPr>
+          <w:rFonts w:ascii="Verdana" w:hAnsi="Verdana"/>
+          <w:sz w:val="18"/>
+          <w:szCs w:val="18"/>
+        </w:rPr>
+      </w:pPr>
+    </w:p>
+    <w:p>
+      <w:pPr>
+        <w:jc w:val="both"/>
+        <w:rPr>
+          <w:rFonts w:ascii="Verdana" w:hAnsi="Verdana"/>
+          <w:sz w:val="18"/>
+          <w:szCs w:val="18"/>
+        </w:rPr>
+      </w:pPr>
+      <w:r>
+        <w:rPr>
+          <w:rFonts w:ascii="Verdana" w:hAnsi="Verdana"/>
+          <w:sz w:val="18"/>
+          <w:szCs w:val="18"/>
+        </w:rPr>
+        <w:t xml:space="preserve">The horizontal movement would come under basic movement and with it come jumping. The jump works in a similar way however requires a button input to work. When the input is pressed the same logic as the horizontal movement is applied however the force it applied positively on the  Y axis. Once </w:t>
+      </w:r>
+      <w:r>
+        <w:rPr>
+          <w:rFonts w:ascii="Verdana" w:hAnsi="Verdana"/>
+          <w:sz w:val="18"/>
+          <w:szCs w:val="18"/>
+        </w:rPr>
+        <w:t>again,</w:t>
+      </w:r>
+      <w:r>
+        <w:rPr>
+          <w:rFonts w:ascii="Verdana" w:hAnsi="Verdana"/>
+          <w:sz w:val="18"/>
+          <w:szCs w:val="18"/>
+        </w:rPr>
+        <w:t xml:space="preserve"> the power of the jump was tested to make sure the  player couldn’t reach areas designed for</w:t>
+      </w:r>
+      <w:r>
+        <w:rPr>
+          <w:rFonts w:ascii="Verdana" w:hAnsi="Verdana"/>
+          <w:sz w:val="18"/>
+          <w:szCs w:val="18"/>
+        </w:rPr>
+        <w:t>. This way of implementing the jump always meant the player jumped the same height each time no matter how long the input was held down for. Once the first version of the jump was developed it was iterated upon by adding the feature of the player going higher the longer the input is held giving variance to each jump and giving the player more control over the character. It works by multiplying the Y axis velocity by half when the jump input is released.</w:t>
+      </w:r>
+    </w:p>
+    <w:p>
+      <w:pPr>
+        <w:jc w:val="both"/>
+        <w:rPr>
+          <w:rFonts w:ascii="Verdana" w:hAnsi="Verdana"/>
+          <w:sz w:val="18"/>
+          <w:szCs w:val="18"/>
+        </w:rPr>
+      </w:pPr>
+    </w:p>
+    <w:p>
+      <w:pPr>
+        <w:jc w:val="both"/>
+        <w:rPr>
+          <w:rFonts w:ascii="Verdana" w:hAnsi="Verdana"/>
+          <w:sz w:val="18"/>
+          <w:szCs w:val="18"/>
+        </w:rPr>
+      </w:pPr>
+      <w:r>
+        <w:rPr>
+          <w:rFonts w:ascii="Verdana" w:hAnsi="Verdana"/>
+          <w:sz w:val="18"/>
+          <w:szCs w:val="18"/>
+        </w:rPr>
+        <w:t xml:space="preserve">The wall jump and wall slide work in parallel with each other while keeping some of the already functioning code of the jump mechanic. </w:t>
+      </w:r>
+    </w:p>
+    <w:p>
+      <w:pPr>
+        <w:jc w:val="both"/>
+        <w:rPr>
+          <w:rFonts w:ascii="Verdana" w:hAnsi="Verdana"/>
+          <w:sz w:val="18"/>
+          <w:szCs w:val="18"/>
+        </w:rPr>
+      </w:pPr>
+    </w:p>
+    <w:p>
+      <w:pPr>
+        <w:pStyle w:val="ListParagraph"/>
+        <w:numPr>
+          <w:ilvl w:val="0"/>
+          <w:numId w:val="14"/>
+        </w:numPr>
+        <w:jc w:val="both"/>
+        <w:rPr>
+          <w:rFonts w:ascii="Verdana" w:hAnsi="Verdana"/>
+          <w:color w:val="FF0000"/>
+          <w:sz w:val="18"/>
+          <w:szCs w:val="18"/>
+        </w:rPr>
+      </w:pPr>
+      <w:r>
+        <w:rPr>
+          <w:rFonts w:ascii="Verdana" w:hAnsi="Verdana"/>
+          <w:color w:val="FF0000"/>
+          <w:sz w:val="18"/>
+          <w:szCs w:val="18"/>
+        </w:rPr>
+        <w:t>Wall jump/slide</w:t>
+      </w:r>
+    </w:p>
+    <w:p>
+      <w:pPr>
+        <w:pStyle w:val="ListParagraph"/>
+        <w:numPr>
+          <w:ilvl w:val="0"/>
+          <w:numId w:val="14"/>
+        </w:numPr>
+        <w:jc w:val="both"/>
+        <w:rPr>
+          <w:rFonts w:ascii="Verdana" w:hAnsi="Verdana"/>
+          <w:color w:val="FF0000"/>
+          <w:sz w:val="18"/>
+          <w:szCs w:val="18"/>
+        </w:rPr>
+      </w:pPr>
+      <w:r>
+        <w:rPr>
+          <w:rFonts w:ascii="Verdana" w:hAnsi="Verdana"/>
+          <w:color w:val="FF0000"/>
+          <w:sz w:val="18"/>
+          <w:szCs w:val="18"/>
+        </w:rPr>
+        <w:t>Dash</w:t>
+      </w:r>
+    </w:p>
+    <w:p>
+      <w:pPr>
+        <w:pStyle w:val="ListParagraph"/>
+        <w:numPr>
+          <w:ilvl w:val="0"/>
+          <w:numId w:val="14"/>
+        </w:numPr>
+        <w:jc w:val="both"/>
+        <w:rPr>
+          <w:rFonts w:ascii="Verdana" w:hAnsi="Verdana"/>
+          <w:color w:val="FF0000"/>
+          <w:sz w:val="18"/>
+          <w:szCs w:val="18"/>
+        </w:rPr>
+      </w:pPr>
+      <w:r>
+        <w:rPr>
+          <w:rFonts w:ascii="Verdana" w:hAnsi="Verdana"/>
+          <w:color w:val="FF0000"/>
+          <w:sz w:val="18"/>
+          <w:szCs w:val="18"/>
+        </w:rPr>
+        <w:t>Level iteration – poster presentation, iteration 1 for testing, iteration 2 post research</w:t>
+      </w:r>
+    </w:p>
+    <w:p>
+      <w:pPr>
+        <w:jc w:val="both"/>
+        <w:rPr>
+          <w:rFonts w:ascii="Verdana" w:hAnsi="Verdana"/>
+          <w:sz w:val="18"/>
+          <w:szCs w:val="18"/>
+        </w:rPr>
+      </w:pPr>
+    </w:p>
+    <w:p>
+      <w:pPr>
+        <w:jc w:val="both"/>
+        <w:rPr>
+          <w:rFonts w:ascii="Courier New" w:hAnsi="Courier New" w:cs="Courier New"/>
+          <w:bCs/>
+          <w:noProof/>
+          <w:sz w:val="18"/>
+          <w:szCs w:val="18"/>
+        </w:rPr>
+      </w:pPr>
+      <w:r>
+        <w:rPr>
+          <w:rFonts w:ascii="Verdana" w:hAnsi="Verdana"/>
+          <w:bCs/>
+          <w:noProof/>
+          <w:sz w:val="18"/>
+          <w:szCs w:val="18"/>
+        </w:rPr>
         <w:t>------------------------------------------------------</w:t>
       </w:r>
     </w:p>
@@ -8635,7 +9105,16 @@
           <w:sz w:val="18"/>
           <w:szCs w:val="18"/>
         </w:rPr>
-        <w:t xml:space="preserve">a few specific examples. </w:t>
+        <w:t xml:space="preserve">a few </w:t>
+      </w:r>
+      <w:r>
+        <w:rPr>
+          <w:rFonts w:ascii="Verdana" w:hAnsi="Verdana"/>
+          <w:color w:val="FF0000"/>
+          <w:sz w:val="18"/>
+          <w:szCs w:val="18"/>
+        </w:rPr>
+        <w:t xml:space="preserve">specific examples. </w:t>
       </w:r>
       <w:r>
         <w:rPr>
@@ -8720,7 +9199,6 @@
           <w:sz w:val="18"/>
           <w:szCs w:val="18"/>
         </w:rPr>
-        <w:lastRenderedPageBreak/>
         <w:t xml:space="preserve">To help you </w:t>
       </w:r>
       <w:r>
@@ -9688,7 +10166,27 @@
           <w:szCs w:val="18"/>
         </w:rPr>
         <w:br/>
-        <w:t xml:space="preserve">For short code examples please use Courier Regular, 9pt. &lt;br /&gt; </w:t>
+        <w:t>For short code examples please use Courier Regular, 9pt. &lt;</w:t>
+      </w:r>
+      <w:proofErr w:type="spellStart"/>
+      <w:r>
+        <w:rPr>
+          <w:rFonts w:ascii="Courier" w:hAnsi="Courier"/>
+          <w:color w:val="FF0000"/>
+          <w:sz w:val="18"/>
+          <w:szCs w:val="18"/>
+        </w:rPr>
+        <w:t>br</w:t>
+      </w:r>
+      <w:proofErr w:type="spellEnd"/>
+      <w:r>
+        <w:rPr>
+          <w:rFonts w:ascii="Courier" w:hAnsi="Courier"/>
+          <w:color w:val="FF0000"/>
+          <w:sz w:val="18"/>
+          <w:szCs w:val="18"/>
+        </w:rPr>
+        <w:t xml:space="preserve"> /&gt; </w:t>
       </w:r>
       <w:r>
         <w:rPr>
@@ -9952,7 +10450,7 @@
                         <a:effectLst/>
                         <a:extLst>
                           <a:ext uri="{C572A759-6A51-4108-AA02-DFA0A04FC94B}">
-                            <ma14:wrappingTextBoxFlag xmlns="" xmlns:mo="http://schemas.microsoft.com/office/mac/office/2008/main" xmlns:mv="urn:schemas-microsoft-com:mac:vml" xmlns:o="urn:schemas-microsoft-com:office:office" xmlns:v="urn:schemas-microsoft-com:vml" xmlns:w10="urn:schemas-microsoft-com:office:word" xmlns:w="http://schemas.openxmlformats.org/wordprocessingml/2006/main" xmlns:ma14="http://schemas.microsoft.com/office/mac/drawingml/2011/main"/>
+                            <ma14:wrappingTextBoxFlag xmlns:ma14="http://schemas.microsoft.com/office/mac/drawingml/2011/main" xmlns:w="http://schemas.openxmlformats.org/wordprocessingml/2006/main" xmlns:w10="urn:schemas-microsoft-com:office:word" xmlns:v="urn:schemas-microsoft-com:vml" xmlns:o="urn:schemas-microsoft-com:office:office" xmlns:mv="urn:schemas-microsoft-com:mac:vml" xmlns:mo="http://schemas.microsoft.com/office/mac/office/2008/main" xmlns=""/>
                           </a:ext>
                         </a:extLst>
                       </wps:spPr>
@@ -10975,6 +11473,7 @@
           <w:sz w:val="18"/>
           <w:szCs w:val="18"/>
         </w:rPr>
+        <w:lastRenderedPageBreak/>
         <w:t>Is there anything that would</w:t>
       </w:r>
       <w:r>
@@ -11129,16 +11628,7 @@
           <w:sz w:val="18"/>
           <w:szCs w:val="18"/>
         </w:rPr>
-        <w:t xml:space="preserve"> efficient workflow for research </w:t>
-      </w:r>
-      <w:r>
-        <w:rPr>
-          <w:rFonts w:ascii="Verdana" w:hAnsi="Verdana"/>
-          <w:color w:val="FF0000"/>
-          <w:sz w:val="18"/>
-          <w:szCs w:val="18"/>
-        </w:rPr>
-        <w:t>or practice</w:t>
+        <w:t xml:space="preserve"> efficient workflow for research or practice</w:t>
       </w:r>
       <w:r>
         <w:rPr>
@@ -12014,7 +12504,15 @@
           <w:sz w:val="18"/>
           <w:szCs w:val="18"/>
         </w:rPr>
-        <w:t xml:space="preserve"> lasta</w:t>
+        <w:t xml:space="preserve"> </w:t>
+      </w:r>
+      <w:r>
+        <w:rPr>
+          <w:rFonts w:ascii="Verdana" w:hAnsi="Verdana"/>
+          <w:sz w:val="18"/>
+          <w:szCs w:val="18"/>
+        </w:rPr>
+        <w:t>last</w:t>
       </w:r>
       <w:r>
         <w:rPr>
@@ -12276,7 +12774,15 @@
           <w:sz w:val="18"/>
           <w:szCs w:val="18"/>
         </w:rPr>
-        <w:t xml:space="preserve"> Available from: </w:t>
+        <w:t xml:space="preserve"> Available </w:t>
+      </w:r>
+      <w:r>
+        <w:rPr>
+          <w:rFonts w:ascii="Verdana" w:hAnsi="Verdana"/>
+          <w:sz w:val="18"/>
+          <w:szCs w:val="18"/>
+        </w:rPr>
+        <w:t xml:space="preserve">from: </w:t>
       </w:r>
       <w:hyperlink r:id="rId34" w:history="1">
         <w:r>
@@ -12674,7 +13180,25 @@
           <w:sz w:val="18"/>
           <w:szCs w:val="18"/>
         </w:rPr>
-        <w:t xml:space="preserve"> (Aug 27, 2020) Learning Styles/Preferences Among Medical Students: Kinesthetic Learner’s Multimodal Approach to Learning Anatomy</w:t>
+        <w:t xml:space="preserve"> (Aug 27, 2020) Learning Styles/Preferences Among Medical Students: </w:t>
+      </w:r>
+      <w:proofErr w:type="spellStart"/>
+      <w:r>
+        <w:rPr>
+          <w:rFonts w:ascii="Verdana" w:hAnsi="Verdana"/>
+          <w:sz w:val="18"/>
+          <w:szCs w:val="18"/>
+        </w:rPr>
+        <w:t>Kinesthetic</w:t>
+      </w:r>
+      <w:proofErr w:type="spellEnd"/>
+      <w:r>
+        <w:rPr>
+          <w:rFonts w:ascii="Verdana" w:hAnsi="Verdana"/>
+          <w:sz w:val="18"/>
+          <w:szCs w:val="18"/>
+        </w:rPr>
+        <w:t xml:space="preserve"> Learner’s Multimodal Approach to Learning Anatomy</w:t>
       </w:r>
       <w:r>
         <w:rPr>
@@ -12929,6 +13453,7 @@
           <w:sz w:val="18"/>
           <w:szCs w:val="18"/>
         </w:rPr>
+        <w:lastRenderedPageBreak/>
         <w:t>Lin Li-Hsin, Narender Rainita, Zak Paul J</w:t>
       </w:r>
       <w:r>
@@ -12963,16 +13488,7 @@
             <w:sz w:val="18"/>
             <w:szCs w:val="18"/>
           </w:rPr>
-          <w:t>https://www.frontiersin.org/journals/behavioral-</w:t>
-        </w:r>
-        <w:r>
-          <w:rPr>
-            <w:rStyle w:val="Hyperlink"/>
-            <w:rFonts w:ascii="Verdana" w:hAnsi="Verdana"/>
-            <w:sz w:val="18"/>
-            <w:szCs w:val="18"/>
-          </w:rPr>
-          <w:t>neuroscience/articles/10.3389/fnbeh.2022.1053053/full</w:t>
+          <w:t>https://www.frontiersin.org/journals/behavioral-neuroscience/articles/10.3389/fnbeh.2022.1053053/full</w:t>
         </w:r>
       </w:hyperlink>
       <w:r>
@@ -13031,7 +13547,25 @@
           <w:sz w:val="18"/>
           <w:szCs w:val="18"/>
         </w:rPr>
-        <w:t xml:space="preserve">Joe Tranquillo (Jun 22, 2008) Kinesthetic Learning in the Classroom. Available from: </w:t>
+        <w:t xml:space="preserve">Joe Tranquillo (Jun 22, 2008) </w:t>
+      </w:r>
+      <w:proofErr w:type="spellStart"/>
+      <w:r>
+        <w:rPr>
+          <w:rFonts w:ascii="Verdana" w:hAnsi="Verdana"/>
+          <w:sz w:val="18"/>
+          <w:szCs w:val="18"/>
+        </w:rPr>
+        <w:t>Kinesthetic</w:t>
+      </w:r>
+      <w:proofErr w:type="spellEnd"/>
+      <w:r>
+        <w:rPr>
+          <w:rFonts w:ascii="Verdana" w:hAnsi="Verdana"/>
+          <w:sz w:val="18"/>
+          <w:szCs w:val="18"/>
+        </w:rPr>
+        <w:t xml:space="preserve"> Learning in the Classroom. Available from: </w:t>
       </w:r>
       <w:r>
         <w:rPr>
@@ -13113,7 +13647,25 @@
           <w:sz w:val="18"/>
           <w:szCs w:val="18"/>
         </w:rPr>
-        <w:t xml:space="preserve"> (Jun 27, 2022) Exploring the Benefits of Art-Based Kinesthetic Activities in the College Classroom. Available from: </w:t>
+        <w:t xml:space="preserve"> (Jun 27, 2022) Exploring the Benefits of Art-Based </w:t>
+      </w:r>
+      <w:proofErr w:type="spellStart"/>
+      <w:r>
+        <w:rPr>
+          <w:rFonts w:ascii="Verdana" w:hAnsi="Verdana"/>
+          <w:sz w:val="18"/>
+          <w:szCs w:val="18"/>
+        </w:rPr>
+        <w:t>Kinesthetic</w:t>
+      </w:r>
+      <w:proofErr w:type="spellEnd"/>
+      <w:r>
+        <w:rPr>
+          <w:rFonts w:ascii="Verdana" w:hAnsi="Verdana"/>
+          <w:sz w:val="18"/>
+          <w:szCs w:val="18"/>
+        </w:rPr>
+        <w:t xml:space="preserve"> Activities in the College Classroom. Available from: </w:t>
       </w:r>
       <w:hyperlink r:id="rId40" w:history="1">
         <w:r>
@@ -13191,7 +13743,25 @@
           <w:sz w:val="18"/>
           <w:szCs w:val="18"/>
         </w:rPr>
-        <w:t>SimpleK12 Staff (Feb 17, 2025) Kinesthetic Learning Style: Definition, Characteristics &amp; Benefits in 2025</w:t>
+        <w:t xml:space="preserve">SimpleK12 Staff (Feb 17, 2025) </w:t>
+      </w:r>
+      <w:proofErr w:type="spellStart"/>
+      <w:r>
+        <w:rPr>
+          <w:rFonts w:ascii="Verdana" w:hAnsi="Verdana"/>
+          <w:sz w:val="18"/>
+          <w:szCs w:val="18"/>
+        </w:rPr>
+        <w:t>Kinesthetic</w:t>
+      </w:r>
+      <w:proofErr w:type="spellEnd"/>
+      <w:r>
+        <w:rPr>
+          <w:rFonts w:ascii="Verdana" w:hAnsi="Verdana"/>
+          <w:sz w:val="18"/>
+          <w:szCs w:val="18"/>
+        </w:rPr>
+        <w:t xml:space="preserve"> Learning Style: Definition, Characteristics &amp; Benefits in 2025</w:t>
       </w:r>
       <w:r>
         <w:rPr>
@@ -13326,7 +13896,25 @@
           <w:sz w:val="18"/>
           <w:szCs w:val="18"/>
         </w:rPr>
-        <w:t xml:space="preserve">Veli-Matti Karhulahti (Sept, 2013) A Kinesthetic Theory of Videogames: Time-Critical Challenge and Aporetic Rhematic. Available from: </w:t>
+        <w:t xml:space="preserve">Veli-Matti Karhulahti (Sept, 2013) A </w:t>
+      </w:r>
+      <w:proofErr w:type="spellStart"/>
+      <w:r>
+        <w:rPr>
+          <w:rFonts w:ascii="Verdana" w:hAnsi="Verdana"/>
+          <w:sz w:val="18"/>
+          <w:szCs w:val="18"/>
+        </w:rPr>
+        <w:t>Kinesthetic</w:t>
+      </w:r>
+      <w:proofErr w:type="spellEnd"/>
+      <w:r>
+        <w:rPr>
+          <w:rFonts w:ascii="Verdana" w:hAnsi="Verdana"/>
+          <w:sz w:val="18"/>
+          <w:szCs w:val="18"/>
+        </w:rPr>
+        <w:t xml:space="preserve"> Theory of Videogames: Time-Critical Challenge and Aporetic Rhematic. Available from: </w:t>
       </w:r>
       <w:hyperlink r:id="rId42" w:history="1">
         <w:r>
@@ -13527,8 +14115,18 @@
           <w:sz w:val="18"/>
           <w:szCs w:val="18"/>
         </w:rPr>
-        <w:t>The VARK Modalities: Visual, Aural, Read/write &amp; Kinesthetic</w:t>
-      </w:r>
+        <w:t xml:space="preserve">The VARK Modalities: Visual, Aural, Read/write &amp; </w:t>
+      </w:r>
+      <w:proofErr w:type="spellStart"/>
+      <w:r>
+        <w:rPr>
+          <w:rFonts w:ascii="Verdana" w:hAnsi="Verdana"/>
+          <w:sz w:val="18"/>
+          <w:szCs w:val="18"/>
+        </w:rPr>
+        <w:t>Kinesthetic</w:t>
+      </w:r>
+      <w:proofErr w:type="spellEnd"/>
       <w:r>
         <w:rPr>
           <w:rFonts w:ascii="Verdana" w:hAnsi="Verdana"/>
@@ -13672,7 +14270,6 @@
           <w:sz w:val="18"/>
           <w:szCs w:val="18"/>
         </w:rPr>
-        <w:lastRenderedPageBreak/>
         <w:t xml:space="preserve">Theodoridis, S and Koutroumbas, K (Feb 24, 2006) </w:t>
       </w:r>
       <w:r>
@@ -14021,15 +14618,7 @@
           <w:sz w:val="18"/>
           <w:szCs w:val="18"/>
         </w:rPr>
-        <w:t xml:space="preserve">. </w:t>
-      </w:r>
-      <w:r>
-        <w:rPr>
-          <w:rFonts w:ascii="Verdana" w:hAnsi="Verdana"/>
-          <w:sz w:val="18"/>
-          <w:szCs w:val="18"/>
-        </w:rPr>
-        <w:t>[Accessed last: Apr 26, 2025]</w:t>
+        <w:t>. [Accessed last: Apr 26, 2025]</w:t>
       </w:r>
     </w:p>
     <w:p>
@@ -14074,41 +14663,43 @@
           <w:sz w:val="18"/>
           <w:szCs w:val="18"/>
         </w:rPr>
-        <w:t xml:space="preserve">. </w:t>
-      </w:r>
-      <w:r>
-        <w:rPr>
-          <w:rFonts w:ascii="Verdana" w:hAnsi="Verdana"/>
-          <w:sz w:val="18"/>
-          <w:szCs w:val="18"/>
-        </w:rPr>
-        <w:t>[Accessed last: Apr 26, 2025]</w:t>
-      </w:r>
-    </w:p>
-    <w:p>
-      <w:pPr>
-        <w:rPr>
-          <w:rFonts w:ascii="Verdana" w:hAnsi="Verdana"/>
-          <w:sz w:val="18"/>
-          <w:szCs w:val="18"/>
-        </w:rPr>
-      </w:pPr>
-    </w:p>
-    <w:p>
-      <w:pPr>
-        <w:rPr>
-          <w:rFonts w:ascii="Verdana" w:hAnsi="Verdana"/>
-          <w:sz w:val="18"/>
-          <w:szCs w:val="18"/>
-        </w:rPr>
-      </w:pPr>
-      <w:r>
-        <w:rPr>
-          <w:rFonts w:ascii="Verdana" w:hAnsi="Verdana"/>
-          <w:sz w:val="18"/>
-          <w:szCs w:val="18"/>
-        </w:rPr>
-        <w:t xml:space="preserve">Tvtropes (n.d.) Video Game Dashing. Available from: </w:t>
+        <w:t>. [Accessed last: Apr 26, 2025]</w:t>
+      </w:r>
+    </w:p>
+    <w:p>
+      <w:pPr>
+        <w:rPr>
+          <w:rFonts w:ascii="Verdana" w:hAnsi="Verdana"/>
+          <w:sz w:val="18"/>
+          <w:szCs w:val="18"/>
+        </w:rPr>
+      </w:pPr>
+    </w:p>
+    <w:p>
+      <w:pPr>
+        <w:rPr>
+          <w:rFonts w:ascii="Verdana" w:hAnsi="Verdana"/>
+          <w:sz w:val="18"/>
+          <w:szCs w:val="18"/>
+        </w:rPr>
+      </w:pPr>
+      <w:proofErr w:type="spellStart"/>
+      <w:r>
+        <w:rPr>
+          <w:rFonts w:ascii="Verdana" w:hAnsi="Verdana"/>
+          <w:sz w:val="18"/>
+          <w:szCs w:val="18"/>
+        </w:rPr>
+        <w:t>Tvtropes</w:t>
+      </w:r>
+      <w:proofErr w:type="spellEnd"/>
+      <w:r>
+        <w:rPr>
+          <w:rFonts w:ascii="Verdana" w:hAnsi="Verdana"/>
+          <w:sz w:val="18"/>
+          <w:szCs w:val="18"/>
+        </w:rPr>
+        <w:t xml:space="preserve"> (n.d.) Video Game Dashing. Available from: </w:t>
       </w:r>
       <w:hyperlink r:id="rId51" w:history="1">
         <w:r>
@@ -14127,15 +14718,7 @@
           <w:sz w:val="18"/>
           <w:szCs w:val="18"/>
         </w:rPr>
-        <w:t xml:space="preserve"> </w:t>
-      </w:r>
-      <w:r>
-        <w:rPr>
-          <w:rFonts w:ascii="Verdana" w:hAnsi="Verdana"/>
-          <w:sz w:val="18"/>
-          <w:szCs w:val="18"/>
-        </w:rPr>
-        <w:t>[Accessed last: Apr 26, 2025]</w:t>
+        <w:t xml:space="preserve"> [Accessed last: Apr 26, 2025]</w:t>
       </w:r>
     </w:p>
     <w:p>
@@ -14177,15 +14760,7 @@
           <w:sz w:val="18"/>
           <w:szCs w:val="18"/>
         </w:rPr>
-        <w:t xml:space="preserve"> </w:t>
-      </w:r>
-      <w:r>
-        <w:rPr>
-          <w:rFonts w:ascii="Verdana" w:hAnsi="Verdana"/>
-          <w:sz w:val="18"/>
-          <w:szCs w:val="18"/>
-        </w:rPr>
-        <w:t>[Accessed last: Apr 26, 2025]</w:t>
+        <w:t xml:space="preserve"> [Accessed last: Apr 26, 2025]</w:t>
       </w:r>
     </w:p>
     <w:p>
@@ -14219,31 +14794,7 @@
           <w:sz w:val="18"/>
           <w:szCs w:val="18"/>
         </w:rPr>
-        <w:t xml:space="preserve"> Box </w:t>
-      </w:r>
-      <w:r>
-        <w:rPr>
-          <w:rFonts w:ascii="Verdana" w:hAnsi="Verdana"/>
-          <w:sz w:val="18"/>
-          <w:szCs w:val="18"/>
-        </w:rPr>
-        <w:t>Collider</w:t>
-      </w:r>
-      <w:r>
-        <w:rPr>
-          <w:rFonts w:ascii="Verdana" w:hAnsi="Verdana"/>
-          <w:sz w:val="18"/>
-          <w:szCs w:val="18"/>
-        </w:rPr>
-        <w:t xml:space="preserve"> 2D component reference</w:t>
-      </w:r>
-      <w:r>
-        <w:rPr>
-          <w:rFonts w:ascii="Verdana" w:hAnsi="Verdana"/>
-          <w:sz w:val="18"/>
-          <w:szCs w:val="18"/>
-        </w:rPr>
-        <w:t xml:space="preserve">. Available from: </w:t>
+        <w:t xml:space="preserve"> Box Collider 2D component reference. Available from: </w:t>
       </w:r>
       <w:hyperlink r:id="rId52" w:history="1">
         <w:r>
@@ -14304,128 +14855,152 @@
           <w:sz w:val="18"/>
           <w:szCs w:val="18"/>
         </w:rPr>
+        <w:t xml:space="preserve"> Rigidbody 2D. Available from: </w:t>
+      </w:r>
+      <w:r>
+        <w:rPr>
+          <w:rFonts w:ascii="Verdana" w:hAnsi="Verdana"/>
+          <w:sz w:val="18"/>
+          <w:szCs w:val="18"/>
+        </w:rPr>
+        <w:t>https://docs.unity3d.com/2023.2/Documentation/Manual/rigidbody2D.html</w:t>
+      </w:r>
+      <w:r>
+        <w:rPr>
+          <w:rFonts w:ascii="Verdana" w:hAnsi="Verdana"/>
+          <w:sz w:val="18"/>
+          <w:szCs w:val="18"/>
+        </w:rPr>
+        <w:t xml:space="preserve">. </w:t>
+      </w:r>
+      <w:r>
+        <w:rPr>
+          <w:rFonts w:ascii="Verdana" w:hAnsi="Verdana"/>
+          <w:sz w:val="18"/>
+          <w:szCs w:val="18"/>
+        </w:rPr>
+        <w:t>[Accessed last: Apr 26, 2025]</w:t>
+      </w:r>
+    </w:p>
+    <w:p>
+      <w:pPr>
+        <w:rPr>
+          <w:rFonts w:ascii="Verdana" w:hAnsi="Verdana"/>
+          <w:sz w:val="18"/>
+          <w:szCs w:val="18"/>
+        </w:rPr>
+      </w:pPr>
+    </w:p>
+    <w:p>
+      <w:pPr>
+        <w:rPr>
+          <w:rFonts w:ascii="Verdana" w:hAnsi="Verdana"/>
+          <w:sz w:val="18"/>
+          <w:szCs w:val="18"/>
+        </w:rPr>
+      </w:pPr>
+    </w:p>
+    <w:p>
+      <w:pPr>
+        <w:rPr>
+          <w:rFonts w:ascii="Verdana" w:hAnsi="Verdana"/>
+          <w:b/>
+          <w:sz w:val="18"/>
+          <w:szCs w:val="18"/>
+        </w:rPr>
+      </w:pPr>
+      <w:r>
+        <w:rPr>
+          <w:rFonts w:ascii="Verdana" w:hAnsi="Verdana"/>
+          <w:b/>
+          <w:sz w:val="18"/>
+          <w:szCs w:val="18"/>
+        </w:rPr>
+        <w:t>---------------------------------------------------</w:t>
+      </w:r>
+    </w:p>
+    <w:p>
+      <w:pPr>
+        <w:rPr>
+          <w:rFonts w:ascii="Verdana" w:hAnsi="Verdana"/>
+          <w:color w:val="FF0000"/>
+          <w:sz w:val="18"/>
+          <w:szCs w:val="18"/>
+        </w:rPr>
+      </w:pPr>
+      <w:r>
+        <w:rPr>
+          <w:rFonts w:ascii="Verdana" w:hAnsi="Verdana"/>
+          <w:b/>
+          <w:color w:val="FF0000"/>
+          <w:sz w:val="18"/>
+          <w:szCs w:val="18"/>
+        </w:rPr>
+        <w:t>9</w:t>
+      </w:r>
+      <w:r>
+        <w:rPr>
+          <w:rFonts w:ascii="Verdana" w:hAnsi="Verdana"/>
+          <w:b/>
+          <w:color w:val="FF0000"/>
+          <w:sz w:val="18"/>
+          <w:szCs w:val="18"/>
+        </w:rPr>
+        <w:t xml:space="preserve">. </w:t>
+      </w:r>
+      <w:r>
+        <w:rPr>
+          <w:rFonts w:ascii="Verdana" w:hAnsi="Verdana"/>
+          <w:b/>
+          <w:color w:val="FF0000"/>
+          <w:sz w:val="18"/>
+          <w:szCs w:val="18"/>
+        </w:rPr>
+        <w:t>Bibliography</w:t>
+      </w:r>
+      <w:r>
+        <w:rPr>
+          <w:rFonts w:ascii="Verdana" w:hAnsi="Verdana"/>
+          <w:color w:val="FF0000"/>
+          <w:sz w:val="18"/>
+          <w:szCs w:val="18"/>
+        </w:rPr>
         <w:t xml:space="preserve"> </w:t>
       </w:r>
       <w:r>
         <w:rPr>
           <w:rFonts w:ascii="Verdana" w:hAnsi="Verdana"/>
-          <w:sz w:val="18"/>
-          <w:szCs w:val="18"/>
-        </w:rPr>
-        <w:t>Rigidbody 2D</w:t>
-      </w:r>
-      <w:r>
-        <w:rPr>
-          <w:rFonts w:ascii="Verdana" w:hAnsi="Verdana"/>
-          <w:sz w:val="18"/>
-          <w:szCs w:val="18"/>
-        </w:rPr>
-        <w:t xml:space="preserve">. Available from: </w:t>
-      </w:r>
-      <w:r>
-        <w:rPr>
-          <w:rFonts w:ascii="Verdana" w:hAnsi="Verdana"/>
-          <w:sz w:val="18"/>
-          <w:szCs w:val="18"/>
-        </w:rPr>
-        <w:t>https://docs.unity3d.com/2023.2/Documentation/Manual/rigidbody2D.html</w:t>
-      </w:r>
-      <w:r>
-        <w:rPr>
-          <w:rFonts w:ascii="Verdana" w:hAnsi="Verdana"/>
-          <w:sz w:val="18"/>
-          <w:szCs w:val="18"/>
-        </w:rPr>
-        <w:t xml:space="preserve">. </w:t>
-      </w:r>
-      <w:r>
-        <w:rPr>
-          <w:rFonts w:ascii="Verdana" w:hAnsi="Verdana"/>
-          <w:sz w:val="18"/>
-          <w:szCs w:val="18"/>
-        </w:rPr>
-        <w:t>[Accessed last: Apr 26, 2025]</w:t>
-      </w:r>
-    </w:p>
-    <w:p>
-      <w:pPr>
-        <w:rPr>
-          <w:rFonts w:ascii="Verdana" w:hAnsi="Verdana"/>
-          <w:sz w:val="18"/>
-          <w:szCs w:val="18"/>
-        </w:rPr>
-      </w:pPr>
-    </w:p>
-    <w:p>
-      <w:pPr>
-        <w:rPr>
-          <w:rFonts w:ascii="Verdana" w:hAnsi="Verdana"/>
-          <w:sz w:val="18"/>
-          <w:szCs w:val="18"/>
-        </w:rPr>
-      </w:pPr>
-    </w:p>
-    <w:p>
-      <w:pPr>
-        <w:rPr>
-          <w:rFonts w:ascii="Verdana" w:hAnsi="Verdana"/>
-          <w:b/>
-          <w:sz w:val="18"/>
-          <w:szCs w:val="18"/>
-        </w:rPr>
-      </w:pPr>
-      <w:r>
-        <w:rPr>
-          <w:rFonts w:ascii="Verdana" w:hAnsi="Verdana"/>
-          <w:b/>
-          <w:sz w:val="18"/>
-          <w:szCs w:val="18"/>
-        </w:rPr>
-        <w:t>---------------------------------------------------</w:t>
-      </w:r>
-    </w:p>
-    <w:p>
-      <w:pPr>
-        <w:rPr>
-          <w:rFonts w:ascii="Verdana" w:hAnsi="Verdana"/>
-          <w:color w:val="FF0000"/>
-          <w:sz w:val="18"/>
-          <w:szCs w:val="18"/>
-        </w:rPr>
-      </w:pPr>
-      <w:r>
-        <w:rPr>
-          <w:rFonts w:ascii="Verdana" w:hAnsi="Verdana"/>
-          <w:b/>
-          <w:color w:val="FF0000"/>
-          <w:sz w:val="18"/>
-          <w:szCs w:val="18"/>
-        </w:rPr>
-        <w:t>9</w:t>
-      </w:r>
-      <w:r>
-        <w:rPr>
-          <w:rFonts w:ascii="Verdana" w:hAnsi="Verdana"/>
-          <w:b/>
-          <w:color w:val="FF0000"/>
-          <w:sz w:val="18"/>
-          <w:szCs w:val="18"/>
-        </w:rPr>
-        <w:t xml:space="preserve">. </w:t>
-      </w:r>
-      <w:r>
-        <w:rPr>
-          <w:rFonts w:ascii="Verdana" w:hAnsi="Verdana"/>
-          <w:b/>
-          <w:color w:val="FF0000"/>
-          <w:sz w:val="18"/>
-          <w:szCs w:val="18"/>
-        </w:rPr>
-        <w:t>Bibliography</w:t>
-      </w:r>
-      <w:r>
-        <w:rPr>
-          <w:rFonts w:ascii="Verdana" w:hAnsi="Verdana"/>
+          <w:noProof/>
+          <w:color w:val="FF0000"/>
+          <w:sz w:val="18"/>
+          <w:szCs w:val="18"/>
+        </w:rPr>
+        <w:t>(</w:t>
+      </w:r>
+      <w:r>
+        <w:rPr>
+          <w:rFonts w:ascii="Verdana" w:hAnsi="Verdana"/>
+          <w:noProof/>
+          <w:color w:val="FF0000"/>
+          <w:sz w:val="18"/>
+          <w:szCs w:val="18"/>
+        </w:rPr>
+        <w:t>=</w:t>
+      </w:r>
+      <w:r>
+        <w:rPr>
+          <w:rFonts w:ascii="Verdana" w:hAnsi="Verdana"/>
+          <w:noProof/>
+          <w:color w:val="FF0000"/>
+          <w:sz w:val="18"/>
+          <w:szCs w:val="18"/>
+        </w:rPr>
+        <w:t>not included in word count</w:t>
+      </w:r>
+      <w:r>
+        <w:rPr>
+          <w:rFonts w:ascii="Verdana" w:hAnsi="Verdana"/>
+          <w:noProof/>
           <w:color w:val="FF0000"/>
           <w:sz w:val="18"/>
           <w:szCs w:val="18"/>
@@ -14440,27 +15015,7 @@
           <w:sz w:val="18"/>
           <w:szCs w:val="18"/>
         </w:rPr>
-        <w:t>(</w:t>
-      </w:r>
-      <w:r>
-        <w:rPr>
-          <w:rFonts w:ascii="Verdana" w:hAnsi="Verdana"/>
-          <w:noProof/>
-          <w:color w:val="FF0000"/>
-          <w:sz w:val="18"/>
-          <w:szCs w:val="18"/>
-        </w:rPr>
-        <w:t>=</w:t>
-      </w:r>
-      <w:r>
-        <w:rPr>
-          <w:rFonts w:ascii="Verdana" w:hAnsi="Verdana"/>
-          <w:noProof/>
-          <w:color w:val="FF0000"/>
-          <w:sz w:val="18"/>
-          <w:szCs w:val="18"/>
-        </w:rPr>
-        <w:t>not included in word count</w:t>
+        <w:t>–</w:t>
       </w:r>
       <w:r>
         <w:rPr>
@@ -14480,26 +15035,6 @@
           <w:sz w:val="18"/>
           <w:szCs w:val="18"/>
         </w:rPr>
-        <w:t>–</w:t>
-      </w:r>
-      <w:r>
-        <w:rPr>
-          <w:rFonts w:ascii="Verdana" w:hAnsi="Verdana"/>
-          <w:noProof/>
-          <w:color w:val="FF0000"/>
-          <w:sz w:val="18"/>
-          <w:szCs w:val="18"/>
-        </w:rPr>
-        <w:t xml:space="preserve"> </w:t>
-      </w:r>
-      <w:r>
-        <w:rPr>
-          <w:rFonts w:ascii="Verdana" w:hAnsi="Verdana"/>
-          <w:noProof/>
-          <w:color w:val="FF0000"/>
-          <w:sz w:val="18"/>
-          <w:szCs w:val="18"/>
-        </w:rPr>
         <w:t xml:space="preserve">these are </w:t>
       </w:r>
       <w:r>
@@ -14645,7 +15180,29 @@
           <w:sz w:val="18"/>
           <w:szCs w:val="18"/>
         </w:rPr>
-        <w:t xml:space="preserve">UWE Library Services:Study skills - The Harvard System </w:t>
+        <w:t xml:space="preserve">UWE Library </w:t>
+      </w:r>
+      <w:proofErr w:type="spellStart"/>
+      <w:r>
+        <w:rPr>
+          <w:rFonts w:ascii="Verdana" w:hAnsi="Verdana"/>
+          <w:i/>
+          <w:color w:val="FF0000"/>
+          <w:sz w:val="18"/>
+          <w:szCs w:val="18"/>
+        </w:rPr>
+        <w:t>Services:Study</w:t>
+      </w:r>
+      <w:proofErr w:type="spellEnd"/>
+      <w:r>
+        <w:rPr>
+          <w:rFonts w:ascii="Verdana" w:hAnsi="Verdana"/>
+          <w:i/>
+          <w:color w:val="FF0000"/>
+          <w:sz w:val="18"/>
+          <w:szCs w:val="18"/>
+        </w:rPr>
+        <w:t xml:space="preserve"> skills - The Harvard System </w:t>
       </w:r>
       <w:r>
         <w:rPr>
@@ -15503,7 +16060,6 @@
           <w:sz w:val="18"/>
           <w:szCs w:val="18"/>
         </w:rPr>
-        <w:lastRenderedPageBreak/>
         <w:t>A</w:t>
       </w:r>
       <w:r>
@@ -16179,6 +16735,92 @@
 <file path=word/numbering.xml><?xml version="1.0" encoding="utf-8"?>
 <w:numbering xmlns:wpc="http://schemas.microsoft.com/office/word/2010/wordprocessingCanvas" xmlns:cx="http://schemas.microsoft.com/office/drawing/2014/chartex" xmlns:cx1="http://schemas.microsoft.com/office/drawing/2015/9/8/chartex" xmlns:cx2="http://schemas.microsoft.com/office/drawing/2015/10/21/chartex" xmlns:cx3="http://schemas.microsoft.com/office/drawing/2016/5/9/chartex" xmlns:cx4="http://schemas.microsoft.com/office/drawing/2016/5/10/chartex" xmlns:cx5="http://schemas.microsoft.com/office/drawing/2016/5/11/chartex" xmlns:cx6="http://schemas.microsoft.com/office/drawing/2016/5/12/chartex" xmlns:cx7="http://schemas.microsoft.com/office/drawing/2016/5/13/chartex" xmlns:cx8="http://schemas.microsoft.com/office/drawing/2016/5/14/chartex" xmlns:mc="http://schemas.openxmlformats.org/markup-compatibility/2006" xmlns:aink="http://schemas.microsoft.com/office/drawing/2016/ink" xmlns:am3d="http://schemas.microsoft.com/office/drawing/2017/model3d" xmlns:o="urn:schemas-microsoft-com:office:office" xmlns:oel="http://schemas.microsoft.com/office/2019/extlst" xmlns:r="http://schemas.openxmlformats.org/officeDocument/2006/relationships" xmlns:m="http://schemas.openxmlformats.org/officeDocument/2006/math" xmlns:v="urn:schemas-microsoft-com:vml" xmlns:wp14="http://schemas.microsoft.com/office/word/2010/wordprocessingDrawing" xmlns:wp="http://schemas.openxmlformats.org/drawingml/2006/wordprocessingDrawing" xmlns:w10="urn:schemas-microsoft-com:office:word" xmlns:w="http://schemas.openxmlformats.org/wordprocessingml/2006/main" xmlns:w14="http://schemas.microsoft.com/office/word/2010/wordml" xmlns:w15="http://schemas.microsoft.com/office/word/2012/wordml" xmlns:w16cex="http://schemas.microsoft.com/office/word/2018/wordml/cex" xmlns:w16cid="http://schemas.microsoft.com/office/word/2016/wordml/cid" xmlns:w16="http://schemas.microsoft.com/office/word/2018/wordml" xmlns:w16du="http://schemas.microsoft.com/office/word/2023/wordml/word16du" xmlns:w16sdtdh="http://schemas.microsoft.com/office/word/2020/wordml/sdtdatahash" xmlns:w16sdtfl="http://schemas.microsoft.com/office/word/2024/wordml/sdtformatlock" xmlns:w16se="http://schemas.microsoft.com/office/word/2015/wordml/symex" xmlns:wpg="http://schemas.microsoft.com/office/word/2010/wordprocessingGroup" xmlns:wpi="http://schemas.microsoft.com/office/word/2010/wordprocessingInk" xmlns:wne="http://schemas.microsoft.com/office/word/2006/wordml" xmlns:wps="http://schemas.microsoft.com/office/word/2010/wordprocessingShape" mc:Ignorable="w14 w15 w16se w16cid w16 w16cex w16sdtdh w16sdtfl w16du wp14">
   <w:abstractNum w:abstractNumId="0" w15:restartNumberingAfterBreak="0">
+    <w:nsid w:val="13AE3370"/>
+    <w:multiLevelType w:val="hybridMultilevel"/>
+    <w:tmpl w:val="3F2251D8"/>
+    <w:lvl w:ilvl="0" w:tplc="0809000F">
+      <w:start w:val="1"/>
+      <w:numFmt w:val="decimal"/>
+      <w:lvlText w:val="%1."/>
+      <w:lvlJc w:val="left"/>
+      <w:pPr>
+        <w:ind w:left="720" w:hanging="360"/>
+      </w:pPr>
+    </w:lvl>
+    <w:lvl w:ilvl="1" w:tplc="08090019" w:tentative="1">
+      <w:start w:val="1"/>
+      <w:numFmt w:val="lowerLetter"/>
+      <w:lvlText w:val="%2."/>
+      <w:lvlJc w:val="left"/>
+      <w:pPr>
+        <w:ind w:left="1440" w:hanging="360"/>
+      </w:pPr>
+    </w:lvl>
+    <w:lvl w:ilvl="2" w:tplc="0809001B" w:tentative="1">
+      <w:start w:val="1"/>
+      <w:numFmt w:val="lowerRoman"/>
+      <w:lvlText w:val="%3."/>
+      <w:lvlJc w:val="right"/>
+      <w:pPr>
+        <w:ind w:left="2160" w:hanging="180"/>
+      </w:pPr>
+    </w:lvl>
+    <w:lvl w:ilvl="3" w:tplc="0809000F" w:tentative="1">
+      <w:start w:val="1"/>
+      <w:numFmt w:val="decimal"/>
+      <w:lvlText w:val="%4."/>
+      <w:lvlJc w:val="left"/>
+      <w:pPr>
+        <w:ind w:left="2880" w:hanging="360"/>
+      </w:pPr>
+    </w:lvl>
+    <w:lvl w:ilvl="4" w:tplc="08090019" w:tentative="1">
+      <w:start w:val="1"/>
+      <w:numFmt w:val="lowerLetter"/>
+      <w:lvlText w:val="%5."/>
+      <w:lvlJc w:val="left"/>
+      <w:pPr>
+        <w:ind w:left="3600" w:hanging="360"/>
+      </w:pPr>
+    </w:lvl>
+    <w:lvl w:ilvl="5" w:tplc="0809001B" w:tentative="1">
+      <w:start w:val="1"/>
+      <w:numFmt w:val="lowerRoman"/>
+      <w:lvlText w:val="%6."/>
+      <w:lvlJc w:val="right"/>
+      <w:pPr>
+        <w:ind w:left="4320" w:hanging="180"/>
+      </w:pPr>
+    </w:lvl>
+    <w:lvl w:ilvl="6" w:tplc="0809000F" w:tentative="1">
+      <w:start w:val="1"/>
+      <w:numFmt w:val="decimal"/>
+      <w:lvlText w:val="%7."/>
+      <w:lvlJc w:val="left"/>
+      <w:pPr>
+        <w:ind w:left="5040" w:hanging="360"/>
+      </w:pPr>
+    </w:lvl>
+    <w:lvl w:ilvl="7" w:tplc="08090019" w:tentative="1">
+      <w:start w:val="1"/>
+      <w:numFmt w:val="lowerLetter"/>
+      <w:lvlText w:val="%8."/>
+      <w:lvlJc w:val="left"/>
+      <w:pPr>
+        <w:ind w:left="5760" w:hanging="360"/>
+      </w:pPr>
+    </w:lvl>
+    <w:lvl w:ilvl="8" w:tplc="0809001B" w:tentative="1">
+      <w:start w:val="1"/>
+      <w:numFmt w:val="lowerRoman"/>
+      <w:lvlText w:val="%9."/>
+      <w:lvlJc w:val="right"/>
+      <w:pPr>
+        <w:ind w:left="6480" w:hanging="180"/>
+      </w:pPr>
+    </w:lvl>
+  </w:abstractNum>
+  <w:abstractNum w:abstractNumId="1" w15:restartNumberingAfterBreak="0">
     <w:nsid w:val="16846ABE"/>
     <w:multiLevelType w:val="hybridMultilevel"/>
     <w:tmpl w:val="6E6A3BEE"/>
@@ -16291,7 +16933,7 @@
       </w:rPr>
     </w:lvl>
   </w:abstractNum>
-  <w:abstractNum w:abstractNumId="1" w15:restartNumberingAfterBreak="0">
+  <w:abstractNum w:abstractNumId="2" w15:restartNumberingAfterBreak="0">
     <w:nsid w:val="1B430F49"/>
     <w:multiLevelType w:val="hybridMultilevel"/>
     <w:tmpl w:val="420AE636"/>
@@ -16404,7 +17046,7 @@
       </w:rPr>
     </w:lvl>
   </w:abstractNum>
-  <w:abstractNum w:abstractNumId="2" w15:restartNumberingAfterBreak="0">
+  <w:abstractNum w:abstractNumId="3" w15:restartNumberingAfterBreak="0">
     <w:nsid w:val="1C2C7F06"/>
     <w:multiLevelType w:val="hybridMultilevel"/>
     <w:tmpl w:val="C10ECA1C"/>
@@ -16517,7 +17159,7 @@
       </w:rPr>
     </w:lvl>
   </w:abstractNum>
-  <w:abstractNum w:abstractNumId="3" w15:restartNumberingAfterBreak="0">
+  <w:abstractNum w:abstractNumId="4" w15:restartNumberingAfterBreak="0">
     <w:nsid w:val="24F91391"/>
     <w:multiLevelType w:val="hybridMultilevel"/>
     <w:tmpl w:val="9A8676EC"/>
@@ -16630,7 +17272,7 @@
       </w:rPr>
     </w:lvl>
   </w:abstractNum>
-  <w:abstractNum w:abstractNumId="4" w15:restartNumberingAfterBreak="0">
+  <w:abstractNum w:abstractNumId="5" w15:restartNumberingAfterBreak="0">
     <w:nsid w:val="25C77CE5"/>
     <w:multiLevelType w:val="hybridMultilevel"/>
     <w:tmpl w:val="80583230"/>
@@ -16716,7 +17358,7 @@
       </w:pPr>
     </w:lvl>
   </w:abstractNum>
-  <w:abstractNum w:abstractNumId="5" w15:restartNumberingAfterBreak="0">
+  <w:abstractNum w:abstractNumId="6" w15:restartNumberingAfterBreak="0">
     <w:nsid w:val="25D63530"/>
     <w:multiLevelType w:val="hybridMultilevel"/>
     <w:tmpl w:val="2DB02EAC"/>
@@ -16809,7 +17451,7 @@
       </w:pPr>
     </w:lvl>
   </w:abstractNum>
-  <w:abstractNum w:abstractNumId="6" w15:restartNumberingAfterBreak="0">
+  <w:abstractNum w:abstractNumId="7" w15:restartNumberingAfterBreak="0">
     <w:nsid w:val="297644F5"/>
     <w:multiLevelType w:val="hybridMultilevel"/>
     <w:tmpl w:val="93CEDB94"/>
@@ -16922,7 +17564,7 @@
       </w:rPr>
     </w:lvl>
   </w:abstractNum>
-  <w:abstractNum w:abstractNumId="7" w15:restartNumberingAfterBreak="0">
+  <w:abstractNum w:abstractNumId="8" w15:restartNumberingAfterBreak="0">
     <w:nsid w:val="308A67DA"/>
     <w:multiLevelType w:val="hybridMultilevel"/>
     <w:tmpl w:val="D7CE906C"/>
@@ -17035,7 +17677,7 @@
       </w:rPr>
     </w:lvl>
   </w:abstractNum>
-  <w:abstractNum w:abstractNumId="8" w15:restartNumberingAfterBreak="0">
+  <w:abstractNum w:abstractNumId="9" w15:restartNumberingAfterBreak="0">
     <w:nsid w:val="52B66869"/>
     <w:multiLevelType w:val="multilevel"/>
     <w:tmpl w:val="49B869D4"/>
@@ -17154,7 +17796,7 @@
       </w:rPr>
     </w:lvl>
   </w:abstractNum>
-  <w:abstractNum w:abstractNumId="9" w15:restartNumberingAfterBreak="0">
+  <w:abstractNum w:abstractNumId="10" w15:restartNumberingAfterBreak="0">
     <w:nsid w:val="6ACA174D"/>
     <w:multiLevelType w:val="multilevel"/>
     <w:tmpl w:val="49B869D4"/>
@@ -17272,7 +17914,7 @@
       </w:rPr>
     </w:lvl>
   </w:abstractNum>
-  <w:abstractNum w:abstractNumId="10" w15:restartNumberingAfterBreak="0">
+  <w:abstractNum w:abstractNumId="11" w15:restartNumberingAfterBreak="0">
     <w:nsid w:val="6C9A26E8"/>
     <w:multiLevelType w:val="hybridMultilevel"/>
     <w:tmpl w:val="87BA9472"/>
@@ -17385,7 +18027,7 @@
       </w:rPr>
     </w:lvl>
   </w:abstractNum>
-  <w:abstractNum w:abstractNumId="11" w15:restartNumberingAfterBreak="0">
+  <w:abstractNum w:abstractNumId="12" w15:restartNumberingAfterBreak="0">
     <w:nsid w:val="733C1702"/>
     <w:multiLevelType w:val="hybridMultilevel"/>
     <w:tmpl w:val="DB8AB832"/>
@@ -17471,7 +18113,7 @@
       </w:pPr>
     </w:lvl>
   </w:abstractNum>
-  <w:abstractNum w:abstractNumId="12" w15:restartNumberingAfterBreak="0">
+  <w:abstractNum w:abstractNumId="13" w15:restartNumberingAfterBreak="0">
     <w:nsid w:val="73776DC2"/>
     <w:multiLevelType w:val="hybridMultilevel"/>
     <w:tmpl w:val="E018A2FE"/>
@@ -17585,43 +18227,46 @@
     </w:lvl>
   </w:abstractNum>
   <w:num w:numId="1" w16cid:durableId="1017195603">
+    <w:abstractNumId w:val="6"/>
+  </w:num>
+  <w:num w:numId="2" w16cid:durableId="2015305648">
+    <w:abstractNumId w:val="4"/>
+  </w:num>
+  <w:num w:numId="3" w16cid:durableId="155387266">
+    <w:abstractNumId w:val="11"/>
+  </w:num>
+  <w:num w:numId="4" w16cid:durableId="899709632">
+    <w:abstractNumId w:val="13"/>
+  </w:num>
+  <w:num w:numId="5" w16cid:durableId="708459630">
+    <w:abstractNumId w:val="1"/>
+  </w:num>
+  <w:num w:numId="6" w16cid:durableId="715008560">
+    <w:abstractNumId w:val="2"/>
+  </w:num>
+  <w:num w:numId="7" w16cid:durableId="1548642568">
+    <w:abstractNumId w:val="3"/>
+  </w:num>
+  <w:num w:numId="8" w16cid:durableId="735129710">
+    <w:abstractNumId w:val="7"/>
+  </w:num>
+  <w:num w:numId="9" w16cid:durableId="982275468">
+    <w:abstractNumId w:val="8"/>
+  </w:num>
+  <w:num w:numId="10" w16cid:durableId="1518885861">
     <w:abstractNumId w:val="5"/>
   </w:num>
-  <w:num w:numId="2" w16cid:durableId="2015305648">
-    <w:abstractNumId w:val="3"/>
+  <w:num w:numId="11" w16cid:durableId="1438520060">
+    <w:abstractNumId w:val="12"/>
   </w:num>
-  <w:num w:numId="3" w16cid:durableId="155387266">
+  <w:num w:numId="12" w16cid:durableId="398091206">
     <w:abstractNumId w:val="10"/>
   </w:num>
-  <w:num w:numId="4" w16cid:durableId="899709632">
-    <w:abstractNumId w:val="12"/>
-  </w:num>
-  <w:num w:numId="5" w16cid:durableId="708459630">
-    <w:abstractNumId w:val="0"/>
-  </w:num>
-  <w:num w:numId="6" w16cid:durableId="715008560">
-    <w:abstractNumId w:val="1"/>
-  </w:num>
-  <w:num w:numId="7" w16cid:durableId="1548642568">
-    <w:abstractNumId w:val="2"/>
-  </w:num>
-  <w:num w:numId="8" w16cid:durableId="735129710">
-    <w:abstractNumId w:val="6"/>
-  </w:num>
-  <w:num w:numId="9" w16cid:durableId="982275468">
-    <w:abstractNumId w:val="7"/>
-  </w:num>
-  <w:num w:numId="10" w16cid:durableId="1518885861">
-    <w:abstractNumId w:val="4"/>
-  </w:num>
-  <w:num w:numId="11" w16cid:durableId="1438520060">
-    <w:abstractNumId w:val="11"/>
-  </w:num>
-  <w:num w:numId="12" w16cid:durableId="398091206">
+  <w:num w:numId="13" w16cid:durableId="1500538690">
     <w:abstractNumId w:val="9"/>
   </w:num>
-  <w:num w:numId="13" w16cid:durableId="1500538690">
-    <w:abstractNumId w:val="8"/>
+  <w:num w:numId="14" w16cid:durableId="97679661">
+    <w:abstractNumId w:val="0"/>
   </w:num>
 </w:numbering>
 </file>
@@ -18078,7 +18723,6 @@
   <w:style w:type="character" w:default="1" w:styleId="DefaultParagraphFont">
     <w:name w:val="Default Paragraph Font"/>
     <w:uiPriority w:val="1"/>
-    <w:semiHidden/>
     <w:unhideWhenUsed/>
   </w:style>
   <w:style w:type="table" w:default="1" w:styleId="TableNormal">
@@ -19013,16 +19657,22 @@
 </file>
 
 <file path=customXml/item1.xml><?xml version="1.0" encoding="utf-8"?>
-<?mso-contentType ?>
-<FormTemplates xmlns="http://schemas.microsoft.com/sharepoint/v3/contenttype/forms">
-  <Display>DocumentLibraryForm</Display>
-  <Edit>DocumentLibraryForm</Edit>
-  <New>DocumentLibraryForm</New>
-</FormTemplates>
+<b:Sources xmlns:b="http://schemas.openxmlformats.org/officeDocument/2006/bibliography" xmlns="http://schemas.openxmlformats.org/officeDocument/2006/bibliography" SelectedStyle="/APA.XSL" StyleName="APA"/>
 </file>
 
 <file path=customXml/item2.xml><?xml version="1.0" encoding="utf-8"?>
-<b:Sources xmlns:b="http://schemas.openxmlformats.org/officeDocument/2006/bibliography" xmlns="http://schemas.openxmlformats.org/officeDocument/2006/bibliography" SelectedStyle="/APA.XSL" StyleName="APA"/>
+<p:properties xmlns:p="http://schemas.microsoft.com/office/2006/metadata/properties" xmlns:xsi="http://www.w3.org/2001/XMLSchema-instance" xmlns:pc="http://schemas.microsoft.com/office/infopath/2007/PartnerControls">
+  <documentManagement>
+    <lcf76f155ced4ddcb4097134ff3c332f xmlns="3ca5950f-9dc6-4fa2-8e6b-e8b0d1a55fc5">
+      <Terms xmlns="http://schemas.microsoft.com/office/infopath/2007/PartnerControls"/>
+    </lcf76f155ced4ddcb4097134ff3c332f>
+    <link xmlns="3ca5950f-9dc6-4fa2-8e6b-e8b0d1a55fc5">
+      <Url xsi:nil="true"/>
+      <Description xsi:nil="true"/>
+    </link>
+    <TaxCatchAll xmlns="da5699a2-2791-44c0-bb0a-d0c081c141e6" xsi:nil="true"/>
+  </documentManagement>
+</p:properties>
 </file>
 
 <file path=customXml/item3.xml><?xml version="1.0" encoding="utf-8"?>
@@ -19282,32 +19932,29 @@
 </file>
 
 <file path=customXml/item4.xml><?xml version="1.0" encoding="utf-8"?>
-<p:properties xmlns:p="http://schemas.microsoft.com/office/2006/metadata/properties" xmlns:xsi="http://www.w3.org/2001/XMLSchema-instance" xmlns:pc="http://schemas.microsoft.com/office/infopath/2007/PartnerControls">
-  <documentManagement>
-    <lcf76f155ced4ddcb4097134ff3c332f xmlns="3ca5950f-9dc6-4fa2-8e6b-e8b0d1a55fc5">
-      <Terms xmlns="http://schemas.microsoft.com/office/infopath/2007/PartnerControls"/>
-    </lcf76f155ced4ddcb4097134ff3c332f>
-    <link xmlns="3ca5950f-9dc6-4fa2-8e6b-e8b0d1a55fc5">
-      <Url xsi:nil="true"/>
-      <Description xsi:nil="true"/>
-    </link>
-    <TaxCatchAll xmlns="da5699a2-2791-44c0-bb0a-d0c081c141e6" xsi:nil="true"/>
-  </documentManagement>
-</p:properties>
+<?mso-contentType ?>
+<FormTemplates xmlns="http://schemas.microsoft.com/sharepoint/v3/contenttype/forms">
+  <Display>DocumentLibraryForm</Display>
+  <Edit>DocumentLibraryForm</Edit>
+  <New>DocumentLibraryForm</New>
+</FormTemplates>
 </file>
 
 <file path=customXml/itemProps1.xml><?xml version="1.0" encoding="utf-8"?>
-<ds:datastoreItem xmlns:ds="http://schemas.openxmlformats.org/officeDocument/2006/customXml" ds:itemID="{CE597715-63E8-4A9F-B3CC-57F27D3DCBFB}">
+<ds:datastoreItem xmlns:ds="http://schemas.openxmlformats.org/officeDocument/2006/customXml" ds:itemID="{191EA17E-4FF3-6543-9328-B87A43C2CF01}">
   <ds:schemaRefs>
-    <ds:schemaRef ds:uri="http://schemas.microsoft.com/sharepoint/v3/contenttype/forms"/>
+    <ds:schemaRef ds:uri="http://schemas.openxmlformats.org/officeDocument/2006/bibliography"/>
   </ds:schemaRefs>
 </ds:datastoreItem>
 </file>
 
 <file path=customXml/itemProps2.xml><?xml version="1.0" encoding="utf-8"?>
-<ds:datastoreItem xmlns:ds="http://schemas.openxmlformats.org/officeDocument/2006/customXml" ds:itemID="{191EA17E-4FF3-6543-9328-B87A43C2CF01}">
+<ds:datastoreItem xmlns:ds="http://schemas.openxmlformats.org/officeDocument/2006/customXml" ds:itemID="{37169F2F-1A49-4A9E-A13A-BBD6F4DE6A1B}">
   <ds:schemaRefs>
-    <ds:schemaRef ds:uri="http://schemas.openxmlformats.org/officeDocument/2006/bibliography"/>
+    <ds:schemaRef ds:uri="http://schemas.microsoft.com/office/2006/metadata/properties"/>
+    <ds:schemaRef ds:uri="http://schemas.microsoft.com/office/infopath/2007/PartnerControls"/>
+    <ds:schemaRef ds:uri="3ca5950f-9dc6-4fa2-8e6b-e8b0d1a55fc5"/>
+    <ds:schemaRef ds:uri="da5699a2-2791-44c0-bb0a-d0c081c141e6"/>
   </ds:schemaRefs>
 </ds:datastoreItem>
 </file>
@@ -19332,12 +19979,9 @@
 </file>
 
 <file path=customXml/itemProps4.xml><?xml version="1.0" encoding="utf-8"?>
-<ds:datastoreItem xmlns:ds="http://schemas.openxmlformats.org/officeDocument/2006/customXml" ds:itemID="{37169F2F-1A49-4A9E-A13A-BBD6F4DE6A1B}">
+<ds:datastoreItem xmlns:ds="http://schemas.openxmlformats.org/officeDocument/2006/customXml" ds:itemID="{CE597715-63E8-4A9F-B3CC-57F27D3DCBFB}">
   <ds:schemaRefs>
-    <ds:schemaRef ds:uri="http://schemas.microsoft.com/office/2006/metadata/properties"/>
-    <ds:schemaRef ds:uri="http://schemas.microsoft.com/office/infopath/2007/PartnerControls"/>
-    <ds:schemaRef ds:uri="3ca5950f-9dc6-4fa2-8e6b-e8b0d1a55fc5"/>
-    <ds:schemaRef ds:uri="da5699a2-2791-44c0-bb0a-d0c081c141e6"/>
+    <ds:schemaRef ds:uri="http://schemas.microsoft.com/sharepoint/v3/contenttype/forms"/>
   </ds:schemaRefs>
 </ds:datastoreItem>
 </file>
</xml_diff>